<commit_message>
Añade la tabla ASCII reducida que faltaba en apuntes y docencia
Los ejercicios de codificación/decodificación (apuntes, docencia,
fichas) referenciaban "la tabla ASCII reducida" sin que esa tabla
existiera en ningún documento. Añadida en apuntes (md + docx, junto a
la presentación de ASCII) y en docencia (como material para proyectar
en el paso del guion correspondiente): mayúsculas, minúsculas, dígitos
y símbolos habituales con su valor decimal.

Co-Authored-By: Claude Sonnet 5 <noreply@anthropic.com>
</commit_message>
<xml_diff>
--- a/UD01-fundamentos-so/UD01_apuntes.docx
+++ b/UD01-fundamentos-so/UD01_apuntes.docx
@@ -5586,6 +5586,4688 @@
         </w:rPr>
         <w:t xml:space="preserve"> — se quedó corto en cuanto la informática se extendió más allá del mundo anglosajón.</w:t>
       </w:r>
+    </w:p>
+    <w:p>
+      <w:pPr>
+        <w:pStyle w:val="Heading3"/>
+        <w:spacing w:after="120" w:before="220"/>
+      </w:pPr>
+      <w:r>
+        <w:rPr>
+          <w:rFonts w:ascii="News Gothic MT" w:cs="News Gothic MT" w:eastAsia="News Gothic MT" w:hAnsi="News Gothic MT"/>
+          <w:b/>
+          <w:bCs/>
+          <w:color w:val="3E5D93"/>
+          <w:sz w:val="23"/>
+          <w:szCs w:val="23"/>
+        </w:rPr>
+        <w:t xml:space="preserve">Tabla ASCII reducida</w:t>
+      </w:r>
+    </w:p>
+    <w:p>
+      <w:pPr>
+        <w:spacing w:after="160" w:line="300"/>
+        <w:jc w:val="both"/>
+      </w:pPr>
+      <w:r>
+        <w:rPr>
+          <w:rFonts w:ascii="News Gothic MT" w:cs="News Gothic MT" w:eastAsia="News Gothic MT" w:hAnsi="News Gothic MT"/>
+          <w:b w:val="false"/>
+          <w:bCs w:val="false"/>
+          <w:i w:val="false"/>
+          <w:iCs w:val="false"/>
+          <w:color w:val="1A1A2E"/>
+          <w:sz w:val="21"/>
+          <w:szCs w:val="21"/>
+        </w:rPr>
+        <w:t xml:space="preserve">No hace falta memorizarla: consúltala cada vez que necesites codificar o decodificar un carácter en las actividades de esta unidad.</w:t>
+      </w:r>
+    </w:p>
+    <w:p>
+      <w:pPr>
+        <w:spacing w:after="160" w:line="300"/>
+        <w:jc w:val="both"/>
+      </w:pPr>
+      <w:r>
+        <w:rPr>
+          <w:rFonts w:ascii="News Gothic MT" w:cs="News Gothic MT" w:eastAsia="News Gothic MT" w:hAnsi="News Gothic MT"/>
+          <w:b/>
+          <w:bCs/>
+          <w:color w:val="1A1A2E"/>
+          <w:sz w:val="21"/>
+          <w:szCs w:val="21"/>
+        </w:rPr>
+        <w:t xml:space="preserve">Letras mayúsculas</w:t>
+      </w:r>
+    </w:p>
+    <w:tbl>
+      <w:tblPr>
+        <w:tblW w:type="dxa" w:w="8838"/>
+        <w:tblBorders>
+          <w:top w:val="single" w:color="D8DEEA" w:sz="4"/>
+          <w:left w:val="single" w:color="D8DEEA" w:sz="4"/>
+          <w:bottom w:val="single" w:color="D8DEEA" w:sz="4"/>
+          <w:right w:val="single" w:color="D8DEEA" w:sz="4"/>
+          <w:insideH w:val="single" w:color="D8DEEA" w:sz="4"/>
+          <w:insideV w:val="single" w:color="D8DEEA" w:sz="4"/>
+        </w:tblBorders>
+      </w:tblPr>
+      <w:tblGrid>
+        <w:gridCol w:w="1200"/>
+        <w:gridCol w:w="1000"/>
+        <w:gridCol w:w="1200"/>
+        <w:gridCol w:w="1000"/>
+        <w:gridCol w:w="1200"/>
+        <w:gridCol w:w="1000"/>
+        <w:gridCol w:w="1200"/>
+        <w:gridCol w:w="1038"/>
+      </w:tblGrid>
+      <w:tr>
+        <w:trPr>
+          <w:tblHeader/>
+        </w:trPr>
+        <w:tc>
+          <w:tcPr>
+            <w:tcW w:type="dxa" w:w="1200"/>
+            <w:shd w:fill="1F3864" w:color="auto" w:val="clear"/>
+            <w:tcMar>
+              <w:top w:type="dxa" w:w="80"/>
+              <w:left w:type="dxa" w:w="120"/>
+              <w:bottom w:type="dxa" w:w="80"/>
+              <w:right w:type="dxa" w:w="120"/>
+            </w:tcMar>
+            <w:vAlign w:val="center"/>
+          </w:tcPr>
+          <w:p>
+            <w:r>
+              <w:rPr>
+                <w:rFonts w:ascii="News Gothic MT" w:cs="News Gothic MT" w:eastAsia="News Gothic MT" w:hAnsi="News Gothic MT"/>
+                <w:b/>
+                <w:bCs/>
+                <w:color w:val="FFFFFF"/>
+                <w:sz w:val="19"/>
+                <w:szCs w:val="19"/>
+              </w:rPr>
+              <w:t xml:space="preserve">Letra</w:t>
+            </w:r>
+          </w:p>
+        </w:tc>
+        <w:tc>
+          <w:tcPr>
+            <w:tcW w:type="dxa" w:w="1000"/>
+            <w:shd w:fill="1F3864" w:color="auto" w:val="clear"/>
+            <w:tcMar>
+              <w:top w:type="dxa" w:w="80"/>
+              <w:left w:type="dxa" w:w="120"/>
+              <w:bottom w:type="dxa" w:w="80"/>
+              <w:right w:type="dxa" w:w="120"/>
+            </w:tcMar>
+            <w:vAlign w:val="center"/>
+          </w:tcPr>
+          <w:p>
+            <w:r>
+              <w:rPr>
+                <w:rFonts w:ascii="News Gothic MT" w:cs="News Gothic MT" w:eastAsia="News Gothic MT" w:hAnsi="News Gothic MT"/>
+                <w:b/>
+                <w:bCs/>
+                <w:color w:val="FFFFFF"/>
+                <w:sz w:val="19"/>
+                <w:szCs w:val="19"/>
+              </w:rPr>
+              <w:t xml:space="preserve">Dec</w:t>
+            </w:r>
+          </w:p>
+        </w:tc>
+        <w:tc>
+          <w:tcPr>
+            <w:tcW w:type="dxa" w:w="1200"/>
+            <w:shd w:fill="1F3864" w:color="auto" w:val="clear"/>
+            <w:tcMar>
+              <w:top w:type="dxa" w:w="80"/>
+              <w:left w:type="dxa" w:w="120"/>
+              <w:bottom w:type="dxa" w:w="80"/>
+              <w:right w:type="dxa" w:w="120"/>
+            </w:tcMar>
+            <w:vAlign w:val="center"/>
+          </w:tcPr>
+          <w:p>
+            <w:r>
+              <w:rPr>
+                <w:rFonts w:ascii="News Gothic MT" w:cs="News Gothic MT" w:eastAsia="News Gothic MT" w:hAnsi="News Gothic MT"/>
+                <w:b/>
+                <w:bCs/>
+                <w:color w:val="FFFFFF"/>
+                <w:sz w:val="19"/>
+                <w:szCs w:val="19"/>
+              </w:rPr>
+              <w:t xml:space="preserve">Letra</w:t>
+            </w:r>
+          </w:p>
+        </w:tc>
+        <w:tc>
+          <w:tcPr>
+            <w:tcW w:type="dxa" w:w="1000"/>
+            <w:shd w:fill="1F3864" w:color="auto" w:val="clear"/>
+            <w:tcMar>
+              <w:top w:type="dxa" w:w="80"/>
+              <w:left w:type="dxa" w:w="120"/>
+              <w:bottom w:type="dxa" w:w="80"/>
+              <w:right w:type="dxa" w:w="120"/>
+            </w:tcMar>
+            <w:vAlign w:val="center"/>
+          </w:tcPr>
+          <w:p>
+            <w:r>
+              <w:rPr>
+                <w:rFonts w:ascii="News Gothic MT" w:cs="News Gothic MT" w:eastAsia="News Gothic MT" w:hAnsi="News Gothic MT"/>
+                <w:b/>
+                <w:bCs/>
+                <w:color w:val="FFFFFF"/>
+                <w:sz w:val="19"/>
+                <w:szCs w:val="19"/>
+              </w:rPr>
+              <w:t xml:space="preserve">Dec</w:t>
+            </w:r>
+          </w:p>
+        </w:tc>
+        <w:tc>
+          <w:tcPr>
+            <w:tcW w:type="dxa" w:w="1200"/>
+            <w:shd w:fill="1F3864" w:color="auto" w:val="clear"/>
+            <w:tcMar>
+              <w:top w:type="dxa" w:w="80"/>
+              <w:left w:type="dxa" w:w="120"/>
+              <w:bottom w:type="dxa" w:w="80"/>
+              <w:right w:type="dxa" w:w="120"/>
+            </w:tcMar>
+            <w:vAlign w:val="center"/>
+          </w:tcPr>
+          <w:p>
+            <w:r>
+              <w:rPr>
+                <w:rFonts w:ascii="News Gothic MT" w:cs="News Gothic MT" w:eastAsia="News Gothic MT" w:hAnsi="News Gothic MT"/>
+                <w:b/>
+                <w:bCs/>
+                <w:color w:val="FFFFFF"/>
+                <w:sz w:val="19"/>
+                <w:szCs w:val="19"/>
+              </w:rPr>
+              <w:t xml:space="preserve">Letra</w:t>
+            </w:r>
+          </w:p>
+        </w:tc>
+        <w:tc>
+          <w:tcPr>
+            <w:tcW w:type="dxa" w:w="1000"/>
+            <w:shd w:fill="1F3864" w:color="auto" w:val="clear"/>
+            <w:tcMar>
+              <w:top w:type="dxa" w:w="80"/>
+              <w:left w:type="dxa" w:w="120"/>
+              <w:bottom w:type="dxa" w:w="80"/>
+              <w:right w:type="dxa" w:w="120"/>
+            </w:tcMar>
+            <w:vAlign w:val="center"/>
+          </w:tcPr>
+          <w:p>
+            <w:r>
+              <w:rPr>
+                <w:rFonts w:ascii="News Gothic MT" w:cs="News Gothic MT" w:eastAsia="News Gothic MT" w:hAnsi="News Gothic MT"/>
+                <w:b/>
+                <w:bCs/>
+                <w:color w:val="FFFFFF"/>
+                <w:sz w:val="19"/>
+                <w:szCs w:val="19"/>
+              </w:rPr>
+              <w:t xml:space="preserve">Dec</w:t>
+            </w:r>
+          </w:p>
+        </w:tc>
+        <w:tc>
+          <w:tcPr>
+            <w:tcW w:type="dxa" w:w="1200"/>
+            <w:shd w:fill="1F3864" w:color="auto" w:val="clear"/>
+            <w:tcMar>
+              <w:top w:type="dxa" w:w="80"/>
+              <w:left w:type="dxa" w:w="120"/>
+              <w:bottom w:type="dxa" w:w="80"/>
+              <w:right w:type="dxa" w:w="120"/>
+            </w:tcMar>
+            <w:vAlign w:val="center"/>
+          </w:tcPr>
+          <w:p>
+            <w:r>
+              <w:rPr>
+                <w:rFonts w:ascii="News Gothic MT" w:cs="News Gothic MT" w:eastAsia="News Gothic MT" w:hAnsi="News Gothic MT"/>
+                <w:b/>
+                <w:bCs/>
+                <w:color w:val="FFFFFF"/>
+                <w:sz w:val="19"/>
+                <w:szCs w:val="19"/>
+              </w:rPr>
+              <w:t xml:space="preserve">Letra</w:t>
+            </w:r>
+          </w:p>
+        </w:tc>
+        <w:tc>
+          <w:tcPr>
+            <w:tcW w:type="dxa" w:w="1038"/>
+            <w:shd w:fill="1F3864" w:color="auto" w:val="clear"/>
+            <w:tcMar>
+              <w:top w:type="dxa" w:w="80"/>
+              <w:left w:type="dxa" w:w="120"/>
+              <w:bottom w:type="dxa" w:w="80"/>
+              <w:right w:type="dxa" w:w="120"/>
+            </w:tcMar>
+            <w:vAlign w:val="center"/>
+          </w:tcPr>
+          <w:p>
+            <w:r>
+              <w:rPr>
+                <w:rFonts w:ascii="News Gothic MT" w:cs="News Gothic MT" w:eastAsia="News Gothic MT" w:hAnsi="News Gothic MT"/>
+                <w:b/>
+                <w:bCs/>
+                <w:color w:val="FFFFFF"/>
+                <w:sz w:val="19"/>
+                <w:szCs w:val="19"/>
+              </w:rPr>
+              <w:t xml:space="preserve">Dec</w:t>
+            </w:r>
+          </w:p>
+        </w:tc>
+      </w:tr>
+      <w:tr>
+        <w:tc>
+          <w:tcPr>
+            <w:tcW w:type="dxa" w:w="1200"/>
+            <w:shd w:fill="FFFFFF" w:color="auto" w:val="clear"/>
+            <w:tcMar>
+              <w:top w:type="dxa" w:w="70"/>
+              <w:left w:type="dxa" w:w="120"/>
+              <w:bottom w:type="dxa" w:w="70"/>
+              <w:right w:type="dxa" w:w="120"/>
+            </w:tcMar>
+            <w:vAlign w:val="center"/>
+          </w:tcPr>
+          <w:p>
+            <w:r>
+              <w:rPr>
+                <w:rFonts w:ascii="News Gothic MT" w:cs="News Gothic MT" w:eastAsia="News Gothic MT" w:hAnsi="News Gothic MT"/>
+                <w:b w:val="false"/>
+                <w:bCs w:val="false"/>
+                <w:i w:val="false"/>
+                <w:iCs w:val="false"/>
+                <w:color w:val="1A1A2E"/>
+                <w:sz w:val="19"/>
+                <w:szCs w:val="19"/>
+              </w:rPr>
+              <w:t xml:space="preserve">A</w:t>
+            </w:r>
+          </w:p>
+        </w:tc>
+        <w:tc>
+          <w:tcPr>
+            <w:tcW w:type="dxa" w:w="1000"/>
+            <w:shd w:fill="FFFFFF" w:color="auto" w:val="clear"/>
+            <w:tcMar>
+              <w:top w:type="dxa" w:w="70"/>
+              <w:left w:type="dxa" w:w="120"/>
+              <w:bottom w:type="dxa" w:w="70"/>
+              <w:right w:type="dxa" w:w="120"/>
+            </w:tcMar>
+            <w:vAlign w:val="center"/>
+          </w:tcPr>
+          <w:p>
+            <w:r>
+              <w:rPr>
+                <w:rFonts w:ascii="News Gothic MT" w:cs="News Gothic MT" w:eastAsia="News Gothic MT" w:hAnsi="News Gothic MT"/>
+                <w:b w:val="false"/>
+                <w:bCs w:val="false"/>
+                <w:i w:val="false"/>
+                <w:iCs w:val="false"/>
+                <w:color w:val="1A1A2E"/>
+                <w:sz w:val="19"/>
+                <w:szCs w:val="19"/>
+              </w:rPr>
+              <w:t xml:space="preserve">65</w:t>
+            </w:r>
+          </w:p>
+        </w:tc>
+        <w:tc>
+          <w:tcPr>
+            <w:tcW w:type="dxa" w:w="1200"/>
+            <w:shd w:fill="FFFFFF" w:color="auto" w:val="clear"/>
+            <w:tcMar>
+              <w:top w:type="dxa" w:w="70"/>
+              <w:left w:type="dxa" w:w="120"/>
+              <w:bottom w:type="dxa" w:w="70"/>
+              <w:right w:type="dxa" w:w="120"/>
+            </w:tcMar>
+            <w:vAlign w:val="center"/>
+          </w:tcPr>
+          <w:p>
+            <w:r>
+              <w:rPr>
+                <w:rFonts w:ascii="News Gothic MT" w:cs="News Gothic MT" w:eastAsia="News Gothic MT" w:hAnsi="News Gothic MT"/>
+                <w:b w:val="false"/>
+                <w:bCs w:val="false"/>
+                <w:i w:val="false"/>
+                <w:iCs w:val="false"/>
+                <w:color w:val="1A1A2E"/>
+                <w:sz w:val="19"/>
+                <w:szCs w:val="19"/>
+              </w:rPr>
+              <w:t xml:space="preserve">H</w:t>
+            </w:r>
+          </w:p>
+        </w:tc>
+        <w:tc>
+          <w:tcPr>
+            <w:tcW w:type="dxa" w:w="1000"/>
+            <w:shd w:fill="FFFFFF" w:color="auto" w:val="clear"/>
+            <w:tcMar>
+              <w:top w:type="dxa" w:w="70"/>
+              <w:left w:type="dxa" w:w="120"/>
+              <w:bottom w:type="dxa" w:w="70"/>
+              <w:right w:type="dxa" w:w="120"/>
+            </w:tcMar>
+            <w:vAlign w:val="center"/>
+          </w:tcPr>
+          <w:p>
+            <w:r>
+              <w:rPr>
+                <w:rFonts w:ascii="News Gothic MT" w:cs="News Gothic MT" w:eastAsia="News Gothic MT" w:hAnsi="News Gothic MT"/>
+                <w:b w:val="false"/>
+                <w:bCs w:val="false"/>
+                <w:i w:val="false"/>
+                <w:iCs w:val="false"/>
+                <w:color w:val="1A1A2E"/>
+                <w:sz w:val="19"/>
+                <w:szCs w:val="19"/>
+              </w:rPr>
+              <w:t xml:space="preserve">72</w:t>
+            </w:r>
+          </w:p>
+        </w:tc>
+        <w:tc>
+          <w:tcPr>
+            <w:tcW w:type="dxa" w:w="1200"/>
+            <w:shd w:fill="FFFFFF" w:color="auto" w:val="clear"/>
+            <w:tcMar>
+              <w:top w:type="dxa" w:w="70"/>
+              <w:left w:type="dxa" w:w="120"/>
+              <w:bottom w:type="dxa" w:w="70"/>
+              <w:right w:type="dxa" w:w="120"/>
+            </w:tcMar>
+            <w:vAlign w:val="center"/>
+          </w:tcPr>
+          <w:p>
+            <w:r>
+              <w:rPr>
+                <w:rFonts w:ascii="News Gothic MT" w:cs="News Gothic MT" w:eastAsia="News Gothic MT" w:hAnsi="News Gothic MT"/>
+                <w:b w:val="false"/>
+                <w:bCs w:val="false"/>
+                <w:i w:val="false"/>
+                <w:iCs w:val="false"/>
+                <w:color w:val="1A1A2E"/>
+                <w:sz w:val="19"/>
+                <w:szCs w:val="19"/>
+              </w:rPr>
+              <w:t xml:space="preserve">O</w:t>
+            </w:r>
+          </w:p>
+        </w:tc>
+        <w:tc>
+          <w:tcPr>
+            <w:tcW w:type="dxa" w:w="1000"/>
+            <w:shd w:fill="FFFFFF" w:color="auto" w:val="clear"/>
+            <w:tcMar>
+              <w:top w:type="dxa" w:w="70"/>
+              <w:left w:type="dxa" w:w="120"/>
+              <w:bottom w:type="dxa" w:w="70"/>
+              <w:right w:type="dxa" w:w="120"/>
+            </w:tcMar>
+            <w:vAlign w:val="center"/>
+          </w:tcPr>
+          <w:p>
+            <w:r>
+              <w:rPr>
+                <w:rFonts w:ascii="News Gothic MT" w:cs="News Gothic MT" w:eastAsia="News Gothic MT" w:hAnsi="News Gothic MT"/>
+                <w:b w:val="false"/>
+                <w:bCs w:val="false"/>
+                <w:i w:val="false"/>
+                <w:iCs w:val="false"/>
+                <w:color w:val="1A1A2E"/>
+                <w:sz w:val="19"/>
+                <w:szCs w:val="19"/>
+              </w:rPr>
+              <w:t xml:space="preserve">79</w:t>
+            </w:r>
+          </w:p>
+        </w:tc>
+        <w:tc>
+          <w:tcPr>
+            <w:tcW w:type="dxa" w:w="1200"/>
+            <w:shd w:fill="FFFFFF" w:color="auto" w:val="clear"/>
+            <w:tcMar>
+              <w:top w:type="dxa" w:w="70"/>
+              <w:left w:type="dxa" w:w="120"/>
+              <w:bottom w:type="dxa" w:w="70"/>
+              <w:right w:type="dxa" w:w="120"/>
+            </w:tcMar>
+            <w:vAlign w:val="center"/>
+          </w:tcPr>
+          <w:p>
+            <w:r>
+              <w:rPr>
+                <w:rFonts w:ascii="News Gothic MT" w:cs="News Gothic MT" w:eastAsia="News Gothic MT" w:hAnsi="News Gothic MT"/>
+                <w:b w:val="false"/>
+                <w:bCs w:val="false"/>
+                <w:i w:val="false"/>
+                <w:iCs w:val="false"/>
+                <w:color w:val="1A1A2E"/>
+                <w:sz w:val="19"/>
+                <w:szCs w:val="19"/>
+              </w:rPr>
+              <w:t xml:space="preserve">V</w:t>
+            </w:r>
+          </w:p>
+        </w:tc>
+        <w:tc>
+          <w:tcPr>
+            <w:tcW w:type="dxa" w:w="1038"/>
+            <w:shd w:fill="FFFFFF" w:color="auto" w:val="clear"/>
+            <w:tcMar>
+              <w:top w:type="dxa" w:w="70"/>
+              <w:left w:type="dxa" w:w="120"/>
+              <w:bottom w:type="dxa" w:w="70"/>
+              <w:right w:type="dxa" w:w="120"/>
+            </w:tcMar>
+            <w:vAlign w:val="center"/>
+          </w:tcPr>
+          <w:p>
+            <w:r>
+              <w:rPr>
+                <w:rFonts w:ascii="News Gothic MT" w:cs="News Gothic MT" w:eastAsia="News Gothic MT" w:hAnsi="News Gothic MT"/>
+                <w:b w:val="false"/>
+                <w:bCs w:val="false"/>
+                <w:i w:val="false"/>
+                <w:iCs w:val="false"/>
+                <w:color w:val="1A1A2E"/>
+                <w:sz w:val="19"/>
+                <w:szCs w:val="19"/>
+              </w:rPr>
+              <w:t xml:space="preserve">86</w:t>
+            </w:r>
+          </w:p>
+        </w:tc>
+      </w:tr>
+      <w:tr>
+        <w:tc>
+          <w:tcPr>
+            <w:tcW w:type="dxa" w:w="1200"/>
+            <w:shd w:fill="EEF1F8" w:color="auto" w:val="clear"/>
+            <w:tcMar>
+              <w:top w:type="dxa" w:w="70"/>
+              <w:left w:type="dxa" w:w="120"/>
+              <w:bottom w:type="dxa" w:w="70"/>
+              <w:right w:type="dxa" w:w="120"/>
+            </w:tcMar>
+            <w:vAlign w:val="center"/>
+          </w:tcPr>
+          <w:p>
+            <w:r>
+              <w:rPr>
+                <w:rFonts w:ascii="News Gothic MT" w:cs="News Gothic MT" w:eastAsia="News Gothic MT" w:hAnsi="News Gothic MT"/>
+                <w:b w:val="false"/>
+                <w:bCs w:val="false"/>
+                <w:i w:val="false"/>
+                <w:iCs w:val="false"/>
+                <w:color w:val="1A1A2E"/>
+                <w:sz w:val="19"/>
+                <w:szCs w:val="19"/>
+              </w:rPr>
+              <w:t xml:space="preserve">B</w:t>
+            </w:r>
+          </w:p>
+        </w:tc>
+        <w:tc>
+          <w:tcPr>
+            <w:tcW w:type="dxa" w:w="1000"/>
+            <w:shd w:fill="EEF1F8" w:color="auto" w:val="clear"/>
+            <w:tcMar>
+              <w:top w:type="dxa" w:w="70"/>
+              <w:left w:type="dxa" w:w="120"/>
+              <w:bottom w:type="dxa" w:w="70"/>
+              <w:right w:type="dxa" w:w="120"/>
+            </w:tcMar>
+            <w:vAlign w:val="center"/>
+          </w:tcPr>
+          <w:p>
+            <w:r>
+              <w:rPr>
+                <w:rFonts w:ascii="News Gothic MT" w:cs="News Gothic MT" w:eastAsia="News Gothic MT" w:hAnsi="News Gothic MT"/>
+                <w:b w:val="false"/>
+                <w:bCs w:val="false"/>
+                <w:i w:val="false"/>
+                <w:iCs w:val="false"/>
+                <w:color w:val="1A1A2E"/>
+                <w:sz w:val="19"/>
+                <w:szCs w:val="19"/>
+              </w:rPr>
+              <w:t xml:space="preserve">66</w:t>
+            </w:r>
+          </w:p>
+        </w:tc>
+        <w:tc>
+          <w:tcPr>
+            <w:tcW w:type="dxa" w:w="1200"/>
+            <w:shd w:fill="EEF1F8" w:color="auto" w:val="clear"/>
+            <w:tcMar>
+              <w:top w:type="dxa" w:w="70"/>
+              <w:left w:type="dxa" w:w="120"/>
+              <w:bottom w:type="dxa" w:w="70"/>
+              <w:right w:type="dxa" w:w="120"/>
+            </w:tcMar>
+            <w:vAlign w:val="center"/>
+          </w:tcPr>
+          <w:p>
+            <w:r>
+              <w:rPr>
+                <w:rFonts w:ascii="News Gothic MT" w:cs="News Gothic MT" w:eastAsia="News Gothic MT" w:hAnsi="News Gothic MT"/>
+                <w:b w:val="false"/>
+                <w:bCs w:val="false"/>
+                <w:i w:val="false"/>
+                <w:iCs w:val="false"/>
+                <w:color w:val="1A1A2E"/>
+                <w:sz w:val="19"/>
+                <w:szCs w:val="19"/>
+              </w:rPr>
+              <w:t xml:space="preserve">I</w:t>
+            </w:r>
+          </w:p>
+        </w:tc>
+        <w:tc>
+          <w:tcPr>
+            <w:tcW w:type="dxa" w:w="1000"/>
+            <w:shd w:fill="EEF1F8" w:color="auto" w:val="clear"/>
+            <w:tcMar>
+              <w:top w:type="dxa" w:w="70"/>
+              <w:left w:type="dxa" w:w="120"/>
+              <w:bottom w:type="dxa" w:w="70"/>
+              <w:right w:type="dxa" w:w="120"/>
+            </w:tcMar>
+            <w:vAlign w:val="center"/>
+          </w:tcPr>
+          <w:p>
+            <w:r>
+              <w:rPr>
+                <w:rFonts w:ascii="News Gothic MT" w:cs="News Gothic MT" w:eastAsia="News Gothic MT" w:hAnsi="News Gothic MT"/>
+                <w:b w:val="false"/>
+                <w:bCs w:val="false"/>
+                <w:i w:val="false"/>
+                <w:iCs w:val="false"/>
+                <w:color w:val="1A1A2E"/>
+                <w:sz w:val="19"/>
+                <w:szCs w:val="19"/>
+              </w:rPr>
+              <w:t xml:space="preserve">73</w:t>
+            </w:r>
+          </w:p>
+        </w:tc>
+        <w:tc>
+          <w:tcPr>
+            <w:tcW w:type="dxa" w:w="1200"/>
+            <w:shd w:fill="EEF1F8" w:color="auto" w:val="clear"/>
+            <w:tcMar>
+              <w:top w:type="dxa" w:w="70"/>
+              <w:left w:type="dxa" w:w="120"/>
+              <w:bottom w:type="dxa" w:w="70"/>
+              <w:right w:type="dxa" w:w="120"/>
+            </w:tcMar>
+            <w:vAlign w:val="center"/>
+          </w:tcPr>
+          <w:p>
+            <w:r>
+              <w:rPr>
+                <w:rFonts w:ascii="News Gothic MT" w:cs="News Gothic MT" w:eastAsia="News Gothic MT" w:hAnsi="News Gothic MT"/>
+                <w:b w:val="false"/>
+                <w:bCs w:val="false"/>
+                <w:i w:val="false"/>
+                <w:iCs w:val="false"/>
+                <w:color w:val="1A1A2E"/>
+                <w:sz w:val="19"/>
+                <w:szCs w:val="19"/>
+              </w:rPr>
+              <w:t xml:space="preserve">P</w:t>
+            </w:r>
+          </w:p>
+        </w:tc>
+        <w:tc>
+          <w:tcPr>
+            <w:tcW w:type="dxa" w:w="1000"/>
+            <w:shd w:fill="EEF1F8" w:color="auto" w:val="clear"/>
+            <w:tcMar>
+              <w:top w:type="dxa" w:w="70"/>
+              <w:left w:type="dxa" w:w="120"/>
+              <w:bottom w:type="dxa" w:w="70"/>
+              <w:right w:type="dxa" w:w="120"/>
+            </w:tcMar>
+            <w:vAlign w:val="center"/>
+          </w:tcPr>
+          <w:p>
+            <w:r>
+              <w:rPr>
+                <w:rFonts w:ascii="News Gothic MT" w:cs="News Gothic MT" w:eastAsia="News Gothic MT" w:hAnsi="News Gothic MT"/>
+                <w:b w:val="false"/>
+                <w:bCs w:val="false"/>
+                <w:i w:val="false"/>
+                <w:iCs w:val="false"/>
+                <w:color w:val="1A1A2E"/>
+                <w:sz w:val="19"/>
+                <w:szCs w:val="19"/>
+              </w:rPr>
+              <w:t xml:space="preserve">80</w:t>
+            </w:r>
+          </w:p>
+        </w:tc>
+        <w:tc>
+          <w:tcPr>
+            <w:tcW w:type="dxa" w:w="1200"/>
+            <w:shd w:fill="EEF1F8" w:color="auto" w:val="clear"/>
+            <w:tcMar>
+              <w:top w:type="dxa" w:w="70"/>
+              <w:left w:type="dxa" w:w="120"/>
+              <w:bottom w:type="dxa" w:w="70"/>
+              <w:right w:type="dxa" w:w="120"/>
+            </w:tcMar>
+            <w:vAlign w:val="center"/>
+          </w:tcPr>
+          <w:p>
+            <w:r>
+              <w:rPr>
+                <w:rFonts w:ascii="News Gothic MT" w:cs="News Gothic MT" w:eastAsia="News Gothic MT" w:hAnsi="News Gothic MT"/>
+                <w:b w:val="false"/>
+                <w:bCs w:val="false"/>
+                <w:i w:val="false"/>
+                <w:iCs w:val="false"/>
+                <w:color w:val="1A1A2E"/>
+                <w:sz w:val="19"/>
+                <w:szCs w:val="19"/>
+              </w:rPr>
+              <w:t xml:space="preserve">W</w:t>
+            </w:r>
+          </w:p>
+        </w:tc>
+        <w:tc>
+          <w:tcPr>
+            <w:tcW w:type="dxa" w:w="1038"/>
+            <w:shd w:fill="EEF1F8" w:color="auto" w:val="clear"/>
+            <w:tcMar>
+              <w:top w:type="dxa" w:w="70"/>
+              <w:left w:type="dxa" w:w="120"/>
+              <w:bottom w:type="dxa" w:w="70"/>
+              <w:right w:type="dxa" w:w="120"/>
+            </w:tcMar>
+            <w:vAlign w:val="center"/>
+          </w:tcPr>
+          <w:p>
+            <w:r>
+              <w:rPr>
+                <w:rFonts w:ascii="News Gothic MT" w:cs="News Gothic MT" w:eastAsia="News Gothic MT" w:hAnsi="News Gothic MT"/>
+                <w:b w:val="false"/>
+                <w:bCs w:val="false"/>
+                <w:i w:val="false"/>
+                <w:iCs w:val="false"/>
+                <w:color w:val="1A1A2E"/>
+                <w:sz w:val="19"/>
+                <w:szCs w:val="19"/>
+              </w:rPr>
+              <w:t xml:space="preserve">87</w:t>
+            </w:r>
+          </w:p>
+        </w:tc>
+      </w:tr>
+      <w:tr>
+        <w:tc>
+          <w:tcPr>
+            <w:tcW w:type="dxa" w:w="1200"/>
+            <w:shd w:fill="FFFFFF" w:color="auto" w:val="clear"/>
+            <w:tcMar>
+              <w:top w:type="dxa" w:w="70"/>
+              <w:left w:type="dxa" w:w="120"/>
+              <w:bottom w:type="dxa" w:w="70"/>
+              <w:right w:type="dxa" w:w="120"/>
+            </w:tcMar>
+            <w:vAlign w:val="center"/>
+          </w:tcPr>
+          <w:p>
+            <w:r>
+              <w:rPr>
+                <w:rFonts w:ascii="News Gothic MT" w:cs="News Gothic MT" w:eastAsia="News Gothic MT" w:hAnsi="News Gothic MT"/>
+                <w:b w:val="false"/>
+                <w:bCs w:val="false"/>
+                <w:i w:val="false"/>
+                <w:iCs w:val="false"/>
+                <w:color w:val="1A1A2E"/>
+                <w:sz w:val="19"/>
+                <w:szCs w:val="19"/>
+              </w:rPr>
+              <w:t xml:space="preserve">C</w:t>
+            </w:r>
+          </w:p>
+        </w:tc>
+        <w:tc>
+          <w:tcPr>
+            <w:tcW w:type="dxa" w:w="1000"/>
+            <w:shd w:fill="FFFFFF" w:color="auto" w:val="clear"/>
+            <w:tcMar>
+              <w:top w:type="dxa" w:w="70"/>
+              <w:left w:type="dxa" w:w="120"/>
+              <w:bottom w:type="dxa" w:w="70"/>
+              <w:right w:type="dxa" w:w="120"/>
+            </w:tcMar>
+            <w:vAlign w:val="center"/>
+          </w:tcPr>
+          <w:p>
+            <w:r>
+              <w:rPr>
+                <w:rFonts w:ascii="News Gothic MT" w:cs="News Gothic MT" w:eastAsia="News Gothic MT" w:hAnsi="News Gothic MT"/>
+                <w:b w:val="false"/>
+                <w:bCs w:val="false"/>
+                <w:i w:val="false"/>
+                <w:iCs w:val="false"/>
+                <w:color w:val="1A1A2E"/>
+                <w:sz w:val="19"/>
+                <w:szCs w:val="19"/>
+              </w:rPr>
+              <w:t xml:space="preserve">67</w:t>
+            </w:r>
+          </w:p>
+        </w:tc>
+        <w:tc>
+          <w:tcPr>
+            <w:tcW w:type="dxa" w:w="1200"/>
+            <w:shd w:fill="FFFFFF" w:color="auto" w:val="clear"/>
+            <w:tcMar>
+              <w:top w:type="dxa" w:w="70"/>
+              <w:left w:type="dxa" w:w="120"/>
+              <w:bottom w:type="dxa" w:w="70"/>
+              <w:right w:type="dxa" w:w="120"/>
+            </w:tcMar>
+            <w:vAlign w:val="center"/>
+          </w:tcPr>
+          <w:p>
+            <w:r>
+              <w:rPr>
+                <w:rFonts w:ascii="News Gothic MT" w:cs="News Gothic MT" w:eastAsia="News Gothic MT" w:hAnsi="News Gothic MT"/>
+                <w:b w:val="false"/>
+                <w:bCs w:val="false"/>
+                <w:i w:val="false"/>
+                <w:iCs w:val="false"/>
+                <w:color w:val="1A1A2E"/>
+                <w:sz w:val="19"/>
+                <w:szCs w:val="19"/>
+              </w:rPr>
+              <w:t xml:space="preserve">J</w:t>
+            </w:r>
+          </w:p>
+        </w:tc>
+        <w:tc>
+          <w:tcPr>
+            <w:tcW w:type="dxa" w:w="1000"/>
+            <w:shd w:fill="FFFFFF" w:color="auto" w:val="clear"/>
+            <w:tcMar>
+              <w:top w:type="dxa" w:w="70"/>
+              <w:left w:type="dxa" w:w="120"/>
+              <w:bottom w:type="dxa" w:w="70"/>
+              <w:right w:type="dxa" w:w="120"/>
+            </w:tcMar>
+            <w:vAlign w:val="center"/>
+          </w:tcPr>
+          <w:p>
+            <w:r>
+              <w:rPr>
+                <w:rFonts w:ascii="News Gothic MT" w:cs="News Gothic MT" w:eastAsia="News Gothic MT" w:hAnsi="News Gothic MT"/>
+                <w:b w:val="false"/>
+                <w:bCs w:val="false"/>
+                <w:i w:val="false"/>
+                <w:iCs w:val="false"/>
+                <w:color w:val="1A1A2E"/>
+                <w:sz w:val="19"/>
+                <w:szCs w:val="19"/>
+              </w:rPr>
+              <w:t xml:space="preserve">74</w:t>
+            </w:r>
+          </w:p>
+        </w:tc>
+        <w:tc>
+          <w:tcPr>
+            <w:tcW w:type="dxa" w:w="1200"/>
+            <w:shd w:fill="FFFFFF" w:color="auto" w:val="clear"/>
+            <w:tcMar>
+              <w:top w:type="dxa" w:w="70"/>
+              <w:left w:type="dxa" w:w="120"/>
+              <w:bottom w:type="dxa" w:w="70"/>
+              <w:right w:type="dxa" w:w="120"/>
+            </w:tcMar>
+            <w:vAlign w:val="center"/>
+          </w:tcPr>
+          <w:p>
+            <w:r>
+              <w:rPr>
+                <w:rFonts w:ascii="News Gothic MT" w:cs="News Gothic MT" w:eastAsia="News Gothic MT" w:hAnsi="News Gothic MT"/>
+                <w:b w:val="false"/>
+                <w:bCs w:val="false"/>
+                <w:i w:val="false"/>
+                <w:iCs w:val="false"/>
+                <w:color w:val="1A1A2E"/>
+                <w:sz w:val="19"/>
+                <w:szCs w:val="19"/>
+              </w:rPr>
+              <w:t xml:space="preserve">Q</w:t>
+            </w:r>
+          </w:p>
+        </w:tc>
+        <w:tc>
+          <w:tcPr>
+            <w:tcW w:type="dxa" w:w="1000"/>
+            <w:shd w:fill="FFFFFF" w:color="auto" w:val="clear"/>
+            <w:tcMar>
+              <w:top w:type="dxa" w:w="70"/>
+              <w:left w:type="dxa" w:w="120"/>
+              <w:bottom w:type="dxa" w:w="70"/>
+              <w:right w:type="dxa" w:w="120"/>
+            </w:tcMar>
+            <w:vAlign w:val="center"/>
+          </w:tcPr>
+          <w:p>
+            <w:r>
+              <w:rPr>
+                <w:rFonts w:ascii="News Gothic MT" w:cs="News Gothic MT" w:eastAsia="News Gothic MT" w:hAnsi="News Gothic MT"/>
+                <w:b w:val="false"/>
+                <w:bCs w:val="false"/>
+                <w:i w:val="false"/>
+                <w:iCs w:val="false"/>
+                <w:color w:val="1A1A2E"/>
+                <w:sz w:val="19"/>
+                <w:szCs w:val="19"/>
+              </w:rPr>
+              <w:t xml:space="preserve">81</w:t>
+            </w:r>
+          </w:p>
+        </w:tc>
+        <w:tc>
+          <w:tcPr>
+            <w:tcW w:type="dxa" w:w="1200"/>
+            <w:shd w:fill="FFFFFF" w:color="auto" w:val="clear"/>
+            <w:tcMar>
+              <w:top w:type="dxa" w:w="70"/>
+              <w:left w:type="dxa" w:w="120"/>
+              <w:bottom w:type="dxa" w:w="70"/>
+              <w:right w:type="dxa" w:w="120"/>
+            </w:tcMar>
+            <w:vAlign w:val="center"/>
+          </w:tcPr>
+          <w:p>
+            <w:r>
+              <w:rPr>
+                <w:rFonts w:ascii="News Gothic MT" w:cs="News Gothic MT" w:eastAsia="News Gothic MT" w:hAnsi="News Gothic MT"/>
+                <w:b w:val="false"/>
+                <w:bCs w:val="false"/>
+                <w:i w:val="false"/>
+                <w:iCs w:val="false"/>
+                <w:color w:val="1A1A2E"/>
+                <w:sz w:val="19"/>
+                <w:szCs w:val="19"/>
+              </w:rPr>
+              <w:t xml:space="preserve">X</w:t>
+            </w:r>
+          </w:p>
+        </w:tc>
+        <w:tc>
+          <w:tcPr>
+            <w:tcW w:type="dxa" w:w="1038"/>
+            <w:shd w:fill="FFFFFF" w:color="auto" w:val="clear"/>
+            <w:tcMar>
+              <w:top w:type="dxa" w:w="70"/>
+              <w:left w:type="dxa" w:w="120"/>
+              <w:bottom w:type="dxa" w:w="70"/>
+              <w:right w:type="dxa" w:w="120"/>
+            </w:tcMar>
+            <w:vAlign w:val="center"/>
+          </w:tcPr>
+          <w:p>
+            <w:r>
+              <w:rPr>
+                <w:rFonts w:ascii="News Gothic MT" w:cs="News Gothic MT" w:eastAsia="News Gothic MT" w:hAnsi="News Gothic MT"/>
+                <w:b w:val="false"/>
+                <w:bCs w:val="false"/>
+                <w:i w:val="false"/>
+                <w:iCs w:val="false"/>
+                <w:color w:val="1A1A2E"/>
+                <w:sz w:val="19"/>
+                <w:szCs w:val="19"/>
+              </w:rPr>
+              <w:t xml:space="preserve">88</w:t>
+            </w:r>
+          </w:p>
+        </w:tc>
+      </w:tr>
+      <w:tr>
+        <w:tc>
+          <w:tcPr>
+            <w:tcW w:type="dxa" w:w="1200"/>
+            <w:shd w:fill="EEF1F8" w:color="auto" w:val="clear"/>
+            <w:tcMar>
+              <w:top w:type="dxa" w:w="70"/>
+              <w:left w:type="dxa" w:w="120"/>
+              <w:bottom w:type="dxa" w:w="70"/>
+              <w:right w:type="dxa" w:w="120"/>
+            </w:tcMar>
+            <w:vAlign w:val="center"/>
+          </w:tcPr>
+          <w:p>
+            <w:r>
+              <w:rPr>
+                <w:rFonts w:ascii="News Gothic MT" w:cs="News Gothic MT" w:eastAsia="News Gothic MT" w:hAnsi="News Gothic MT"/>
+                <w:b w:val="false"/>
+                <w:bCs w:val="false"/>
+                <w:i w:val="false"/>
+                <w:iCs w:val="false"/>
+                <w:color w:val="1A1A2E"/>
+                <w:sz w:val="19"/>
+                <w:szCs w:val="19"/>
+              </w:rPr>
+              <w:t xml:space="preserve">D</w:t>
+            </w:r>
+          </w:p>
+        </w:tc>
+        <w:tc>
+          <w:tcPr>
+            <w:tcW w:type="dxa" w:w="1000"/>
+            <w:shd w:fill="EEF1F8" w:color="auto" w:val="clear"/>
+            <w:tcMar>
+              <w:top w:type="dxa" w:w="70"/>
+              <w:left w:type="dxa" w:w="120"/>
+              <w:bottom w:type="dxa" w:w="70"/>
+              <w:right w:type="dxa" w:w="120"/>
+            </w:tcMar>
+            <w:vAlign w:val="center"/>
+          </w:tcPr>
+          <w:p>
+            <w:r>
+              <w:rPr>
+                <w:rFonts w:ascii="News Gothic MT" w:cs="News Gothic MT" w:eastAsia="News Gothic MT" w:hAnsi="News Gothic MT"/>
+                <w:b w:val="false"/>
+                <w:bCs w:val="false"/>
+                <w:i w:val="false"/>
+                <w:iCs w:val="false"/>
+                <w:color w:val="1A1A2E"/>
+                <w:sz w:val="19"/>
+                <w:szCs w:val="19"/>
+              </w:rPr>
+              <w:t xml:space="preserve">68</w:t>
+            </w:r>
+          </w:p>
+        </w:tc>
+        <w:tc>
+          <w:tcPr>
+            <w:tcW w:type="dxa" w:w="1200"/>
+            <w:shd w:fill="EEF1F8" w:color="auto" w:val="clear"/>
+            <w:tcMar>
+              <w:top w:type="dxa" w:w="70"/>
+              <w:left w:type="dxa" w:w="120"/>
+              <w:bottom w:type="dxa" w:w="70"/>
+              <w:right w:type="dxa" w:w="120"/>
+            </w:tcMar>
+            <w:vAlign w:val="center"/>
+          </w:tcPr>
+          <w:p>
+            <w:r>
+              <w:rPr>
+                <w:rFonts w:ascii="News Gothic MT" w:cs="News Gothic MT" w:eastAsia="News Gothic MT" w:hAnsi="News Gothic MT"/>
+                <w:b w:val="false"/>
+                <w:bCs w:val="false"/>
+                <w:i w:val="false"/>
+                <w:iCs w:val="false"/>
+                <w:color w:val="1A1A2E"/>
+                <w:sz w:val="19"/>
+                <w:szCs w:val="19"/>
+              </w:rPr>
+              <w:t xml:space="preserve">K</w:t>
+            </w:r>
+          </w:p>
+        </w:tc>
+        <w:tc>
+          <w:tcPr>
+            <w:tcW w:type="dxa" w:w="1000"/>
+            <w:shd w:fill="EEF1F8" w:color="auto" w:val="clear"/>
+            <w:tcMar>
+              <w:top w:type="dxa" w:w="70"/>
+              <w:left w:type="dxa" w:w="120"/>
+              <w:bottom w:type="dxa" w:w="70"/>
+              <w:right w:type="dxa" w:w="120"/>
+            </w:tcMar>
+            <w:vAlign w:val="center"/>
+          </w:tcPr>
+          <w:p>
+            <w:r>
+              <w:rPr>
+                <w:rFonts w:ascii="News Gothic MT" w:cs="News Gothic MT" w:eastAsia="News Gothic MT" w:hAnsi="News Gothic MT"/>
+                <w:b w:val="false"/>
+                <w:bCs w:val="false"/>
+                <w:i w:val="false"/>
+                <w:iCs w:val="false"/>
+                <w:color w:val="1A1A2E"/>
+                <w:sz w:val="19"/>
+                <w:szCs w:val="19"/>
+              </w:rPr>
+              <w:t xml:space="preserve">75</w:t>
+            </w:r>
+          </w:p>
+        </w:tc>
+        <w:tc>
+          <w:tcPr>
+            <w:tcW w:type="dxa" w:w="1200"/>
+            <w:shd w:fill="EEF1F8" w:color="auto" w:val="clear"/>
+            <w:tcMar>
+              <w:top w:type="dxa" w:w="70"/>
+              <w:left w:type="dxa" w:w="120"/>
+              <w:bottom w:type="dxa" w:w="70"/>
+              <w:right w:type="dxa" w:w="120"/>
+            </w:tcMar>
+            <w:vAlign w:val="center"/>
+          </w:tcPr>
+          <w:p>
+            <w:r>
+              <w:rPr>
+                <w:rFonts w:ascii="News Gothic MT" w:cs="News Gothic MT" w:eastAsia="News Gothic MT" w:hAnsi="News Gothic MT"/>
+                <w:b w:val="false"/>
+                <w:bCs w:val="false"/>
+                <w:i w:val="false"/>
+                <w:iCs w:val="false"/>
+                <w:color w:val="1A1A2E"/>
+                <w:sz w:val="19"/>
+                <w:szCs w:val="19"/>
+              </w:rPr>
+              <w:t xml:space="preserve">R</w:t>
+            </w:r>
+          </w:p>
+        </w:tc>
+        <w:tc>
+          <w:tcPr>
+            <w:tcW w:type="dxa" w:w="1000"/>
+            <w:shd w:fill="EEF1F8" w:color="auto" w:val="clear"/>
+            <w:tcMar>
+              <w:top w:type="dxa" w:w="70"/>
+              <w:left w:type="dxa" w:w="120"/>
+              <w:bottom w:type="dxa" w:w="70"/>
+              <w:right w:type="dxa" w:w="120"/>
+            </w:tcMar>
+            <w:vAlign w:val="center"/>
+          </w:tcPr>
+          <w:p>
+            <w:r>
+              <w:rPr>
+                <w:rFonts w:ascii="News Gothic MT" w:cs="News Gothic MT" w:eastAsia="News Gothic MT" w:hAnsi="News Gothic MT"/>
+                <w:b w:val="false"/>
+                <w:bCs w:val="false"/>
+                <w:i w:val="false"/>
+                <w:iCs w:val="false"/>
+                <w:color w:val="1A1A2E"/>
+                <w:sz w:val="19"/>
+                <w:szCs w:val="19"/>
+              </w:rPr>
+              <w:t xml:space="preserve">82</w:t>
+            </w:r>
+          </w:p>
+        </w:tc>
+        <w:tc>
+          <w:tcPr>
+            <w:tcW w:type="dxa" w:w="1200"/>
+            <w:shd w:fill="EEF1F8" w:color="auto" w:val="clear"/>
+            <w:tcMar>
+              <w:top w:type="dxa" w:w="70"/>
+              <w:left w:type="dxa" w:w="120"/>
+              <w:bottom w:type="dxa" w:w="70"/>
+              <w:right w:type="dxa" w:w="120"/>
+            </w:tcMar>
+            <w:vAlign w:val="center"/>
+          </w:tcPr>
+          <w:p>
+            <w:r>
+              <w:rPr>
+                <w:rFonts w:ascii="News Gothic MT" w:cs="News Gothic MT" w:eastAsia="News Gothic MT" w:hAnsi="News Gothic MT"/>
+                <w:b w:val="false"/>
+                <w:bCs w:val="false"/>
+                <w:i w:val="false"/>
+                <w:iCs w:val="false"/>
+                <w:color w:val="1A1A2E"/>
+                <w:sz w:val="19"/>
+                <w:szCs w:val="19"/>
+              </w:rPr>
+              <w:t xml:space="preserve">Y</w:t>
+            </w:r>
+          </w:p>
+        </w:tc>
+        <w:tc>
+          <w:tcPr>
+            <w:tcW w:type="dxa" w:w="1038"/>
+            <w:shd w:fill="EEF1F8" w:color="auto" w:val="clear"/>
+            <w:tcMar>
+              <w:top w:type="dxa" w:w="70"/>
+              <w:left w:type="dxa" w:w="120"/>
+              <w:bottom w:type="dxa" w:w="70"/>
+              <w:right w:type="dxa" w:w="120"/>
+            </w:tcMar>
+            <w:vAlign w:val="center"/>
+          </w:tcPr>
+          <w:p>
+            <w:r>
+              <w:rPr>
+                <w:rFonts w:ascii="News Gothic MT" w:cs="News Gothic MT" w:eastAsia="News Gothic MT" w:hAnsi="News Gothic MT"/>
+                <w:b w:val="false"/>
+                <w:bCs w:val="false"/>
+                <w:i w:val="false"/>
+                <w:iCs w:val="false"/>
+                <w:color w:val="1A1A2E"/>
+                <w:sz w:val="19"/>
+                <w:szCs w:val="19"/>
+              </w:rPr>
+              <w:t xml:space="preserve">89</w:t>
+            </w:r>
+          </w:p>
+        </w:tc>
+      </w:tr>
+      <w:tr>
+        <w:tc>
+          <w:tcPr>
+            <w:tcW w:type="dxa" w:w="1200"/>
+            <w:shd w:fill="FFFFFF" w:color="auto" w:val="clear"/>
+            <w:tcMar>
+              <w:top w:type="dxa" w:w="70"/>
+              <w:left w:type="dxa" w:w="120"/>
+              <w:bottom w:type="dxa" w:w="70"/>
+              <w:right w:type="dxa" w:w="120"/>
+            </w:tcMar>
+            <w:vAlign w:val="center"/>
+          </w:tcPr>
+          <w:p>
+            <w:r>
+              <w:rPr>
+                <w:rFonts w:ascii="News Gothic MT" w:cs="News Gothic MT" w:eastAsia="News Gothic MT" w:hAnsi="News Gothic MT"/>
+                <w:b w:val="false"/>
+                <w:bCs w:val="false"/>
+                <w:i w:val="false"/>
+                <w:iCs w:val="false"/>
+                <w:color w:val="1A1A2E"/>
+                <w:sz w:val="19"/>
+                <w:szCs w:val="19"/>
+              </w:rPr>
+              <w:t xml:space="preserve">E</w:t>
+            </w:r>
+          </w:p>
+        </w:tc>
+        <w:tc>
+          <w:tcPr>
+            <w:tcW w:type="dxa" w:w="1000"/>
+            <w:shd w:fill="FFFFFF" w:color="auto" w:val="clear"/>
+            <w:tcMar>
+              <w:top w:type="dxa" w:w="70"/>
+              <w:left w:type="dxa" w:w="120"/>
+              <w:bottom w:type="dxa" w:w="70"/>
+              <w:right w:type="dxa" w:w="120"/>
+            </w:tcMar>
+            <w:vAlign w:val="center"/>
+          </w:tcPr>
+          <w:p>
+            <w:r>
+              <w:rPr>
+                <w:rFonts w:ascii="News Gothic MT" w:cs="News Gothic MT" w:eastAsia="News Gothic MT" w:hAnsi="News Gothic MT"/>
+                <w:b w:val="false"/>
+                <w:bCs w:val="false"/>
+                <w:i w:val="false"/>
+                <w:iCs w:val="false"/>
+                <w:color w:val="1A1A2E"/>
+                <w:sz w:val="19"/>
+                <w:szCs w:val="19"/>
+              </w:rPr>
+              <w:t xml:space="preserve">69</w:t>
+            </w:r>
+          </w:p>
+        </w:tc>
+        <w:tc>
+          <w:tcPr>
+            <w:tcW w:type="dxa" w:w="1200"/>
+            <w:shd w:fill="FFFFFF" w:color="auto" w:val="clear"/>
+            <w:tcMar>
+              <w:top w:type="dxa" w:w="70"/>
+              <w:left w:type="dxa" w:w="120"/>
+              <w:bottom w:type="dxa" w:w="70"/>
+              <w:right w:type="dxa" w:w="120"/>
+            </w:tcMar>
+            <w:vAlign w:val="center"/>
+          </w:tcPr>
+          <w:p>
+            <w:r>
+              <w:rPr>
+                <w:rFonts w:ascii="News Gothic MT" w:cs="News Gothic MT" w:eastAsia="News Gothic MT" w:hAnsi="News Gothic MT"/>
+                <w:b w:val="false"/>
+                <w:bCs w:val="false"/>
+                <w:i w:val="false"/>
+                <w:iCs w:val="false"/>
+                <w:color w:val="1A1A2E"/>
+                <w:sz w:val="19"/>
+                <w:szCs w:val="19"/>
+              </w:rPr>
+              <w:t xml:space="preserve">L</w:t>
+            </w:r>
+          </w:p>
+        </w:tc>
+        <w:tc>
+          <w:tcPr>
+            <w:tcW w:type="dxa" w:w="1000"/>
+            <w:shd w:fill="FFFFFF" w:color="auto" w:val="clear"/>
+            <w:tcMar>
+              <w:top w:type="dxa" w:w="70"/>
+              <w:left w:type="dxa" w:w="120"/>
+              <w:bottom w:type="dxa" w:w="70"/>
+              <w:right w:type="dxa" w:w="120"/>
+            </w:tcMar>
+            <w:vAlign w:val="center"/>
+          </w:tcPr>
+          <w:p>
+            <w:r>
+              <w:rPr>
+                <w:rFonts w:ascii="News Gothic MT" w:cs="News Gothic MT" w:eastAsia="News Gothic MT" w:hAnsi="News Gothic MT"/>
+                <w:b w:val="false"/>
+                <w:bCs w:val="false"/>
+                <w:i w:val="false"/>
+                <w:iCs w:val="false"/>
+                <w:color w:val="1A1A2E"/>
+                <w:sz w:val="19"/>
+                <w:szCs w:val="19"/>
+              </w:rPr>
+              <w:t xml:space="preserve">76</w:t>
+            </w:r>
+          </w:p>
+        </w:tc>
+        <w:tc>
+          <w:tcPr>
+            <w:tcW w:type="dxa" w:w="1200"/>
+            <w:shd w:fill="FFFFFF" w:color="auto" w:val="clear"/>
+            <w:tcMar>
+              <w:top w:type="dxa" w:w="70"/>
+              <w:left w:type="dxa" w:w="120"/>
+              <w:bottom w:type="dxa" w:w="70"/>
+              <w:right w:type="dxa" w:w="120"/>
+            </w:tcMar>
+            <w:vAlign w:val="center"/>
+          </w:tcPr>
+          <w:p>
+            <w:r>
+              <w:rPr>
+                <w:rFonts w:ascii="News Gothic MT" w:cs="News Gothic MT" w:eastAsia="News Gothic MT" w:hAnsi="News Gothic MT"/>
+                <w:b w:val="false"/>
+                <w:bCs w:val="false"/>
+                <w:i w:val="false"/>
+                <w:iCs w:val="false"/>
+                <w:color w:val="1A1A2E"/>
+                <w:sz w:val="19"/>
+                <w:szCs w:val="19"/>
+              </w:rPr>
+              <w:t xml:space="preserve">S</w:t>
+            </w:r>
+          </w:p>
+        </w:tc>
+        <w:tc>
+          <w:tcPr>
+            <w:tcW w:type="dxa" w:w="1000"/>
+            <w:shd w:fill="FFFFFF" w:color="auto" w:val="clear"/>
+            <w:tcMar>
+              <w:top w:type="dxa" w:w="70"/>
+              <w:left w:type="dxa" w:w="120"/>
+              <w:bottom w:type="dxa" w:w="70"/>
+              <w:right w:type="dxa" w:w="120"/>
+            </w:tcMar>
+            <w:vAlign w:val="center"/>
+          </w:tcPr>
+          <w:p>
+            <w:r>
+              <w:rPr>
+                <w:rFonts w:ascii="News Gothic MT" w:cs="News Gothic MT" w:eastAsia="News Gothic MT" w:hAnsi="News Gothic MT"/>
+                <w:b w:val="false"/>
+                <w:bCs w:val="false"/>
+                <w:i w:val="false"/>
+                <w:iCs w:val="false"/>
+                <w:color w:val="1A1A2E"/>
+                <w:sz w:val="19"/>
+                <w:szCs w:val="19"/>
+              </w:rPr>
+              <w:t xml:space="preserve">83</w:t>
+            </w:r>
+          </w:p>
+        </w:tc>
+        <w:tc>
+          <w:tcPr>
+            <w:tcW w:type="dxa" w:w="1200"/>
+            <w:shd w:fill="FFFFFF" w:color="auto" w:val="clear"/>
+            <w:tcMar>
+              <w:top w:type="dxa" w:w="70"/>
+              <w:left w:type="dxa" w:w="120"/>
+              <w:bottom w:type="dxa" w:w="70"/>
+              <w:right w:type="dxa" w:w="120"/>
+            </w:tcMar>
+            <w:vAlign w:val="center"/>
+          </w:tcPr>
+          <w:p>
+            <w:r>
+              <w:rPr>
+                <w:rFonts w:ascii="News Gothic MT" w:cs="News Gothic MT" w:eastAsia="News Gothic MT" w:hAnsi="News Gothic MT"/>
+                <w:b w:val="false"/>
+                <w:bCs w:val="false"/>
+                <w:i w:val="false"/>
+                <w:iCs w:val="false"/>
+                <w:color w:val="1A1A2E"/>
+                <w:sz w:val="19"/>
+                <w:szCs w:val="19"/>
+              </w:rPr>
+              <w:t xml:space="preserve">Z</w:t>
+            </w:r>
+          </w:p>
+        </w:tc>
+        <w:tc>
+          <w:tcPr>
+            <w:tcW w:type="dxa" w:w="1038"/>
+            <w:shd w:fill="FFFFFF" w:color="auto" w:val="clear"/>
+            <w:tcMar>
+              <w:top w:type="dxa" w:w="70"/>
+              <w:left w:type="dxa" w:w="120"/>
+              <w:bottom w:type="dxa" w:w="70"/>
+              <w:right w:type="dxa" w:w="120"/>
+            </w:tcMar>
+            <w:vAlign w:val="center"/>
+          </w:tcPr>
+          <w:p>
+            <w:r>
+              <w:rPr>
+                <w:rFonts w:ascii="News Gothic MT" w:cs="News Gothic MT" w:eastAsia="News Gothic MT" w:hAnsi="News Gothic MT"/>
+                <w:b w:val="false"/>
+                <w:bCs w:val="false"/>
+                <w:i w:val="false"/>
+                <w:iCs w:val="false"/>
+                <w:color w:val="1A1A2E"/>
+                <w:sz w:val="19"/>
+                <w:szCs w:val="19"/>
+              </w:rPr>
+              <w:t xml:space="preserve">90</w:t>
+            </w:r>
+          </w:p>
+        </w:tc>
+      </w:tr>
+      <w:tr>
+        <w:tc>
+          <w:tcPr>
+            <w:tcW w:type="dxa" w:w="1200"/>
+            <w:shd w:fill="EEF1F8" w:color="auto" w:val="clear"/>
+            <w:tcMar>
+              <w:top w:type="dxa" w:w="70"/>
+              <w:left w:type="dxa" w:w="120"/>
+              <w:bottom w:type="dxa" w:w="70"/>
+              <w:right w:type="dxa" w:w="120"/>
+            </w:tcMar>
+            <w:vAlign w:val="center"/>
+          </w:tcPr>
+          <w:p>
+            <w:r>
+              <w:rPr>
+                <w:rFonts w:ascii="News Gothic MT" w:cs="News Gothic MT" w:eastAsia="News Gothic MT" w:hAnsi="News Gothic MT"/>
+                <w:b w:val="false"/>
+                <w:bCs w:val="false"/>
+                <w:i w:val="false"/>
+                <w:iCs w:val="false"/>
+                <w:color w:val="1A1A2E"/>
+                <w:sz w:val="19"/>
+                <w:szCs w:val="19"/>
+              </w:rPr>
+              <w:t xml:space="preserve">F</w:t>
+            </w:r>
+          </w:p>
+        </w:tc>
+        <w:tc>
+          <w:tcPr>
+            <w:tcW w:type="dxa" w:w="1000"/>
+            <w:shd w:fill="EEF1F8" w:color="auto" w:val="clear"/>
+            <w:tcMar>
+              <w:top w:type="dxa" w:w="70"/>
+              <w:left w:type="dxa" w:w="120"/>
+              <w:bottom w:type="dxa" w:w="70"/>
+              <w:right w:type="dxa" w:w="120"/>
+            </w:tcMar>
+            <w:vAlign w:val="center"/>
+          </w:tcPr>
+          <w:p>
+            <w:r>
+              <w:rPr>
+                <w:rFonts w:ascii="News Gothic MT" w:cs="News Gothic MT" w:eastAsia="News Gothic MT" w:hAnsi="News Gothic MT"/>
+                <w:b w:val="false"/>
+                <w:bCs w:val="false"/>
+                <w:i w:val="false"/>
+                <w:iCs w:val="false"/>
+                <w:color w:val="1A1A2E"/>
+                <w:sz w:val="19"/>
+                <w:szCs w:val="19"/>
+              </w:rPr>
+              <w:t xml:space="preserve">70</w:t>
+            </w:r>
+          </w:p>
+        </w:tc>
+        <w:tc>
+          <w:tcPr>
+            <w:tcW w:type="dxa" w:w="1200"/>
+            <w:shd w:fill="EEF1F8" w:color="auto" w:val="clear"/>
+            <w:tcMar>
+              <w:top w:type="dxa" w:w="70"/>
+              <w:left w:type="dxa" w:w="120"/>
+              <w:bottom w:type="dxa" w:w="70"/>
+              <w:right w:type="dxa" w:w="120"/>
+            </w:tcMar>
+            <w:vAlign w:val="center"/>
+          </w:tcPr>
+          <w:p>
+            <w:r>
+              <w:rPr>
+                <w:rFonts w:ascii="News Gothic MT" w:cs="News Gothic MT" w:eastAsia="News Gothic MT" w:hAnsi="News Gothic MT"/>
+                <w:b w:val="false"/>
+                <w:bCs w:val="false"/>
+                <w:i w:val="false"/>
+                <w:iCs w:val="false"/>
+                <w:color w:val="1A1A2E"/>
+                <w:sz w:val="19"/>
+                <w:szCs w:val="19"/>
+              </w:rPr>
+              <w:t xml:space="preserve">M</w:t>
+            </w:r>
+          </w:p>
+        </w:tc>
+        <w:tc>
+          <w:tcPr>
+            <w:tcW w:type="dxa" w:w="1000"/>
+            <w:shd w:fill="EEF1F8" w:color="auto" w:val="clear"/>
+            <w:tcMar>
+              <w:top w:type="dxa" w:w="70"/>
+              <w:left w:type="dxa" w:w="120"/>
+              <w:bottom w:type="dxa" w:w="70"/>
+              <w:right w:type="dxa" w:w="120"/>
+            </w:tcMar>
+            <w:vAlign w:val="center"/>
+          </w:tcPr>
+          <w:p>
+            <w:r>
+              <w:rPr>
+                <w:rFonts w:ascii="News Gothic MT" w:cs="News Gothic MT" w:eastAsia="News Gothic MT" w:hAnsi="News Gothic MT"/>
+                <w:b w:val="false"/>
+                <w:bCs w:val="false"/>
+                <w:i w:val="false"/>
+                <w:iCs w:val="false"/>
+                <w:color w:val="1A1A2E"/>
+                <w:sz w:val="19"/>
+                <w:szCs w:val="19"/>
+              </w:rPr>
+              <w:t xml:space="preserve">77</w:t>
+            </w:r>
+          </w:p>
+        </w:tc>
+        <w:tc>
+          <w:tcPr>
+            <w:tcW w:type="dxa" w:w="1200"/>
+            <w:shd w:fill="EEF1F8" w:color="auto" w:val="clear"/>
+            <w:tcMar>
+              <w:top w:type="dxa" w:w="70"/>
+              <w:left w:type="dxa" w:w="120"/>
+              <w:bottom w:type="dxa" w:w="70"/>
+              <w:right w:type="dxa" w:w="120"/>
+            </w:tcMar>
+            <w:vAlign w:val="center"/>
+          </w:tcPr>
+          <w:p>
+            <w:r>
+              <w:rPr>
+                <w:rFonts w:ascii="News Gothic MT" w:cs="News Gothic MT" w:eastAsia="News Gothic MT" w:hAnsi="News Gothic MT"/>
+                <w:b w:val="false"/>
+                <w:bCs w:val="false"/>
+                <w:i w:val="false"/>
+                <w:iCs w:val="false"/>
+                <w:color w:val="1A1A2E"/>
+                <w:sz w:val="19"/>
+                <w:szCs w:val="19"/>
+              </w:rPr>
+              <w:t xml:space="preserve">T</w:t>
+            </w:r>
+          </w:p>
+        </w:tc>
+        <w:tc>
+          <w:tcPr>
+            <w:tcW w:type="dxa" w:w="1000"/>
+            <w:shd w:fill="EEF1F8" w:color="auto" w:val="clear"/>
+            <w:tcMar>
+              <w:top w:type="dxa" w:w="70"/>
+              <w:left w:type="dxa" w:w="120"/>
+              <w:bottom w:type="dxa" w:w="70"/>
+              <w:right w:type="dxa" w:w="120"/>
+            </w:tcMar>
+            <w:vAlign w:val="center"/>
+          </w:tcPr>
+          <w:p>
+            <w:r>
+              <w:rPr>
+                <w:rFonts w:ascii="News Gothic MT" w:cs="News Gothic MT" w:eastAsia="News Gothic MT" w:hAnsi="News Gothic MT"/>
+                <w:b w:val="false"/>
+                <w:bCs w:val="false"/>
+                <w:i w:val="false"/>
+                <w:iCs w:val="false"/>
+                <w:color w:val="1A1A2E"/>
+                <w:sz w:val="19"/>
+                <w:szCs w:val="19"/>
+              </w:rPr>
+              <w:t xml:space="preserve">84</w:t>
+            </w:r>
+          </w:p>
+        </w:tc>
+        <w:tc>
+          <w:tcPr>
+            <w:tcW w:type="dxa" w:w="1200"/>
+            <w:shd w:fill="EEF1F8" w:color="auto" w:val="clear"/>
+            <w:tcMar>
+              <w:top w:type="dxa" w:w="70"/>
+              <w:left w:type="dxa" w:w="120"/>
+              <w:bottom w:type="dxa" w:w="70"/>
+              <w:right w:type="dxa" w:w="120"/>
+            </w:tcMar>
+            <w:vAlign w:val="center"/>
+          </w:tcPr>
+          <w:p/>
+        </w:tc>
+        <w:tc>
+          <w:tcPr>
+            <w:tcW w:type="dxa" w:w="1038"/>
+            <w:shd w:fill="EEF1F8" w:color="auto" w:val="clear"/>
+            <w:tcMar>
+              <w:top w:type="dxa" w:w="70"/>
+              <w:left w:type="dxa" w:w="120"/>
+              <w:bottom w:type="dxa" w:w="70"/>
+              <w:right w:type="dxa" w:w="120"/>
+            </w:tcMar>
+            <w:vAlign w:val="center"/>
+          </w:tcPr>
+          <w:p/>
+        </w:tc>
+      </w:tr>
+      <w:tr>
+        <w:tc>
+          <w:tcPr>
+            <w:tcW w:type="dxa" w:w="1200"/>
+            <w:shd w:fill="FFFFFF" w:color="auto" w:val="clear"/>
+            <w:tcMar>
+              <w:top w:type="dxa" w:w="70"/>
+              <w:left w:type="dxa" w:w="120"/>
+              <w:bottom w:type="dxa" w:w="70"/>
+              <w:right w:type="dxa" w:w="120"/>
+            </w:tcMar>
+            <w:vAlign w:val="center"/>
+          </w:tcPr>
+          <w:p>
+            <w:r>
+              <w:rPr>
+                <w:rFonts w:ascii="News Gothic MT" w:cs="News Gothic MT" w:eastAsia="News Gothic MT" w:hAnsi="News Gothic MT"/>
+                <w:b w:val="false"/>
+                <w:bCs w:val="false"/>
+                <w:i w:val="false"/>
+                <w:iCs w:val="false"/>
+                <w:color w:val="1A1A2E"/>
+                <w:sz w:val="19"/>
+                <w:szCs w:val="19"/>
+              </w:rPr>
+              <w:t xml:space="preserve">G</w:t>
+            </w:r>
+          </w:p>
+        </w:tc>
+        <w:tc>
+          <w:tcPr>
+            <w:tcW w:type="dxa" w:w="1000"/>
+            <w:shd w:fill="FFFFFF" w:color="auto" w:val="clear"/>
+            <w:tcMar>
+              <w:top w:type="dxa" w:w="70"/>
+              <w:left w:type="dxa" w:w="120"/>
+              <w:bottom w:type="dxa" w:w="70"/>
+              <w:right w:type="dxa" w:w="120"/>
+            </w:tcMar>
+            <w:vAlign w:val="center"/>
+          </w:tcPr>
+          <w:p>
+            <w:r>
+              <w:rPr>
+                <w:rFonts w:ascii="News Gothic MT" w:cs="News Gothic MT" w:eastAsia="News Gothic MT" w:hAnsi="News Gothic MT"/>
+                <w:b w:val="false"/>
+                <w:bCs w:val="false"/>
+                <w:i w:val="false"/>
+                <w:iCs w:val="false"/>
+                <w:color w:val="1A1A2E"/>
+                <w:sz w:val="19"/>
+                <w:szCs w:val="19"/>
+              </w:rPr>
+              <w:t xml:space="preserve">71</w:t>
+            </w:r>
+          </w:p>
+        </w:tc>
+        <w:tc>
+          <w:tcPr>
+            <w:tcW w:type="dxa" w:w="1200"/>
+            <w:shd w:fill="FFFFFF" w:color="auto" w:val="clear"/>
+            <w:tcMar>
+              <w:top w:type="dxa" w:w="70"/>
+              <w:left w:type="dxa" w:w="120"/>
+              <w:bottom w:type="dxa" w:w="70"/>
+              <w:right w:type="dxa" w:w="120"/>
+            </w:tcMar>
+            <w:vAlign w:val="center"/>
+          </w:tcPr>
+          <w:p>
+            <w:r>
+              <w:rPr>
+                <w:rFonts w:ascii="News Gothic MT" w:cs="News Gothic MT" w:eastAsia="News Gothic MT" w:hAnsi="News Gothic MT"/>
+                <w:b w:val="false"/>
+                <w:bCs w:val="false"/>
+                <w:i w:val="false"/>
+                <w:iCs w:val="false"/>
+                <w:color w:val="1A1A2E"/>
+                <w:sz w:val="19"/>
+                <w:szCs w:val="19"/>
+              </w:rPr>
+              <w:t xml:space="preserve">N</w:t>
+            </w:r>
+          </w:p>
+        </w:tc>
+        <w:tc>
+          <w:tcPr>
+            <w:tcW w:type="dxa" w:w="1000"/>
+            <w:shd w:fill="FFFFFF" w:color="auto" w:val="clear"/>
+            <w:tcMar>
+              <w:top w:type="dxa" w:w="70"/>
+              <w:left w:type="dxa" w:w="120"/>
+              <w:bottom w:type="dxa" w:w="70"/>
+              <w:right w:type="dxa" w:w="120"/>
+            </w:tcMar>
+            <w:vAlign w:val="center"/>
+          </w:tcPr>
+          <w:p>
+            <w:r>
+              <w:rPr>
+                <w:rFonts w:ascii="News Gothic MT" w:cs="News Gothic MT" w:eastAsia="News Gothic MT" w:hAnsi="News Gothic MT"/>
+                <w:b w:val="false"/>
+                <w:bCs w:val="false"/>
+                <w:i w:val="false"/>
+                <w:iCs w:val="false"/>
+                <w:color w:val="1A1A2E"/>
+                <w:sz w:val="19"/>
+                <w:szCs w:val="19"/>
+              </w:rPr>
+              <w:t xml:space="preserve">78</w:t>
+            </w:r>
+          </w:p>
+        </w:tc>
+        <w:tc>
+          <w:tcPr>
+            <w:tcW w:type="dxa" w:w="1200"/>
+            <w:shd w:fill="FFFFFF" w:color="auto" w:val="clear"/>
+            <w:tcMar>
+              <w:top w:type="dxa" w:w="70"/>
+              <w:left w:type="dxa" w:w="120"/>
+              <w:bottom w:type="dxa" w:w="70"/>
+              <w:right w:type="dxa" w:w="120"/>
+            </w:tcMar>
+            <w:vAlign w:val="center"/>
+          </w:tcPr>
+          <w:p>
+            <w:r>
+              <w:rPr>
+                <w:rFonts w:ascii="News Gothic MT" w:cs="News Gothic MT" w:eastAsia="News Gothic MT" w:hAnsi="News Gothic MT"/>
+                <w:b w:val="false"/>
+                <w:bCs w:val="false"/>
+                <w:i w:val="false"/>
+                <w:iCs w:val="false"/>
+                <w:color w:val="1A1A2E"/>
+                <w:sz w:val="19"/>
+                <w:szCs w:val="19"/>
+              </w:rPr>
+              <w:t xml:space="preserve">U</w:t>
+            </w:r>
+          </w:p>
+        </w:tc>
+        <w:tc>
+          <w:tcPr>
+            <w:tcW w:type="dxa" w:w="1000"/>
+            <w:shd w:fill="FFFFFF" w:color="auto" w:val="clear"/>
+            <w:tcMar>
+              <w:top w:type="dxa" w:w="70"/>
+              <w:left w:type="dxa" w:w="120"/>
+              <w:bottom w:type="dxa" w:w="70"/>
+              <w:right w:type="dxa" w:w="120"/>
+            </w:tcMar>
+            <w:vAlign w:val="center"/>
+          </w:tcPr>
+          <w:p>
+            <w:r>
+              <w:rPr>
+                <w:rFonts w:ascii="News Gothic MT" w:cs="News Gothic MT" w:eastAsia="News Gothic MT" w:hAnsi="News Gothic MT"/>
+                <w:b w:val="false"/>
+                <w:bCs w:val="false"/>
+                <w:i w:val="false"/>
+                <w:iCs w:val="false"/>
+                <w:color w:val="1A1A2E"/>
+                <w:sz w:val="19"/>
+                <w:szCs w:val="19"/>
+              </w:rPr>
+              <w:t xml:space="preserve">85</w:t>
+            </w:r>
+          </w:p>
+        </w:tc>
+        <w:tc>
+          <w:tcPr>
+            <w:tcW w:type="dxa" w:w="1200"/>
+            <w:shd w:fill="FFFFFF" w:color="auto" w:val="clear"/>
+            <w:tcMar>
+              <w:top w:type="dxa" w:w="70"/>
+              <w:left w:type="dxa" w:w="120"/>
+              <w:bottom w:type="dxa" w:w="70"/>
+              <w:right w:type="dxa" w:w="120"/>
+            </w:tcMar>
+            <w:vAlign w:val="center"/>
+          </w:tcPr>
+          <w:p/>
+        </w:tc>
+        <w:tc>
+          <w:tcPr>
+            <w:tcW w:type="dxa" w:w="1038"/>
+            <w:shd w:fill="FFFFFF" w:color="auto" w:val="clear"/>
+            <w:tcMar>
+              <w:top w:type="dxa" w:w="70"/>
+              <w:left w:type="dxa" w:w="120"/>
+              <w:bottom w:type="dxa" w:w="70"/>
+              <w:right w:type="dxa" w:w="120"/>
+            </w:tcMar>
+            <w:vAlign w:val="center"/>
+          </w:tcPr>
+          <w:p/>
+        </w:tc>
+      </w:tr>
+    </w:tbl>
+    <w:p>
+      <w:pPr>
+        <w:spacing w:after="120"/>
+      </w:pPr>
+    </w:p>
+    <w:p>
+      <w:pPr>
+        <w:spacing w:after="160" w:line="300"/>
+        <w:jc w:val="both"/>
+      </w:pPr>
+      <w:r>
+        <w:rPr>
+          <w:rFonts w:ascii="News Gothic MT" w:cs="News Gothic MT" w:eastAsia="News Gothic MT" w:hAnsi="News Gothic MT"/>
+          <w:b/>
+          <w:bCs/>
+          <w:color w:val="1A1A2E"/>
+          <w:sz w:val="21"/>
+          <w:szCs w:val="21"/>
+        </w:rPr>
+        <w:t xml:space="preserve">Letras minúsculas</w:t>
+      </w:r>
+    </w:p>
+    <w:tbl>
+      <w:tblPr>
+        <w:tblW w:type="dxa" w:w="8838"/>
+        <w:tblBorders>
+          <w:top w:val="single" w:color="D8DEEA" w:sz="4"/>
+          <w:left w:val="single" w:color="D8DEEA" w:sz="4"/>
+          <w:bottom w:val="single" w:color="D8DEEA" w:sz="4"/>
+          <w:right w:val="single" w:color="D8DEEA" w:sz="4"/>
+          <w:insideH w:val="single" w:color="D8DEEA" w:sz="4"/>
+          <w:insideV w:val="single" w:color="D8DEEA" w:sz="4"/>
+        </w:tblBorders>
+      </w:tblPr>
+      <w:tblGrid>
+        <w:gridCol w:w="1200"/>
+        <w:gridCol w:w="1000"/>
+        <w:gridCol w:w="1200"/>
+        <w:gridCol w:w="1000"/>
+        <w:gridCol w:w="1200"/>
+        <w:gridCol w:w="1000"/>
+        <w:gridCol w:w="1200"/>
+        <w:gridCol w:w="1038"/>
+      </w:tblGrid>
+      <w:tr>
+        <w:trPr>
+          <w:tblHeader/>
+        </w:trPr>
+        <w:tc>
+          <w:tcPr>
+            <w:tcW w:type="dxa" w:w="1200"/>
+            <w:shd w:fill="1F3864" w:color="auto" w:val="clear"/>
+            <w:tcMar>
+              <w:top w:type="dxa" w:w="80"/>
+              <w:left w:type="dxa" w:w="120"/>
+              <w:bottom w:type="dxa" w:w="80"/>
+              <w:right w:type="dxa" w:w="120"/>
+            </w:tcMar>
+            <w:vAlign w:val="center"/>
+          </w:tcPr>
+          <w:p>
+            <w:r>
+              <w:rPr>
+                <w:rFonts w:ascii="News Gothic MT" w:cs="News Gothic MT" w:eastAsia="News Gothic MT" w:hAnsi="News Gothic MT"/>
+                <w:b/>
+                <w:bCs/>
+                <w:color w:val="FFFFFF"/>
+                <w:sz w:val="19"/>
+                <w:szCs w:val="19"/>
+              </w:rPr>
+              <w:t xml:space="preserve">Letra</w:t>
+            </w:r>
+          </w:p>
+        </w:tc>
+        <w:tc>
+          <w:tcPr>
+            <w:tcW w:type="dxa" w:w="1000"/>
+            <w:shd w:fill="1F3864" w:color="auto" w:val="clear"/>
+            <w:tcMar>
+              <w:top w:type="dxa" w:w="80"/>
+              <w:left w:type="dxa" w:w="120"/>
+              <w:bottom w:type="dxa" w:w="80"/>
+              <w:right w:type="dxa" w:w="120"/>
+            </w:tcMar>
+            <w:vAlign w:val="center"/>
+          </w:tcPr>
+          <w:p>
+            <w:r>
+              <w:rPr>
+                <w:rFonts w:ascii="News Gothic MT" w:cs="News Gothic MT" w:eastAsia="News Gothic MT" w:hAnsi="News Gothic MT"/>
+                <w:b/>
+                <w:bCs/>
+                <w:color w:val="FFFFFF"/>
+                <w:sz w:val="19"/>
+                <w:szCs w:val="19"/>
+              </w:rPr>
+              <w:t xml:space="preserve">Dec</w:t>
+            </w:r>
+          </w:p>
+        </w:tc>
+        <w:tc>
+          <w:tcPr>
+            <w:tcW w:type="dxa" w:w="1200"/>
+            <w:shd w:fill="1F3864" w:color="auto" w:val="clear"/>
+            <w:tcMar>
+              <w:top w:type="dxa" w:w="80"/>
+              <w:left w:type="dxa" w:w="120"/>
+              <w:bottom w:type="dxa" w:w="80"/>
+              <w:right w:type="dxa" w:w="120"/>
+            </w:tcMar>
+            <w:vAlign w:val="center"/>
+          </w:tcPr>
+          <w:p>
+            <w:r>
+              <w:rPr>
+                <w:rFonts w:ascii="News Gothic MT" w:cs="News Gothic MT" w:eastAsia="News Gothic MT" w:hAnsi="News Gothic MT"/>
+                <w:b/>
+                <w:bCs/>
+                <w:color w:val="FFFFFF"/>
+                <w:sz w:val="19"/>
+                <w:szCs w:val="19"/>
+              </w:rPr>
+              <w:t xml:space="preserve">Letra</w:t>
+            </w:r>
+          </w:p>
+        </w:tc>
+        <w:tc>
+          <w:tcPr>
+            <w:tcW w:type="dxa" w:w="1000"/>
+            <w:shd w:fill="1F3864" w:color="auto" w:val="clear"/>
+            <w:tcMar>
+              <w:top w:type="dxa" w:w="80"/>
+              <w:left w:type="dxa" w:w="120"/>
+              <w:bottom w:type="dxa" w:w="80"/>
+              <w:right w:type="dxa" w:w="120"/>
+            </w:tcMar>
+            <w:vAlign w:val="center"/>
+          </w:tcPr>
+          <w:p>
+            <w:r>
+              <w:rPr>
+                <w:rFonts w:ascii="News Gothic MT" w:cs="News Gothic MT" w:eastAsia="News Gothic MT" w:hAnsi="News Gothic MT"/>
+                <w:b/>
+                <w:bCs/>
+                <w:color w:val="FFFFFF"/>
+                <w:sz w:val="19"/>
+                <w:szCs w:val="19"/>
+              </w:rPr>
+              <w:t xml:space="preserve">Dec</w:t>
+            </w:r>
+          </w:p>
+        </w:tc>
+        <w:tc>
+          <w:tcPr>
+            <w:tcW w:type="dxa" w:w="1200"/>
+            <w:shd w:fill="1F3864" w:color="auto" w:val="clear"/>
+            <w:tcMar>
+              <w:top w:type="dxa" w:w="80"/>
+              <w:left w:type="dxa" w:w="120"/>
+              <w:bottom w:type="dxa" w:w="80"/>
+              <w:right w:type="dxa" w:w="120"/>
+            </w:tcMar>
+            <w:vAlign w:val="center"/>
+          </w:tcPr>
+          <w:p>
+            <w:r>
+              <w:rPr>
+                <w:rFonts w:ascii="News Gothic MT" w:cs="News Gothic MT" w:eastAsia="News Gothic MT" w:hAnsi="News Gothic MT"/>
+                <w:b/>
+                <w:bCs/>
+                <w:color w:val="FFFFFF"/>
+                <w:sz w:val="19"/>
+                <w:szCs w:val="19"/>
+              </w:rPr>
+              <w:t xml:space="preserve">Letra</w:t>
+            </w:r>
+          </w:p>
+        </w:tc>
+        <w:tc>
+          <w:tcPr>
+            <w:tcW w:type="dxa" w:w="1000"/>
+            <w:shd w:fill="1F3864" w:color="auto" w:val="clear"/>
+            <w:tcMar>
+              <w:top w:type="dxa" w:w="80"/>
+              <w:left w:type="dxa" w:w="120"/>
+              <w:bottom w:type="dxa" w:w="80"/>
+              <w:right w:type="dxa" w:w="120"/>
+            </w:tcMar>
+            <w:vAlign w:val="center"/>
+          </w:tcPr>
+          <w:p>
+            <w:r>
+              <w:rPr>
+                <w:rFonts w:ascii="News Gothic MT" w:cs="News Gothic MT" w:eastAsia="News Gothic MT" w:hAnsi="News Gothic MT"/>
+                <w:b/>
+                <w:bCs/>
+                <w:color w:val="FFFFFF"/>
+                <w:sz w:val="19"/>
+                <w:szCs w:val="19"/>
+              </w:rPr>
+              <w:t xml:space="preserve">Dec</w:t>
+            </w:r>
+          </w:p>
+        </w:tc>
+        <w:tc>
+          <w:tcPr>
+            <w:tcW w:type="dxa" w:w="1200"/>
+            <w:shd w:fill="1F3864" w:color="auto" w:val="clear"/>
+            <w:tcMar>
+              <w:top w:type="dxa" w:w="80"/>
+              <w:left w:type="dxa" w:w="120"/>
+              <w:bottom w:type="dxa" w:w="80"/>
+              <w:right w:type="dxa" w:w="120"/>
+            </w:tcMar>
+            <w:vAlign w:val="center"/>
+          </w:tcPr>
+          <w:p>
+            <w:r>
+              <w:rPr>
+                <w:rFonts w:ascii="News Gothic MT" w:cs="News Gothic MT" w:eastAsia="News Gothic MT" w:hAnsi="News Gothic MT"/>
+                <w:b/>
+                <w:bCs/>
+                <w:color w:val="FFFFFF"/>
+                <w:sz w:val="19"/>
+                <w:szCs w:val="19"/>
+              </w:rPr>
+              <w:t xml:space="preserve">Letra</w:t>
+            </w:r>
+          </w:p>
+        </w:tc>
+        <w:tc>
+          <w:tcPr>
+            <w:tcW w:type="dxa" w:w="1038"/>
+            <w:shd w:fill="1F3864" w:color="auto" w:val="clear"/>
+            <w:tcMar>
+              <w:top w:type="dxa" w:w="80"/>
+              <w:left w:type="dxa" w:w="120"/>
+              <w:bottom w:type="dxa" w:w="80"/>
+              <w:right w:type="dxa" w:w="120"/>
+            </w:tcMar>
+            <w:vAlign w:val="center"/>
+          </w:tcPr>
+          <w:p>
+            <w:r>
+              <w:rPr>
+                <w:rFonts w:ascii="News Gothic MT" w:cs="News Gothic MT" w:eastAsia="News Gothic MT" w:hAnsi="News Gothic MT"/>
+                <w:b/>
+                <w:bCs/>
+                <w:color w:val="FFFFFF"/>
+                <w:sz w:val="19"/>
+                <w:szCs w:val="19"/>
+              </w:rPr>
+              <w:t xml:space="preserve">Dec</w:t>
+            </w:r>
+          </w:p>
+        </w:tc>
+      </w:tr>
+      <w:tr>
+        <w:tc>
+          <w:tcPr>
+            <w:tcW w:type="dxa" w:w="1200"/>
+            <w:shd w:fill="FFFFFF" w:color="auto" w:val="clear"/>
+            <w:tcMar>
+              <w:top w:type="dxa" w:w="70"/>
+              <w:left w:type="dxa" w:w="120"/>
+              <w:bottom w:type="dxa" w:w="70"/>
+              <w:right w:type="dxa" w:w="120"/>
+            </w:tcMar>
+            <w:vAlign w:val="center"/>
+          </w:tcPr>
+          <w:p>
+            <w:r>
+              <w:rPr>
+                <w:rFonts w:ascii="News Gothic MT" w:cs="News Gothic MT" w:eastAsia="News Gothic MT" w:hAnsi="News Gothic MT"/>
+                <w:b w:val="false"/>
+                <w:bCs w:val="false"/>
+                <w:i w:val="false"/>
+                <w:iCs w:val="false"/>
+                <w:color w:val="1A1A2E"/>
+                <w:sz w:val="19"/>
+                <w:szCs w:val="19"/>
+              </w:rPr>
+              <w:t xml:space="preserve">a</w:t>
+            </w:r>
+          </w:p>
+        </w:tc>
+        <w:tc>
+          <w:tcPr>
+            <w:tcW w:type="dxa" w:w="1000"/>
+            <w:shd w:fill="FFFFFF" w:color="auto" w:val="clear"/>
+            <w:tcMar>
+              <w:top w:type="dxa" w:w="70"/>
+              <w:left w:type="dxa" w:w="120"/>
+              <w:bottom w:type="dxa" w:w="70"/>
+              <w:right w:type="dxa" w:w="120"/>
+            </w:tcMar>
+            <w:vAlign w:val="center"/>
+          </w:tcPr>
+          <w:p>
+            <w:r>
+              <w:rPr>
+                <w:rFonts w:ascii="News Gothic MT" w:cs="News Gothic MT" w:eastAsia="News Gothic MT" w:hAnsi="News Gothic MT"/>
+                <w:b w:val="false"/>
+                <w:bCs w:val="false"/>
+                <w:i w:val="false"/>
+                <w:iCs w:val="false"/>
+                <w:color w:val="1A1A2E"/>
+                <w:sz w:val="19"/>
+                <w:szCs w:val="19"/>
+              </w:rPr>
+              <w:t xml:space="preserve">97</w:t>
+            </w:r>
+          </w:p>
+        </w:tc>
+        <w:tc>
+          <w:tcPr>
+            <w:tcW w:type="dxa" w:w="1200"/>
+            <w:shd w:fill="FFFFFF" w:color="auto" w:val="clear"/>
+            <w:tcMar>
+              <w:top w:type="dxa" w:w="70"/>
+              <w:left w:type="dxa" w:w="120"/>
+              <w:bottom w:type="dxa" w:w="70"/>
+              <w:right w:type="dxa" w:w="120"/>
+            </w:tcMar>
+            <w:vAlign w:val="center"/>
+          </w:tcPr>
+          <w:p>
+            <w:r>
+              <w:rPr>
+                <w:rFonts w:ascii="News Gothic MT" w:cs="News Gothic MT" w:eastAsia="News Gothic MT" w:hAnsi="News Gothic MT"/>
+                <w:b w:val="false"/>
+                <w:bCs w:val="false"/>
+                <w:i w:val="false"/>
+                <w:iCs w:val="false"/>
+                <w:color w:val="1A1A2E"/>
+                <w:sz w:val="19"/>
+                <w:szCs w:val="19"/>
+              </w:rPr>
+              <w:t xml:space="preserve">h</w:t>
+            </w:r>
+          </w:p>
+        </w:tc>
+        <w:tc>
+          <w:tcPr>
+            <w:tcW w:type="dxa" w:w="1000"/>
+            <w:shd w:fill="FFFFFF" w:color="auto" w:val="clear"/>
+            <w:tcMar>
+              <w:top w:type="dxa" w:w="70"/>
+              <w:left w:type="dxa" w:w="120"/>
+              <w:bottom w:type="dxa" w:w="70"/>
+              <w:right w:type="dxa" w:w="120"/>
+            </w:tcMar>
+            <w:vAlign w:val="center"/>
+          </w:tcPr>
+          <w:p>
+            <w:r>
+              <w:rPr>
+                <w:rFonts w:ascii="News Gothic MT" w:cs="News Gothic MT" w:eastAsia="News Gothic MT" w:hAnsi="News Gothic MT"/>
+                <w:b w:val="false"/>
+                <w:bCs w:val="false"/>
+                <w:i w:val="false"/>
+                <w:iCs w:val="false"/>
+                <w:color w:val="1A1A2E"/>
+                <w:sz w:val="19"/>
+                <w:szCs w:val="19"/>
+              </w:rPr>
+              <w:t xml:space="preserve">104</w:t>
+            </w:r>
+          </w:p>
+        </w:tc>
+        <w:tc>
+          <w:tcPr>
+            <w:tcW w:type="dxa" w:w="1200"/>
+            <w:shd w:fill="FFFFFF" w:color="auto" w:val="clear"/>
+            <w:tcMar>
+              <w:top w:type="dxa" w:w="70"/>
+              <w:left w:type="dxa" w:w="120"/>
+              <w:bottom w:type="dxa" w:w="70"/>
+              <w:right w:type="dxa" w:w="120"/>
+            </w:tcMar>
+            <w:vAlign w:val="center"/>
+          </w:tcPr>
+          <w:p>
+            <w:r>
+              <w:rPr>
+                <w:rFonts w:ascii="News Gothic MT" w:cs="News Gothic MT" w:eastAsia="News Gothic MT" w:hAnsi="News Gothic MT"/>
+                <w:b w:val="false"/>
+                <w:bCs w:val="false"/>
+                <w:i w:val="false"/>
+                <w:iCs w:val="false"/>
+                <w:color w:val="1A1A2E"/>
+                <w:sz w:val="19"/>
+                <w:szCs w:val="19"/>
+              </w:rPr>
+              <w:t xml:space="preserve">o</w:t>
+            </w:r>
+          </w:p>
+        </w:tc>
+        <w:tc>
+          <w:tcPr>
+            <w:tcW w:type="dxa" w:w="1000"/>
+            <w:shd w:fill="FFFFFF" w:color="auto" w:val="clear"/>
+            <w:tcMar>
+              <w:top w:type="dxa" w:w="70"/>
+              <w:left w:type="dxa" w:w="120"/>
+              <w:bottom w:type="dxa" w:w="70"/>
+              <w:right w:type="dxa" w:w="120"/>
+            </w:tcMar>
+            <w:vAlign w:val="center"/>
+          </w:tcPr>
+          <w:p>
+            <w:r>
+              <w:rPr>
+                <w:rFonts w:ascii="News Gothic MT" w:cs="News Gothic MT" w:eastAsia="News Gothic MT" w:hAnsi="News Gothic MT"/>
+                <w:b w:val="false"/>
+                <w:bCs w:val="false"/>
+                <w:i w:val="false"/>
+                <w:iCs w:val="false"/>
+                <w:color w:val="1A1A2E"/>
+                <w:sz w:val="19"/>
+                <w:szCs w:val="19"/>
+              </w:rPr>
+              <w:t xml:space="preserve">111</w:t>
+            </w:r>
+          </w:p>
+        </w:tc>
+        <w:tc>
+          <w:tcPr>
+            <w:tcW w:type="dxa" w:w="1200"/>
+            <w:shd w:fill="FFFFFF" w:color="auto" w:val="clear"/>
+            <w:tcMar>
+              <w:top w:type="dxa" w:w="70"/>
+              <w:left w:type="dxa" w:w="120"/>
+              <w:bottom w:type="dxa" w:w="70"/>
+              <w:right w:type="dxa" w:w="120"/>
+            </w:tcMar>
+            <w:vAlign w:val="center"/>
+          </w:tcPr>
+          <w:p>
+            <w:r>
+              <w:rPr>
+                <w:rFonts w:ascii="News Gothic MT" w:cs="News Gothic MT" w:eastAsia="News Gothic MT" w:hAnsi="News Gothic MT"/>
+                <w:b w:val="false"/>
+                <w:bCs w:val="false"/>
+                <w:i w:val="false"/>
+                <w:iCs w:val="false"/>
+                <w:color w:val="1A1A2E"/>
+                <w:sz w:val="19"/>
+                <w:szCs w:val="19"/>
+              </w:rPr>
+              <w:t xml:space="preserve">v</w:t>
+            </w:r>
+          </w:p>
+        </w:tc>
+        <w:tc>
+          <w:tcPr>
+            <w:tcW w:type="dxa" w:w="1038"/>
+            <w:shd w:fill="FFFFFF" w:color="auto" w:val="clear"/>
+            <w:tcMar>
+              <w:top w:type="dxa" w:w="70"/>
+              <w:left w:type="dxa" w:w="120"/>
+              <w:bottom w:type="dxa" w:w="70"/>
+              <w:right w:type="dxa" w:w="120"/>
+            </w:tcMar>
+            <w:vAlign w:val="center"/>
+          </w:tcPr>
+          <w:p>
+            <w:r>
+              <w:rPr>
+                <w:rFonts w:ascii="News Gothic MT" w:cs="News Gothic MT" w:eastAsia="News Gothic MT" w:hAnsi="News Gothic MT"/>
+                <w:b w:val="false"/>
+                <w:bCs w:val="false"/>
+                <w:i w:val="false"/>
+                <w:iCs w:val="false"/>
+                <w:color w:val="1A1A2E"/>
+                <w:sz w:val="19"/>
+                <w:szCs w:val="19"/>
+              </w:rPr>
+              <w:t xml:space="preserve">118</w:t>
+            </w:r>
+          </w:p>
+        </w:tc>
+      </w:tr>
+      <w:tr>
+        <w:tc>
+          <w:tcPr>
+            <w:tcW w:type="dxa" w:w="1200"/>
+            <w:shd w:fill="EEF1F8" w:color="auto" w:val="clear"/>
+            <w:tcMar>
+              <w:top w:type="dxa" w:w="70"/>
+              <w:left w:type="dxa" w:w="120"/>
+              <w:bottom w:type="dxa" w:w="70"/>
+              <w:right w:type="dxa" w:w="120"/>
+            </w:tcMar>
+            <w:vAlign w:val="center"/>
+          </w:tcPr>
+          <w:p>
+            <w:r>
+              <w:rPr>
+                <w:rFonts w:ascii="News Gothic MT" w:cs="News Gothic MT" w:eastAsia="News Gothic MT" w:hAnsi="News Gothic MT"/>
+                <w:b w:val="false"/>
+                <w:bCs w:val="false"/>
+                <w:i w:val="false"/>
+                <w:iCs w:val="false"/>
+                <w:color w:val="1A1A2E"/>
+                <w:sz w:val="19"/>
+                <w:szCs w:val="19"/>
+              </w:rPr>
+              <w:t xml:space="preserve">b</w:t>
+            </w:r>
+          </w:p>
+        </w:tc>
+        <w:tc>
+          <w:tcPr>
+            <w:tcW w:type="dxa" w:w="1000"/>
+            <w:shd w:fill="EEF1F8" w:color="auto" w:val="clear"/>
+            <w:tcMar>
+              <w:top w:type="dxa" w:w="70"/>
+              <w:left w:type="dxa" w:w="120"/>
+              <w:bottom w:type="dxa" w:w="70"/>
+              <w:right w:type="dxa" w:w="120"/>
+            </w:tcMar>
+            <w:vAlign w:val="center"/>
+          </w:tcPr>
+          <w:p>
+            <w:r>
+              <w:rPr>
+                <w:rFonts w:ascii="News Gothic MT" w:cs="News Gothic MT" w:eastAsia="News Gothic MT" w:hAnsi="News Gothic MT"/>
+                <w:b w:val="false"/>
+                <w:bCs w:val="false"/>
+                <w:i w:val="false"/>
+                <w:iCs w:val="false"/>
+                <w:color w:val="1A1A2E"/>
+                <w:sz w:val="19"/>
+                <w:szCs w:val="19"/>
+              </w:rPr>
+              <w:t xml:space="preserve">98</w:t>
+            </w:r>
+          </w:p>
+        </w:tc>
+        <w:tc>
+          <w:tcPr>
+            <w:tcW w:type="dxa" w:w="1200"/>
+            <w:shd w:fill="EEF1F8" w:color="auto" w:val="clear"/>
+            <w:tcMar>
+              <w:top w:type="dxa" w:w="70"/>
+              <w:left w:type="dxa" w:w="120"/>
+              <w:bottom w:type="dxa" w:w="70"/>
+              <w:right w:type="dxa" w:w="120"/>
+            </w:tcMar>
+            <w:vAlign w:val="center"/>
+          </w:tcPr>
+          <w:p>
+            <w:r>
+              <w:rPr>
+                <w:rFonts w:ascii="News Gothic MT" w:cs="News Gothic MT" w:eastAsia="News Gothic MT" w:hAnsi="News Gothic MT"/>
+                <w:b w:val="false"/>
+                <w:bCs w:val="false"/>
+                <w:i w:val="false"/>
+                <w:iCs w:val="false"/>
+                <w:color w:val="1A1A2E"/>
+                <w:sz w:val="19"/>
+                <w:szCs w:val="19"/>
+              </w:rPr>
+              <w:t xml:space="preserve">i</w:t>
+            </w:r>
+          </w:p>
+        </w:tc>
+        <w:tc>
+          <w:tcPr>
+            <w:tcW w:type="dxa" w:w="1000"/>
+            <w:shd w:fill="EEF1F8" w:color="auto" w:val="clear"/>
+            <w:tcMar>
+              <w:top w:type="dxa" w:w="70"/>
+              <w:left w:type="dxa" w:w="120"/>
+              <w:bottom w:type="dxa" w:w="70"/>
+              <w:right w:type="dxa" w:w="120"/>
+            </w:tcMar>
+            <w:vAlign w:val="center"/>
+          </w:tcPr>
+          <w:p>
+            <w:r>
+              <w:rPr>
+                <w:rFonts w:ascii="News Gothic MT" w:cs="News Gothic MT" w:eastAsia="News Gothic MT" w:hAnsi="News Gothic MT"/>
+                <w:b w:val="false"/>
+                <w:bCs w:val="false"/>
+                <w:i w:val="false"/>
+                <w:iCs w:val="false"/>
+                <w:color w:val="1A1A2E"/>
+                <w:sz w:val="19"/>
+                <w:szCs w:val="19"/>
+              </w:rPr>
+              <w:t xml:space="preserve">105</w:t>
+            </w:r>
+          </w:p>
+        </w:tc>
+        <w:tc>
+          <w:tcPr>
+            <w:tcW w:type="dxa" w:w="1200"/>
+            <w:shd w:fill="EEF1F8" w:color="auto" w:val="clear"/>
+            <w:tcMar>
+              <w:top w:type="dxa" w:w="70"/>
+              <w:left w:type="dxa" w:w="120"/>
+              <w:bottom w:type="dxa" w:w="70"/>
+              <w:right w:type="dxa" w:w="120"/>
+            </w:tcMar>
+            <w:vAlign w:val="center"/>
+          </w:tcPr>
+          <w:p>
+            <w:r>
+              <w:rPr>
+                <w:rFonts w:ascii="News Gothic MT" w:cs="News Gothic MT" w:eastAsia="News Gothic MT" w:hAnsi="News Gothic MT"/>
+                <w:b w:val="false"/>
+                <w:bCs w:val="false"/>
+                <w:i w:val="false"/>
+                <w:iCs w:val="false"/>
+                <w:color w:val="1A1A2E"/>
+                <w:sz w:val="19"/>
+                <w:szCs w:val="19"/>
+              </w:rPr>
+              <w:t xml:space="preserve">p</w:t>
+            </w:r>
+          </w:p>
+        </w:tc>
+        <w:tc>
+          <w:tcPr>
+            <w:tcW w:type="dxa" w:w="1000"/>
+            <w:shd w:fill="EEF1F8" w:color="auto" w:val="clear"/>
+            <w:tcMar>
+              <w:top w:type="dxa" w:w="70"/>
+              <w:left w:type="dxa" w:w="120"/>
+              <w:bottom w:type="dxa" w:w="70"/>
+              <w:right w:type="dxa" w:w="120"/>
+            </w:tcMar>
+            <w:vAlign w:val="center"/>
+          </w:tcPr>
+          <w:p>
+            <w:r>
+              <w:rPr>
+                <w:rFonts w:ascii="News Gothic MT" w:cs="News Gothic MT" w:eastAsia="News Gothic MT" w:hAnsi="News Gothic MT"/>
+                <w:b w:val="false"/>
+                <w:bCs w:val="false"/>
+                <w:i w:val="false"/>
+                <w:iCs w:val="false"/>
+                <w:color w:val="1A1A2E"/>
+                <w:sz w:val="19"/>
+                <w:szCs w:val="19"/>
+              </w:rPr>
+              <w:t xml:space="preserve">112</w:t>
+            </w:r>
+          </w:p>
+        </w:tc>
+        <w:tc>
+          <w:tcPr>
+            <w:tcW w:type="dxa" w:w="1200"/>
+            <w:shd w:fill="EEF1F8" w:color="auto" w:val="clear"/>
+            <w:tcMar>
+              <w:top w:type="dxa" w:w="70"/>
+              <w:left w:type="dxa" w:w="120"/>
+              <w:bottom w:type="dxa" w:w="70"/>
+              <w:right w:type="dxa" w:w="120"/>
+            </w:tcMar>
+            <w:vAlign w:val="center"/>
+          </w:tcPr>
+          <w:p>
+            <w:r>
+              <w:rPr>
+                <w:rFonts w:ascii="News Gothic MT" w:cs="News Gothic MT" w:eastAsia="News Gothic MT" w:hAnsi="News Gothic MT"/>
+                <w:b w:val="false"/>
+                <w:bCs w:val="false"/>
+                <w:i w:val="false"/>
+                <w:iCs w:val="false"/>
+                <w:color w:val="1A1A2E"/>
+                <w:sz w:val="19"/>
+                <w:szCs w:val="19"/>
+              </w:rPr>
+              <w:t xml:space="preserve">w</w:t>
+            </w:r>
+          </w:p>
+        </w:tc>
+        <w:tc>
+          <w:tcPr>
+            <w:tcW w:type="dxa" w:w="1038"/>
+            <w:shd w:fill="EEF1F8" w:color="auto" w:val="clear"/>
+            <w:tcMar>
+              <w:top w:type="dxa" w:w="70"/>
+              <w:left w:type="dxa" w:w="120"/>
+              <w:bottom w:type="dxa" w:w="70"/>
+              <w:right w:type="dxa" w:w="120"/>
+            </w:tcMar>
+            <w:vAlign w:val="center"/>
+          </w:tcPr>
+          <w:p>
+            <w:r>
+              <w:rPr>
+                <w:rFonts w:ascii="News Gothic MT" w:cs="News Gothic MT" w:eastAsia="News Gothic MT" w:hAnsi="News Gothic MT"/>
+                <w:b w:val="false"/>
+                <w:bCs w:val="false"/>
+                <w:i w:val="false"/>
+                <w:iCs w:val="false"/>
+                <w:color w:val="1A1A2E"/>
+                <w:sz w:val="19"/>
+                <w:szCs w:val="19"/>
+              </w:rPr>
+              <w:t xml:space="preserve">119</w:t>
+            </w:r>
+          </w:p>
+        </w:tc>
+      </w:tr>
+      <w:tr>
+        <w:tc>
+          <w:tcPr>
+            <w:tcW w:type="dxa" w:w="1200"/>
+            <w:shd w:fill="FFFFFF" w:color="auto" w:val="clear"/>
+            <w:tcMar>
+              <w:top w:type="dxa" w:w="70"/>
+              <w:left w:type="dxa" w:w="120"/>
+              <w:bottom w:type="dxa" w:w="70"/>
+              <w:right w:type="dxa" w:w="120"/>
+            </w:tcMar>
+            <w:vAlign w:val="center"/>
+          </w:tcPr>
+          <w:p>
+            <w:r>
+              <w:rPr>
+                <w:rFonts w:ascii="News Gothic MT" w:cs="News Gothic MT" w:eastAsia="News Gothic MT" w:hAnsi="News Gothic MT"/>
+                <w:b w:val="false"/>
+                <w:bCs w:val="false"/>
+                <w:i w:val="false"/>
+                <w:iCs w:val="false"/>
+                <w:color w:val="1A1A2E"/>
+                <w:sz w:val="19"/>
+                <w:szCs w:val="19"/>
+              </w:rPr>
+              <w:t xml:space="preserve">c</w:t>
+            </w:r>
+          </w:p>
+        </w:tc>
+        <w:tc>
+          <w:tcPr>
+            <w:tcW w:type="dxa" w:w="1000"/>
+            <w:shd w:fill="FFFFFF" w:color="auto" w:val="clear"/>
+            <w:tcMar>
+              <w:top w:type="dxa" w:w="70"/>
+              <w:left w:type="dxa" w:w="120"/>
+              <w:bottom w:type="dxa" w:w="70"/>
+              <w:right w:type="dxa" w:w="120"/>
+            </w:tcMar>
+            <w:vAlign w:val="center"/>
+          </w:tcPr>
+          <w:p>
+            <w:r>
+              <w:rPr>
+                <w:rFonts w:ascii="News Gothic MT" w:cs="News Gothic MT" w:eastAsia="News Gothic MT" w:hAnsi="News Gothic MT"/>
+                <w:b w:val="false"/>
+                <w:bCs w:val="false"/>
+                <w:i w:val="false"/>
+                <w:iCs w:val="false"/>
+                <w:color w:val="1A1A2E"/>
+                <w:sz w:val="19"/>
+                <w:szCs w:val="19"/>
+              </w:rPr>
+              <w:t xml:space="preserve">99</w:t>
+            </w:r>
+          </w:p>
+        </w:tc>
+        <w:tc>
+          <w:tcPr>
+            <w:tcW w:type="dxa" w:w="1200"/>
+            <w:shd w:fill="FFFFFF" w:color="auto" w:val="clear"/>
+            <w:tcMar>
+              <w:top w:type="dxa" w:w="70"/>
+              <w:left w:type="dxa" w:w="120"/>
+              <w:bottom w:type="dxa" w:w="70"/>
+              <w:right w:type="dxa" w:w="120"/>
+            </w:tcMar>
+            <w:vAlign w:val="center"/>
+          </w:tcPr>
+          <w:p>
+            <w:r>
+              <w:rPr>
+                <w:rFonts w:ascii="News Gothic MT" w:cs="News Gothic MT" w:eastAsia="News Gothic MT" w:hAnsi="News Gothic MT"/>
+                <w:b w:val="false"/>
+                <w:bCs w:val="false"/>
+                <w:i w:val="false"/>
+                <w:iCs w:val="false"/>
+                <w:color w:val="1A1A2E"/>
+                <w:sz w:val="19"/>
+                <w:szCs w:val="19"/>
+              </w:rPr>
+              <w:t xml:space="preserve">j</w:t>
+            </w:r>
+          </w:p>
+        </w:tc>
+        <w:tc>
+          <w:tcPr>
+            <w:tcW w:type="dxa" w:w="1000"/>
+            <w:shd w:fill="FFFFFF" w:color="auto" w:val="clear"/>
+            <w:tcMar>
+              <w:top w:type="dxa" w:w="70"/>
+              <w:left w:type="dxa" w:w="120"/>
+              <w:bottom w:type="dxa" w:w="70"/>
+              <w:right w:type="dxa" w:w="120"/>
+            </w:tcMar>
+            <w:vAlign w:val="center"/>
+          </w:tcPr>
+          <w:p>
+            <w:r>
+              <w:rPr>
+                <w:rFonts w:ascii="News Gothic MT" w:cs="News Gothic MT" w:eastAsia="News Gothic MT" w:hAnsi="News Gothic MT"/>
+                <w:b w:val="false"/>
+                <w:bCs w:val="false"/>
+                <w:i w:val="false"/>
+                <w:iCs w:val="false"/>
+                <w:color w:val="1A1A2E"/>
+                <w:sz w:val="19"/>
+                <w:szCs w:val="19"/>
+              </w:rPr>
+              <w:t xml:space="preserve">106</w:t>
+            </w:r>
+          </w:p>
+        </w:tc>
+        <w:tc>
+          <w:tcPr>
+            <w:tcW w:type="dxa" w:w="1200"/>
+            <w:shd w:fill="FFFFFF" w:color="auto" w:val="clear"/>
+            <w:tcMar>
+              <w:top w:type="dxa" w:w="70"/>
+              <w:left w:type="dxa" w:w="120"/>
+              <w:bottom w:type="dxa" w:w="70"/>
+              <w:right w:type="dxa" w:w="120"/>
+            </w:tcMar>
+            <w:vAlign w:val="center"/>
+          </w:tcPr>
+          <w:p>
+            <w:r>
+              <w:rPr>
+                <w:rFonts w:ascii="News Gothic MT" w:cs="News Gothic MT" w:eastAsia="News Gothic MT" w:hAnsi="News Gothic MT"/>
+                <w:b w:val="false"/>
+                <w:bCs w:val="false"/>
+                <w:i w:val="false"/>
+                <w:iCs w:val="false"/>
+                <w:color w:val="1A1A2E"/>
+                <w:sz w:val="19"/>
+                <w:szCs w:val="19"/>
+              </w:rPr>
+              <w:t xml:space="preserve">q</w:t>
+            </w:r>
+          </w:p>
+        </w:tc>
+        <w:tc>
+          <w:tcPr>
+            <w:tcW w:type="dxa" w:w="1000"/>
+            <w:shd w:fill="FFFFFF" w:color="auto" w:val="clear"/>
+            <w:tcMar>
+              <w:top w:type="dxa" w:w="70"/>
+              <w:left w:type="dxa" w:w="120"/>
+              <w:bottom w:type="dxa" w:w="70"/>
+              <w:right w:type="dxa" w:w="120"/>
+            </w:tcMar>
+            <w:vAlign w:val="center"/>
+          </w:tcPr>
+          <w:p>
+            <w:r>
+              <w:rPr>
+                <w:rFonts w:ascii="News Gothic MT" w:cs="News Gothic MT" w:eastAsia="News Gothic MT" w:hAnsi="News Gothic MT"/>
+                <w:b w:val="false"/>
+                <w:bCs w:val="false"/>
+                <w:i w:val="false"/>
+                <w:iCs w:val="false"/>
+                <w:color w:val="1A1A2E"/>
+                <w:sz w:val="19"/>
+                <w:szCs w:val="19"/>
+              </w:rPr>
+              <w:t xml:space="preserve">113</w:t>
+            </w:r>
+          </w:p>
+        </w:tc>
+        <w:tc>
+          <w:tcPr>
+            <w:tcW w:type="dxa" w:w="1200"/>
+            <w:shd w:fill="FFFFFF" w:color="auto" w:val="clear"/>
+            <w:tcMar>
+              <w:top w:type="dxa" w:w="70"/>
+              <w:left w:type="dxa" w:w="120"/>
+              <w:bottom w:type="dxa" w:w="70"/>
+              <w:right w:type="dxa" w:w="120"/>
+            </w:tcMar>
+            <w:vAlign w:val="center"/>
+          </w:tcPr>
+          <w:p>
+            <w:r>
+              <w:rPr>
+                <w:rFonts w:ascii="News Gothic MT" w:cs="News Gothic MT" w:eastAsia="News Gothic MT" w:hAnsi="News Gothic MT"/>
+                <w:b w:val="false"/>
+                <w:bCs w:val="false"/>
+                <w:i w:val="false"/>
+                <w:iCs w:val="false"/>
+                <w:color w:val="1A1A2E"/>
+                <w:sz w:val="19"/>
+                <w:szCs w:val="19"/>
+              </w:rPr>
+              <w:t xml:space="preserve">x</w:t>
+            </w:r>
+          </w:p>
+        </w:tc>
+        <w:tc>
+          <w:tcPr>
+            <w:tcW w:type="dxa" w:w="1038"/>
+            <w:shd w:fill="FFFFFF" w:color="auto" w:val="clear"/>
+            <w:tcMar>
+              <w:top w:type="dxa" w:w="70"/>
+              <w:left w:type="dxa" w:w="120"/>
+              <w:bottom w:type="dxa" w:w="70"/>
+              <w:right w:type="dxa" w:w="120"/>
+            </w:tcMar>
+            <w:vAlign w:val="center"/>
+          </w:tcPr>
+          <w:p>
+            <w:r>
+              <w:rPr>
+                <w:rFonts w:ascii="News Gothic MT" w:cs="News Gothic MT" w:eastAsia="News Gothic MT" w:hAnsi="News Gothic MT"/>
+                <w:b w:val="false"/>
+                <w:bCs w:val="false"/>
+                <w:i w:val="false"/>
+                <w:iCs w:val="false"/>
+                <w:color w:val="1A1A2E"/>
+                <w:sz w:val="19"/>
+                <w:szCs w:val="19"/>
+              </w:rPr>
+              <w:t xml:space="preserve">120</w:t>
+            </w:r>
+          </w:p>
+        </w:tc>
+      </w:tr>
+      <w:tr>
+        <w:tc>
+          <w:tcPr>
+            <w:tcW w:type="dxa" w:w="1200"/>
+            <w:shd w:fill="EEF1F8" w:color="auto" w:val="clear"/>
+            <w:tcMar>
+              <w:top w:type="dxa" w:w="70"/>
+              <w:left w:type="dxa" w:w="120"/>
+              <w:bottom w:type="dxa" w:w="70"/>
+              <w:right w:type="dxa" w:w="120"/>
+            </w:tcMar>
+            <w:vAlign w:val="center"/>
+          </w:tcPr>
+          <w:p>
+            <w:r>
+              <w:rPr>
+                <w:rFonts w:ascii="News Gothic MT" w:cs="News Gothic MT" w:eastAsia="News Gothic MT" w:hAnsi="News Gothic MT"/>
+                <w:b w:val="false"/>
+                <w:bCs w:val="false"/>
+                <w:i w:val="false"/>
+                <w:iCs w:val="false"/>
+                <w:color w:val="1A1A2E"/>
+                <w:sz w:val="19"/>
+                <w:szCs w:val="19"/>
+              </w:rPr>
+              <w:t xml:space="preserve">d</w:t>
+            </w:r>
+          </w:p>
+        </w:tc>
+        <w:tc>
+          <w:tcPr>
+            <w:tcW w:type="dxa" w:w="1000"/>
+            <w:shd w:fill="EEF1F8" w:color="auto" w:val="clear"/>
+            <w:tcMar>
+              <w:top w:type="dxa" w:w="70"/>
+              <w:left w:type="dxa" w:w="120"/>
+              <w:bottom w:type="dxa" w:w="70"/>
+              <w:right w:type="dxa" w:w="120"/>
+            </w:tcMar>
+            <w:vAlign w:val="center"/>
+          </w:tcPr>
+          <w:p>
+            <w:r>
+              <w:rPr>
+                <w:rFonts w:ascii="News Gothic MT" w:cs="News Gothic MT" w:eastAsia="News Gothic MT" w:hAnsi="News Gothic MT"/>
+                <w:b w:val="false"/>
+                <w:bCs w:val="false"/>
+                <w:i w:val="false"/>
+                <w:iCs w:val="false"/>
+                <w:color w:val="1A1A2E"/>
+                <w:sz w:val="19"/>
+                <w:szCs w:val="19"/>
+              </w:rPr>
+              <w:t xml:space="preserve">100</w:t>
+            </w:r>
+          </w:p>
+        </w:tc>
+        <w:tc>
+          <w:tcPr>
+            <w:tcW w:type="dxa" w:w="1200"/>
+            <w:shd w:fill="EEF1F8" w:color="auto" w:val="clear"/>
+            <w:tcMar>
+              <w:top w:type="dxa" w:w="70"/>
+              <w:left w:type="dxa" w:w="120"/>
+              <w:bottom w:type="dxa" w:w="70"/>
+              <w:right w:type="dxa" w:w="120"/>
+            </w:tcMar>
+            <w:vAlign w:val="center"/>
+          </w:tcPr>
+          <w:p>
+            <w:r>
+              <w:rPr>
+                <w:rFonts w:ascii="News Gothic MT" w:cs="News Gothic MT" w:eastAsia="News Gothic MT" w:hAnsi="News Gothic MT"/>
+                <w:b w:val="false"/>
+                <w:bCs w:val="false"/>
+                <w:i w:val="false"/>
+                <w:iCs w:val="false"/>
+                <w:color w:val="1A1A2E"/>
+                <w:sz w:val="19"/>
+                <w:szCs w:val="19"/>
+              </w:rPr>
+              <w:t xml:space="preserve">k</w:t>
+            </w:r>
+          </w:p>
+        </w:tc>
+        <w:tc>
+          <w:tcPr>
+            <w:tcW w:type="dxa" w:w="1000"/>
+            <w:shd w:fill="EEF1F8" w:color="auto" w:val="clear"/>
+            <w:tcMar>
+              <w:top w:type="dxa" w:w="70"/>
+              <w:left w:type="dxa" w:w="120"/>
+              <w:bottom w:type="dxa" w:w="70"/>
+              <w:right w:type="dxa" w:w="120"/>
+            </w:tcMar>
+            <w:vAlign w:val="center"/>
+          </w:tcPr>
+          <w:p>
+            <w:r>
+              <w:rPr>
+                <w:rFonts w:ascii="News Gothic MT" w:cs="News Gothic MT" w:eastAsia="News Gothic MT" w:hAnsi="News Gothic MT"/>
+                <w:b w:val="false"/>
+                <w:bCs w:val="false"/>
+                <w:i w:val="false"/>
+                <w:iCs w:val="false"/>
+                <w:color w:val="1A1A2E"/>
+                <w:sz w:val="19"/>
+                <w:szCs w:val="19"/>
+              </w:rPr>
+              <w:t xml:space="preserve">107</w:t>
+            </w:r>
+          </w:p>
+        </w:tc>
+        <w:tc>
+          <w:tcPr>
+            <w:tcW w:type="dxa" w:w="1200"/>
+            <w:shd w:fill="EEF1F8" w:color="auto" w:val="clear"/>
+            <w:tcMar>
+              <w:top w:type="dxa" w:w="70"/>
+              <w:left w:type="dxa" w:w="120"/>
+              <w:bottom w:type="dxa" w:w="70"/>
+              <w:right w:type="dxa" w:w="120"/>
+            </w:tcMar>
+            <w:vAlign w:val="center"/>
+          </w:tcPr>
+          <w:p>
+            <w:r>
+              <w:rPr>
+                <w:rFonts w:ascii="News Gothic MT" w:cs="News Gothic MT" w:eastAsia="News Gothic MT" w:hAnsi="News Gothic MT"/>
+                <w:b w:val="false"/>
+                <w:bCs w:val="false"/>
+                <w:i w:val="false"/>
+                <w:iCs w:val="false"/>
+                <w:color w:val="1A1A2E"/>
+                <w:sz w:val="19"/>
+                <w:szCs w:val="19"/>
+              </w:rPr>
+              <w:t xml:space="preserve">r</w:t>
+            </w:r>
+          </w:p>
+        </w:tc>
+        <w:tc>
+          <w:tcPr>
+            <w:tcW w:type="dxa" w:w="1000"/>
+            <w:shd w:fill="EEF1F8" w:color="auto" w:val="clear"/>
+            <w:tcMar>
+              <w:top w:type="dxa" w:w="70"/>
+              <w:left w:type="dxa" w:w="120"/>
+              <w:bottom w:type="dxa" w:w="70"/>
+              <w:right w:type="dxa" w:w="120"/>
+            </w:tcMar>
+            <w:vAlign w:val="center"/>
+          </w:tcPr>
+          <w:p>
+            <w:r>
+              <w:rPr>
+                <w:rFonts w:ascii="News Gothic MT" w:cs="News Gothic MT" w:eastAsia="News Gothic MT" w:hAnsi="News Gothic MT"/>
+                <w:b w:val="false"/>
+                <w:bCs w:val="false"/>
+                <w:i w:val="false"/>
+                <w:iCs w:val="false"/>
+                <w:color w:val="1A1A2E"/>
+                <w:sz w:val="19"/>
+                <w:szCs w:val="19"/>
+              </w:rPr>
+              <w:t xml:space="preserve">114</w:t>
+            </w:r>
+          </w:p>
+        </w:tc>
+        <w:tc>
+          <w:tcPr>
+            <w:tcW w:type="dxa" w:w="1200"/>
+            <w:shd w:fill="EEF1F8" w:color="auto" w:val="clear"/>
+            <w:tcMar>
+              <w:top w:type="dxa" w:w="70"/>
+              <w:left w:type="dxa" w:w="120"/>
+              <w:bottom w:type="dxa" w:w="70"/>
+              <w:right w:type="dxa" w:w="120"/>
+            </w:tcMar>
+            <w:vAlign w:val="center"/>
+          </w:tcPr>
+          <w:p>
+            <w:r>
+              <w:rPr>
+                <w:rFonts w:ascii="News Gothic MT" w:cs="News Gothic MT" w:eastAsia="News Gothic MT" w:hAnsi="News Gothic MT"/>
+                <w:b w:val="false"/>
+                <w:bCs w:val="false"/>
+                <w:i w:val="false"/>
+                <w:iCs w:val="false"/>
+                <w:color w:val="1A1A2E"/>
+                <w:sz w:val="19"/>
+                <w:szCs w:val="19"/>
+              </w:rPr>
+              <w:t xml:space="preserve">y</w:t>
+            </w:r>
+          </w:p>
+        </w:tc>
+        <w:tc>
+          <w:tcPr>
+            <w:tcW w:type="dxa" w:w="1038"/>
+            <w:shd w:fill="EEF1F8" w:color="auto" w:val="clear"/>
+            <w:tcMar>
+              <w:top w:type="dxa" w:w="70"/>
+              <w:left w:type="dxa" w:w="120"/>
+              <w:bottom w:type="dxa" w:w="70"/>
+              <w:right w:type="dxa" w:w="120"/>
+            </w:tcMar>
+            <w:vAlign w:val="center"/>
+          </w:tcPr>
+          <w:p>
+            <w:r>
+              <w:rPr>
+                <w:rFonts w:ascii="News Gothic MT" w:cs="News Gothic MT" w:eastAsia="News Gothic MT" w:hAnsi="News Gothic MT"/>
+                <w:b w:val="false"/>
+                <w:bCs w:val="false"/>
+                <w:i w:val="false"/>
+                <w:iCs w:val="false"/>
+                <w:color w:val="1A1A2E"/>
+                <w:sz w:val="19"/>
+                <w:szCs w:val="19"/>
+              </w:rPr>
+              <w:t xml:space="preserve">121</w:t>
+            </w:r>
+          </w:p>
+        </w:tc>
+      </w:tr>
+      <w:tr>
+        <w:tc>
+          <w:tcPr>
+            <w:tcW w:type="dxa" w:w="1200"/>
+            <w:shd w:fill="FFFFFF" w:color="auto" w:val="clear"/>
+            <w:tcMar>
+              <w:top w:type="dxa" w:w="70"/>
+              <w:left w:type="dxa" w:w="120"/>
+              <w:bottom w:type="dxa" w:w="70"/>
+              <w:right w:type="dxa" w:w="120"/>
+            </w:tcMar>
+            <w:vAlign w:val="center"/>
+          </w:tcPr>
+          <w:p>
+            <w:r>
+              <w:rPr>
+                <w:rFonts w:ascii="News Gothic MT" w:cs="News Gothic MT" w:eastAsia="News Gothic MT" w:hAnsi="News Gothic MT"/>
+                <w:b w:val="false"/>
+                <w:bCs w:val="false"/>
+                <w:i w:val="false"/>
+                <w:iCs w:val="false"/>
+                <w:color w:val="1A1A2E"/>
+                <w:sz w:val="19"/>
+                <w:szCs w:val="19"/>
+              </w:rPr>
+              <w:t xml:space="preserve">e</w:t>
+            </w:r>
+          </w:p>
+        </w:tc>
+        <w:tc>
+          <w:tcPr>
+            <w:tcW w:type="dxa" w:w="1000"/>
+            <w:shd w:fill="FFFFFF" w:color="auto" w:val="clear"/>
+            <w:tcMar>
+              <w:top w:type="dxa" w:w="70"/>
+              <w:left w:type="dxa" w:w="120"/>
+              <w:bottom w:type="dxa" w:w="70"/>
+              <w:right w:type="dxa" w:w="120"/>
+            </w:tcMar>
+            <w:vAlign w:val="center"/>
+          </w:tcPr>
+          <w:p>
+            <w:r>
+              <w:rPr>
+                <w:rFonts w:ascii="News Gothic MT" w:cs="News Gothic MT" w:eastAsia="News Gothic MT" w:hAnsi="News Gothic MT"/>
+                <w:b w:val="false"/>
+                <w:bCs w:val="false"/>
+                <w:i w:val="false"/>
+                <w:iCs w:val="false"/>
+                <w:color w:val="1A1A2E"/>
+                <w:sz w:val="19"/>
+                <w:szCs w:val="19"/>
+              </w:rPr>
+              <w:t xml:space="preserve">101</w:t>
+            </w:r>
+          </w:p>
+        </w:tc>
+        <w:tc>
+          <w:tcPr>
+            <w:tcW w:type="dxa" w:w="1200"/>
+            <w:shd w:fill="FFFFFF" w:color="auto" w:val="clear"/>
+            <w:tcMar>
+              <w:top w:type="dxa" w:w="70"/>
+              <w:left w:type="dxa" w:w="120"/>
+              <w:bottom w:type="dxa" w:w="70"/>
+              <w:right w:type="dxa" w:w="120"/>
+            </w:tcMar>
+            <w:vAlign w:val="center"/>
+          </w:tcPr>
+          <w:p>
+            <w:r>
+              <w:rPr>
+                <w:rFonts w:ascii="News Gothic MT" w:cs="News Gothic MT" w:eastAsia="News Gothic MT" w:hAnsi="News Gothic MT"/>
+                <w:b w:val="false"/>
+                <w:bCs w:val="false"/>
+                <w:i w:val="false"/>
+                <w:iCs w:val="false"/>
+                <w:color w:val="1A1A2E"/>
+                <w:sz w:val="19"/>
+                <w:szCs w:val="19"/>
+              </w:rPr>
+              <w:t xml:space="preserve">l</w:t>
+            </w:r>
+          </w:p>
+        </w:tc>
+        <w:tc>
+          <w:tcPr>
+            <w:tcW w:type="dxa" w:w="1000"/>
+            <w:shd w:fill="FFFFFF" w:color="auto" w:val="clear"/>
+            <w:tcMar>
+              <w:top w:type="dxa" w:w="70"/>
+              <w:left w:type="dxa" w:w="120"/>
+              <w:bottom w:type="dxa" w:w="70"/>
+              <w:right w:type="dxa" w:w="120"/>
+            </w:tcMar>
+            <w:vAlign w:val="center"/>
+          </w:tcPr>
+          <w:p>
+            <w:r>
+              <w:rPr>
+                <w:rFonts w:ascii="News Gothic MT" w:cs="News Gothic MT" w:eastAsia="News Gothic MT" w:hAnsi="News Gothic MT"/>
+                <w:b w:val="false"/>
+                <w:bCs w:val="false"/>
+                <w:i w:val="false"/>
+                <w:iCs w:val="false"/>
+                <w:color w:val="1A1A2E"/>
+                <w:sz w:val="19"/>
+                <w:szCs w:val="19"/>
+              </w:rPr>
+              <w:t xml:space="preserve">108</w:t>
+            </w:r>
+          </w:p>
+        </w:tc>
+        <w:tc>
+          <w:tcPr>
+            <w:tcW w:type="dxa" w:w="1200"/>
+            <w:shd w:fill="FFFFFF" w:color="auto" w:val="clear"/>
+            <w:tcMar>
+              <w:top w:type="dxa" w:w="70"/>
+              <w:left w:type="dxa" w:w="120"/>
+              <w:bottom w:type="dxa" w:w="70"/>
+              <w:right w:type="dxa" w:w="120"/>
+            </w:tcMar>
+            <w:vAlign w:val="center"/>
+          </w:tcPr>
+          <w:p>
+            <w:r>
+              <w:rPr>
+                <w:rFonts w:ascii="News Gothic MT" w:cs="News Gothic MT" w:eastAsia="News Gothic MT" w:hAnsi="News Gothic MT"/>
+                <w:b w:val="false"/>
+                <w:bCs w:val="false"/>
+                <w:i w:val="false"/>
+                <w:iCs w:val="false"/>
+                <w:color w:val="1A1A2E"/>
+                <w:sz w:val="19"/>
+                <w:szCs w:val="19"/>
+              </w:rPr>
+              <w:t xml:space="preserve">s</w:t>
+            </w:r>
+          </w:p>
+        </w:tc>
+        <w:tc>
+          <w:tcPr>
+            <w:tcW w:type="dxa" w:w="1000"/>
+            <w:shd w:fill="FFFFFF" w:color="auto" w:val="clear"/>
+            <w:tcMar>
+              <w:top w:type="dxa" w:w="70"/>
+              <w:left w:type="dxa" w:w="120"/>
+              <w:bottom w:type="dxa" w:w="70"/>
+              <w:right w:type="dxa" w:w="120"/>
+            </w:tcMar>
+            <w:vAlign w:val="center"/>
+          </w:tcPr>
+          <w:p>
+            <w:r>
+              <w:rPr>
+                <w:rFonts w:ascii="News Gothic MT" w:cs="News Gothic MT" w:eastAsia="News Gothic MT" w:hAnsi="News Gothic MT"/>
+                <w:b w:val="false"/>
+                <w:bCs w:val="false"/>
+                <w:i w:val="false"/>
+                <w:iCs w:val="false"/>
+                <w:color w:val="1A1A2E"/>
+                <w:sz w:val="19"/>
+                <w:szCs w:val="19"/>
+              </w:rPr>
+              <w:t xml:space="preserve">115</w:t>
+            </w:r>
+          </w:p>
+        </w:tc>
+        <w:tc>
+          <w:tcPr>
+            <w:tcW w:type="dxa" w:w="1200"/>
+            <w:shd w:fill="FFFFFF" w:color="auto" w:val="clear"/>
+            <w:tcMar>
+              <w:top w:type="dxa" w:w="70"/>
+              <w:left w:type="dxa" w:w="120"/>
+              <w:bottom w:type="dxa" w:w="70"/>
+              <w:right w:type="dxa" w:w="120"/>
+            </w:tcMar>
+            <w:vAlign w:val="center"/>
+          </w:tcPr>
+          <w:p>
+            <w:r>
+              <w:rPr>
+                <w:rFonts w:ascii="News Gothic MT" w:cs="News Gothic MT" w:eastAsia="News Gothic MT" w:hAnsi="News Gothic MT"/>
+                <w:b w:val="false"/>
+                <w:bCs w:val="false"/>
+                <w:i w:val="false"/>
+                <w:iCs w:val="false"/>
+                <w:color w:val="1A1A2E"/>
+                <w:sz w:val="19"/>
+                <w:szCs w:val="19"/>
+              </w:rPr>
+              <w:t xml:space="preserve">z</w:t>
+            </w:r>
+          </w:p>
+        </w:tc>
+        <w:tc>
+          <w:tcPr>
+            <w:tcW w:type="dxa" w:w="1038"/>
+            <w:shd w:fill="FFFFFF" w:color="auto" w:val="clear"/>
+            <w:tcMar>
+              <w:top w:type="dxa" w:w="70"/>
+              <w:left w:type="dxa" w:w="120"/>
+              <w:bottom w:type="dxa" w:w="70"/>
+              <w:right w:type="dxa" w:w="120"/>
+            </w:tcMar>
+            <w:vAlign w:val="center"/>
+          </w:tcPr>
+          <w:p>
+            <w:r>
+              <w:rPr>
+                <w:rFonts w:ascii="News Gothic MT" w:cs="News Gothic MT" w:eastAsia="News Gothic MT" w:hAnsi="News Gothic MT"/>
+                <w:b w:val="false"/>
+                <w:bCs w:val="false"/>
+                <w:i w:val="false"/>
+                <w:iCs w:val="false"/>
+                <w:color w:val="1A1A2E"/>
+                <w:sz w:val="19"/>
+                <w:szCs w:val="19"/>
+              </w:rPr>
+              <w:t xml:space="preserve">122</w:t>
+            </w:r>
+          </w:p>
+        </w:tc>
+      </w:tr>
+      <w:tr>
+        <w:tc>
+          <w:tcPr>
+            <w:tcW w:type="dxa" w:w="1200"/>
+            <w:shd w:fill="EEF1F8" w:color="auto" w:val="clear"/>
+            <w:tcMar>
+              <w:top w:type="dxa" w:w="70"/>
+              <w:left w:type="dxa" w:w="120"/>
+              <w:bottom w:type="dxa" w:w="70"/>
+              <w:right w:type="dxa" w:w="120"/>
+            </w:tcMar>
+            <w:vAlign w:val="center"/>
+          </w:tcPr>
+          <w:p>
+            <w:r>
+              <w:rPr>
+                <w:rFonts w:ascii="News Gothic MT" w:cs="News Gothic MT" w:eastAsia="News Gothic MT" w:hAnsi="News Gothic MT"/>
+                <w:b w:val="false"/>
+                <w:bCs w:val="false"/>
+                <w:i w:val="false"/>
+                <w:iCs w:val="false"/>
+                <w:color w:val="1A1A2E"/>
+                <w:sz w:val="19"/>
+                <w:szCs w:val="19"/>
+              </w:rPr>
+              <w:t xml:space="preserve">f</w:t>
+            </w:r>
+          </w:p>
+        </w:tc>
+        <w:tc>
+          <w:tcPr>
+            <w:tcW w:type="dxa" w:w="1000"/>
+            <w:shd w:fill="EEF1F8" w:color="auto" w:val="clear"/>
+            <w:tcMar>
+              <w:top w:type="dxa" w:w="70"/>
+              <w:left w:type="dxa" w:w="120"/>
+              <w:bottom w:type="dxa" w:w="70"/>
+              <w:right w:type="dxa" w:w="120"/>
+            </w:tcMar>
+            <w:vAlign w:val="center"/>
+          </w:tcPr>
+          <w:p>
+            <w:r>
+              <w:rPr>
+                <w:rFonts w:ascii="News Gothic MT" w:cs="News Gothic MT" w:eastAsia="News Gothic MT" w:hAnsi="News Gothic MT"/>
+                <w:b w:val="false"/>
+                <w:bCs w:val="false"/>
+                <w:i w:val="false"/>
+                <w:iCs w:val="false"/>
+                <w:color w:val="1A1A2E"/>
+                <w:sz w:val="19"/>
+                <w:szCs w:val="19"/>
+              </w:rPr>
+              <w:t xml:space="preserve">102</w:t>
+            </w:r>
+          </w:p>
+        </w:tc>
+        <w:tc>
+          <w:tcPr>
+            <w:tcW w:type="dxa" w:w="1200"/>
+            <w:shd w:fill="EEF1F8" w:color="auto" w:val="clear"/>
+            <w:tcMar>
+              <w:top w:type="dxa" w:w="70"/>
+              <w:left w:type="dxa" w:w="120"/>
+              <w:bottom w:type="dxa" w:w="70"/>
+              <w:right w:type="dxa" w:w="120"/>
+            </w:tcMar>
+            <w:vAlign w:val="center"/>
+          </w:tcPr>
+          <w:p>
+            <w:r>
+              <w:rPr>
+                <w:rFonts w:ascii="News Gothic MT" w:cs="News Gothic MT" w:eastAsia="News Gothic MT" w:hAnsi="News Gothic MT"/>
+                <w:b w:val="false"/>
+                <w:bCs w:val="false"/>
+                <w:i w:val="false"/>
+                <w:iCs w:val="false"/>
+                <w:color w:val="1A1A2E"/>
+                <w:sz w:val="19"/>
+                <w:szCs w:val="19"/>
+              </w:rPr>
+              <w:t xml:space="preserve">m</w:t>
+            </w:r>
+          </w:p>
+        </w:tc>
+        <w:tc>
+          <w:tcPr>
+            <w:tcW w:type="dxa" w:w="1000"/>
+            <w:shd w:fill="EEF1F8" w:color="auto" w:val="clear"/>
+            <w:tcMar>
+              <w:top w:type="dxa" w:w="70"/>
+              <w:left w:type="dxa" w:w="120"/>
+              <w:bottom w:type="dxa" w:w="70"/>
+              <w:right w:type="dxa" w:w="120"/>
+            </w:tcMar>
+            <w:vAlign w:val="center"/>
+          </w:tcPr>
+          <w:p>
+            <w:r>
+              <w:rPr>
+                <w:rFonts w:ascii="News Gothic MT" w:cs="News Gothic MT" w:eastAsia="News Gothic MT" w:hAnsi="News Gothic MT"/>
+                <w:b w:val="false"/>
+                <w:bCs w:val="false"/>
+                <w:i w:val="false"/>
+                <w:iCs w:val="false"/>
+                <w:color w:val="1A1A2E"/>
+                <w:sz w:val="19"/>
+                <w:szCs w:val="19"/>
+              </w:rPr>
+              <w:t xml:space="preserve">109</w:t>
+            </w:r>
+          </w:p>
+        </w:tc>
+        <w:tc>
+          <w:tcPr>
+            <w:tcW w:type="dxa" w:w="1200"/>
+            <w:shd w:fill="EEF1F8" w:color="auto" w:val="clear"/>
+            <w:tcMar>
+              <w:top w:type="dxa" w:w="70"/>
+              <w:left w:type="dxa" w:w="120"/>
+              <w:bottom w:type="dxa" w:w="70"/>
+              <w:right w:type="dxa" w:w="120"/>
+            </w:tcMar>
+            <w:vAlign w:val="center"/>
+          </w:tcPr>
+          <w:p>
+            <w:r>
+              <w:rPr>
+                <w:rFonts w:ascii="News Gothic MT" w:cs="News Gothic MT" w:eastAsia="News Gothic MT" w:hAnsi="News Gothic MT"/>
+                <w:b w:val="false"/>
+                <w:bCs w:val="false"/>
+                <w:i w:val="false"/>
+                <w:iCs w:val="false"/>
+                <w:color w:val="1A1A2E"/>
+                <w:sz w:val="19"/>
+                <w:szCs w:val="19"/>
+              </w:rPr>
+              <w:t xml:space="preserve">t</w:t>
+            </w:r>
+          </w:p>
+        </w:tc>
+        <w:tc>
+          <w:tcPr>
+            <w:tcW w:type="dxa" w:w="1000"/>
+            <w:shd w:fill="EEF1F8" w:color="auto" w:val="clear"/>
+            <w:tcMar>
+              <w:top w:type="dxa" w:w="70"/>
+              <w:left w:type="dxa" w:w="120"/>
+              <w:bottom w:type="dxa" w:w="70"/>
+              <w:right w:type="dxa" w:w="120"/>
+            </w:tcMar>
+            <w:vAlign w:val="center"/>
+          </w:tcPr>
+          <w:p>
+            <w:r>
+              <w:rPr>
+                <w:rFonts w:ascii="News Gothic MT" w:cs="News Gothic MT" w:eastAsia="News Gothic MT" w:hAnsi="News Gothic MT"/>
+                <w:b w:val="false"/>
+                <w:bCs w:val="false"/>
+                <w:i w:val="false"/>
+                <w:iCs w:val="false"/>
+                <w:color w:val="1A1A2E"/>
+                <w:sz w:val="19"/>
+                <w:szCs w:val="19"/>
+              </w:rPr>
+              <w:t xml:space="preserve">116</w:t>
+            </w:r>
+          </w:p>
+        </w:tc>
+        <w:tc>
+          <w:tcPr>
+            <w:tcW w:type="dxa" w:w="1200"/>
+            <w:shd w:fill="EEF1F8" w:color="auto" w:val="clear"/>
+            <w:tcMar>
+              <w:top w:type="dxa" w:w="70"/>
+              <w:left w:type="dxa" w:w="120"/>
+              <w:bottom w:type="dxa" w:w="70"/>
+              <w:right w:type="dxa" w:w="120"/>
+            </w:tcMar>
+            <w:vAlign w:val="center"/>
+          </w:tcPr>
+          <w:p/>
+        </w:tc>
+        <w:tc>
+          <w:tcPr>
+            <w:tcW w:type="dxa" w:w="1038"/>
+            <w:shd w:fill="EEF1F8" w:color="auto" w:val="clear"/>
+            <w:tcMar>
+              <w:top w:type="dxa" w:w="70"/>
+              <w:left w:type="dxa" w:w="120"/>
+              <w:bottom w:type="dxa" w:w="70"/>
+              <w:right w:type="dxa" w:w="120"/>
+            </w:tcMar>
+            <w:vAlign w:val="center"/>
+          </w:tcPr>
+          <w:p/>
+        </w:tc>
+      </w:tr>
+      <w:tr>
+        <w:tc>
+          <w:tcPr>
+            <w:tcW w:type="dxa" w:w="1200"/>
+            <w:shd w:fill="FFFFFF" w:color="auto" w:val="clear"/>
+            <w:tcMar>
+              <w:top w:type="dxa" w:w="70"/>
+              <w:left w:type="dxa" w:w="120"/>
+              <w:bottom w:type="dxa" w:w="70"/>
+              <w:right w:type="dxa" w:w="120"/>
+            </w:tcMar>
+            <w:vAlign w:val="center"/>
+          </w:tcPr>
+          <w:p>
+            <w:r>
+              <w:rPr>
+                <w:rFonts w:ascii="News Gothic MT" w:cs="News Gothic MT" w:eastAsia="News Gothic MT" w:hAnsi="News Gothic MT"/>
+                <w:b w:val="false"/>
+                <w:bCs w:val="false"/>
+                <w:i w:val="false"/>
+                <w:iCs w:val="false"/>
+                <w:color w:val="1A1A2E"/>
+                <w:sz w:val="19"/>
+                <w:szCs w:val="19"/>
+              </w:rPr>
+              <w:t xml:space="preserve">g</w:t>
+            </w:r>
+          </w:p>
+        </w:tc>
+        <w:tc>
+          <w:tcPr>
+            <w:tcW w:type="dxa" w:w="1000"/>
+            <w:shd w:fill="FFFFFF" w:color="auto" w:val="clear"/>
+            <w:tcMar>
+              <w:top w:type="dxa" w:w="70"/>
+              <w:left w:type="dxa" w:w="120"/>
+              <w:bottom w:type="dxa" w:w="70"/>
+              <w:right w:type="dxa" w:w="120"/>
+            </w:tcMar>
+            <w:vAlign w:val="center"/>
+          </w:tcPr>
+          <w:p>
+            <w:r>
+              <w:rPr>
+                <w:rFonts w:ascii="News Gothic MT" w:cs="News Gothic MT" w:eastAsia="News Gothic MT" w:hAnsi="News Gothic MT"/>
+                <w:b w:val="false"/>
+                <w:bCs w:val="false"/>
+                <w:i w:val="false"/>
+                <w:iCs w:val="false"/>
+                <w:color w:val="1A1A2E"/>
+                <w:sz w:val="19"/>
+                <w:szCs w:val="19"/>
+              </w:rPr>
+              <w:t xml:space="preserve">103</w:t>
+            </w:r>
+          </w:p>
+        </w:tc>
+        <w:tc>
+          <w:tcPr>
+            <w:tcW w:type="dxa" w:w="1200"/>
+            <w:shd w:fill="FFFFFF" w:color="auto" w:val="clear"/>
+            <w:tcMar>
+              <w:top w:type="dxa" w:w="70"/>
+              <w:left w:type="dxa" w:w="120"/>
+              <w:bottom w:type="dxa" w:w="70"/>
+              <w:right w:type="dxa" w:w="120"/>
+            </w:tcMar>
+            <w:vAlign w:val="center"/>
+          </w:tcPr>
+          <w:p>
+            <w:r>
+              <w:rPr>
+                <w:rFonts w:ascii="News Gothic MT" w:cs="News Gothic MT" w:eastAsia="News Gothic MT" w:hAnsi="News Gothic MT"/>
+                <w:b w:val="false"/>
+                <w:bCs w:val="false"/>
+                <w:i w:val="false"/>
+                <w:iCs w:val="false"/>
+                <w:color w:val="1A1A2E"/>
+                <w:sz w:val="19"/>
+                <w:szCs w:val="19"/>
+              </w:rPr>
+              <w:t xml:space="preserve">n</w:t>
+            </w:r>
+          </w:p>
+        </w:tc>
+        <w:tc>
+          <w:tcPr>
+            <w:tcW w:type="dxa" w:w="1000"/>
+            <w:shd w:fill="FFFFFF" w:color="auto" w:val="clear"/>
+            <w:tcMar>
+              <w:top w:type="dxa" w:w="70"/>
+              <w:left w:type="dxa" w:w="120"/>
+              <w:bottom w:type="dxa" w:w="70"/>
+              <w:right w:type="dxa" w:w="120"/>
+            </w:tcMar>
+            <w:vAlign w:val="center"/>
+          </w:tcPr>
+          <w:p>
+            <w:r>
+              <w:rPr>
+                <w:rFonts w:ascii="News Gothic MT" w:cs="News Gothic MT" w:eastAsia="News Gothic MT" w:hAnsi="News Gothic MT"/>
+                <w:b w:val="false"/>
+                <w:bCs w:val="false"/>
+                <w:i w:val="false"/>
+                <w:iCs w:val="false"/>
+                <w:color w:val="1A1A2E"/>
+                <w:sz w:val="19"/>
+                <w:szCs w:val="19"/>
+              </w:rPr>
+              <w:t xml:space="preserve">110</w:t>
+            </w:r>
+          </w:p>
+        </w:tc>
+        <w:tc>
+          <w:tcPr>
+            <w:tcW w:type="dxa" w:w="1200"/>
+            <w:shd w:fill="FFFFFF" w:color="auto" w:val="clear"/>
+            <w:tcMar>
+              <w:top w:type="dxa" w:w="70"/>
+              <w:left w:type="dxa" w:w="120"/>
+              <w:bottom w:type="dxa" w:w="70"/>
+              <w:right w:type="dxa" w:w="120"/>
+            </w:tcMar>
+            <w:vAlign w:val="center"/>
+          </w:tcPr>
+          <w:p>
+            <w:r>
+              <w:rPr>
+                <w:rFonts w:ascii="News Gothic MT" w:cs="News Gothic MT" w:eastAsia="News Gothic MT" w:hAnsi="News Gothic MT"/>
+                <w:b w:val="false"/>
+                <w:bCs w:val="false"/>
+                <w:i w:val="false"/>
+                <w:iCs w:val="false"/>
+                <w:color w:val="1A1A2E"/>
+                <w:sz w:val="19"/>
+                <w:szCs w:val="19"/>
+              </w:rPr>
+              <w:t xml:space="preserve">u</w:t>
+            </w:r>
+          </w:p>
+        </w:tc>
+        <w:tc>
+          <w:tcPr>
+            <w:tcW w:type="dxa" w:w="1000"/>
+            <w:shd w:fill="FFFFFF" w:color="auto" w:val="clear"/>
+            <w:tcMar>
+              <w:top w:type="dxa" w:w="70"/>
+              <w:left w:type="dxa" w:w="120"/>
+              <w:bottom w:type="dxa" w:w="70"/>
+              <w:right w:type="dxa" w:w="120"/>
+            </w:tcMar>
+            <w:vAlign w:val="center"/>
+          </w:tcPr>
+          <w:p>
+            <w:r>
+              <w:rPr>
+                <w:rFonts w:ascii="News Gothic MT" w:cs="News Gothic MT" w:eastAsia="News Gothic MT" w:hAnsi="News Gothic MT"/>
+                <w:b w:val="false"/>
+                <w:bCs w:val="false"/>
+                <w:i w:val="false"/>
+                <w:iCs w:val="false"/>
+                <w:color w:val="1A1A2E"/>
+                <w:sz w:val="19"/>
+                <w:szCs w:val="19"/>
+              </w:rPr>
+              <w:t xml:space="preserve">117</w:t>
+            </w:r>
+          </w:p>
+        </w:tc>
+        <w:tc>
+          <w:tcPr>
+            <w:tcW w:type="dxa" w:w="1200"/>
+            <w:shd w:fill="FFFFFF" w:color="auto" w:val="clear"/>
+            <w:tcMar>
+              <w:top w:type="dxa" w:w="70"/>
+              <w:left w:type="dxa" w:w="120"/>
+              <w:bottom w:type="dxa" w:w="70"/>
+              <w:right w:type="dxa" w:w="120"/>
+            </w:tcMar>
+            <w:vAlign w:val="center"/>
+          </w:tcPr>
+          <w:p/>
+        </w:tc>
+        <w:tc>
+          <w:tcPr>
+            <w:tcW w:type="dxa" w:w="1038"/>
+            <w:shd w:fill="FFFFFF" w:color="auto" w:val="clear"/>
+            <w:tcMar>
+              <w:top w:type="dxa" w:w="70"/>
+              <w:left w:type="dxa" w:w="120"/>
+              <w:bottom w:type="dxa" w:w="70"/>
+              <w:right w:type="dxa" w:w="120"/>
+            </w:tcMar>
+            <w:vAlign w:val="center"/>
+          </w:tcPr>
+          <w:p/>
+        </w:tc>
+      </w:tr>
+    </w:tbl>
+    <w:p>
+      <w:pPr>
+        <w:spacing w:after="120"/>
+      </w:pPr>
+    </w:p>
+    <w:p>
+      <w:pPr>
+        <w:spacing w:after="160" w:line="300"/>
+        <w:jc w:val="both"/>
+      </w:pPr>
+      <w:r>
+        <w:rPr>
+          <w:rFonts w:ascii="News Gothic MT" w:cs="News Gothic MT" w:eastAsia="News Gothic MT" w:hAnsi="News Gothic MT"/>
+          <w:b/>
+          <w:bCs/>
+          <w:color w:val="1A1A2E"/>
+          <w:sz w:val="21"/>
+          <w:szCs w:val="21"/>
+        </w:rPr>
+        <w:t xml:space="preserve">Dígitos y símbolos habituales</w:t>
+      </w:r>
+    </w:p>
+    <w:tbl>
+      <w:tblPr>
+        <w:tblW w:type="dxa" w:w="8838"/>
+        <w:tblBorders>
+          <w:top w:val="single" w:color="D8DEEA" w:sz="4"/>
+          <w:left w:val="single" w:color="D8DEEA" w:sz="4"/>
+          <w:bottom w:val="single" w:color="D8DEEA" w:sz="4"/>
+          <w:right w:val="single" w:color="D8DEEA" w:sz="4"/>
+          <w:insideH w:val="single" w:color="D8DEEA" w:sz="4"/>
+          <w:insideV w:val="single" w:color="D8DEEA" w:sz="4"/>
+        </w:tblBorders>
+      </w:tblPr>
+      <w:tblGrid>
+        <w:gridCol w:w="1500"/>
+        <w:gridCol w:w="700"/>
+        <w:gridCol w:w="1500"/>
+        <w:gridCol w:w="700"/>
+        <w:gridCol w:w="1500"/>
+        <w:gridCol w:w="700"/>
+        <w:gridCol w:w="1500"/>
+        <w:gridCol w:w="738"/>
+      </w:tblGrid>
+      <w:tr>
+        <w:trPr>
+          <w:tblHeader/>
+        </w:trPr>
+        <w:tc>
+          <w:tcPr>
+            <w:tcW w:type="dxa" w:w="1500"/>
+            <w:shd w:fill="1F3864" w:color="auto" w:val="clear"/>
+            <w:tcMar>
+              <w:top w:type="dxa" w:w="80"/>
+              <w:left w:type="dxa" w:w="120"/>
+              <w:bottom w:type="dxa" w:w="80"/>
+              <w:right w:type="dxa" w:w="120"/>
+            </w:tcMar>
+            <w:vAlign w:val="center"/>
+          </w:tcPr>
+          <w:p>
+            <w:r>
+              <w:rPr>
+                <w:rFonts w:ascii="News Gothic MT" w:cs="News Gothic MT" w:eastAsia="News Gothic MT" w:hAnsi="News Gothic MT"/>
+                <w:b/>
+                <w:bCs/>
+                <w:color w:val="FFFFFF"/>
+                <w:sz w:val="19"/>
+                <w:szCs w:val="19"/>
+              </w:rPr>
+              <w:t xml:space="preserve">Carácter</w:t>
+            </w:r>
+          </w:p>
+        </w:tc>
+        <w:tc>
+          <w:tcPr>
+            <w:tcW w:type="dxa" w:w="700"/>
+            <w:shd w:fill="1F3864" w:color="auto" w:val="clear"/>
+            <w:tcMar>
+              <w:top w:type="dxa" w:w="80"/>
+              <w:left w:type="dxa" w:w="120"/>
+              <w:bottom w:type="dxa" w:w="80"/>
+              <w:right w:type="dxa" w:w="120"/>
+            </w:tcMar>
+            <w:vAlign w:val="center"/>
+          </w:tcPr>
+          <w:p>
+            <w:r>
+              <w:rPr>
+                <w:rFonts w:ascii="News Gothic MT" w:cs="News Gothic MT" w:eastAsia="News Gothic MT" w:hAnsi="News Gothic MT"/>
+                <w:b/>
+                <w:bCs/>
+                <w:color w:val="FFFFFF"/>
+                <w:sz w:val="19"/>
+                <w:szCs w:val="19"/>
+              </w:rPr>
+              <w:t xml:space="preserve">Dec</w:t>
+            </w:r>
+          </w:p>
+        </w:tc>
+        <w:tc>
+          <w:tcPr>
+            <w:tcW w:type="dxa" w:w="1500"/>
+            <w:shd w:fill="1F3864" w:color="auto" w:val="clear"/>
+            <w:tcMar>
+              <w:top w:type="dxa" w:w="80"/>
+              <w:left w:type="dxa" w:w="120"/>
+              <w:bottom w:type="dxa" w:w="80"/>
+              <w:right w:type="dxa" w:w="120"/>
+            </w:tcMar>
+            <w:vAlign w:val="center"/>
+          </w:tcPr>
+          <w:p>
+            <w:r>
+              <w:rPr>
+                <w:rFonts w:ascii="News Gothic MT" w:cs="News Gothic MT" w:eastAsia="News Gothic MT" w:hAnsi="News Gothic MT"/>
+                <w:b/>
+                <w:bCs/>
+                <w:color w:val="FFFFFF"/>
+                <w:sz w:val="19"/>
+                <w:szCs w:val="19"/>
+              </w:rPr>
+              <w:t xml:space="preserve">Carácter</w:t>
+            </w:r>
+          </w:p>
+        </w:tc>
+        <w:tc>
+          <w:tcPr>
+            <w:tcW w:type="dxa" w:w="700"/>
+            <w:shd w:fill="1F3864" w:color="auto" w:val="clear"/>
+            <w:tcMar>
+              <w:top w:type="dxa" w:w="80"/>
+              <w:left w:type="dxa" w:w="120"/>
+              <w:bottom w:type="dxa" w:w="80"/>
+              <w:right w:type="dxa" w:w="120"/>
+            </w:tcMar>
+            <w:vAlign w:val="center"/>
+          </w:tcPr>
+          <w:p>
+            <w:r>
+              <w:rPr>
+                <w:rFonts w:ascii="News Gothic MT" w:cs="News Gothic MT" w:eastAsia="News Gothic MT" w:hAnsi="News Gothic MT"/>
+                <w:b/>
+                <w:bCs/>
+                <w:color w:val="FFFFFF"/>
+                <w:sz w:val="19"/>
+                <w:szCs w:val="19"/>
+              </w:rPr>
+              <w:t xml:space="preserve">Dec</w:t>
+            </w:r>
+          </w:p>
+        </w:tc>
+        <w:tc>
+          <w:tcPr>
+            <w:tcW w:type="dxa" w:w="1500"/>
+            <w:shd w:fill="1F3864" w:color="auto" w:val="clear"/>
+            <w:tcMar>
+              <w:top w:type="dxa" w:w="80"/>
+              <w:left w:type="dxa" w:w="120"/>
+              <w:bottom w:type="dxa" w:w="80"/>
+              <w:right w:type="dxa" w:w="120"/>
+            </w:tcMar>
+            <w:vAlign w:val="center"/>
+          </w:tcPr>
+          <w:p>
+            <w:r>
+              <w:rPr>
+                <w:rFonts w:ascii="News Gothic MT" w:cs="News Gothic MT" w:eastAsia="News Gothic MT" w:hAnsi="News Gothic MT"/>
+                <w:b/>
+                <w:bCs/>
+                <w:color w:val="FFFFFF"/>
+                <w:sz w:val="19"/>
+                <w:szCs w:val="19"/>
+              </w:rPr>
+              <w:t xml:space="preserve">Carácter</w:t>
+            </w:r>
+          </w:p>
+        </w:tc>
+        <w:tc>
+          <w:tcPr>
+            <w:tcW w:type="dxa" w:w="700"/>
+            <w:shd w:fill="1F3864" w:color="auto" w:val="clear"/>
+            <w:tcMar>
+              <w:top w:type="dxa" w:w="80"/>
+              <w:left w:type="dxa" w:w="120"/>
+              <w:bottom w:type="dxa" w:w="80"/>
+              <w:right w:type="dxa" w:w="120"/>
+            </w:tcMar>
+            <w:vAlign w:val="center"/>
+          </w:tcPr>
+          <w:p>
+            <w:r>
+              <w:rPr>
+                <w:rFonts w:ascii="News Gothic MT" w:cs="News Gothic MT" w:eastAsia="News Gothic MT" w:hAnsi="News Gothic MT"/>
+                <w:b/>
+                <w:bCs/>
+                <w:color w:val="FFFFFF"/>
+                <w:sz w:val="19"/>
+                <w:szCs w:val="19"/>
+              </w:rPr>
+              <w:t xml:space="preserve">Dec</w:t>
+            </w:r>
+          </w:p>
+        </w:tc>
+        <w:tc>
+          <w:tcPr>
+            <w:tcW w:type="dxa" w:w="1500"/>
+            <w:shd w:fill="1F3864" w:color="auto" w:val="clear"/>
+            <w:tcMar>
+              <w:top w:type="dxa" w:w="80"/>
+              <w:left w:type="dxa" w:w="120"/>
+              <w:bottom w:type="dxa" w:w="80"/>
+              <w:right w:type="dxa" w:w="120"/>
+            </w:tcMar>
+            <w:vAlign w:val="center"/>
+          </w:tcPr>
+          <w:p>
+            <w:r>
+              <w:rPr>
+                <w:rFonts w:ascii="News Gothic MT" w:cs="News Gothic MT" w:eastAsia="News Gothic MT" w:hAnsi="News Gothic MT"/>
+                <w:b/>
+                <w:bCs/>
+                <w:color w:val="FFFFFF"/>
+                <w:sz w:val="19"/>
+                <w:szCs w:val="19"/>
+              </w:rPr>
+              <w:t xml:space="preserve">Carácter</w:t>
+            </w:r>
+          </w:p>
+        </w:tc>
+        <w:tc>
+          <w:tcPr>
+            <w:tcW w:type="dxa" w:w="738"/>
+            <w:shd w:fill="1F3864" w:color="auto" w:val="clear"/>
+            <w:tcMar>
+              <w:top w:type="dxa" w:w="80"/>
+              <w:left w:type="dxa" w:w="120"/>
+              <w:bottom w:type="dxa" w:w="80"/>
+              <w:right w:type="dxa" w:w="120"/>
+            </w:tcMar>
+            <w:vAlign w:val="center"/>
+          </w:tcPr>
+          <w:p>
+            <w:r>
+              <w:rPr>
+                <w:rFonts w:ascii="News Gothic MT" w:cs="News Gothic MT" w:eastAsia="News Gothic MT" w:hAnsi="News Gothic MT"/>
+                <w:b/>
+                <w:bCs/>
+                <w:color w:val="FFFFFF"/>
+                <w:sz w:val="19"/>
+                <w:szCs w:val="19"/>
+              </w:rPr>
+              <w:t xml:space="preserve">Dec</w:t>
+            </w:r>
+          </w:p>
+        </w:tc>
+      </w:tr>
+      <w:tr>
+        <w:tc>
+          <w:tcPr>
+            <w:tcW w:type="dxa" w:w="1500"/>
+            <w:shd w:fill="FFFFFF" w:color="auto" w:val="clear"/>
+            <w:tcMar>
+              <w:top w:type="dxa" w:w="70"/>
+              <w:left w:type="dxa" w:w="120"/>
+              <w:bottom w:type="dxa" w:w="70"/>
+              <w:right w:type="dxa" w:w="120"/>
+            </w:tcMar>
+            <w:vAlign w:val="center"/>
+          </w:tcPr>
+          <w:p>
+            <w:r>
+              <w:rPr>
+                <w:rFonts w:ascii="News Gothic MT" w:cs="News Gothic MT" w:eastAsia="News Gothic MT" w:hAnsi="News Gothic MT"/>
+                <w:b w:val="false"/>
+                <w:bCs w:val="false"/>
+                <w:i w:val="false"/>
+                <w:iCs w:val="false"/>
+                <w:color w:val="1A1A2E"/>
+                <w:sz w:val="19"/>
+                <w:szCs w:val="19"/>
+              </w:rPr>
+              <w:t xml:space="preserve">(espacio)</w:t>
+            </w:r>
+          </w:p>
+        </w:tc>
+        <w:tc>
+          <w:tcPr>
+            <w:tcW w:type="dxa" w:w="700"/>
+            <w:shd w:fill="FFFFFF" w:color="auto" w:val="clear"/>
+            <w:tcMar>
+              <w:top w:type="dxa" w:w="70"/>
+              <w:left w:type="dxa" w:w="120"/>
+              <w:bottom w:type="dxa" w:w="70"/>
+              <w:right w:type="dxa" w:w="120"/>
+            </w:tcMar>
+            <w:vAlign w:val="center"/>
+          </w:tcPr>
+          <w:p>
+            <w:r>
+              <w:rPr>
+                <w:rFonts w:ascii="News Gothic MT" w:cs="News Gothic MT" w:eastAsia="News Gothic MT" w:hAnsi="News Gothic MT"/>
+                <w:b w:val="false"/>
+                <w:bCs w:val="false"/>
+                <w:i w:val="false"/>
+                <w:iCs w:val="false"/>
+                <w:color w:val="1A1A2E"/>
+                <w:sz w:val="19"/>
+                <w:szCs w:val="19"/>
+              </w:rPr>
+              <w:t xml:space="preserve">32</w:t>
+            </w:r>
+          </w:p>
+        </w:tc>
+        <w:tc>
+          <w:tcPr>
+            <w:tcW w:type="dxa" w:w="1500"/>
+            <w:shd w:fill="FFFFFF" w:color="auto" w:val="clear"/>
+            <w:tcMar>
+              <w:top w:type="dxa" w:w="70"/>
+              <w:left w:type="dxa" w:w="120"/>
+              <w:bottom w:type="dxa" w:w="70"/>
+              <w:right w:type="dxa" w:w="120"/>
+            </w:tcMar>
+            <w:vAlign w:val="center"/>
+          </w:tcPr>
+          <w:p>
+            <w:r>
+              <w:rPr>
+                <w:rFonts w:ascii="News Gothic MT" w:cs="News Gothic MT" w:eastAsia="News Gothic MT" w:hAnsi="News Gothic MT"/>
+                <w:b w:val="false"/>
+                <w:bCs w:val="false"/>
+                <w:i w:val="false"/>
+                <w:iCs w:val="false"/>
+                <w:color w:val="1A1A2E"/>
+                <w:sz w:val="19"/>
+                <w:szCs w:val="19"/>
+              </w:rPr>
+              <w:t xml:space="preserve">3</w:t>
+            </w:r>
+          </w:p>
+        </w:tc>
+        <w:tc>
+          <w:tcPr>
+            <w:tcW w:type="dxa" w:w="700"/>
+            <w:shd w:fill="FFFFFF" w:color="auto" w:val="clear"/>
+            <w:tcMar>
+              <w:top w:type="dxa" w:w="70"/>
+              <w:left w:type="dxa" w:w="120"/>
+              <w:bottom w:type="dxa" w:w="70"/>
+              <w:right w:type="dxa" w:w="120"/>
+            </w:tcMar>
+            <w:vAlign w:val="center"/>
+          </w:tcPr>
+          <w:p>
+            <w:r>
+              <w:rPr>
+                <w:rFonts w:ascii="News Gothic MT" w:cs="News Gothic MT" w:eastAsia="News Gothic MT" w:hAnsi="News Gothic MT"/>
+                <w:b w:val="false"/>
+                <w:bCs w:val="false"/>
+                <w:i w:val="false"/>
+                <w:iCs w:val="false"/>
+                <w:color w:val="1A1A2E"/>
+                <w:sz w:val="19"/>
+                <w:szCs w:val="19"/>
+              </w:rPr>
+              <w:t xml:space="preserve">51</w:t>
+            </w:r>
+          </w:p>
+        </w:tc>
+        <w:tc>
+          <w:tcPr>
+            <w:tcW w:type="dxa" w:w="1500"/>
+            <w:shd w:fill="FFFFFF" w:color="auto" w:val="clear"/>
+            <w:tcMar>
+              <w:top w:type="dxa" w:w="70"/>
+              <w:left w:type="dxa" w:w="120"/>
+              <w:bottom w:type="dxa" w:w="70"/>
+              <w:right w:type="dxa" w:w="120"/>
+            </w:tcMar>
+            <w:vAlign w:val="center"/>
+          </w:tcPr>
+          <w:p>
+            <w:r>
+              <w:rPr>
+                <w:rFonts w:ascii="News Gothic MT" w:cs="News Gothic MT" w:eastAsia="News Gothic MT" w:hAnsi="News Gothic MT"/>
+                <w:b w:val="false"/>
+                <w:bCs w:val="false"/>
+                <w:i w:val="false"/>
+                <w:iCs w:val="false"/>
+                <w:color w:val="1A1A2E"/>
+                <w:sz w:val="19"/>
+                <w:szCs w:val="19"/>
+              </w:rPr>
+              <w:t xml:space="preserve">6</w:t>
+            </w:r>
+          </w:p>
+        </w:tc>
+        <w:tc>
+          <w:tcPr>
+            <w:tcW w:type="dxa" w:w="700"/>
+            <w:shd w:fill="FFFFFF" w:color="auto" w:val="clear"/>
+            <w:tcMar>
+              <w:top w:type="dxa" w:w="70"/>
+              <w:left w:type="dxa" w:w="120"/>
+              <w:bottom w:type="dxa" w:w="70"/>
+              <w:right w:type="dxa" w:w="120"/>
+            </w:tcMar>
+            <w:vAlign w:val="center"/>
+          </w:tcPr>
+          <w:p>
+            <w:r>
+              <w:rPr>
+                <w:rFonts w:ascii="News Gothic MT" w:cs="News Gothic MT" w:eastAsia="News Gothic MT" w:hAnsi="News Gothic MT"/>
+                <w:b w:val="false"/>
+                <w:bCs w:val="false"/>
+                <w:i w:val="false"/>
+                <w:iCs w:val="false"/>
+                <w:color w:val="1A1A2E"/>
+                <w:sz w:val="19"/>
+                <w:szCs w:val="19"/>
+              </w:rPr>
+              <w:t xml:space="preserve">54</w:t>
+            </w:r>
+          </w:p>
+        </w:tc>
+        <w:tc>
+          <w:tcPr>
+            <w:tcW w:type="dxa" w:w="1500"/>
+            <w:shd w:fill="FFFFFF" w:color="auto" w:val="clear"/>
+            <w:tcMar>
+              <w:top w:type="dxa" w:w="70"/>
+              <w:left w:type="dxa" w:w="120"/>
+              <w:bottom w:type="dxa" w:w="70"/>
+              <w:right w:type="dxa" w:w="120"/>
+            </w:tcMar>
+            <w:vAlign w:val="center"/>
+          </w:tcPr>
+          <w:p>
+            <w:r>
+              <w:rPr>
+                <w:rFonts w:ascii="News Gothic MT" w:cs="News Gothic MT" w:eastAsia="News Gothic MT" w:hAnsi="News Gothic MT"/>
+                <w:b w:val="false"/>
+                <w:bCs w:val="false"/>
+                <w:i w:val="false"/>
+                <w:iCs w:val="false"/>
+                <w:color w:val="1A1A2E"/>
+                <w:sz w:val="19"/>
+                <w:szCs w:val="19"/>
+              </w:rPr>
+              <w:t xml:space="preserve">9</w:t>
+            </w:r>
+          </w:p>
+        </w:tc>
+        <w:tc>
+          <w:tcPr>
+            <w:tcW w:type="dxa" w:w="738"/>
+            <w:shd w:fill="FFFFFF" w:color="auto" w:val="clear"/>
+            <w:tcMar>
+              <w:top w:type="dxa" w:w="70"/>
+              <w:left w:type="dxa" w:w="120"/>
+              <w:bottom w:type="dxa" w:w="70"/>
+              <w:right w:type="dxa" w:w="120"/>
+            </w:tcMar>
+            <w:vAlign w:val="center"/>
+          </w:tcPr>
+          <w:p>
+            <w:r>
+              <w:rPr>
+                <w:rFonts w:ascii="News Gothic MT" w:cs="News Gothic MT" w:eastAsia="News Gothic MT" w:hAnsi="News Gothic MT"/>
+                <w:b w:val="false"/>
+                <w:bCs w:val="false"/>
+                <w:i w:val="false"/>
+                <w:iCs w:val="false"/>
+                <w:color w:val="1A1A2E"/>
+                <w:sz w:val="19"/>
+                <w:szCs w:val="19"/>
+              </w:rPr>
+              <w:t xml:space="preserve">57</w:t>
+            </w:r>
+          </w:p>
+        </w:tc>
+      </w:tr>
+      <w:tr>
+        <w:tc>
+          <w:tcPr>
+            <w:tcW w:type="dxa" w:w="1500"/>
+            <w:shd w:fill="EEF1F8" w:color="auto" w:val="clear"/>
+            <w:tcMar>
+              <w:top w:type="dxa" w:w="70"/>
+              <w:left w:type="dxa" w:w="120"/>
+              <w:bottom w:type="dxa" w:w="70"/>
+              <w:right w:type="dxa" w:w="120"/>
+            </w:tcMar>
+            <w:vAlign w:val="center"/>
+          </w:tcPr>
+          <w:p>
+            <w:r>
+              <w:rPr>
+                <w:rFonts w:ascii="News Gothic MT" w:cs="News Gothic MT" w:eastAsia="News Gothic MT" w:hAnsi="News Gothic MT"/>
+                <w:b w:val="false"/>
+                <w:bCs w:val="false"/>
+                <w:i w:val="false"/>
+                <w:iCs w:val="false"/>
+                <w:color w:val="1A1A2E"/>
+                <w:sz w:val="19"/>
+                <w:szCs w:val="19"/>
+              </w:rPr>
+              <w:t xml:space="preserve">0</w:t>
+            </w:r>
+          </w:p>
+        </w:tc>
+        <w:tc>
+          <w:tcPr>
+            <w:tcW w:type="dxa" w:w="700"/>
+            <w:shd w:fill="EEF1F8" w:color="auto" w:val="clear"/>
+            <w:tcMar>
+              <w:top w:type="dxa" w:w="70"/>
+              <w:left w:type="dxa" w:w="120"/>
+              <w:bottom w:type="dxa" w:w="70"/>
+              <w:right w:type="dxa" w:w="120"/>
+            </w:tcMar>
+            <w:vAlign w:val="center"/>
+          </w:tcPr>
+          <w:p>
+            <w:r>
+              <w:rPr>
+                <w:rFonts w:ascii="News Gothic MT" w:cs="News Gothic MT" w:eastAsia="News Gothic MT" w:hAnsi="News Gothic MT"/>
+                <w:b w:val="false"/>
+                <w:bCs w:val="false"/>
+                <w:i w:val="false"/>
+                <w:iCs w:val="false"/>
+                <w:color w:val="1A1A2E"/>
+                <w:sz w:val="19"/>
+                <w:szCs w:val="19"/>
+              </w:rPr>
+              <w:t xml:space="preserve">48</w:t>
+            </w:r>
+          </w:p>
+        </w:tc>
+        <w:tc>
+          <w:tcPr>
+            <w:tcW w:type="dxa" w:w="1500"/>
+            <w:shd w:fill="EEF1F8" w:color="auto" w:val="clear"/>
+            <w:tcMar>
+              <w:top w:type="dxa" w:w="70"/>
+              <w:left w:type="dxa" w:w="120"/>
+              <w:bottom w:type="dxa" w:w="70"/>
+              <w:right w:type="dxa" w:w="120"/>
+            </w:tcMar>
+            <w:vAlign w:val="center"/>
+          </w:tcPr>
+          <w:p>
+            <w:r>
+              <w:rPr>
+                <w:rFonts w:ascii="News Gothic MT" w:cs="News Gothic MT" w:eastAsia="News Gothic MT" w:hAnsi="News Gothic MT"/>
+                <w:b w:val="false"/>
+                <w:bCs w:val="false"/>
+                <w:i w:val="false"/>
+                <w:iCs w:val="false"/>
+                <w:color w:val="1A1A2E"/>
+                <w:sz w:val="19"/>
+                <w:szCs w:val="19"/>
+              </w:rPr>
+              <w:t xml:space="preserve">4</w:t>
+            </w:r>
+          </w:p>
+        </w:tc>
+        <w:tc>
+          <w:tcPr>
+            <w:tcW w:type="dxa" w:w="700"/>
+            <w:shd w:fill="EEF1F8" w:color="auto" w:val="clear"/>
+            <w:tcMar>
+              <w:top w:type="dxa" w:w="70"/>
+              <w:left w:type="dxa" w:w="120"/>
+              <w:bottom w:type="dxa" w:w="70"/>
+              <w:right w:type="dxa" w:w="120"/>
+            </w:tcMar>
+            <w:vAlign w:val="center"/>
+          </w:tcPr>
+          <w:p>
+            <w:r>
+              <w:rPr>
+                <w:rFonts w:ascii="News Gothic MT" w:cs="News Gothic MT" w:eastAsia="News Gothic MT" w:hAnsi="News Gothic MT"/>
+                <w:b w:val="false"/>
+                <w:bCs w:val="false"/>
+                <w:i w:val="false"/>
+                <w:iCs w:val="false"/>
+                <w:color w:val="1A1A2E"/>
+                <w:sz w:val="19"/>
+                <w:szCs w:val="19"/>
+              </w:rPr>
+              <w:t xml:space="preserve">52</w:t>
+            </w:r>
+          </w:p>
+        </w:tc>
+        <w:tc>
+          <w:tcPr>
+            <w:tcW w:type="dxa" w:w="1500"/>
+            <w:shd w:fill="EEF1F8" w:color="auto" w:val="clear"/>
+            <w:tcMar>
+              <w:top w:type="dxa" w:w="70"/>
+              <w:left w:type="dxa" w:w="120"/>
+              <w:bottom w:type="dxa" w:w="70"/>
+              <w:right w:type="dxa" w:w="120"/>
+            </w:tcMar>
+            <w:vAlign w:val="center"/>
+          </w:tcPr>
+          <w:p>
+            <w:r>
+              <w:rPr>
+                <w:rFonts w:ascii="News Gothic MT" w:cs="News Gothic MT" w:eastAsia="News Gothic MT" w:hAnsi="News Gothic MT"/>
+                <w:b w:val="false"/>
+                <w:bCs w:val="false"/>
+                <w:i w:val="false"/>
+                <w:iCs w:val="false"/>
+                <w:color w:val="1A1A2E"/>
+                <w:sz w:val="19"/>
+                <w:szCs w:val="19"/>
+              </w:rPr>
+              <w:t xml:space="preserve">7</w:t>
+            </w:r>
+          </w:p>
+        </w:tc>
+        <w:tc>
+          <w:tcPr>
+            <w:tcW w:type="dxa" w:w="700"/>
+            <w:shd w:fill="EEF1F8" w:color="auto" w:val="clear"/>
+            <w:tcMar>
+              <w:top w:type="dxa" w:w="70"/>
+              <w:left w:type="dxa" w:w="120"/>
+              <w:bottom w:type="dxa" w:w="70"/>
+              <w:right w:type="dxa" w:w="120"/>
+            </w:tcMar>
+            <w:vAlign w:val="center"/>
+          </w:tcPr>
+          <w:p>
+            <w:r>
+              <w:rPr>
+                <w:rFonts w:ascii="News Gothic MT" w:cs="News Gothic MT" w:eastAsia="News Gothic MT" w:hAnsi="News Gothic MT"/>
+                <w:b w:val="false"/>
+                <w:bCs w:val="false"/>
+                <w:i w:val="false"/>
+                <w:iCs w:val="false"/>
+                <w:color w:val="1A1A2E"/>
+                <w:sz w:val="19"/>
+                <w:szCs w:val="19"/>
+              </w:rPr>
+              <w:t xml:space="preserve">55</w:t>
+            </w:r>
+          </w:p>
+        </w:tc>
+        <w:tc>
+          <w:tcPr>
+            <w:tcW w:type="dxa" w:w="1500"/>
+            <w:shd w:fill="EEF1F8" w:color="auto" w:val="clear"/>
+            <w:tcMar>
+              <w:top w:type="dxa" w:w="70"/>
+              <w:left w:type="dxa" w:w="120"/>
+              <w:bottom w:type="dxa" w:w="70"/>
+              <w:right w:type="dxa" w:w="120"/>
+            </w:tcMar>
+            <w:vAlign w:val="center"/>
+          </w:tcPr>
+          <w:p>
+            <w:r>
+              <w:rPr>
+                <w:rFonts w:ascii="News Gothic MT" w:cs="News Gothic MT" w:eastAsia="News Gothic MT" w:hAnsi="News Gothic MT"/>
+                <w:b w:val="false"/>
+                <w:bCs w:val="false"/>
+                <w:i w:val="false"/>
+                <w:iCs w:val="false"/>
+                <w:color w:val="1A1A2E"/>
+                <w:sz w:val="19"/>
+                <w:szCs w:val="19"/>
+              </w:rPr>
+              <w:t xml:space="preserve">.</w:t>
+            </w:r>
+          </w:p>
+        </w:tc>
+        <w:tc>
+          <w:tcPr>
+            <w:tcW w:type="dxa" w:w="738"/>
+            <w:shd w:fill="EEF1F8" w:color="auto" w:val="clear"/>
+            <w:tcMar>
+              <w:top w:type="dxa" w:w="70"/>
+              <w:left w:type="dxa" w:w="120"/>
+              <w:bottom w:type="dxa" w:w="70"/>
+              <w:right w:type="dxa" w:w="120"/>
+            </w:tcMar>
+            <w:vAlign w:val="center"/>
+          </w:tcPr>
+          <w:p>
+            <w:r>
+              <w:rPr>
+                <w:rFonts w:ascii="News Gothic MT" w:cs="News Gothic MT" w:eastAsia="News Gothic MT" w:hAnsi="News Gothic MT"/>
+                <w:b w:val="false"/>
+                <w:bCs w:val="false"/>
+                <w:i w:val="false"/>
+                <w:iCs w:val="false"/>
+                <w:color w:val="1A1A2E"/>
+                <w:sz w:val="19"/>
+                <w:szCs w:val="19"/>
+              </w:rPr>
+              <w:t xml:space="preserve">46</w:t>
+            </w:r>
+          </w:p>
+        </w:tc>
+      </w:tr>
+      <w:tr>
+        <w:tc>
+          <w:tcPr>
+            <w:tcW w:type="dxa" w:w="1500"/>
+            <w:shd w:fill="FFFFFF" w:color="auto" w:val="clear"/>
+            <w:tcMar>
+              <w:top w:type="dxa" w:w="70"/>
+              <w:left w:type="dxa" w:w="120"/>
+              <w:bottom w:type="dxa" w:w="70"/>
+              <w:right w:type="dxa" w:w="120"/>
+            </w:tcMar>
+            <w:vAlign w:val="center"/>
+          </w:tcPr>
+          <w:p>
+            <w:r>
+              <w:rPr>
+                <w:rFonts w:ascii="News Gothic MT" w:cs="News Gothic MT" w:eastAsia="News Gothic MT" w:hAnsi="News Gothic MT"/>
+                <w:b w:val="false"/>
+                <w:bCs w:val="false"/>
+                <w:i w:val="false"/>
+                <w:iCs w:val="false"/>
+                <w:color w:val="1A1A2E"/>
+                <w:sz w:val="19"/>
+                <w:szCs w:val="19"/>
+              </w:rPr>
+              <w:t xml:space="preserve">1</w:t>
+            </w:r>
+          </w:p>
+        </w:tc>
+        <w:tc>
+          <w:tcPr>
+            <w:tcW w:type="dxa" w:w="700"/>
+            <w:shd w:fill="FFFFFF" w:color="auto" w:val="clear"/>
+            <w:tcMar>
+              <w:top w:type="dxa" w:w="70"/>
+              <w:left w:type="dxa" w:w="120"/>
+              <w:bottom w:type="dxa" w:w="70"/>
+              <w:right w:type="dxa" w:w="120"/>
+            </w:tcMar>
+            <w:vAlign w:val="center"/>
+          </w:tcPr>
+          <w:p>
+            <w:r>
+              <w:rPr>
+                <w:rFonts w:ascii="News Gothic MT" w:cs="News Gothic MT" w:eastAsia="News Gothic MT" w:hAnsi="News Gothic MT"/>
+                <w:b w:val="false"/>
+                <w:bCs w:val="false"/>
+                <w:i w:val="false"/>
+                <w:iCs w:val="false"/>
+                <w:color w:val="1A1A2E"/>
+                <w:sz w:val="19"/>
+                <w:szCs w:val="19"/>
+              </w:rPr>
+              <w:t xml:space="preserve">49</w:t>
+            </w:r>
+          </w:p>
+        </w:tc>
+        <w:tc>
+          <w:tcPr>
+            <w:tcW w:type="dxa" w:w="1500"/>
+            <w:shd w:fill="FFFFFF" w:color="auto" w:val="clear"/>
+            <w:tcMar>
+              <w:top w:type="dxa" w:w="70"/>
+              <w:left w:type="dxa" w:w="120"/>
+              <w:bottom w:type="dxa" w:w="70"/>
+              <w:right w:type="dxa" w:w="120"/>
+            </w:tcMar>
+            <w:vAlign w:val="center"/>
+          </w:tcPr>
+          <w:p>
+            <w:r>
+              <w:rPr>
+                <w:rFonts w:ascii="News Gothic MT" w:cs="News Gothic MT" w:eastAsia="News Gothic MT" w:hAnsi="News Gothic MT"/>
+                <w:b w:val="false"/>
+                <w:bCs w:val="false"/>
+                <w:i w:val="false"/>
+                <w:iCs w:val="false"/>
+                <w:color w:val="1A1A2E"/>
+                <w:sz w:val="19"/>
+                <w:szCs w:val="19"/>
+              </w:rPr>
+              <w:t xml:space="preserve">5</w:t>
+            </w:r>
+          </w:p>
+        </w:tc>
+        <w:tc>
+          <w:tcPr>
+            <w:tcW w:type="dxa" w:w="700"/>
+            <w:shd w:fill="FFFFFF" w:color="auto" w:val="clear"/>
+            <w:tcMar>
+              <w:top w:type="dxa" w:w="70"/>
+              <w:left w:type="dxa" w:w="120"/>
+              <w:bottom w:type="dxa" w:w="70"/>
+              <w:right w:type="dxa" w:w="120"/>
+            </w:tcMar>
+            <w:vAlign w:val="center"/>
+          </w:tcPr>
+          <w:p>
+            <w:r>
+              <w:rPr>
+                <w:rFonts w:ascii="News Gothic MT" w:cs="News Gothic MT" w:eastAsia="News Gothic MT" w:hAnsi="News Gothic MT"/>
+                <w:b w:val="false"/>
+                <w:bCs w:val="false"/>
+                <w:i w:val="false"/>
+                <w:iCs w:val="false"/>
+                <w:color w:val="1A1A2E"/>
+                <w:sz w:val="19"/>
+                <w:szCs w:val="19"/>
+              </w:rPr>
+              <w:t xml:space="preserve">53</w:t>
+            </w:r>
+          </w:p>
+        </w:tc>
+        <w:tc>
+          <w:tcPr>
+            <w:tcW w:type="dxa" w:w="1500"/>
+            <w:shd w:fill="FFFFFF" w:color="auto" w:val="clear"/>
+            <w:tcMar>
+              <w:top w:type="dxa" w:w="70"/>
+              <w:left w:type="dxa" w:w="120"/>
+              <w:bottom w:type="dxa" w:w="70"/>
+              <w:right w:type="dxa" w:w="120"/>
+            </w:tcMar>
+            <w:vAlign w:val="center"/>
+          </w:tcPr>
+          <w:p>
+            <w:r>
+              <w:rPr>
+                <w:rFonts w:ascii="News Gothic MT" w:cs="News Gothic MT" w:eastAsia="News Gothic MT" w:hAnsi="News Gothic MT"/>
+                <w:b w:val="false"/>
+                <w:bCs w:val="false"/>
+                <w:i w:val="false"/>
+                <w:iCs w:val="false"/>
+                <w:color w:val="1A1A2E"/>
+                <w:sz w:val="19"/>
+                <w:szCs w:val="19"/>
+              </w:rPr>
+              <w:t xml:space="preserve">8</w:t>
+            </w:r>
+          </w:p>
+        </w:tc>
+        <w:tc>
+          <w:tcPr>
+            <w:tcW w:type="dxa" w:w="700"/>
+            <w:shd w:fill="FFFFFF" w:color="auto" w:val="clear"/>
+            <w:tcMar>
+              <w:top w:type="dxa" w:w="70"/>
+              <w:left w:type="dxa" w:w="120"/>
+              <w:bottom w:type="dxa" w:w="70"/>
+              <w:right w:type="dxa" w:w="120"/>
+            </w:tcMar>
+            <w:vAlign w:val="center"/>
+          </w:tcPr>
+          <w:p>
+            <w:r>
+              <w:rPr>
+                <w:rFonts w:ascii="News Gothic MT" w:cs="News Gothic MT" w:eastAsia="News Gothic MT" w:hAnsi="News Gothic MT"/>
+                <w:b w:val="false"/>
+                <w:bCs w:val="false"/>
+                <w:i w:val="false"/>
+                <w:iCs w:val="false"/>
+                <w:color w:val="1A1A2E"/>
+                <w:sz w:val="19"/>
+                <w:szCs w:val="19"/>
+              </w:rPr>
+              <w:t xml:space="preserve">56</w:t>
+            </w:r>
+          </w:p>
+        </w:tc>
+        <w:tc>
+          <w:tcPr>
+            <w:tcW w:type="dxa" w:w="1500"/>
+            <w:shd w:fill="FFFFFF" w:color="auto" w:val="clear"/>
+            <w:tcMar>
+              <w:top w:type="dxa" w:w="70"/>
+              <w:left w:type="dxa" w:w="120"/>
+              <w:bottom w:type="dxa" w:w="70"/>
+              <w:right w:type="dxa" w:w="120"/>
+            </w:tcMar>
+            <w:vAlign w:val="center"/>
+          </w:tcPr>
+          <w:p>
+            <w:r>
+              <w:rPr>
+                <w:rFonts w:ascii="News Gothic MT" w:cs="News Gothic MT" w:eastAsia="News Gothic MT" w:hAnsi="News Gothic MT"/>
+                <w:b w:val="false"/>
+                <w:bCs w:val="false"/>
+                <w:i w:val="false"/>
+                <w:iCs w:val="false"/>
+                <w:color w:val="1A1A2E"/>
+                <w:sz w:val="19"/>
+                <w:szCs w:val="19"/>
+              </w:rPr>
+              <w:t xml:space="preserve">,</w:t>
+            </w:r>
+          </w:p>
+        </w:tc>
+        <w:tc>
+          <w:tcPr>
+            <w:tcW w:type="dxa" w:w="738"/>
+            <w:shd w:fill="FFFFFF" w:color="auto" w:val="clear"/>
+            <w:tcMar>
+              <w:top w:type="dxa" w:w="70"/>
+              <w:left w:type="dxa" w:w="120"/>
+              <w:bottom w:type="dxa" w:w="70"/>
+              <w:right w:type="dxa" w:w="120"/>
+            </w:tcMar>
+            <w:vAlign w:val="center"/>
+          </w:tcPr>
+          <w:p>
+            <w:r>
+              <w:rPr>
+                <w:rFonts w:ascii="News Gothic MT" w:cs="News Gothic MT" w:eastAsia="News Gothic MT" w:hAnsi="News Gothic MT"/>
+                <w:b w:val="false"/>
+                <w:bCs w:val="false"/>
+                <w:i w:val="false"/>
+                <w:iCs w:val="false"/>
+                <w:color w:val="1A1A2E"/>
+                <w:sz w:val="19"/>
+                <w:szCs w:val="19"/>
+              </w:rPr>
+              <w:t xml:space="preserve">44</w:t>
+            </w:r>
+          </w:p>
+        </w:tc>
+      </w:tr>
+      <w:tr>
+        <w:tc>
+          <w:tcPr>
+            <w:tcW w:type="dxa" w:w="1500"/>
+            <w:shd w:fill="EEF1F8" w:color="auto" w:val="clear"/>
+            <w:tcMar>
+              <w:top w:type="dxa" w:w="70"/>
+              <w:left w:type="dxa" w:w="120"/>
+              <w:bottom w:type="dxa" w:w="70"/>
+              <w:right w:type="dxa" w:w="120"/>
+            </w:tcMar>
+            <w:vAlign w:val="center"/>
+          </w:tcPr>
+          <w:p>
+            <w:r>
+              <w:rPr>
+                <w:rFonts w:ascii="News Gothic MT" w:cs="News Gothic MT" w:eastAsia="News Gothic MT" w:hAnsi="News Gothic MT"/>
+                <w:b w:val="false"/>
+                <w:bCs w:val="false"/>
+                <w:i w:val="false"/>
+                <w:iCs w:val="false"/>
+                <w:color w:val="1A1A2E"/>
+                <w:sz w:val="19"/>
+                <w:szCs w:val="19"/>
+              </w:rPr>
+              <w:t xml:space="preserve">2</w:t>
+            </w:r>
+          </w:p>
+        </w:tc>
+        <w:tc>
+          <w:tcPr>
+            <w:tcW w:type="dxa" w:w="700"/>
+            <w:shd w:fill="EEF1F8" w:color="auto" w:val="clear"/>
+            <w:tcMar>
+              <w:top w:type="dxa" w:w="70"/>
+              <w:left w:type="dxa" w:w="120"/>
+              <w:bottom w:type="dxa" w:w="70"/>
+              <w:right w:type="dxa" w:w="120"/>
+            </w:tcMar>
+            <w:vAlign w:val="center"/>
+          </w:tcPr>
+          <w:p>
+            <w:r>
+              <w:rPr>
+                <w:rFonts w:ascii="News Gothic MT" w:cs="News Gothic MT" w:eastAsia="News Gothic MT" w:hAnsi="News Gothic MT"/>
+                <w:b w:val="false"/>
+                <w:bCs w:val="false"/>
+                <w:i w:val="false"/>
+                <w:iCs w:val="false"/>
+                <w:color w:val="1A1A2E"/>
+                <w:sz w:val="19"/>
+                <w:szCs w:val="19"/>
+              </w:rPr>
+              <w:t xml:space="preserve">50</w:t>
+            </w:r>
+          </w:p>
+        </w:tc>
+        <w:tc>
+          <w:tcPr>
+            <w:tcW w:type="dxa" w:w="1500"/>
+            <w:shd w:fill="EEF1F8" w:color="auto" w:val="clear"/>
+            <w:tcMar>
+              <w:top w:type="dxa" w:w="70"/>
+              <w:left w:type="dxa" w:w="120"/>
+              <w:bottom w:type="dxa" w:w="70"/>
+              <w:right w:type="dxa" w:w="120"/>
+            </w:tcMar>
+            <w:vAlign w:val="center"/>
+          </w:tcPr>
+          <w:p/>
+        </w:tc>
+        <w:tc>
+          <w:tcPr>
+            <w:tcW w:type="dxa" w:w="700"/>
+            <w:shd w:fill="EEF1F8" w:color="auto" w:val="clear"/>
+            <w:tcMar>
+              <w:top w:type="dxa" w:w="70"/>
+              <w:left w:type="dxa" w:w="120"/>
+              <w:bottom w:type="dxa" w:w="70"/>
+              <w:right w:type="dxa" w:w="120"/>
+            </w:tcMar>
+            <w:vAlign w:val="center"/>
+          </w:tcPr>
+          <w:p/>
+        </w:tc>
+        <w:tc>
+          <w:tcPr>
+            <w:tcW w:type="dxa" w:w="1500"/>
+            <w:shd w:fill="EEF1F8" w:color="auto" w:val="clear"/>
+            <w:tcMar>
+              <w:top w:type="dxa" w:w="70"/>
+              <w:left w:type="dxa" w:w="120"/>
+              <w:bottom w:type="dxa" w:w="70"/>
+              <w:right w:type="dxa" w:w="120"/>
+            </w:tcMar>
+            <w:vAlign w:val="center"/>
+          </w:tcPr>
+          <w:p/>
+        </w:tc>
+        <w:tc>
+          <w:tcPr>
+            <w:tcW w:type="dxa" w:w="700"/>
+            <w:shd w:fill="EEF1F8" w:color="auto" w:val="clear"/>
+            <w:tcMar>
+              <w:top w:type="dxa" w:w="70"/>
+              <w:left w:type="dxa" w:w="120"/>
+              <w:bottom w:type="dxa" w:w="70"/>
+              <w:right w:type="dxa" w:w="120"/>
+            </w:tcMar>
+            <w:vAlign w:val="center"/>
+          </w:tcPr>
+          <w:p/>
+        </w:tc>
+        <w:tc>
+          <w:tcPr>
+            <w:tcW w:type="dxa" w:w="1500"/>
+            <w:shd w:fill="EEF1F8" w:color="auto" w:val="clear"/>
+            <w:tcMar>
+              <w:top w:type="dxa" w:w="70"/>
+              <w:left w:type="dxa" w:w="120"/>
+              <w:bottom w:type="dxa" w:w="70"/>
+              <w:right w:type="dxa" w:w="120"/>
+            </w:tcMar>
+            <w:vAlign w:val="center"/>
+          </w:tcPr>
+          <w:p/>
+        </w:tc>
+        <w:tc>
+          <w:tcPr>
+            <w:tcW w:type="dxa" w:w="738"/>
+            <w:shd w:fill="EEF1F8" w:color="auto" w:val="clear"/>
+            <w:tcMar>
+              <w:top w:type="dxa" w:w="70"/>
+              <w:left w:type="dxa" w:w="120"/>
+              <w:bottom w:type="dxa" w:w="70"/>
+              <w:right w:type="dxa" w:w="120"/>
+            </w:tcMar>
+            <w:vAlign w:val="center"/>
+          </w:tcPr>
+          <w:p/>
+        </w:tc>
+      </w:tr>
+    </w:tbl>
+    <w:p>
+      <w:pPr>
+        <w:spacing w:after="160"/>
+      </w:pPr>
     </w:p>
     <w:p>
       <w:pPr>

</xml_diff>

<commit_message>
Añade actividad práctica: comprobar en el ordenador el tamaño UTF-8
Nueva caja "Vamos a practicar" en el bloque de UTF-16, en apuntes
(md + docx) y docencia: los alumnos calculan a mano cuántos bytes
ocupa el texto "Año 😀" en UTF-8 (1+2+1+1+4=9 bytes, mezclando los
tres tamaños posibles), lo crean en un editor de texto plano y
comprueban el tamaño real del archivo. Incluye el matiz de BOM y
salto de línea para interpretar pequeñas diferencias en el resultado.
Es una actividad "anclada" a la propia sesión del alumno, difícil de
resolver copiando una respuesta de un modelo de IA.

Co-Authored-By: Claude Sonnet 5 <noreply@anthropic.com>
</commit_message>
<xml_diff>
--- a/UD01-fundamentos-so/UD01_apuntes.docx
+++ b/UD01-fundamentos-so/UD01_apuntes.docx
@@ -11610,6 +11610,441 @@
         </w:rPr>
         <w:t xml:space="preserve">Cuando un archivo de texto se abre "lleno de símbolos raros" en vez de mostrar tildes o eñes correctamente, casi siempre es un problema de codificación: los bytes son los mismos, pero se están interpretando con el patrón de bits equivocado, así que el programa reconstruye un carácter distinto al que realmente se guardó.</w:t>
       </w:r>
+    </w:p>
+    <w:p>
+      <w:pPr>
+        <w:spacing w:after="80"/>
+      </w:pPr>
+    </w:p>
+    <w:tbl>
+      <w:tblPr>
+        <w:tblW w:type="dxa" w:w="9638"/>
+        <w:tblBorders>
+          <w:top w:val="single" w:color="CD0063" w:sz="10"/>
+          <w:left w:val="single" w:color="CD0063" w:sz="10"/>
+          <w:bottom w:val="single" w:color="CD0063" w:sz="10"/>
+          <w:right w:val="single" w:color="CD0063" w:sz="10"/>
+          <w:insideH w:val="single" w:color="auto" w:sz="4"/>
+          <w:insideV w:val="single" w:color="auto" w:sz="4"/>
+        </w:tblBorders>
+      </w:tblPr>
+      <w:tblGrid>
+        <w:gridCol w:w="100"/>
+      </w:tblGrid>
+      <w:tr>
+        <w:tc>
+          <w:tcPr>
+            <w:tcW w:type="dxa" w:w="9638"/>
+            <w:shd w:fill="EEF1F8" w:color="auto" w:val="clear"/>
+            <w:tcMar>
+              <w:top w:type="dxa" w:w="200"/>
+              <w:left w:type="dxa" w:w="260"/>
+              <w:bottom w:type="dxa" w:w="200"/>
+              <w:right w:type="dxa" w:w="260"/>
+            </w:tcMar>
+          </w:tcPr>
+          <w:p>
+            <w:pPr>
+              <w:spacing w:after="140"/>
+            </w:pPr>
+            <w:r>
+              <w:rPr>
+                <w:rFonts w:ascii="News Gothic MT" w:cs="News Gothic MT" w:eastAsia="News Gothic MT" w:hAnsi="News Gothic MT"/>
+                <w:b/>
+                <w:bCs/>
+                <w:color w:val="CD0063"/>
+                <w:spacing w:val="20"/>
+                <w:sz w:val="19"/>
+                <w:szCs w:val="19"/>
+              </w:rPr>
+              <w:t xml:space="preserve">VAMOS A PRACTICAR: COMPRUÉBALO TÚ MISMO</w:t>
+            </w:r>
+          </w:p>
+          <w:p>
+            <w:pPr>
+              <w:spacing w:after="140" w:line="300"/>
+              <w:jc w:val="both"/>
+            </w:pPr>
+            <w:r>
+              <w:rPr>
+                <w:rFonts w:ascii="News Gothic MT" w:cs="News Gothic MT" w:eastAsia="News Gothic MT" w:hAnsi="News Gothic MT"/>
+                <w:b w:val="false"/>
+                <w:bCs w:val="false"/>
+                <w:i w:val="false"/>
+                <w:iCs w:val="false"/>
+                <w:color w:val="1A1A2E"/>
+                <w:sz w:val="21"/>
+                <w:szCs w:val="21"/>
+              </w:rPr>
+              <w:t xml:space="preserve">Como cada carácter puede ocupar de 1 a 4 bytes, un archivo de texto no pesa "número de caracteres × un tamaño fijo" — pesa la suma de lo que ocupa cada carácter concreto.</w:t>
+            </w:r>
+          </w:p>
+          <w:p>
+            <w:pPr>
+              <w:spacing w:after="140" w:line="300"/>
+              <w:jc w:val="both"/>
+            </w:pPr>
+            <w:r>
+              <w:rPr>
+                <w:rFonts w:ascii="News Gothic MT" w:cs="News Gothic MT" w:eastAsia="News Gothic MT" w:hAnsi="News Gothic MT"/>
+                <w:b w:val="false"/>
+                <w:bCs w:val="false"/>
+                <w:i w:val="false"/>
+                <w:iCs w:val="false"/>
+                <w:color w:val="1A1A2E"/>
+                <w:sz w:val="21"/>
+                <w:szCs w:val="21"/>
+              </w:rPr>
+              <w:t xml:space="preserve">1. Calcula a mano, carácter a carácter, cuántos bytes ocupará el texto </w:t>
+            </w:r>
+            <w:r>
+              <w:rPr>
+                <w:rFonts w:ascii="News Gothic MT" w:cs="News Gothic MT" w:eastAsia="News Gothic MT" w:hAnsi="News Gothic MT"/>
+                <w:b/>
+                <w:bCs/>
+                <w:color w:val="1A1A2E"/>
+                <w:sz w:val="21"/>
+                <w:szCs w:val="21"/>
+              </w:rPr>
+              <w:t xml:space="preserve">`Año 😀`</w:t>
+            </w:r>
+            <w:r>
+              <w:rPr>
+                <w:rFonts w:ascii="News Gothic MT" w:cs="News Gothic MT" w:eastAsia="News Gothic MT" w:hAnsi="News Gothic MT"/>
+                <w:b w:val="false"/>
+                <w:bCs w:val="false"/>
+                <w:i w:val="false"/>
+                <w:iCs w:val="false"/>
+                <w:color w:val="1A1A2E"/>
+                <w:sz w:val="21"/>
+                <w:szCs w:val="21"/>
+              </w:rPr>
+              <w:t xml:space="preserve"> guardado en UTF-8 (usa la tabla de patrones de bits: recuerda que 'ñ' ya la tienes resuelta, y que un emoji cae muy por encima de U+FFFF).</w:t>
+            </w:r>
+          </w:p>
+          <w:p>
+            <w:pPr>
+              <w:spacing w:after="140" w:line="300"/>
+              <w:jc w:val="both"/>
+            </w:pPr>
+            <w:r>
+              <w:rPr>
+                <w:rFonts w:ascii="News Gothic MT" w:cs="News Gothic MT" w:eastAsia="News Gothic MT" w:hAnsi="News Gothic MT"/>
+                <w:b w:val="false"/>
+                <w:bCs w:val="false"/>
+                <w:i w:val="false"/>
+                <w:iCs w:val="false"/>
+                <w:color w:val="1A1A2E"/>
+                <w:sz w:val="21"/>
+                <w:szCs w:val="21"/>
+              </w:rPr>
+              <w:t xml:space="preserve">2. Abre un editor de </w:t>
+            </w:r>
+            <w:r>
+              <w:rPr>
+                <w:rFonts w:ascii="News Gothic MT" w:cs="News Gothic MT" w:eastAsia="News Gothic MT" w:hAnsi="News Gothic MT"/>
+                <w:b/>
+                <w:bCs/>
+                <w:color w:val="1A1A2E"/>
+                <w:sz w:val="21"/>
+                <w:szCs w:val="21"/>
+              </w:rPr>
+              <w:t xml:space="preserve">texto plano</w:t>
+            </w:r>
+            <w:r>
+              <w:rPr>
+                <w:rFonts w:ascii="News Gothic MT" w:cs="News Gothic MT" w:eastAsia="News Gothic MT" w:hAnsi="News Gothic MT"/>
+                <w:b w:val="false"/>
+                <w:bCs w:val="false"/>
+                <w:i w:val="false"/>
+                <w:iCs w:val="false"/>
+                <w:color w:val="1A1A2E"/>
+                <w:sz w:val="21"/>
+                <w:szCs w:val="21"/>
+              </w:rPr>
+              <w:t xml:space="preserve"> — Bloc de notas en Windows, o un editor de texto en Linux (no uses Word ni ningún procesador de textos: añaden formato y no son texto plano). Escribe exactamente ese texto y guárdalo asegurándote de que la codificación sea UTF-8 (en Bloc de notas, se elige en el desplegable "Codificación" del cuadro de guardar).</w:t>
+            </w:r>
+          </w:p>
+          <w:p>
+            <w:pPr>
+              <w:spacing w:after="140" w:line="300"/>
+              <w:jc w:val="both"/>
+            </w:pPr>
+            <w:r>
+              <w:rPr>
+                <w:rFonts w:ascii="News Gothic MT" w:cs="News Gothic MT" w:eastAsia="News Gothic MT" w:hAnsi="News Gothic MT"/>
+                <w:b w:val="false"/>
+                <w:bCs w:val="false"/>
+                <w:i w:val="false"/>
+                <w:iCs w:val="false"/>
+                <w:color w:val="1A1A2E"/>
+                <w:sz w:val="21"/>
+                <w:szCs w:val="21"/>
+              </w:rPr>
+              <w:t xml:space="preserve">3. Comprueba el tamaño del archivo en bytes: en Windows, clic derecho → Propiedades (o el comando </w:t>
+            </w:r>
+            <w:r>
+              <w:rPr>
+                <w:rFonts w:ascii="Courier New" w:cs="Courier New" w:eastAsia="Courier New" w:hAnsi="Courier New"/>
+                <w:b w:val="false"/>
+                <w:bCs w:val="false"/>
+                <w:color w:val="9B1B5C"/>
+                <w:sz w:val="20"/>
+                <w:szCs w:val="20"/>
+              </w:rPr>
+              <w:t xml:space="preserve">dir</w:t>
+            </w:r>
+            <w:r>
+              <w:rPr>
+                <w:rFonts w:ascii="News Gothic MT" w:cs="News Gothic MT" w:eastAsia="News Gothic MT" w:hAnsi="News Gothic MT"/>
+                <w:b w:val="false"/>
+                <w:bCs w:val="false"/>
+                <w:i w:val="false"/>
+                <w:iCs w:val="false"/>
+                <w:color w:val="1A1A2E"/>
+                <w:sz w:val="21"/>
+                <w:szCs w:val="21"/>
+              </w:rPr>
+              <w:t xml:space="preserve"> en una terminal); en Linux, </w:t>
+            </w:r>
+            <w:r>
+              <w:rPr>
+                <w:rFonts w:ascii="Courier New" w:cs="Courier New" w:eastAsia="Courier New" w:hAnsi="Courier New"/>
+                <w:b w:val="false"/>
+                <w:bCs w:val="false"/>
+                <w:color w:val="9B1B5C"/>
+                <w:sz w:val="20"/>
+                <w:szCs w:val="20"/>
+              </w:rPr>
+              <w:t xml:space="preserve">ls -l archivo.txt</w:t>
+            </w:r>
+            <w:r>
+              <w:rPr>
+                <w:rFonts w:ascii="News Gothic MT" w:cs="News Gothic MT" w:eastAsia="News Gothic MT" w:hAnsi="News Gothic MT"/>
+                <w:b w:val="false"/>
+                <w:bCs w:val="false"/>
+                <w:i w:val="false"/>
+                <w:iCs w:val="false"/>
+                <w:color w:val="1A1A2E"/>
+                <w:sz w:val="21"/>
+                <w:szCs w:val="21"/>
+              </w:rPr>
+              <w:t xml:space="preserve"> o </w:t>
+            </w:r>
+            <w:r>
+              <w:rPr>
+                <w:rFonts w:ascii="Courier New" w:cs="Courier New" w:eastAsia="Courier New" w:hAnsi="Courier New"/>
+                <w:b w:val="false"/>
+                <w:bCs w:val="false"/>
+                <w:color w:val="9B1B5C"/>
+                <w:sz w:val="20"/>
+                <w:szCs w:val="20"/>
+              </w:rPr>
+              <w:t xml:space="preserve">wc -c archivo.txt</w:t>
+            </w:r>
+            <w:r>
+              <w:rPr>
+                <w:rFonts w:ascii="News Gothic MT" w:cs="News Gothic MT" w:eastAsia="News Gothic MT" w:hAnsi="News Gothic MT"/>
+                <w:b w:val="false"/>
+                <w:bCs w:val="false"/>
+                <w:i w:val="false"/>
+                <w:iCs w:val="false"/>
+                <w:color w:val="1A1A2E"/>
+                <w:sz w:val="21"/>
+                <w:szCs w:val="21"/>
+              </w:rPr>
+              <w:t xml:space="preserve">.</w:t>
+            </w:r>
+          </w:p>
+          <w:p>
+            <w:pPr>
+              <w:spacing w:after="140" w:line="300"/>
+              <w:jc w:val="both"/>
+            </w:pPr>
+            <w:r>
+              <w:rPr>
+                <w:rFonts w:ascii="News Gothic MT" w:cs="News Gothic MT" w:eastAsia="News Gothic MT" w:hAnsi="News Gothic MT"/>
+                <w:b w:val="false"/>
+                <w:bCs w:val="false"/>
+                <w:i w:val="false"/>
+                <w:iCs w:val="false"/>
+                <w:color w:val="1A1A2E"/>
+                <w:sz w:val="21"/>
+                <w:szCs w:val="21"/>
+              </w:rPr>
+              <w:t xml:space="preserve">4. ¿Coincide con tu cálculo? Si el tamaño real es un poco mayor de lo esperado, no te preocupes: puede deberse a un carácter de salto de línea añadido automáticamente al guardar (1-2 bytes más), o a que el editor haya incluido una marca </w:t>
+            </w:r>
+            <w:r>
+              <w:rPr>
+                <w:rFonts w:ascii="News Gothic MT" w:cs="News Gothic MT" w:eastAsia="News Gothic MT" w:hAnsi="News Gothic MT"/>
+                <w:b/>
+                <w:bCs/>
+                <w:color w:val="1A1A2E"/>
+                <w:sz w:val="21"/>
+                <w:szCs w:val="21"/>
+              </w:rPr>
+              <w:t xml:space="preserve">BOM</w:t>
+            </w:r>
+            <w:r>
+              <w:rPr>
+                <w:rFonts w:ascii="News Gothic MT" w:cs="News Gothic MT" w:eastAsia="News Gothic MT" w:hAnsi="News Gothic MT"/>
+                <w:b w:val="false"/>
+                <w:bCs w:val="false"/>
+                <w:i w:val="false"/>
+                <w:iCs w:val="false"/>
+                <w:color w:val="1A1A2E"/>
+                <w:sz w:val="21"/>
+                <w:szCs w:val="21"/>
+              </w:rPr>
+              <w:t xml:space="preserve"> al principio del archivo (3 bytes más) — infórmate de qué es un BOM si te encuentras con esta diferencia.</w:t>
+            </w:r>
+          </w:p>
+          <w:p>
+            <w:pPr>
+              <w:spacing w:after="0" w:line="300"/>
+              <w:jc w:val="both"/>
+            </w:pPr>
+            <w:r>
+              <w:rPr>
+                <w:rFonts w:ascii="News Gothic MT" w:cs="News Gothic MT" w:eastAsia="News Gothic MT" w:hAnsi="News Gothic MT"/>
+                <w:b/>
+                <w:bCs/>
+                <w:i/>
+                <w:iCs/>
+                <w:color w:val="1F3864"/>
+                <w:sz w:val="21"/>
+                <w:szCs w:val="21"/>
+              </w:rPr>
+              <w:t xml:space="preserve">Ejemplo resuelto (cálculo): </w:t>
+            </w:r>
+            <w:r>
+              <w:rPr>
+                <w:rFonts w:ascii="Courier New" w:cs="Courier New" w:eastAsia="Courier New" w:hAnsi="Courier New"/>
+                <w:b w:val="false"/>
+                <w:bCs w:val="false"/>
+                <w:color w:val="9B1B5C"/>
+                <w:sz w:val="20"/>
+                <w:szCs w:val="20"/>
+              </w:rPr>
+              <w:t xml:space="preserve">A</w:t>
+            </w:r>
+            <w:r>
+              <w:rPr>
+                <w:rFonts w:ascii="News Gothic MT" w:cs="News Gothic MT" w:eastAsia="News Gothic MT" w:hAnsi="News Gothic MT"/>
+                <w:b w:val="false"/>
+                <w:bCs w:val="false"/>
+                <w:i/>
+                <w:iCs/>
+                <w:color w:val="1A1A2E"/>
+                <w:sz w:val="21"/>
+                <w:szCs w:val="21"/>
+              </w:rPr>
+              <w:t xml:space="preserve"> (1 byte) + </w:t>
+            </w:r>
+            <w:r>
+              <w:rPr>
+                <w:rFonts w:ascii="Courier New" w:cs="Courier New" w:eastAsia="Courier New" w:hAnsi="Courier New"/>
+                <w:b w:val="false"/>
+                <w:bCs w:val="false"/>
+                <w:color w:val="9B1B5C"/>
+                <w:sz w:val="20"/>
+                <w:szCs w:val="20"/>
+              </w:rPr>
+              <w:t xml:space="preserve">ñ</w:t>
+            </w:r>
+            <w:r>
+              <w:rPr>
+                <w:rFonts w:ascii="News Gothic MT" w:cs="News Gothic MT" w:eastAsia="News Gothic MT" w:hAnsi="News Gothic MT"/>
+                <w:b w:val="false"/>
+                <w:bCs w:val="false"/>
+                <w:i/>
+                <w:iCs/>
+                <w:color w:val="1A1A2E"/>
+                <w:sz w:val="21"/>
+                <w:szCs w:val="21"/>
+              </w:rPr>
+              <w:t xml:space="preserve"> (2 bytes) + </w:t>
+            </w:r>
+            <w:r>
+              <w:rPr>
+                <w:rFonts w:ascii="Courier New" w:cs="Courier New" w:eastAsia="Courier New" w:hAnsi="Courier New"/>
+                <w:b w:val="false"/>
+                <w:bCs w:val="false"/>
+                <w:color w:val="9B1B5C"/>
+                <w:sz w:val="20"/>
+                <w:szCs w:val="20"/>
+              </w:rPr>
+              <w:t xml:space="preserve">o</w:t>
+            </w:r>
+            <w:r>
+              <w:rPr>
+                <w:rFonts w:ascii="News Gothic MT" w:cs="News Gothic MT" w:eastAsia="News Gothic MT" w:hAnsi="News Gothic MT"/>
+                <w:b w:val="false"/>
+                <w:bCs w:val="false"/>
+                <w:i/>
+                <w:iCs/>
+                <w:color w:val="1A1A2E"/>
+                <w:sz w:val="21"/>
+                <w:szCs w:val="21"/>
+              </w:rPr>
+              <w:t xml:space="preserve"> (1 byte) + espacio (1 byte) + </w:t>
+            </w:r>
+            <w:r>
+              <w:rPr>
+                <w:rFonts w:ascii="Courier New" w:cs="Courier New" w:eastAsia="Courier New" w:hAnsi="Courier New"/>
+                <w:b w:val="false"/>
+                <w:bCs w:val="false"/>
+                <w:color w:val="9B1B5C"/>
+                <w:sz w:val="20"/>
+                <w:szCs w:val="20"/>
+              </w:rPr>
+              <w:t xml:space="preserve">😀</w:t>
+            </w:r>
+            <w:r>
+              <w:rPr>
+                <w:rFonts w:ascii="News Gothic MT" w:cs="News Gothic MT" w:eastAsia="News Gothic MT" w:hAnsi="News Gothic MT"/>
+                <w:b w:val="false"/>
+                <w:bCs w:val="false"/>
+                <w:i/>
+                <w:iCs/>
+                <w:color w:val="1A1A2E"/>
+                <w:sz w:val="21"/>
+                <w:szCs w:val="21"/>
+              </w:rPr>
+              <w:t xml:space="preserve"> (4 bytes) = </w:t>
+            </w:r>
+            <w:r>
+              <w:rPr>
+                <w:rFonts w:ascii="News Gothic MT" w:cs="News Gothic MT" w:eastAsia="News Gothic MT" w:hAnsi="News Gothic MT"/>
+                <w:b/>
+                <w:bCs/>
+                <w:color w:val="1A1A2E"/>
+                <w:sz w:val="21"/>
+                <w:szCs w:val="21"/>
+              </w:rPr>
+              <w:t xml:space="preserve">9 bytes para 5 caracteres</w:t>
+            </w:r>
+            <w:r>
+              <w:rPr>
+                <w:rFonts w:ascii="News Gothic MT" w:cs="News Gothic MT" w:eastAsia="News Gothic MT" w:hAnsi="News Gothic MT"/>
+                <w:b w:val="false"/>
+                <w:bCs w:val="false"/>
+                <w:i/>
+                <w:iCs/>
+                <w:color w:val="1A1A2E"/>
+                <w:sz w:val="21"/>
+                <w:szCs w:val="21"/>
+              </w:rPr>
+              <w:t xml:space="preserve">.</w:t>
+            </w:r>
+          </w:p>
+        </w:tc>
+      </w:tr>
+    </w:tbl>
+    <w:p>
+      <w:pPr>
+        <w:spacing w:after="160"/>
+      </w:pPr>
     </w:p>
     <w:p>
       <w:pPr>

</xml_diff>

<commit_message>
Añade actividades con equipo a UD01 y primera prueba evaluatoria
Revisadas todas las actividades de la unidad para añadir 8 ejercicios
"con equipo" (drivers, memoria, procesos, rutas, mayúsculas Windows/
Linux, atributos, capacidad de disco, sistema de archivos de un
pendrive), aprovechando que el aula tiene Windows y Linux disponibles.
Actualizados apuntes, fichas, solucionario, docencia y la plantilla
docx. Añadida también la primera prueba evaluatoria de UD01 (75-90 min,
máx. 1h45min) con su solucionario, ponderada igual que los epígrafes
de la unidad.

Co-Authored-By: Claude Sonnet 5 <noreply@anthropic.com>
</commit_message>
<xml_diff>
--- a/UD01-fundamentos-so/UD01_apuntes.docx
+++ b/UD01-fundamentos-so/UD01_apuntes.docx
@@ -1179,6 +1179,200 @@
     </w:tbl>
     <w:p>
       <w:pPr>
+        <w:spacing w:after="160"/>
+      </w:pPr>
+    </w:p>
+    <w:tbl>
+      <w:tblPr>
+        <w:tblW w:type="dxa" w:w="9638"/>
+        <w:tblBorders>
+          <w:top w:val="single" w:color="CD0063" w:sz="10"/>
+          <w:left w:val="single" w:color="CD0063" w:sz="10"/>
+          <w:bottom w:val="single" w:color="CD0063" w:sz="10"/>
+          <w:right w:val="single" w:color="CD0063" w:sz="10"/>
+          <w:insideH w:val="single" w:color="auto" w:sz="4"/>
+          <w:insideV w:val="single" w:color="auto" w:sz="4"/>
+        </w:tblBorders>
+      </w:tblPr>
+      <w:tblGrid>
+        <w:gridCol w:w="100"/>
+      </w:tblGrid>
+      <w:tr>
+        <w:tc>
+          <w:tcPr>
+            <w:tcW w:type="dxa" w:w="9638"/>
+            <w:shd w:fill="EEF1F8" w:color="auto" w:val="clear"/>
+            <w:tcMar>
+              <w:top w:type="dxa" w:w="200"/>
+              <w:left w:type="dxa" w:w="260"/>
+              <w:bottom w:type="dxa" w:w="200"/>
+              <w:right w:type="dxa" w:w="260"/>
+            </w:tcMar>
+          </w:tcPr>
+          <w:p>
+            <w:pPr>
+              <w:spacing w:after="140"/>
+            </w:pPr>
+            <w:r>
+              <w:rPr>
+                <w:rFonts w:ascii="News Gothic MT" w:cs="News Gothic MT" w:eastAsia="News Gothic MT" w:hAnsi="News Gothic MT"/>
+                <w:b/>
+                <w:bCs/>
+                <w:color w:val="CD0063"/>
+                <w:spacing w:val="20"/>
+                <w:sz w:val="19"/>
+                <w:szCs w:val="19"/>
+              </w:rPr>
+              <w:t xml:space="preserve">VAMOS A PRACTICAR: LOCALIZA SOFTWARE DE BASE REAL EN TU PROPIO EQUIPO</w:t>
+            </w:r>
+          </w:p>
+          <w:p>
+            <w:pPr>
+              <w:spacing w:after="140" w:line="300"/>
+              <w:jc w:val="both"/>
+            </w:pPr>
+            <w:r>
+              <w:rPr>
+                <w:rFonts w:ascii="News Gothic MT" w:cs="News Gothic MT" w:eastAsia="News Gothic MT" w:hAnsi="News Gothic MT"/>
+                <w:b w:val="false"/>
+                <w:bCs w:val="false"/>
+                <w:i w:val="false"/>
+                <w:iCs w:val="false"/>
+                <w:color w:val="1A1A2E"/>
+                <w:sz w:val="21"/>
+                <w:szCs w:val="21"/>
+              </w:rPr>
+              <w:t xml:space="preserve">En Windows, abre el </w:t>
+            </w:r>
+            <w:r>
+              <w:rPr>
+                <w:rFonts w:ascii="News Gothic MT" w:cs="News Gothic MT" w:eastAsia="News Gothic MT" w:hAnsi="News Gothic MT"/>
+                <w:b/>
+                <w:bCs/>
+                <w:color w:val="1A1A2E"/>
+                <w:sz w:val="21"/>
+                <w:szCs w:val="21"/>
+              </w:rPr>
+              <w:t xml:space="preserve">Administrador de dispositivos</w:t>
+            </w:r>
+            <w:r>
+              <w:rPr>
+                <w:rFonts w:ascii="News Gothic MT" w:cs="News Gothic MT" w:eastAsia="News Gothic MT" w:hAnsi="News Gothic MT"/>
+                <w:b w:val="false"/>
+                <w:bCs w:val="false"/>
+                <w:i w:val="false"/>
+                <w:iCs w:val="false"/>
+                <w:color w:val="1A1A2E"/>
+                <w:sz w:val="21"/>
+                <w:szCs w:val="21"/>
+              </w:rPr>
+              <w:t xml:space="preserve"> (búscalo en el menú Inicio) y despliega al menos tres categorías (por ejemplo, "Adaptadores de red", "Controladoras de sonido, vídeo y juegos" o "Adaptadores de pantalla"). Elige tres dispositivos y anota, para cada uno, el nombre del controlador que aparece en sus propiedades (pestaña "Controlador" → "Proveedor del controlador" y "Fecha del controlador").</w:t>
+            </w:r>
+          </w:p>
+          <w:p>
+            <w:pPr>
+              <w:spacing w:after="140" w:line="300"/>
+              <w:jc w:val="both"/>
+            </w:pPr>
+            <w:r>
+              <w:rPr>
+                <w:rFonts w:ascii="News Gothic MT" w:cs="News Gothic MT" w:eastAsia="News Gothic MT" w:hAnsi="News Gothic MT"/>
+                <w:b w:val="false"/>
+                <w:bCs w:val="false"/>
+                <w:i w:val="false"/>
+                <w:iCs w:val="false"/>
+                <w:color w:val="1A1A2E"/>
+                <w:sz w:val="21"/>
+                <w:szCs w:val="21"/>
+              </w:rPr>
+              <w:t xml:space="preserve">Si tu equipo tiene también Linux instalado, compara con el comando </w:t>
+            </w:r>
+            <w:r>
+              <w:rPr>
+                <w:rFonts w:ascii="Courier New" w:cs="Courier New" w:eastAsia="Courier New" w:hAnsi="Courier New"/>
+                <w:b w:val="false"/>
+                <w:bCs w:val="false"/>
+                <w:color w:val="9B1B5C"/>
+                <w:sz w:val="20"/>
+                <w:szCs w:val="20"/>
+              </w:rPr>
+              <w:t xml:space="preserve">lspci</w:t>
+            </w:r>
+            <w:r>
+              <w:rPr>
+                <w:rFonts w:ascii="News Gothic MT" w:cs="News Gothic MT" w:eastAsia="News Gothic MT" w:hAnsi="News Gothic MT"/>
+                <w:b w:val="false"/>
+                <w:bCs w:val="false"/>
+                <w:i w:val="false"/>
+                <w:iCs w:val="false"/>
+                <w:color w:val="1A1A2E"/>
+                <w:sz w:val="21"/>
+                <w:szCs w:val="21"/>
+              </w:rPr>
+              <w:t xml:space="preserve"> (dispositivos conectados a la placa base) o </w:t>
+            </w:r>
+            <w:r>
+              <w:rPr>
+                <w:rFonts w:ascii="Courier New" w:cs="Courier New" w:eastAsia="Courier New" w:hAnsi="Courier New"/>
+                <w:b w:val="false"/>
+                <w:bCs w:val="false"/>
+                <w:color w:val="9B1B5C"/>
+                <w:sz w:val="20"/>
+                <w:szCs w:val="20"/>
+              </w:rPr>
+              <w:t xml:space="preserve">lsusb</w:t>
+            </w:r>
+            <w:r>
+              <w:rPr>
+                <w:rFonts w:ascii="News Gothic MT" w:cs="News Gothic MT" w:eastAsia="News Gothic MT" w:hAnsi="News Gothic MT"/>
+                <w:b w:val="false"/>
+                <w:bCs w:val="false"/>
+                <w:i w:val="false"/>
+                <w:iCs w:val="false"/>
+                <w:color w:val="1A1A2E"/>
+                <w:sz w:val="21"/>
+                <w:szCs w:val="21"/>
+              </w:rPr>
+              <w:t xml:space="preserve"> (dispositivos USB) ejecutado en una terminal: obtendrás una lista equivalente, aunque el sistema no use la palabra "controlador" de la misma forma explícita.</w:t>
+            </w:r>
+          </w:p>
+          <w:p>
+            <w:pPr>
+              <w:spacing w:after="0" w:line="300"/>
+              <w:jc w:val="both"/>
+            </w:pPr>
+            <w:r>
+              <w:rPr>
+                <w:rFonts w:ascii="News Gothic MT" w:cs="News Gothic MT" w:eastAsia="News Gothic MT" w:hAnsi="News Gothic MT"/>
+                <w:b/>
+                <w:bCs/>
+                <w:i/>
+                <w:iCs/>
+                <w:color w:val="1F3864"/>
+                <w:sz w:val="21"/>
+                <w:szCs w:val="21"/>
+              </w:rPr>
+              <w:t xml:space="preserve">Reflexiona: </w:t>
+            </w:r>
+            <w:r>
+              <w:rPr>
+                <w:rFonts w:ascii="News Gothic MT" w:cs="News Gothic MT" w:eastAsia="News Gothic MT" w:hAnsi="News Gothic MT"/>
+                <w:b w:val="false"/>
+                <w:bCs w:val="false"/>
+                <w:i/>
+                <w:iCs/>
+                <w:color w:val="1A1A2E"/>
+                <w:sz w:val="21"/>
+                <w:szCs w:val="21"/>
+              </w:rPr>
+              <w:t xml:space="preserve">¿alguno de esos tres dispositivos dejaría de funcionar correctamente si le faltara su controlador, aunque el hardware siga físicamente bien conectado?</w:t>
+            </w:r>
+          </w:p>
+        </w:tc>
+      </w:tr>
+    </w:tbl>
+    <w:p>
+      <w:pPr>
         <w:spacing w:after="200"/>
       </w:pPr>
     </w:p>
@@ -1610,6 +1804,210 @@
         </w:rPr>
         <w:t xml:space="preserve">Esta es la razón real de por qué se pueden tener más aplicaciones abiertas de las que "caben" en la RAM instalada, y también de por qué el ordenador se ralentiza mucho cuando empieza a depender demasiado del disco para esto: el disco, incluso un SSD, es mucho más lento que la RAM.</w:t>
       </w:r>
+    </w:p>
+    <w:p>
+      <w:pPr>
+        <w:spacing w:after="80"/>
+      </w:pPr>
+    </w:p>
+    <w:tbl>
+      <w:tblPr>
+        <w:tblW w:type="dxa" w:w="9638"/>
+        <w:tblBorders>
+          <w:top w:val="single" w:color="CD0063" w:sz="10"/>
+          <w:left w:val="single" w:color="CD0063" w:sz="10"/>
+          <w:bottom w:val="single" w:color="CD0063" w:sz="10"/>
+          <w:right w:val="single" w:color="CD0063" w:sz="10"/>
+          <w:insideH w:val="single" w:color="auto" w:sz="4"/>
+          <w:insideV w:val="single" w:color="auto" w:sz="4"/>
+        </w:tblBorders>
+      </w:tblPr>
+      <w:tblGrid>
+        <w:gridCol w:w="100"/>
+      </w:tblGrid>
+      <w:tr>
+        <w:tc>
+          <w:tcPr>
+            <w:tcW w:type="dxa" w:w="9638"/>
+            <w:shd w:fill="EEF1F8" w:color="auto" w:val="clear"/>
+            <w:tcMar>
+              <w:top w:type="dxa" w:w="200"/>
+              <w:left w:type="dxa" w:w="260"/>
+              <w:bottom w:type="dxa" w:w="200"/>
+              <w:right w:type="dxa" w:w="260"/>
+            </w:tcMar>
+          </w:tcPr>
+          <w:p>
+            <w:pPr>
+              <w:spacing w:after="140"/>
+            </w:pPr>
+            <w:r>
+              <w:rPr>
+                <w:rFonts w:ascii="News Gothic MT" w:cs="News Gothic MT" w:eastAsia="News Gothic MT" w:hAnsi="News Gothic MT"/>
+                <w:b/>
+                <w:bCs/>
+                <w:color w:val="CD0063"/>
+                <w:spacing w:val="20"/>
+                <w:sz w:val="19"/>
+                <w:szCs w:val="19"/>
+              </w:rPr>
+              <w:t xml:space="preserve">VAMOS A PRACTICAR: COMPRUEBA LA MEMORIA REAL DE TU EQUIPO</w:t>
+            </w:r>
+          </w:p>
+          <w:p>
+            <w:pPr>
+              <w:spacing w:after="140" w:line="300"/>
+              <w:jc w:val="both"/>
+            </w:pPr>
+            <w:r>
+              <w:rPr>
+                <w:rFonts w:ascii="News Gothic MT" w:cs="News Gothic MT" w:eastAsia="News Gothic MT" w:hAnsi="News Gothic MT"/>
+                <w:b w:val="false"/>
+                <w:bCs w:val="false"/>
+                <w:i w:val="false"/>
+                <w:iCs w:val="false"/>
+                <w:color w:val="1A1A2E"/>
+                <w:sz w:val="21"/>
+                <w:szCs w:val="21"/>
+              </w:rPr>
+              <w:t xml:space="preserve">Abre el Administrador de tareas de Windows (</w:t>
+            </w:r>
+            <w:r>
+              <w:rPr>
+                <w:rFonts w:ascii="Courier New" w:cs="Courier New" w:eastAsia="Courier New" w:hAnsi="Courier New"/>
+                <w:b w:val="false"/>
+                <w:bCs w:val="false"/>
+                <w:color w:val="9B1B5C"/>
+                <w:sz w:val="20"/>
+                <w:szCs w:val="20"/>
+              </w:rPr>
+              <w:t xml:space="preserve">Ctrl+Shift+Esc</w:t>
+            </w:r>
+            <w:r>
+              <w:rPr>
+                <w:rFonts w:ascii="News Gothic MT" w:cs="News Gothic MT" w:eastAsia="News Gothic MT" w:hAnsi="News Gothic MT"/>
+                <w:b w:val="false"/>
+                <w:bCs w:val="false"/>
+                <w:i w:val="false"/>
+                <w:iCs w:val="false"/>
+                <w:color w:val="1A1A2E"/>
+                <w:sz w:val="21"/>
+                <w:szCs w:val="21"/>
+              </w:rPr>
+              <w:t xml:space="preserve">) → pestaña </w:t>
+            </w:r>
+            <w:r>
+              <w:rPr>
+                <w:rFonts w:ascii="News Gothic MT" w:cs="News Gothic MT" w:eastAsia="News Gothic MT" w:hAnsi="News Gothic MT"/>
+                <w:b/>
+                <w:bCs/>
+                <w:color w:val="1A1A2E"/>
+                <w:sz w:val="21"/>
+                <w:szCs w:val="21"/>
+              </w:rPr>
+              <w:t xml:space="preserve">Rendimiento</w:t>
+            </w:r>
+            <w:r>
+              <w:rPr>
+                <w:rFonts w:ascii="News Gothic MT" w:cs="News Gothic MT" w:eastAsia="News Gothic MT" w:hAnsi="News Gothic MT"/>
+                <w:b w:val="false"/>
+                <w:bCs w:val="false"/>
+                <w:i w:val="false"/>
+                <w:iCs w:val="false"/>
+                <w:color w:val="1A1A2E"/>
+                <w:sz w:val="21"/>
+                <w:szCs w:val="21"/>
+              </w:rPr>
+              <w:t xml:space="preserve"> → </w:t>
+            </w:r>
+            <w:r>
+              <w:rPr>
+                <w:rFonts w:ascii="News Gothic MT" w:cs="News Gothic MT" w:eastAsia="News Gothic MT" w:hAnsi="News Gothic MT"/>
+                <w:b/>
+                <w:bCs/>
+                <w:color w:val="1A1A2E"/>
+                <w:sz w:val="21"/>
+                <w:szCs w:val="21"/>
+              </w:rPr>
+              <w:t xml:space="preserve">Memoria</w:t>
+            </w:r>
+            <w:r>
+              <w:rPr>
+                <w:rFonts w:ascii="News Gothic MT" w:cs="News Gothic MT" w:eastAsia="News Gothic MT" w:hAnsi="News Gothic MT"/>
+                <w:b w:val="false"/>
+                <w:bCs w:val="false"/>
+                <w:i w:val="false"/>
+                <w:iCs w:val="false"/>
+                <w:color w:val="1A1A2E"/>
+                <w:sz w:val="21"/>
+                <w:szCs w:val="21"/>
+              </w:rPr>
+              <w:t xml:space="preserve"> (en Linux, el Monitor del sistema, o el comando </w:t>
+            </w:r>
+            <w:r>
+              <w:rPr>
+                <w:rFonts w:ascii="Courier New" w:cs="Courier New" w:eastAsia="Courier New" w:hAnsi="Courier New"/>
+                <w:b w:val="false"/>
+                <w:bCs w:val="false"/>
+                <w:color w:val="9B1B5C"/>
+                <w:sz w:val="20"/>
+                <w:szCs w:val="20"/>
+              </w:rPr>
+              <w:t xml:space="preserve">free -h</w:t>
+            </w:r>
+            <w:r>
+              <w:rPr>
+                <w:rFonts w:ascii="News Gothic MT" w:cs="News Gothic MT" w:eastAsia="News Gothic MT" w:hAnsi="News Gothic MT"/>
+                <w:b w:val="false"/>
+                <w:bCs w:val="false"/>
+                <w:i w:val="false"/>
+                <w:iCs w:val="false"/>
+                <w:color w:val="1A1A2E"/>
+                <w:sz w:val="21"/>
+                <w:szCs w:val="21"/>
+              </w:rPr>
+              <w:t xml:space="preserve"> en una terminal). Anota tres datos: la RAM total instalada, la RAM en uso ahora mismo, y si aparece alguna referencia a "memoria virtual"/"archivo de paginación" (Windows) o "swap" (Linux), y cuánto espacio tiene reservado.</w:t>
+            </w:r>
+          </w:p>
+          <w:p>
+            <w:pPr>
+              <w:spacing w:after="0" w:line="300"/>
+              <w:jc w:val="both"/>
+            </w:pPr>
+            <w:r>
+              <w:rPr>
+                <w:rFonts w:ascii="News Gothic MT" w:cs="News Gothic MT" w:eastAsia="News Gothic MT" w:hAnsi="News Gothic MT"/>
+                <w:b/>
+                <w:bCs/>
+                <w:i/>
+                <w:iCs/>
+                <w:color w:val="1F3864"/>
+                <w:sz w:val="21"/>
+                <w:szCs w:val="21"/>
+              </w:rPr>
+              <w:t xml:space="preserve">Reflexiona: </w:t>
+            </w:r>
+            <w:r>
+              <w:rPr>
+                <w:rFonts w:ascii="News Gothic MT" w:cs="News Gothic MT" w:eastAsia="News Gothic MT" w:hAnsi="News Gothic MT"/>
+                <w:b w:val="false"/>
+                <w:bCs w:val="false"/>
+                <w:i/>
+                <w:iCs/>
+                <w:color w:val="1A1A2E"/>
+                <w:sz w:val="21"/>
+                <w:szCs w:val="21"/>
+              </w:rPr>
+              <w:t xml:space="preserve">si cerraras ahora mismo todas las aplicaciones que tienes abiertas, ¿bajaría a cero el uso de RAM que muestra el sistema? ¿Por qué no?</w:t>
+            </w:r>
+          </w:p>
+        </w:tc>
+      </w:tr>
+    </w:tbl>
+    <w:p>
+      <w:pPr>
+        <w:spacing w:after="160"/>
+      </w:pPr>
     </w:p>
     <w:p>
       <w:pPr>
@@ -3652,1105 +4050,8 @@
     </w:tbl>
     <w:p>
       <w:pPr>
-        <w:spacing w:after="200"/>
-      </w:pPr>
-    </w:p>
-    <w:p>
-      <w:pPr>
-        <w:pStyle w:val="Heading1"/>
-        <w:pBdr>
-          <w:bottom w:val="single" w:color="CD0063" w:sz="6" w:space="4"/>
-        </w:pBdr>
-        <w:spacing w:after="200" w:before="400"/>
-      </w:pPr>
-      <w:r>
-        <w:rPr>
-          <w:rFonts w:ascii="News Gothic MT" w:cs="News Gothic MT" w:eastAsia="News Gothic MT" w:hAnsi="News Gothic MT"/>
-          <w:b/>
-          <w:bCs/>
-          <w:color w:val="1F3864"/>
-          <w:sz w:val="32"/>
-          <w:szCs w:val="32"/>
-        </w:rPr>
-        <w:t xml:space="preserve">4. Sistema de archivos: organización y atributos</w:t>
-      </w:r>
-    </w:p>
-    <w:p>
-      <w:pPr>
-        <w:pStyle w:val="Heading2"/>
-        <w:spacing w:after="140" w:before="280"/>
-      </w:pPr>
-      <w:r>
-        <w:rPr>
-          <w:rFonts w:ascii="News Gothic MT" w:cs="News Gothic MT" w:eastAsia="News Gothic MT" w:hAnsi="News Gothic MT"/>
-          <w:b/>
-          <w:bCs/>
-          <w:color w:val="1F3864"/>
-          <w:sz w:val="26"/>
-          <w:szCs w:val="26"/>
-        </w:rPr>
-        <w:t xml:space="preserve">¿Para qué sirve un sistema de archivos?</w:t>
-      </w:r>
-    </w:p>
-    <w:p>
-      <w:pPr>
-        <w:spacing w:after="160" w:line="300"/>
-        <w:jc w:val="both"/>
-      </w:pPr>
-      <w:r>
-        <w:rPr>
-          <w:rFonts w:ascii="News Gothic MT" w:cs="News Gothic MT" w:eastAsia="News Gothic MT" w:hAnsi="News Gothic MT"/>
-          <w:b w:val="false"/>
-          <w:bCs w:val="false"/>
-          <w:i w:val="false"/>
-          <w:iCs w:val="false"/>
-          <w:color w:val="1A1A2E"/>
-          <w:sz w:val="21"/>
-          <w:szCs w:val="21"/>
-        </w:rPr>
-        <w:t xml:space="preserve">Cuando guardas un archivo, no se coloca en un lugar aleatorio del disco: el </w:t>
-      </w:r>
-      <w:r>
-        <w:rPr>
-          <w:rFonts w:ascii="News Gothic MT" w:cs="News Gothic MT" w:eastAsia="News Gothic MT" w:hAnsi="News Gothic MT"/>
-          <w:b/>
-          <w:bCs/>
-          <w:color w:val="1A1A2E"/>
-          <w:sz w:val="21"/>
-          <w:szCs w:val="21"/>
-        </w:rPr>
-        <w:t xml:space="preserve">sistema de archivos</w:t>
-      </w:r>
-      <w:r>
-        <w:rPr>
-          <w:rFonts w:ascii="News Gothic MT" w:cs="News Gothic MT" w:eastAsia="News Gothic MT" w:hAnsi="News Gothic MT"/>
-          <w:b w:val="false"/>
-          <w:bCs w:val="false"/>
-          <w:i w:val="false"/>
-          <w:iCs w:val="false"/>
-          <w:color w:val="1A1A2E"/>
-          <w:sz w:val="21"/>
-          <w:szCs w:val="21"/>
-        </w:rPr>
-        <w:t xml:space="preserve"> es la estructura que organiza y localiza toda la información almacenada. Sin él, un disco sería simplemente un espacio de bytes sin ningún orden ni forma de encontrar nada.</w:t>
-      </w:r>
-    </w:p>
-    <w:p>
-      <w:pPr>
-        <w:pStyle w:val="Heading2"/>
-        <w:spacing w:after="140" w:before="280"/>
-      </w:pPr>
-      <w:r>
-        <w:rPr>
-          <w:rFonts w:ascii="News Gothic MT" w:cs="News Gothic MT" w:eastAsia="News Gothic MT" w:hAnsi="News Gothic MT"/>
-          <w:b/>
-          <w:bCs/>
-          <w:color w:val="1F3864"/>
-          <w:sz w:val="26"/>
-          <w:szCs w:val="26"/>
-        </w:rPr>
-        <w:t xml:space="preserve">La jerarquía de directorios en Windows</w:t>
-      </w:r>
-    </w:p>
-    <w:p>
-      <w:pPr>
-        <w:spacing w:after="160" w:line="300"/>
-        <w:jc w:val="both"/>
-      </w:pPr>
-      <w:r>
-        <w:rPr>
-          <w:rFonts w:ascii="News Gothic MT" w:cs="News Gothic MT" w:eastAsia="News Gothic MT" w:hAnsi="News Gothic MT"/>
-          <w:b w:val="false"/>
-          <w:bCs w:val="false"/>
-          <w:i w:val="false"/>
-          <w:iCs w:val="false"/>
-          <w:color w:val="1A1A2E"/>
-          <w:sz w:val="21"/>
-          <w:szCs w:val="21"/>
-        </w:rPr>
-        <w:t xml:space="preserve">Windows organiza los discos con </w:t>
-      </w:r>
-      <w:r>
-        <w:rPr>
-          <w:rFonts w:ascii="News Gothic MT" w:cs="News Gothic MT" w:eastAsia="News Gothic MT" w:hAnsi="News Gothic MT"/>
-          <w:b/>
-          <w:bCs/>
-          <w:color w:val="1A1A2E"/>
-          <w:sz w:val="21"/>
-          <w:szCs w:val="21"/>
-        </w:rPr>
-        <w:t xml:space="preserve">letras de unidad</w:t>
-      </w:r>
-      <w:r>
-        <w:rPr>
-          <w:rFonts w:ascii="News Gothic MT" w:cs="News Gothic MT" w:eastAsia="News Gothic MT" w:hAnsi="News Gothic MT"/>
-          <w:b w:val="false"/>
-          <w:bCs w:val="false"/>
-          <w:i w:val="false"/>
-          <w:iCs w:val="false"/>
-          <w:color w:val="1A1A2E"/>
-          <w:sz w:val="21"/>
-          <w:szCs w:val="21"/>
-        </w:rPr>
-        <w:t xml:space="preserve"> (</w:t>
-      </w:r>
-      <w:r>
-        <w:rPr>
-          <w:rFonts w:ascii="Courier New" w:cs="Courier New" w:eastAsia="Courier New" w:hAnsi="Courier New"/>
-          <w:b w:val="false"/>
-          <w:bCs w:val="false"/>
-          <w:color w:val="9B1B5C"/>
-          <w:sz w:val="20"/>
-          <w:szCs w:val="20"/>
-        </w:rPr>
-        <w:t xml:space="preserve">C:\</w:t>
-      </w:r>
-      <w:r>
-        <w:rPr>
-          <w:rFonts w:ascii="News Gothic MT" w:cs="News Gothic MT" w:eastAsia="News Gothic MT" w:hAnsi="News Gothic MT"/>
-          <w:b w:val="false"/>
-          <w:bCs w:val="false"/>
-          <w:i w:val="false"/>
-          <w:iCs w:val="false"/>
-          <w:color w:val="1A1A2E"/>
-          <w:sz w:val="21"/>
-          <w:szCs w:val="21"/>
-        </w:rPr>
-        <w:t xml:space="preserve">, </w:t>
-      </w:r>
-      <w:r>
-        <w:rPr>
-          <w:rFonts w:ascii="Courier New" w:cs="Courier New" w:eastAsia="Courier New" w:hAnsi="Courier New"/>
-          <w:b w:val="false"/>
-          <w:bCs w:val="false"/>
-          <w:color w:val="9B1B5C"/>
-          <w:sz w:val="20"/>
-          <w:szCs w:val="20"/>
-        </w:rPr>
-        <w:t xml:space="preserve">D:\</w:t>
-      </w:r>
-      <w:r>
-        <w:rPr>
-          <w:rFonts w:ascii="News Gothic MT" w:cs="News Gothic MT" w:eastAsia="News Gothic MT" w:hAnsi="News Gothic MT"/>
-          <w:b w:val="false"/>
-          <w:bCs w:val="false"/>
-          <w:i w:val="false"/>
-          <w:iCs w:val="false"/>
-          <w:color w:val="1A1A2E"/>
-          <w:sz w:val="21"/>
-          <w:szCs w:val="21"/>
-        </w:rPr>
-        <w:t xml:space="preserve">...), cada una con su propia estructura de carpetas. Dentro de la unidad principal encontrarás carpetas típicas como </w:t>
-      </w:r>
-      <w:r>
-        <w:rPr>
-          <w:rFonts w:ascii="Courier New" w:cs="Courier New" w:eastAsia="Courier New" w:hAnsi="Courier New"/>
-          <w:b w:val="false"/>
-          <w:bCs w:val="false"/>
-          <w:color w:val="9B1B5C"/>
-          <w:sz w:val="20"/>
-          <w:szCs w:val="20"/>
-        </w:rPr>
-        <w:t xml:space="preserve">Usuarios</w:t>
-      </w:r>
-      <w:r>
-        <w:rPr>
-          <w:rFonts w:ascii="News Gothic MT" w:cs="News Gothic MT" w:eastAsia="News Gothic MT" w:hAnsi="News Gothic MT"/>
-          <w:b w:val="false"/>
-          <w:bCs w:val="false"/>
-          <w:i w:val="false"/>
-          <w:iCs w:val="false"/>
-          <w:color w:val="1A1A2E"/>
-          <w:sz w:val="21"/>
-          <w:szCs w:val="21"/>
-        </w:rPr>
-        <w:t xml:space="preserve">, </w:t>
-      </w:r>
-      <w:r>
-        <w:rPr>
-          <w:rFonts w:ascii="Courier New" w:cs="Courier New" w:eastAsia="Courier New" w:hAnsi="Courier New"/>
-          <w:b w:val="false"/>
-          <w:bCs w:val="false"/>
-          <w:color w:val="9B1B5C"/>
-          <w:sz w:val="20"/>
-          <w:szCs w:val="20"/>
-        </w:rPr>
-        <w:t xml:space="preserve">Archivos de programa</w:t>
-      </w:r>
-      <w:r>
-        <w:rPr>
-          <w:rFonts w:ascii="News Gothic MT" w:cs="News Gothic MT" w:eastAsia="News Gothic MT" w:hAnsi="News Gothic MT"/>
-          <w:b w:val="false"/>
-          <w:bCs w:val="false"/>
-          <w:i w:val="false"/>
-          <w:iCs w:val="false"/>
-          <w:color w:val="1A1A2E"/>
-          <w:sz w:val="21"/>
-          <w:szCs w:val="21"/>
-        </w:rPr>
-        <w:t xml:space="preserve"> o </w:t>
-      </w:r>
-      <w:r>
-        <w:rPr>
-          <w:rFonts w:ascii="Courier New" w:cs="Courier New" w:eastAsia="Courier New" w:hAnsi="Courier New"/>
-          <w:b w:val="false"/>
-          <w:bCs w:val="false"/>
-          <w:color w:val="9B1B5C"/>
-          <w:sz w:val="20"/>
-          <w:szCs w:val="20"/>
-        </w:rPr>
-        <w:t xml:space="preserve">Windows</w:t>
-      </w:r>
-      <w:r>
-        <w:rPr>
-          <w:rFonts w:ascii="News Gothic MT" w:cs="News Gothic MT" w:eastAsia="News Gothic MT" w:hAnsi="News Gothic MT"/>
-          <w:b w:val="false"/>
-          <w:bCs w:val="false"/>
-          <w:i w:val="false"/>
-          <w:iCs w:val="false"/>
-          <w:color w:val="1A1A2E"/>
-          <w:sz w:val="21"/>
-          <w:szCs w:val="21"/>
-        </w:rPr>
-        <w:t xml:space="preserve">. Las rutas se escriben separando carpetas con la barra invertida </w:t>
-      </w:r>
-      <w:r>
-        <w:rPr>
-          <w:rFonts w:ascii="Courier New" w:cs="Courier New" w:eastAsia="Courier New" w:hAnsi="Courier New"/>
-          <w:b w:val="false"/>
-          <w:bCs w:val="false"/>
-          <w:color w:val="9B1B5C"/>
-          <w:sz w:val="20"/>
-          <w:szCs w:val="20"/>
-        </w:rPr>
-        <w:t xml:space="preserve">\</w:t>
-      </w:r>
-      <w:r>
-        <w:rPr>
-          <w:rFonts w:ascii="News Gothic MT" w:cs="News Gothic MT" w:eastAsia="News Gothic MT" w:hAnsi="News Gothic MT"/>
-          <w:b w:val="false"/>
-          <w:bCs w:val="false"/>
-          <w:i w:val="false"/>
-          <w:iCs w:val="false"/>
-          <w:color w:val="1A1A2E"/>
-          <w:sz w:val="21"/>
-          <w:szCs w:val="21"/>
-        </w:rPr>
-        <w:t xml:space="preserve">, y pueden ser:</w:t>
-      </w:r>
-    </w:p>
-    <w:p>
-      <w:pPr>
-        <w:pStyle w:val="ListParagraph"/>
-        <w:numPr>
-          <w:ilvl w:val="0"/>
-          <w:numId w:val="1"/>
-        </w:numPr>
-        <w:spacing w:after="100" w:line="300"/>
-      </w:pPr>
-      <w:r>
-        <w:rPr>
-          <w:rFonts w:ascii="News Gothic MT" w:cs="News Gothic MT" w:eastAsia="News Gothic MT" w:hAnsi="News Gothic MT"/>
-          <w:b/>
-          <w:bCs/>
-          <w:color w:val="1A1A2E"/>
-          <w:sz w:val="21"/>
-          <w:szCs w:val="21"/>
-        </w:rPr>
-        <w:t xml:space="preserve">Absolutas</w:t>
-      </w:r>
-      <w:r>
-        <w:rPr>
-          <w:rFonts w:ascii="News Gothic MT" w:cs="News Gothic MT" w:eastAsia="News Gothic MT" w:hAnsi="News Gothic MT"/>
-          <w:b w:val="false"/>
-          <w:bCs w:val="false"/>
-          <w:i w:val="false"/>
-          <w:iCs w:val="false"/>
-          <w:color w:val="1A1A2E"/>
-          <w:sz w:val="21"/>
-          <w:szCs w:val="21"/>
-        </w:rPr>
-        <w:t xml:space="preserve">: desde la raíz de la unidad, por ejemplo </w:t>
-      </w:r>
-      <w:r>
-        <w:rPr>
-          <w:rFonts w:ascii="Courier New" w:cs="Courier New" w:eastAsia="Courier New" w:hAnsi="Courier New"/>
-          <w:b w:val="false"/>
-          <w:bCs w:val="false"/>
-          <w:color w:val="9B1B5C"/>
-          <w:sz w:val="20"/>
-          <w:szCs w:val="20"/>
-        </w:rPr>
-        <w:t xml:space="preserve">C:\Usuarios\Alejandro\Documentos\informe.docx</w:t>
-      </w:r>
-      <w:r>
-        <w:rPr>
-          <w:rFonts w:ascii="News Gothic MT" w:cs="News Gothic MT" w:eastAsia="News Gothic MT" w:hAnsi="News Gothic MT"/>
-          <w:b w:val="false"/>
-          <w:bCs w:val="false"/>
-          <w:i w:val="false"/>
-          <w:iCs w:val="false"/>
-          <w:color w:val="1A1A2E"/>
-          <w:sz w:val="21"/>
-          <w:szCs w:val="21"/>
-        </w:rPr>
-        <w:t xml:space="preserve">.</w:t>
-      </w:r>
-    </w:p>
-    <w:p>
-      <w:pPr>
-        <w:pStyle w:val="ListParagraph"/>
-        <w:numPr>
-          <w:ilvl w:val="0"/>
-          <w:numId w:val="1"/>
-        </w:numPr>
-        <w:spacing w:after="100" w:line="300"/>
-      </w:pPr>
-      <w:r>
-        <w:rPr>
-          <w:rFonts w:ascii="News Gothic MT" w:cs="News Gothic MT" w:eastAsia="News Gothic MT" w:hAnsi="News Gothic MT"/>
-          <w:b/>
-          <w:bCs/>
-          <w:color w:val="1A1A2E"/>
-          <w:sz w:val="21"/>
-          <w:szCs w:val="21"/>
-        </w:rPr>
-        <w:t xml:space="preserve">Relativas</w:t>
-      </w:r>
-      <w:r>
-        <w:rPr>
-          <w:rFonts w:ascii="News Gothic MT" w:cs="News Gothic MT" w:eastAsia="News Gothic MT" w:hAnsi="News Gothic MT"/>
-          <w:b w:val="false"/>
-          <w:bCs w:val="false"/>
-          <w:i w:val="false"/>
-          <w:iCs w:val="false"/>
-          <w:color w:val="1A1A2E"/>
-          <w:sz w:val="21"/>
-          <w:szCs w:val="21"/>
-        </w:rPr>
-        <w:t xml:space="preserve">: desde la carpeta en la que ya estás, por ejemplo </w:t>
-      </w:r>
-      <w:r>
-        <w:rPr>
-          <w:rFonts w:ascii="Courier New" w:cs="Courier New" w:eastAsia="Courier New" w:hAnsi="Courier New"/>
-          <w:b w:val="false"/>
-          <w:bCs w:val="false"/>
-          <w:color w:val="9B1B5C"/>
-          <w:sz w:val="20"/>
-          <w:szCs w:val="20"/>
-        </w:rPr>
-        <w:t xml:space="preserve">Documentos\informe.docx</w:t>
-      </w:r>
-      <w:r>
-        <w:rPr>
-          <w:rFonts w:ascii="News Gothic MT" w:cs="News Gothic MT" w:eastAsia="News Gothic MT" w:hAnsi="News Gothic MT"/>
-          <w:b w:val="false"/>
-          <w:bCs w:val="false"/>
-          <w:i w:val="false"/>
-          <w:iCs w:val="false"/>
-          <w:color w:val="1A1A2E"/>
-          <w:sz w:val="21"/>
-          <w:szCs w:val="21"/>
-        </w:rPr>
-        <w:t xml:space="preserve"> si ya estás dentro de </w:t>
-      </w:r>
-      <w:r>
-        <w:rPr>
-          <w:rFonts w:ascii="Courier New" w:cs="Courier New" w:eastAsia="Courier New" w:hAnsi="Courier New"/>
-          <w:b w:val="false"/>
-          <w:bCs w:val="false"/>
-          <w:color w:val="9B1B5C"/>
-          <w:sz w:val="20"/>
-          <w:szCs w:val="20"/>
-        </w:rPr>
-        <w:t xml:space="preserve">C:\Usuarios\Alejandro</w:t>
-      </w:r>
-      <w:r>
-        <w:rPr>
-          <w:rFonts w:ascii="News Gothic MT" w:cs="News Gothic MT" w:eastAsia="News Gothic MT" w:hAnsi="News Gothic MT"/>
-          <w:b w:val="false"/>
-          <w:bCs w:val="false"/>
-          <w:i w:val="false"/>
-          <w:iCs w:val="false"/>
-          <w:color w:val="1A1A2E"/>
-          <w:sz w:val="21"/>
-          <w:szCs w:val="21"/>
-        </w:rPr>
-        <w:t xml:space="preserve">.</w:t>
-      </w:r>
-    </w:p>
-    <w:p>
-      <w:pPr>
-        <w:pStyle w:val="Heading2"/>
-        <w:spacing w:after="140" w:before="280"/>
-      </w:pPr>
-      <w:r>
-        <w:rPr>
-          <w:rFonts w:ascii="News Gothic MT" w:cs="News Gothic MT" w:eastAsia="News Gothic MT" w:hAnsi="News Gothic MT"/>
-          <w:b/>
-          <w:bCs/>
-          <w:color w:val="1F3864"/>
-          <w:sz w:val="26"/>
-          <w:szCs w:val="26"/>
-        </w:rPr>
-        <w:t xml:space="preserve">La jerarquía de directorios en Linux</w:t>
-      </w:r>
-    </w:p>
-    <w:p>
-      <w:pPr>
-        <w:spacing w:after="160" w:line="300"/>
-        <w:jc w:val="both"/>
-      </w:pPr>
-      <w:r>
-        <w:rPr>
-          <w:rFonts w:ascii="News Gothic MT" w:cs="News Gothic MT" w:eastAsia="News Gothic MT" w:hAnsi="News Gothic MT"/>
-          <w:b w:val="false"/>
-          <w:bCs w:val="false"/>
-          <w:i w:val="false"/>
-          <w:iCs w:val="false"/>
-          <w:color w:val="1A1A2E"/>
-          <w:sz w:val="21"/>
-          <w:szCs w:val="21"/>
-        </w:rPr>
-        <w:t xml:space="preserve">Linux no usa letras de unidad: existe una </w:t>
-      </w:r>
-      <w:r>
-        <w:rPr>
-          <w:rFonts w:ascii="News Gothic MT" w:cs="News Gothic MT" w:eastAsia="News Gothic MT" w:hAnsi="News Gothic MT"/>
-          <w:b/>
-          <w:bCs/>
-          <w:color w:val="1A1A2E"/>
-          <w:sz w:val="21"/>
-          <w:szCs w:val="21"/>
-        </w:rPr>
-        <w:t xml:space="preserve">única raíz</w:t>
-      </w:r>
-      <w:r>
-        <w:rPr>
-          <w:rFonts w:ascii="News Gothic MT" w:cs="News Gothic MT" w:eastAsia="News Gothic MT" w:hAnsi="News Gothic MT"/>
-          <w:b w:val="false"/>
-          <w:bCs w:val="false"/>
-          <w:i w:val="false"/>
-          <w:iCs w:val="false"/>
-          <w:color w:val="1A1A2E"/>
-          <w:sz w:val="21"/>
-          <w:szCs w:val="21"/>
-        </w:rPr>
-        <w:t xml:space="preserve"> (</w:t>
-      </w:r>
-      <w:r>
-        <w:rPr>
-          <w:rFonts w:ascii="Courier New" w:cs="Courier New" w:eastAsia="Courier New" w:hAnsi="Courier New"/>
-          <w:b w:val="false"/>
-          <w:bCs w:val="false"/>
-          <w:color w:val="9B1B5C"/>
-          <w:sz w:val="20"/>
-          <w:szCs w:val="20"/>
-        </w:rPr>
-        <w:t xml:space="preserve">/</w:t>
-      </w:r>
-      <w:r>
-        <w:rPr>
-          <w:rFonts w:ascii="News Gothic MT" w:cs="News Gothic MT" w:eastAsia="News Gothic MT" w:hAnsi="News Gothic MT"/>
-          <w:b w:val="false"/>
-          <w:bCs w:val="false"/>
-          <w:i w:val="false"/>
-          <w:iCs w:val="false"/>
-          <w:color w:val="1A1A2E"/>
-          <w:sz w:val="21"/>
-          <w:szCs w:val="21"/>
-        </w:rPr>
-        <w:t xml:space="preserve">), y cualquier disco o partición adicional se </w:t>
-      </w:r>
-      <w:r>
-        <w:rPr>
-          <w:rFonts w:ascii="News Gothic MT" w:cs="News Gothic MT" w:eastAsia="News Gothic MT" w:hAnsi="News Gothic MT"/>
-          <w:b/>
-          <w:bCs/>
-          <w:color w:val="1A1A2E"/>
-          <w:sz w:val="21"/>
-          <w:szCs w:val="21"/>
-        </w:rPr>
-        <w:t xml:space="preserve">monta</w:t>
-      </w:r>
-      <w:r>
-        <w:rPr>
-          <w:rFonts w:ascii="News Gothic MT" w:cs="News Gothic MT" w:eastAsia="News Gothic MT" w:hAnsi="News Gothic MT"/>
-          <w:b w:val="false"/>
-          <w:bCs w:val="false"/>
-          <w:i w:val="false"/>
-          <w:iCs w:val="false"/>
-          <w:color w:val="1A1A2E"/>
-          <w:sz w:val="21"/>
-          <w:szCs w:val="21"/>
-        </w:rPr>
-        <w:t xml:space="preserve"> dentro de ese árbol único, apareciendo como una carpeta más — no como una letra nueva. Algunos de los directorios principales son:</w:t>
-      </w:r>
-    </w:p>
-    <w:p>
-      <w:pPr>
-        <w:pStyle w:val="ListParagraph"/>
-        <w:numPr>
-          <w:ilvl w:val="0"/>
-          <w:numId w:val="1"/>
-        </w:numPr>
-        <w:spacing w:after="100" w:line="300"/>
-      </w:pPr>
-      <w:r>
-        <w:rPr>
-          <w:rFonts w:ascii="Courier New" w:cs="Courier New" w:eastAsia="Courier New" w:hAnsi="Courier New"/>
-          <w:b w:val="false"/>
-          <w:bCs w:val="false"/>
-          <w:color w:val="9B1B5C"/>
-          <w:sz w:val="20"/>
-          <w:szCs w:val="20"/>
-        </w:rPr>
-        <w:t xml:space="preserve">/home</w:t>
-      </w:r>
-      <w:r>
-        <w:rPr>
-          <w:rFonts w:ascii="News Gothic MT" w:cs="News Gothic MT" w:eastAsia="News Gothic MT" w:hAnsi="News Gothic MT"/>
-          <w:b w:val="false"/>
-          <w:bCs w:val="false"/>
-          <w:i w:val="false"/>
-          <w:iCs w:val="false"/>
-          <w:color w:val="1A1A2E"/>
-          <w:sz w:val="21"/>
-          <w:szCs w:val="21"/>
-        </w:rPr>
-        <w:t xml:space="preserve"> — carpetas personales de cada usuario.</w:t>
-      </w:r>
-    </w:p>
-    <w:p>
-      <w:pPr>
-        <w:pStyle w:val="ListParagraph"/>
-        <w:numPr>
-          <w:ilvl w:val="0"/>
-          <w:numId w:val="1"/>
-        </w:numPr>
-        <w:spacing w:after="100" w:line="300"/>
-      </w:pPr>
-      <w:r>
-        <w:rPr>
-          <w:rFonts w:ascii="Courier New" w:cs="Courier New" w:eastAsia="Courier New" w:hAnsi="Courier New"/>
-          <w:b w:val="false"/>
-          <w:bCs w:val="false"/>
-          <w:color w:val="9B1B5C"/>
-          <w:sz w:val="20"/>
-          <w:szCs w:val="20"/>
-        </w:rPr>
-        <w:t xml:space="preserve">/etc</w:t>
-      </w:r>
-      <w:r>
-        <w:rPr>
-          <w:rFonts w:ascii="News Gothic MT" w:cs="News Gothic MT" w:eastAsia="News Gothic MT" w:hAnsi="News Gothic MT"/>
-          <w:b w:val="false"/>
-          <w:bCs w:val="false"/>
-          <w:i w:val="false"/>
-          <w:iCs w:val="false"/>
-          <w:color w:val="1A1A2E"/>
-          <w:sz w:val="21"/>
-          <w:szCs w:val="21"/>
-        </w:rPr>
-        <w:t xml:space="preserve"> — archivos de configuración del sistema.</w:t>
-      </w:r>
-    </w:p>
-    <w:p>
-      <w:pPr>
-        <w:pStyle w:val="ListParagraph"/>
-        <w:numPr>
-          <w:ilvl w:val="0"/>
-          <w:numId w:val="1"/>
-        </w:numPr>
-        <w:spacing w:after="100" w:line="300"/>
-      </w:pPr>
-      <w:r>
-        <w:rPr>
-          <w:rFonts w:ascii="Courier New" w:cs="Courier New" w:eastAsia="Courier New" w:hAnsi="Courier New"/>
-          <w:b w:val="false"/>
-          <w:bCs w:val="false"/>
-          <w:color w:val="9B1B5C"/>
-          <w:sz w:val="20"/>
-          <w:szCs w:val="20"/>
-        </w:rPr>
-        <w:t xml:space="preserve">/var</w:t>
-      </w:r>
-      <w:r>
-        <w:rPr>
-          <w:rFonts w:ascii="News Gothic MT" w:cs="News Gothic MT" w:eastAsia="News Gothic MT" w:hAnsi="News Gothic MT"/>
-          <w:b w:val="false"/>
-          <w:bCs w:val="false"/>
-          <w:i w:val="false"/>
-          <w:iCs w:val="false"/>
-          <w:color w:val="1A1A2E"/>
-          <w:sz w:val="21"/>
-          <w:szCs w:val="21"/>
-        </w:rPr>
-        <w:t xml:space="preserve"> — datos que cambian con el tiempo (registros, colas de impresión...).</w:t>
-      </w:r>
-    </w:p>
-    <w:p>
-      <w:pPr>
-        <w:pStyle w:val="ListParagraph"/>
-        <w:numPr>
-          <w:ilvl w:val="0"/>
-          <w:numId w:val="1"/>
-        </w:numPr>
-        <w:spacing w:after="100" w:line="300"/>
-      </w:pPr>
-      <w:r>
-        <w:rPr>
-          <w:rFonts w:ascii="Courier New" w:cs="Courier New" w:eastAsia="Courier New" w:hAnsi="Courier New"/>
-          <w:b w:val="false"/>
-          <w:bCs w:val="false"/>
-          <w:color w:val="9B1B5C"/>
-          <w:sz w:val="20"/>
-          <w:szCs w:val="20"/>
-        </w:rPr>
-        <w:t xml:space="preserve">/bin</w:t>
-      </w:r>
-      <w:r>
-        <w:rPr>
-          <w:rFonts w:ascii="News Gothic MT" w:cs="News Gothic MT" w:eastAsia="News Gothic MT" w:hAnsi="News Gothic MT"/>
-          <w:b w:val="false"/>
-          <w:bCs w:val="false"/>
-          <w:i w:val="false"/>
-          <w:iCs w:val="false"/>
-          <w:color w:val="1A1A2E"/>
-          <w:sz w:val="21"/>
-          <w:szCs w:val="21"/>
-        </w:rPr>
-        <w:t xml:space="preserve"> y </w:t>
-      </w:r>
-      <w:r>
-        <w:rPr>
-          <w:rFonts w:ascii="Courier New" w:cs="Courier New" w:eastAsia="Courier New" w:hAnsi="Courier New"/>
-          <w:b w:val="false"/>
-          <w:bCs w:val="false"/>
-          <w:color w:val="9B1B5C"/>
-          <w:sz w:val="20"/>
-          <w:szCs w:val="20"/>
-        </w:rPr>
-        <w:t xml:space="preserve">/usr</w:t>
-      </w:r>
-      <w:r>
-        <w:rPr>
-          <w:rFonts w:ascii="News Gothic MT" w:cs="News Gothic MT" w:eastAsia="News Gothic MT" w:hAnsi="News Gothic MT"/>
-          <w:b w:val="false"/>
-          <w:bCs w:val="false"/>
-          <w:i w:val="false"/>
-          <w:iCs w:val="false"/>
-          <w:color w:val="1A1A2E"/>
-          <w:sz w:val="21"/>
-          <w:szCs w:val="21"/>
-        </w:rPr>
-        <w:t xml:space="preserve"> — programas del sistema.</w:t>
-      </w:r>
-    </w:p>
-    <w:p>
-      <w:pPr>
-        <w:spacing w:after="160" w:line="300"/>
-        <w:jc w:val="both"/>
-      </w:pPr>
-      <w:r>
-        <w:rPr>
-          <w:rFonts w:ascii="News Gothic MT" w:cs="News Gothic MT" w:eastAsia="News Gothic MT" w:hAnsi="News Gothic MT"/>
-          <w:b w:val="false"/>
-          <w:bCs w:val="false"/>
-          <w:i w:val="false"/>
-          <w:iCs w:val="false"/>
-          <w:color w:val="1A1A2E"/>
-          <w:sz w:val="21"/>
-          <w:szCs w:val="21"/>
-        </w:rPr>
-        <w:t xml:space="preserve">Las rutas en Linux se separan con la barra </w:t>
-      </w:r>
-      <w:r>
-        <w:rPr>
-          <w:rFonts w:ascii="Courier New" w:cs="Courier New" w:eastAsia="Courier New" w:hAnsi="Courier New"/>
-          <w:b w:val="false"/>
-          <w:bCs w:val="false"/>
-          <w:color w:val="9B1B5C"/>
-          <w:sz w:val="20"/>
-          <w:szCs w:val="20"/>
-        </w:rPr>
-        <w:t xml:space="preserve">/</w:t>
-      </w:r>
-      <w:r>
-        <w:rPr>
-          <w:rFonts w:ascii="News Gothic MT" w:cs="News Gothic MT" w:eastAsia="News Gothic MT" w:hAnsi="News Gothic MT"/>
-          <w:b w:val="false"/>
-          <w:bCs w:val="false"/>
-          <w:i w:val="false"/>
-          <w:iCs w:val="false"/>
-          <w:color w:val="1A1A2E"/>
-          <w:sz w:val="21"/>
-          <w:szCs w:val="21"/>
-        </w:rPr>
-        <w:t xml:space="preserve"> (no </w:t>
-      </w:r>
-      <w:r>
-        <w:rPr>
-          <w:rFonts w:ascii="Courier New" w:cs="Courier New" w:eastAsia="Courier New" w:hAnsi="Courier New"/>
-          <w:b w:val="false"/>
-          <w:bCs w:val="false"/>
-          <w:color w:val="9B1B5C"/>
-          <w:sz w:val="20"/>
-          <w:szCs w:val="20"/>
-        </w:rPr>
-        <w:t xml:space="preserve">\</w:t>
-      </w:r>
-      <w:r>
-        <w:rPr>
-          <w:rFonts w:ascii="News Gothic MT" w:cs="News Gothic MT" w:eastAsia="News Gothic MT" w:hAnsi="News Gothic MT"/>
-          <w:b w:val="false"/>
-          <w:bCs w:val="false"/>
-          <w:i w:val="false"/>
-          <w:iCs w:val="false"/>
-          <w:color w:val="1A1A2E"/>
-          <w:sz w:val="21"/>
-          <w:szCs w:val="21"/>
-        </w:rPr>
-        <w:t xml:space="preserve">), y también pueden ser absolutas o relativas, igual que en Windows.</w:t>
-      </w:r>
-    </w:p>
-    <w:p>
-      <w:pPr>
-        <w:pStyle w:val="Heading2"/>
-        <w:spacing w:after="140" w:before="280"/>
-      </w:pPr>
-      <w:r>
-        <w:rPr>
-          <w:rFonts w:ascii="News Gothic MT" w:cs="News Gothic MT" w:eastAsia="News Gothic MT" w:hAnsi="News Gothic MT"/>
-          <w:b/>
-          <w:bCs/>
-          <w:color w:val="1F3864"/>
-          <w:sz w:val="26"/>
-          <w:szCs w:val="26"/>
-        </w:rPr>
-        <w:t xml:space="preserve">La diferencia que más suele fallar: mayúsculas y minúsculas</w:t>
-      </w:r>
-    </w:p>
-    <w:p>
-      <w:pPr>
-        <w:spacing w:after="160" w:line="300"/>
-        <w:jc w:val="both"/>
-      </w:pPr>
-      <w:r>
-        <w:rPr>
-          <w:rFonts w:ascii="News Gothic MT" w:cs="News Gothic MT" w:eastAsia="News Gothic MT" w:hAnsi="News Gothic MT"/>
-          <w:b/>
-          <w:bCs/>
-          <w:color w:val="1A1A2E"/>
-          <w:sz w:val="21"/>
-          <w:szCs w:val="21"/>
-        </w:rPr>
-        <w:t xml:space="preserve">Windows no distingue mayúsculas de minúsculas</w:t>
-      </w:r>
-      <w:r>
-        <w:rPr>
-          <w:rFonts w:ascii="News Gothic MT" w:cs="News Gothic MT" w:eastAsia="News Gothic MT" w:hAnsi="News Gothic MT"/>
-          <w:b w:val="false"/>
-          <w:bCs w:val="false"/>
-          <w:i w:val="false"/>
-          <w:iCs w:val="false"/>
-          <w:color w:val="1A1A2E"/>
-          <w:sz w:val="21"/>
-          <w:szCs w:val="21"/>
-        </w:rPr>
-        <w:t xml:space="preserve"> en los nombres de archivo: </w:t>
-      </w:r>
-      <w:r>
-        <w:rPr>
-          <w:rFonts w:ascii="Courier New" w:cs="Courier New" w:eastAsia="Courier New" w:hAnsi="Courier New"/>
-          <w:b w:val="false"/>
-          <w:bCs w:val="false"/>
-          <w:color w:val="9B1B5C"/>
-          <w:sz w:val="20"/>
-          <w:szCs w:val="20"/>
-        </w:rPr>
-        <w:t xml:space="preserve">Documento.txt</w:t>
-      </w:r>
-      <w:r>
-        <w:rPr>
-          <w:rFonts w:ascii="News Gothic MT" w:cs="News Gothic MT" w:eastAsia="News Gothic MT" w:hAnsi="News Gothic MT"/>
-          <w:b w:val="false"/>
-          <w:bCs w:val="false"/>
-          <w:i w:val="false"/>
-          <w:iCs w:val="false"/>
-          <w:color w:val="1A1A2E"/>
-          <w:sz w:val="21"/>
-          <w:szCs w:val="21"/>
-        </w:rPr>
-        <w:t xml:space="preserve"> y </w:t>
-      </w:r>
-      <w:r>
-        <w:rPr>
-          <w:rFonts w:ascii="Courier New" w:cs="Courier New" w:eastAsia="Courier New" w:hAnsi="Courier New"/>
-          <w:b w:val="false"/>
-          <w:bCs w:val="false"/>
-          <w:color w:val="9B1B5C"/>
-          <w:sz w:val="20"/>
-          <w:szCs w:val="20"/>
-        </w:rPr>
-        <w:t xml:space="preserve">documento.txt</w:t>
-      </w:r>
-      <w:r>
-        <w:rPr>
-          <w:rFonts w:ascii="News Gothic MT" w:cs="News Gothic MT" w:eastAsia="News Gothic MT" w:hAnsi="News Gothic MT"/>
-          <w:b w:val="false"/>
-          <w:bCs w:val="false"/>
-          <w:i w:val="false"/>
-          <w:iCs w:val="false"/>
-          <w:color w:val="1A1A2E"/>
-          <w:sz w:val="21"/>
-          <w:szCs w:val="21"/>
-        </w:rPr>
-        <w:t xml:space="preserve"> son el mismo archivo. </w:t>
-      </w:r>
-      <w:r>
-        <w:rPr>
-          <w:rFonts w:ascii="News Gothic MT" w:cs="News Gothic MT" w:eastAsia="News Gothic MT" w:hAnsi="News Gothic MT"/>
-          <w:b/>
-          <w:bCs/>
-          <w:color w:val="1A1A2E"/>
-          <w:sz w:val="21"/>
-          <w:szCs w:val="21"/>
-        </w:rPr>
-        <w:t xml:space="preserve">Linux sí distingue</w:t>
-      </w:r>
-      <w:r>
-        <w:rPr>
-          <w:rFonts w:ascii="News Gothic MT" w:cs="News Gothic MT" w:eastAsia="News Gothic MT" w:hAnsi="News Gothic MT"/>
-          <w:b w:val="false"/>
-          <w:bCs w:val="false"/>
-          <w:i w:val="false"/>
-          <w:iCs w:val="false"/>
-          <w:color w:val="1A1A2E"/>
-          <w:sz w:val="21"/>
-          <w:szCs w:val="21"/>
-        </w:rPr>
-        <w:t xml:space="preserve">: esos mismos dos nombres serían dos archivos completamente distintos. Esta diferencia es la causa más habitual de que "un comando no funcione" cuando se empieza a trabajar con la terminal de Linux — conviene tenerla muy presente desde ya, antes de que te encuentres con ese problema en la práctica.</w:t>
-      </w:r>
-    </w:p>
-    <w:p>
-      <w:pPr>
-        <w:pStyle w:val="Heading2"/>
-        <w:spacing w:after="140" w:before="280"/>
-      </w:pPr>
-      <w:r>
-        <w:rPr>
-          <w:rFonts w:ascii="News Gothic MT" w:cs="News Gothic MT" w:eastAsia="News Gothic MT" w:hAnsi="News Gothic MT"/>
-          <w:b/>
-          <w:bCs/>
-          <w:color w:val="1F3864"/>
-          <w:sz w:val="26"/>
-          <w:szCs w:val="26"/>
-        </w:rPr>
-        <w:t xml:space="preserve">Atributos de archivos y directorios</w:t>
-      </w:r>
-    </w:p>
-    <w:p>
-      <w:pPr>
-        <w:spacing w:after="160" w:line="300"/>
-        <w:jc w:val="both"/>
-      </w:pPr>
-      <w:r>
-        <w:rPr>
-          <w:rFonts w:ascii="News Gothic MT" w:cs="News Gothic MT" w:eastAsia="News Gothic MT" w:hAnsi="News Gothic MT"/>
-          <w:b w:val="false"/>
-          <w:bCs w:val="false"/>
-          <w:i w:val="false"/>
-          <w:iCs w:val="false"/>
-          <w:color w:val="1A1A2E"/>
-          <w:sz w:val="21"/>
-          <w:szCs w:val="21"/>
-        </w:rPr>
-        <w:t xml:space="preserve">Tanto Windows como Linux permiten marcar archivos y carpetas con </w:t>
-      </w:r>
-      <w:r>
-        <w:rPr>
-          <w:rFonts w:ascii="News Gothic MT" w:cs="News Gothic MT" w:eastAsia="News Gothic MT" w:hAnsi="News Gothic MT"/>
-          <w:b/>
-          <w:bCs/>
-          <w:color w:val="1A1A2E"/>
-          <w:sz w:val="21"/>
-          <w:szCs w:val="21"/>
-        </w:rPr>
-        <w:t xml:space="preserve">atributos</w:t>
-      </w:r>
-      <w:r>
-        <w:rPr>
-          <w:rFonts w:ascii="News Gothic MT" w:cs="News Gothic MT" w:eastAsia="News Gothic MT" w:hAnsi="News Gothic MT"/>
-          <w:b w:val="false"/>
-          <w:bCs w:val="false"/>
-          <w:i w:val="false"/>
-          <w:iCs w:val="false"/>
-          <w:color w:val="1A1A2E"/>
-          <w:sz w:val="21"/>
-          <w:szCs w:val="21"/>
-        </w:rPr>
-        <w:t xml:space="preserve"> que indican propiedades adicionales:</w:t>
-      </w:r>
-    </w:p>
-    <w:p>
-      <w:pPr>
-        <w:pStyle w:val="ListParagraph"/>
-        <w:numPr>
-          <w:ilvl w:val="0"/>
-          <w:numId w:val="1"/>
-        </w:numPr>
-        <w:spacing w:after="100" w:line="300"/>
-      </w:pPr>
-      <w:r>
-        <w:rPr>
-          <w:rFonts w:ascii="News Gothic MT" w:cs="News Gothic MT" w:eastAsia="News Gothic MT" w:hAnsi="News Gothic MT"/>
-          <w:b/>
-          <w:bCs/>
-          <w:color w:val="1A1A2E"/>
-          <w:sz w:val="21"/>
-          <w:szCs w:val="21"/>
-        </w:rPr>
-        <w:t xml:space="preserve">En Windows</w:t>
-      </w:r>
-      <w:r>
-        <w:rPr>
-          <w:rFonts w:ascii="News Gothic MT" w:cs="News Gothic MT" w:eastAsia="News Gothic MT" w:hAnsi="News Gothic MT"/>
-          <w:b w:val="false"/>
-          <w:bCs w:val="false"/>
-          <w:i w:val="false"/>
-          <w:iCs w:val="false"/>
-          <w:color w:val="1A1A2E"/>
-          <w:sz w:val="21"/>
-          <w:szCs w:val="21"/>
-        </w:rPr>
-        <w:t xml:space="preserve">: solo lectura, oculto, sistema, archivo listo para archivar. Se consultan y modifican desde las propiedades del archivo en el Explorador.</w:t>
-      </w:r>
-    </w:p>
-    <w:p>
-      <w:pPr>
-        <w:pStyle w:val="ListParagraph"/>
-        <w:numPr>
-          <w:ilvl w:val="0"/>
-          <w:numId w:val="1"/>
-        </w:numPr>
-        <w:spacing w:after="100" w:line="300"/>
-      </w:pPr>
-      <w:r>
-        <w:rPr>
-          <w:rFonts w:ascii="News Gothic MT" w:cs="News Gothic MT" w:eastAsia="News Gothic MT" w:hAnsi="News Gothic MT"/>
-          <w:b/>
-          <w:bCs/>
-          <w:color w:val="1A1A2E"/>
-          <w:sz w:val="21"/>
-          <w:szCs w:val="21"/>
-        </w:rPr>
-        <w:t xml:space="preserve">En Linux</w:t>
-      </w:r>
-      <w:r>
-        <w:rPr>
-          <w:rFonts w:ascii="News Gothic MT" w:cs="News Gothic MT" w:eastAsia="News Gothic MT" w:hAnsi="News Gothic MT"/>
-          <w:b w:val="false"/>
-          <w:bCs w:val="false"/>
-          <w:i w:val="false"/>
-          <w:iCs w:val="false"/>
-          <w:color w:val="1A1A2E"/>
-          <w:sz w:val="21"/>
-          <w:szCs w:val="21"/>
-        </w:rPr>
-        <w:t xml:space="preserve">: los archivos ocultos se marcan poniendo un punto al principio del nombre (</w:t>
-      </w:r>
-      <w:r>
-        <w:rPr>
-          <w:rFonts w:ascii="Courier New" w:cs="Courier New" w:eastAsia="Courier New" w:hAnsi="Courier New"/>
-          <w:b w:val="false"/>
-          <w:bCs w:val="false"/>
-          <w:color w:val="9B1B5C"/>
-          <w:sz w:val="20"/>
-          <w:szCs w:val="20"/>
-        </w:rPr>
-        <w:t xml:space="preserve">.archivo</w:t>
-      </w:r>
-      <w:r>
-        <w:rPr>
-          <w:rFonts w:ascii="News Gothic MT" w:cs="News Gothic MT" w:eastAsia="News Gothic MT" w:hAnsi="News Gothic MT"/>
-          <w:b w:val="false"/>
-          <w:bCs w:val="false"/>
-          <w:i w:val="false"/>
-          <w:iCs w:val="false"/>
-          <w:color w:val="1A1A2E"/>
-          <w:sz w:val="21"/>
-          <w:szCs w:val="21"/>
-        </w:rPr>
-        <w:t xml:space="preserve">). Existen otros atributos más avanzados gestionables con la herramienta </w:t>
-      </w:r>
-      <w:r>
-        <w:rPr>
-          <w:rFonts w:ascii="Courier New" w:cs="Courier New" w:eastAsia="Courier New" w:hAnsi="Courier New"/>
-          <w:b w:val="false"/>
-          <w:bCs w:val="false"/>
-          <w:color w:val="9B1B5C"/>
-          <w:sz w:val="20"/>
-          <w:szCs w:val="20"/>
-        </w:rPr>
-        <w:t xml:space="preserve">chattr</w:t>
-      </w:r>
-      <w:r>
-        <w:rPr>
-          <w:rFonts w:ascii="News Gothic MT" w:cs="News Gothic MT" w:eastAsia="News Gothic MT" w:hAnsi="News Gothic MT"/>
-          <w:b w:val="false"/>
-          <w:bCs w:val="false"/>
-          <w:i w:val="false"/>
-          <w:iCs w:val="false"/>
-          <w:color w:val="1A1A2E"/>
-          <w:sz w:val="21"/>
-          <w:szCs w:val="21"/>
-        </w:rPr>
-        <w:t xml:space="preserve">, que verás con más detalle en unidades posteriores.</w:t>
-      </w:r>
-    </w:p>
-    <w:p>
-      <w:pPr>
-        <w:spacing w:after="160" w:line="300"/>
-        <w:jc w:val="both"/>
-      </w:pPr>
-      <w:r>
-        <w:rPr>
-          <w:rFonts w:ascii="News Gothic MT" w:cs="News Gothic MT" w:eastAsia="News Gothic MT" w:hAnsi="News Gothic MT"/>
-          <w:b w:val="false"/>
-          <w:bCs w:val="false"/>
-          <w:i w:val="false"/>
-          <w:iCs w:val="false"/>
-          <w:color w:val="1A1A2E"/>
-          <w:sz w:val="21"/>
-          <w:szCs w:val="21"/>
-        </w:rPr>
-        <w:t xml:space="preserve">Un archivo oculto </w:t>
-      </w:r>
-      <w:r>
-        <w:rPr>
-          <w:rFonts w:ascii="News Gothic MT" w:cs="News Gothic MT" w:eastAsia="News Gothic MT" w:hAnsi="News Gothic MT"/>
-          <w:b/>
-          <w:bCs/>
-          <w:color w:val="1A1A2E"/>
-          <w:sz w:val="21"/>
-          <w:szCs w:val="21"/>
-        </w:rPr>
-        <w:t xml:space="preserve">no está protegido</w:t>
-      </w:r>
-      <w:r>
-        <w:rPr>
-          <w:rFonts w:ascii="News Gothic MT" w:cs="News Gothic MT" w:eastAsia="News Gothic MT" w:hAnsi="News Gothic MT"/>
-          <w:b w:val="false"/>
-          <w:bCs w:val="false"/>
-          <w:i w:val="false"/>
-          <w:iCs w:val="false"/>
-          <w:color w:val="1A1A2E"/>
-          <w:sz w:val="21"/>
-          <w:szCs w:val="21"/>
-        </w:rPr>
-        <w:t xml:space="preserve"> de ningún modo especial: simplemente no se muestra por defecto. No confundas "oculto" con "seguro".</w:t>
-      </w:r>
+        <w:spacing w:after="160"/>
+      </w:pPr>
     </w:p>
     <w:tbl>
       <w:tblPr>
@@ -4793,6 +4094,1230 @@
                 <w:sz w:val="19"/>
                 <w:szCs w:val="19"/>
               </w:rPr>
+              <w:t xml:space="preserve">VAMOS A PRACTICAR: UN PROGRAMA, VARIOS PROCESOS</w:t>
+            </w:r>
+          </w:p>
+          <w:p>
+            <w:pPr>
+              <w:spacing w:after="140" w:line="300"/>
+              <w:jc w:val="both"/>
+            </w:pPr>
+            <w:r>
+              <w:rPr>
+                <w:rFonts w:ascii="News Gothic MT" w:cs="News Gothic MT" w:eastAsia="News Gothic MT" w:hAnsi="News Gothic MT"/>
+                <w:b w:val="false"/>
+                <w:bCs w:val="false"/>
+                <w:i w:val="false"/>
+                <w:iCs w:val="false"/>
+                <w:color w:val="1A1A2E"/>
+                <w:sz w:val="21"/>
+                <w:szCs w:val="21"/>
+              </w:rPr>
+              <w:t xml:space="preserve">Abre tu navegador habitual y crea tres pestañas nuevas, cada una en una página distinta. Después abre el Administrador de tareas de Windows (o ejecuta </w:t>
+            </w:r>
+            <w:r>
+              <w:rPr>
+                <w:rFonts w:ascii="Courier New" w:cs="Courier New" w:eastAsia="Courier New" w:hAnsi="Courier New"/>
+                <w:b w:val="false"/>
+                <w:bCs w:val="false"/>
+                <w:color w:val="9B1B5C"/>
+                <w:sz w:val="20"/>
+                <w:szCs w:val="20"/>
+              </w:rPr>
+              <w:t xml:space="preserve">ps aux | grep &lt;nombre-del-navegador&gt;</w:t>
+            </w:r>
+            <w:r>
+              <w:rPr>
+                <w:rFonts w:ascii="News Gothic MT" w:cs="News Gothic MT" w:eastAsia="News Gothic MT" w:hAnsi="News Gothic MT"/>
+                <w:b w:val="false"/>
+                <w:bCs w:val="false"/>
+                <w:i w:val="false"/>
+                <w:iCs w:val="false"/>
+                <w:color w:val="1A1A2E"/>
+                <w:sz w:val="21"/>
+                <w:szCs w:val="21"/>
+              </w:rPr>
+              <w:t xml:space="preserve"> en una terminal Linux) y cuenta cuántos procesos aparecen asociados a ese navegador.</w:t>
+            </w:r>
+          </w:p>
+          <w:p>
+            <w:pPr>
+              <w:spacing w:after="0" w:line="300"/>
+              <w:jc w:val="both"/>
+            </w:pPr>
+            <w:r>
+              <w:rPr>
+                <w:rFonts w:ascii="News Gothic MT" w:cs="News Gothic MT" w:eastAsia="News Gothic MT" w:hAnsi="News Gothic MT"/>
+                <w:b/>
+                <w:bCs/>
+                <w:i/>
+                <w:iCs/>
+                <w:color w:val="1F3864"/>
+                <w:sz w:val="21"/>
+                <w:szCs w:val="21"/>
+              </w:rPr>
+              <w:t xml:space="preserve">Reflexiona: </w:t>
+            </w:r>
+            <w:r>
+              <w:rPr>
+                <w:rFonts w:ascii="News Gothic MT" w:cs="News Gothic MT" w:eastAsia="News Gothic MT" w:hAnsi="News Gothic MT"/>
+                <w:b w:val="false"/>
+                <w:bCs w:val="false"/>
+                <w:i/>
+                <w:iCs/>
+                <w:color w:val="1A1A2E"/>
+                <w:sz w:val="21"/>
+                <w:szCs w:val="21"/>
+              </w:rPr>
+              <w:t xml:space="preserve">si el navegador es un único programa instalado en tu disco, ¿por qué aparecen varios procesos al ejecutarlo? ¿Qué le pasaría al resto de pestañas si uno solo de esos procesos se bloqueara?</w:t>
+            </w:r>
+          </w:p>
+        </w:tc>
+      </w:tr>
+    </w:tbl>
+    <w:p>
+      <w:pPr>
+        <w:spacing w:after="200"/>
+      </w:pPr>
+    </w:p>
+    <w:p>
+      <w:pPr>
+        <w:pStyle w:val="Heading1"/>
+        <w:pBdr>
+          <w:bottom w:val="single" w:color="CD0063" w:sz="6" w:space="4"/>
+        </w:pBdr>
+        <w:spacing w:after="200" w:before="400"/>
+      </w:pPr>
+      <w:r>
+        <w:rPr>
+          <w:rFonts w:ascii="News Gothic MT" w:cs="News Gothic MT" w:eastAsia="News Gothic MT" w:hAnsi="News Gothic MT"/>
+          <w:b/>
+          <w:bCs/>
+          <w:color w:val="1F3864"/>
+          <w:sz w:val="32"/>
+          <w:szCs w:val="32"/>
+        </w:rPr>
+        <w:t xml:space="preserve">4. Sistema de archivos: organización y atributos</w:t>
+      </w:r>
+    </w:p>
+    <w:p>
+      <w:pPr>
+        <w:pStyle w:val="Heading2"/>
+        <w:spacing w:after="140" w:before="280"/>
+      </w:pPr>
+      <w:r>
+        <w:rPr>
+          <w:rFonts w:ascii="News Gothic MT" w:cs="News Gothic MT" w:eastAsia="News Gothic MT" w:hAnsi="News Gothic MT"/>
+          <w:b/>
+          <w:bCs/>
+          <w:color w:val="1F3864"/>
+          <w:sz w:val="26"/>
+          <w:szCs w:val="26"/>
+        </w:rPr>
+        <w:t xml:space="preserve">¿Para qué sirve un sistema de archivos?</w:t>
+      </w:r>
+    </w:p>
+    <w:p>
+      <w:pPr>
+        <w:spacing w:after="160" w:line="300"/>
+        <w:jc w:val="both"/>
+      </w:pPr>
+      <w:r>
+        <w:rPr>
+          <w:rFonts w:ascii="News Gothic MT" w:cs="News Gothic MT" w:eastAsia="News Gothic MT" w:hAnsi="News Gothic MT"/>
+          <w:b w:val="false"/>
+          <w:bCs w:val="false"/>
+          <w:i w:val="false"/>
+          <w:iCs w:val="false"/>
+          <w:color w:val="1A1A2E"/>
+          <w:sz w:val="21"/>
+          <w:szCs w:val="21"/>
+        </w:rPr>
+        <w:t xml:space="preserve">Cuando guardas un archivo, no se coloca en un lugar aleatorio del disco: el </w:t>
+      </w:r>
+      <w:r>
+        <w:rPr>
+          <w:rFonts w:ascii="News Gothic MT" w:cs="News Gothic MT" w:eastAsia="News Gothic MT" w:hAnsi="News Gothic MT"/>
+          <w:b/>
+          <w:bCs/>
+          <w:color w:val="1A1A2E"/>
+          <w:sz w:val="21"/>
+          <w:szCs w:val="21"/>
+        </w:rPr>
+        <w:t xml:space="preserve">sistema de archivos</w:t>
+      </w:r>
+      <w:r>
+        <w:rPr>
+          <w:rFonts w:ascii="News Gothic MT" w:cs="News Gothic MT" w:eastAsia="News Gothic MT" w:hAnsi="News Gothic MT"/>
+          <w:b w:val="false"/>
+          <w:bCs w:val="false"/>
+          <w:i w:val="false"/>
+          <w:iCs w:val="false"/>
+          <w:color w:val="1A1A2E"/>
+          <w:sz w:val="21"/>
+          <w:szCs w:val="21"/>
+        </w:rPr>
+        <w:t xml:space="preserve"> es la estructura que organiza y localiza toda la información almacenada. Sin él, un disco sería simplemente un espacio de bytes sin ningún orden ni forma de encontrar nada.</w:t>
+      </w:r>
+    </w:p>
+    <w:p>
+      <w:pPr>
+        <w:pStyle w:val="Heading2"/>
+        <w:spacing w:after="140" w:before="280"/>
+      </w:pPr>
+      <w:r>
+        <w:rPr>
+          <w:rFonts w:ascii="News Gothic MT" w:cs="News Gothic MT" w:eastAsia="News Gothic MT" w:hAnsi="News Gothic MT"/>
+          <w:b/>
+          <w:bCs/>
+          <w:color w:val="1F3864"/>
+          <w:sz w:val="26"/>
+          <w:szCs w:val="26"/>
+        </w:rPr>
+        <w:t xml:space="preserve">La jerarquía de directorios en Windows</w:t>
+      </w:r>
+    </w:p>
+    <w:p>
+      <w:pPr>
+        <w:spacing w:after="160" w:line="300"/>
+        <w:jc w:val="both"/>
+      </w:pPr>
+      <w:r>
+        <w:rPr>
+          <w:rFonts w:ascii="News Gothic MT" w:cs="News Gothic MT" w:eastAsia="News Gothic MT" w:hAnsi="News Gothic MT"/>
+          <w:b w:val="false"/>
+          <w:bCs w:val="false"/>
+          <w:i w:val="false"/>
+          <w:iCs w:val="false"/>
+          <w:color w:val="1A1A2E"/>
+          <w:sz w:val="21"/>
+          <w:szCs w:val="21"/>
+        </w:rPr>
+        <w:t xml:space="preserve">Windows organiza los discos con </w:t>
+      </w:r>
+      <w:r>
+        <w:rPr>
+          <w:rFonts w:ascii="News Gothic MT" w:cs="News Gothic MT" w:eastAsia="News Gothic MT" w:hAnsi="News Gothic MT"/>
+          <w:b/>
+          <w:bCs/>
+          <w:color w:val="1A1A2E"/>
+          <w:sz w:val="21"/>
+          <w:szCs w:val="21"/>
+        </w:rPr>
+        <w:t xml:space="preserve">letras de unidad</w:t>
+      </w:r>
+      <w:r>
+        <w:rPr>
+          <w:rFonts w:ascii="News Gothic MT" w:cs="News Gothic MT" w:eastAsia="News Gothic MT" w:hAnsi="News Gothic MT"/>
+          <w:b w:val="false"/>
+          <w:bCs w:val="false"/>
+          <w:i w:val="false"/>
+          <w:iCs w:val="false"/>
+          <w:color w:val="1A1A2E"/>
+          <w:sz w:val="21"/>
+          <w:szCs w:val="21"/>
+        </w:rPr>
+        <w:t xml:space="preserve"> (</w:t>
+      </w:r>
+      <w:r>
+        <w:rPr>
+          <w:rFonts w:ascii="Courier New" w:cs="Courier New" w:eastAsia="Courier New" w:hAnsi="Courier New"/>
+          <w:b w:val="false"/>
+          <w:bCs w:val="false"/>
+          <w:color w:val="9B1B5C"/>
+          <w:sz w:val="20"/>
+          <w:szCs w:val="20"/>
+        </w:rPr>
+        <w:t xml:space="preserve">C:\</w:t>
+      </w:r>
+      <w:r>
+        <w:rPr>
+          <w:rFonts w:ascii="News Gothic MT" w:cs="News Gothic MT" w:eastAsia="News Gothic MT" w:hAnsi="News Gothic MT"/>
+          <w:b w:val="false"/>
+          <w:bCs w:val="false"/>
+          <w:i w:val="false"/>
+          <w:iCs w:val="false"/>
+          <w:color w:val="1A1A2E"/>
+          <w:sz w:val="21"/>
+          <w:szCs w:val="21"/>
+        </w:rPr>
+        <w:t xml:space="preserve">, </w:t>
+      </w:r>
+      <w:r>
+        <w:rPr>
+          <w:rFonts w:ascii="Courier New" w:cs="Courier New" w:eastAsia="Courier New" w:hAnsi="Courier New"/>
+          <w:b w:val="false"/>
+          <w:bCs w:val="false"/>
+          <w:color w:val="9B1B5C"/>
+          <w:sz w:val="20"/>
+          <w:szCs w:val="20"/>
+        </w:rPr>
+        <w:t xml:space="preserve">D:\</w:t>
+      </w:r>
+      <w:r>
+        <w:rPr>
+          <w:rFonts w:ascii="News Gothic MT" w:cs="News Gothic MT" w:eastAsia="News Gothic MT" w:hAnsi="News Gothic MT"/>
+          <w:b w:val="false"/>
+          <w:bCs w:val="false"/>
+          <w:i w:val="false"/>
+          <w:iCs w:val="false"/>
+          <w:color w:val="1A1A2E"/>
+          <w:sz w:val="21"/>
+          <w:szCs w:val="21"/>
+        </w:rPr>
+        <w:t xml:space="preserve">...), cada una con su propia estructura de carpetas. Dentro de la unidad principal encontrarás carpetas típicas como </w:t>
+      </w:r>
+      <w:r>
+        <w:rPr>
+          <w:rFonts w:ascii="Courier New" w:cs="Courier New" w:eastAsia="Courier New" w:hAnsi="Courier New"/>
+          <w:b w:val="false"/>
+          <w:bCs w:val="false"/>
+          <w:color w:val="9B1B5C"/>
+          <w:sz w:val="20"/>
+          <w:szCs w:val="20"/>
+        </w:rPr>
+        <w:t xml:space="preserve">Usuarios</w:t>
+      </w:r>
+      <w:r>
+        <w:rPr>
+          <w:rFonts w:ascii="News Gothic MT" w:cs="News Gothic MT" w:eastAsia="News Gothic MT" w:hAnsi="News Gothic MT"/>
+          <w:b w:val="false"/>
+          <w:bCs w:val="false"/>
+          <w:i w:val="false"/>
+          <w:iCs w:val="false"/>
+          <w:color w:val="1A1A2E"/>
+          <w:sz w:val="21"/>
+          <w:szCs w:val="21"/>
+        </w:rPr>
+        <w:t xml:space="preserve">, </w:t>
+      </w:r>
+      <w:r>
+        <w:rPr>
+          <w:rFonts w:ascii="Courier New" w:cs="Courier New" w:eastAsia="Courier New" w:hAnsi="Courier New"/>
+          <w:b w:val="false"/>
+          <w:bCs w:val="false"/>
+          <w:color w:val="9B1B5C"/>
+          <w:sz w:val="20"/>
+          <w:szCs w:val="20"/>
+        </w:rPr>
+        <w:t xml:space="preserve">Archivos de programa</w:t>
+      </w:r>
+      <w:r>
+        <w:rPr>
+          <w:rFonts w:ascii="News Gothic MT" w:cs="News Gothic MT" w:eastAsia="News Gothic MT" w:hAnsi="News Gothic MT"/>
+          <w:b w:val="false"/>
+          <w:bCs w:val="false"/>
+          <w:i w:val="false"/>
+          <w:iCs w:val="false"/>
+          <w:color w:val="1A1A2E"/>
+          <w:sz w:val="21"/>
+          <w:szCs w:val="21"/>
+        </w:rPr>
+        <w:t xml:space="preserve"> o </w:t>
+      </w:r>
+      <w:r>
+        <w:rPr>
+          <w:rFonts w:ascii="Courier New" w:cs="Courier New" w:eastAsia="Courier New" w:hAnsi="Courier New"/>
+          <w:b w:val="false"/>
+          <w:bCs w:val="false"/>
+          <w:color w:val="9B1B5C"/>
+          <w:sz w:val="20"/>
+          <w:szCs w:val="20"/>
+        </w:rPr>
+        <w:t xml:space="preserve">Windows</w:t>
+      </w:r>
+      <w:r>
+        <w:rPr>
+          <w:rFonts w:ascii="News Gothic MT" w:cs="News Gothic MT" w:eastAsia="News Gothic MT" w:hAnsi="News Gothic MT"/>
+          <w:b w:val="false"/>
+          <w:bCs w:val="false"/>
+          <w:i w:val="false"/>
+          <w:iCs w:val="false"/>
+          <w:color w:val="1A1A2E"/>
+          <w:sz w:val="21"/>
+          <w:szCs w:val="21"/>
+        </w:rPr>
+        <w:t xml:space="preserve">. Las rutas se escriben separando carpetas con la barra invertida </w:t>
+      </w:r>
+      <w:r>
+        <w:rPr>
+          <w:rFonts w:ascii="Courier New" w:cs="Courier New" w:eastAsia="Courier New" w:hAnsi="Courier New"/>
+          <w:b w:val="false"/>
+          <w:bCs w:val="false"/>
+          <w:color w:val="9B1B5C"/>
+          <w:sz w:val="20"/>
+          <w:szCs w:val="20"/>
+        </w:rPr>
+        <w:t xml:space="preserve">\</w:t>
+      </w:r>
+      <w:r>
+        <w:rPr>
+          <w:rFonts w:ascii="News Gothic MT" w:cs="News Gothic MT" w:eastAsia="News Gothic MT" w:hAnsi="News Gothic MT"/>
+          <w:b w:val="false"/>
+          <w:bCs w:val="false"/>
+          <w:i w:val="false"/>
+          <w:iCs w:val="false"/>
+          <w:color w:val="1A1A2E"/>
+          <w:sz w:val="21"/>
+          <w:szCs w:val="21"/>
+        </w:rPr>
+        <w:t xml:space="preserve">, y pueden ser:</w:t>
+      </w:r>
+    </w:p>
+    <w:p>
+      <w:pPr>
+        <w:pStyle w:val="ListParagraph"/>
+        <w:numPr>
+          <w:ilvl w:val="0"/>
+          <w:numId w:val="1"/>
+        </w:numPr>
+        <w:spacing w:after="100" w:line="300"/>
+      </w:pPr>
+      <w:r>
+        <w:rPr>
+          <w:rFonts w:ascii="News Gothic MT" w:cs="News Gothic MT" w:eastAsia="News Gothic MT" w:hAnsi="News Gothic MT"/>
+          <w:b/>
+          <w:bCs/>
+          <w:color w:val="1A1A2E"/>
+          <w:sz w:val="21"/>
+          <w:szCs w:val="21"/>
+        </w:rPr>
+        <w:t xml:space="preserve">Absolutas</w:t>
+      </w:r>
+      <w:r>
+        <w:rPr>
+          <w:rFonts w:ascii="News Gothic MT" w:cs="News Gothic MT" w:eastAsia="News Gothic MT" w:hAnsi="News Gothic MT"/>
+          <w:b w:val="false"/>
+          <w:bCs w:val="false"/>
+          <w:i w:val="false"/>
+          <w:iCs w:val="false"/>
+          <w:color w:val="1A1A2E"/>
+          <w:sz w:val="21"/>
+          <w:szCs w:val="21"/>
+        </w:rPr>
+        <w:t xml:space="preserve">: desde la raíz de la unidad, por ejemplo </w:t>
+      </w:r>
+      <w:r>
+        <w:rPr>
+          <w:rFonts w:ascii="Courier New" w:cs="Courier New" w:eastAsia="Courier New" w:hAnsi="Courier New"/>
+          <w:b w:val="false"/>
+          <w:bCs w:val="false"/>
+          <w:color w:val="9B1B5C"/>
+          <w:sz w:val="20"/>
+          <w:szCs w:val="20"/>
+        </w:rPr>
+        <w:t xml:space="preserve">C:\Usuarios\Alejandro\Documentos\informe.docx</w:t>
+      </w:r>
+      <w:r>
+        <w:rPr>
+          <w:rFonts w:ascii="News Gothic MT" w:cs="News Gothic MT" w:eastAsia="News Gothic MT" w:hAnsi="News Gothic MT"/>
+          <w:b w:val="false"/>
+          <w:bCs w:val="false"/>
+          <w:i w:val="false"/>
+          <w:iCs w:val="false"/>
+          <w:color w:val="1A1A2E"/>
+          <w:sz w:val="21"/>
+          <w:szCs w:val="21"/>
+        </w:rPr>
+        <w:t xml:space="preserve">.</w:t>
+      </w:r>
+    </w:p>
+    <w:p>
+      <w:pPr>
+        <w:pStyle w:val="ListParagraph"/>
+        <w:numPr>
+          <w:ilvl w:val="0"/>
+          <w:numId w:val="1"/>
+        </w:numPr>
+        <w:spacing w:after="100" w:line="300"/>
+      </w:pPr>
+      <w:r>
+        <w:rPr>
+          <w:rFonts w:ascii="News Gothic MT" w:cs="News Gothic MT" w:eastAsia="News Gothic MT" w:hAnsi="News Gothic MT"/>
+          <w:b/>
+          <w:bCs/>
+          <w:color w:val="1A1A2E"/>
+          <w:sz w:val="21"/>
+          <w:szCs w:val="21"/>
+        </w:rPr>
+        <w:t xml:space="preserve">Relativas</w:t>
+      </w:r>
+      <w:r>
+        <w:rPr>
+          <w:rFonts w:ascii="News Gothic MT" w:cs="News Gothic MT" w:eastAsia="News Gothic MT" w:hAnsi="News Gothic MT"/>
+          <w:b w:val="false"/>
+          <w:bCs w:val="false"/>
+          <w:i w:val="false"/>
+          <w:iCs w:val="false"/>
+          <w:color w:val="1A1A2E"/>
+          <w:sz w:val="21"/>
+          <w:szCs w:val="21"/>
+        </w:rPr>
+        <w:t xml:space="preserve">: desde la carpeta en la que ya estás, por ejemplo </w:t>
+      </w:r>
+      <w:r>
+        <w:rPr>
+          <w:rFonts w:ascii="Courier New" w:cs="Courier New" w:eastAsia="Courier New" w:hAnsi="Courier New"/>
+          <w:b w:val="false"/>
+          <w:bCs w:val="false"/>
+          <w:color w:val="9B1B5C"/>
+          <w:sz w:val="20"/>
+          <w:szCs w:val="20"/>
+        </w:rPr>
+        <w:t xml:space="preserve">Documentos\informe.docx</w:t>
+      </w:r>
+      <w:r>
+        <w:rPr>
+          <w:rFonts w:ascii="News Gothic MT" w:cs="News Gothic MT" w:eastAsia="News Gothic MT" w:hAnsi="News Gothic MT"/>
+          <w:b w:val="false"/>
+          <w:bCs w:val="false"/>
+          <w:i w:val="false"/>
+          <w:iCs w:val="false"/>
+          <w:color w:val="1A1A2E"/>
+          <w:sz w:val="21"/>
+          <w:szCs w:val="21"/>
+        </w:rPr>
+        <w:t xml:space="preserve"> si ya estás dentro de </w:t>
+      </w:r>
+      <w:r>
+        <w:rPr>
+          <w:rFonts w:ascii="Courier New" w:cs="Courier New" w:eastAsia="Courier New" w:hAnsi="Courier New"/>
+          <w:b w:val="false"/>
+          <w:bCs w:val="false"/>
+          <w:color w:val="9B1B5C"/>
+          <w:sz w:val="20"/>
+          <w:szCs w:val="20"/>
+        </w:rPr>
+        <w:t xml:space="preserve">C:\Usuarios\Alejandro</w:t>
+      </w:r>
+      <w:r>
+        <w:rPr>
+          <w:rFonts w:ascii="News Gothic MT" w:cs="News Gothic MT" w:eastAsia="News Gothic MT" w:hAnsi="News Gothic MT"/>
+          <w:b w:val="false"/>
+          <w:bCs w:val="false"/>
+          <w:i w:val="false"/>
+          <w:iCs w:val="false"/>
+          <w:color w:val="1A1A2E"/>
+          <w:sz w:val="21"/>
+          <w:szCs w:val="21"/>
+        </w:rPr>
+        <w:t xml:space="preserve">.</w:t>
+      </w:r>
+    </w:p>
+    <w:p>
+      <w:pPr>
+        <w:pStyle w:val="Heading2"/>
+        <w:spacing w:after="140" w:before="280"/>
+      </w:pPr>
+      <w:r>
+        <w:rPr>
+          <w:rFonts w:ascii="News Gothic MT" w:cs="News Gothic MT" w:eastAsia="News Gothic MT" w:hAnsi="News Gothic MT"/>
+          <w:b/>
+          <w:bCs/>
+          <w:color w:val="1F3864"/>
+          <w:sz w:val="26"/>
+          <w:szCs w:val="26"/>
+        </w:rPr>
+        <w:t xml:space="preserve">La jerarquía de directorios en Linux</w:t>
+      </w:r>
+    </w:p>
+    <w:p>
+      <w:pPr>
+        <w:spacing w:after="160" w:line="300"/>
+        <w:jc w:val="both"/>
+      </w:pPr>
+      <w:r>
+        <w:rPr>
+          <w:rFonts w:ascii="News Gothic MT" w:cs="News Gothic MT" w:eastAsia="News Gothic MT" w:hAnsi="News Gothic MT"/>
+          <w:b w:val="false"/>
+          <w:bCs w:val="false"/>
+          <w:i w:val="false"/>
+          <w:iCs w:val="false"/>
+          <w:color w:val="1A1A2E"/>
+          <w:sz w:val="21"/>
+          <w:szCs w:val="21"/>
+        </w:rPr>
+        <w:t xml:space="preserve">Linux no usa letras de unidad: existe una </w:t>
+      </w:r>
+      <w:r>
+        <w:rPr>
+          <w:rFonts w:ascii="News Gothic MT" w:cs="News Gothic MT" w:eastAsia="News Gothic MT" w:hAnsi="News Gothic MT"/>
+          <w:b/>
+          <w:bCs/>
+          <w:color w:val="1A1A2E"/>
+          <w:sz w:val="21"/>
+          <w:szCs w:val="21"/>
+        </w:rPr>
+        <w:t xml:space="preserve">única raíz</w:t>
+      </w:r>
+      <w:r>
+        <w:rPr>
+          <w:rFonts w:ascii="News Gothic MT" w:cs="News Gothic MT" w:eastAsia="News Gothic MT" w:hAnsi="News Gothic MT"/>
+          <w:b w:val="false"/>
+          <w:bCs w:val="false"/>
+          <w:i w:val="false"/>
+          <w:iCs w:val="false"/>
+          <w:color w:val="1A1A2E"/>
+          <w:sz w:val="21"/>
+          <w:szCs w:val="21"/>
+        </w:rPr>
+        <w:t xml:space="preserve"> (</w:t>
+      </w:r>
+      <w:r>
+        <w:rPr>
+          <w:rFonts w:ascii="Courier New" w:cs="Courier New" w:eastAsia="Courier New" w:hAnsi="Courier New"/>
+          <w:b w:val="false"/>
+          <w:bCs w:val="false"/>
+          <w:color w:val="9B1B5C"/>
+          <w:sz w:val="20"/>
+          <w:szCs w:val="20"/>
+        </w:rPr>
+        <w:t xml:space="preserve">/</w:t>
+      </w:r>
+      <w:r>
+        <w:rPr>
+          <w:rFonts w:ascii="News Gothic MT" w:cs="News Gothic MT" w:eastAsia="News Gothic MT" w:hAnsi="News Gothic MT"/>
+          <w:b w:val="false"/>
+          <w:bCs w:val="false"/>
+          <w:i w:val="false"/>
+          <w:iCs w:val="false"/>
+          <w:color w:val="1A1A2E"/>
+          <w:sz w:val="21"/>
+          <w:szCs w:val="21"/>
+        </w:rPr>
+        <w:t xml:space="preserve">), y cualquier disco o partición adicional se </w:t>
+      </w:r>
+      <w:r>
+        <w:rPr>
+          <w:rFonts w:ascii="News Gothic MT" w:cs="News Gothic MT" w:eastAsia="News Gothic MT" w:hAnsi="News Gothic MT"/>
+          <w:b/>
+          <w:bCs/>
+          <w:color w:val="1A1A2E"/>
+          <w:sz w:val="21"/>
+          <w:szCs w:val="21"/>
+        </w:rPr>
+        <w:t xml:space="preserve">monta</w:t>
+      </w:r>
+      <w:r>
+        <w:rPr>
+          <w:rFonts w:ascii="News Gothic MT" w:cs="News Gothic MT" w:eastAsia="News Gothic MT" w:hAnsi="News Gothic MT"/>
+          <w:b w:val="false"/>
+          <w:bCs w:val="false"/>
+          <w:i w:val="false"/>
+          <w:iCs w:val="false"/>
+          <w:color w:val="1A1A2E"/>
+          <w:sz w:val="21"/>
+          <w:szCs w:val="21"/>
+        </w:rPr>
+        <w:t xml:space="preserve"> dentro de ese árbol único, apareciendo como una carpeta más — no como una letra nueva. Algunos de los directorios principales son:</w:t>
+      </w:r>
+    </w:p>
+    <w:p>
+      <w:pPr>
+        <w:pStyle w:val="ListParagraph"/>
+        <w:numPr>
+          <w:ilvl w:val="0"/>
+          <w:numId w:val="1"/>
+        </w:numPr>
+        <w:spacing w:after="100" w:line="300"/>
+      </w:pPr>
+      <w:r>
+        <w:rPr>
+          <w:rFonts w:ascii="Courier New" w:cs="Courier New" w:eastAsia="Courier New" w:hAnsi="Courier New"/>
+          <w:b w:val="false"/>
+          <w:bCs w:val="false"/>
+          <w:color w:val="9B1B5C"/>
+          <w:sz w:val="20"/>
+          <w:szCs w:val="20"/>
+        </w:rPr>
+        <w:t xml:space="preserve">/home</w:t>
+      </w:r>
+      <w:r>
+        <w:rPr>
+          <w:rFonts w:ascii="News Gothic MT" w:cs="News Gothic MT" w:eastAsia="News Gothic MT" w:hAnsi="News Gothic MT"/>
+          <w:b w:val="false"/>
+          <w:bCs w:val="false"/>
+          <w:i w:val="false"/>
+          <w:iCs w:val="false"/>
+          <w:color w:val="1A1A2E"/>
+          <w:sz w:val="21"/>
+          <w:szCs w:val="21"/>
+        </w:rPr>
+        <w:t xml:space="preserve"> — carpetas personales de cada usuario.</w:t>
+      </w:r>
+    </w:p>
+    <w:p>
+      <w:pPr>
+        <w:pStyle w:val="ListParagraph"/>
+        <w:numPr>
+          <w:ilvl w:val="0"/>
+          <w:numId w:val="1"/>
+        </w:numPr>
+        <w:spacing w:after="100" w:line="300"/>
+      </w:pPr>
+      <w:r>
+        <w:rPr>
+          <w:rFonts w:ascii="Courier New" w:cs="Courier New" w:eastAsia="Courier New" w:hAnsi="Courier New"/>
+          <w:b w:val="false"/>
+          <w:bCs w:val="false"/>
+          <w:color w:val="9B1B5C"/>
+          <w:sz w:val="20"/>
+          <w:szCs w:val="20"/>
+        </w:rPr>
+        <w:t xml:space="preserve">/etc</w:t>
+      </w:r>
+      <w:r>
+        <w:rPr>
+          <w:rFonts w:ascii="News Gothic MT" w:cs="News Gothic MT" w:eastAsia="News Gothic MT" w:hAnsi="News Gothic MT"/>
+          <w:b w:val="false"/>
+          <w:bCs w:val="false"/>
+          <w:i w:val="false"/>
+          <w:iCs w:val="false"/>
+          <w:color w:val="1A1A2E"/>
+          <w:sz w:val="21"/>
+          <w:szCs w:val="21"/>
+        </w:rPr>
+        <w:t xml:space="preserve"> — archivos de configuración del sistema.</w:t>
+      </w:r>
+    </w:p>
+    <w:p>
+      <w:pPr>
+        <w:pStyle w:val="ListParagraph"/>
+        <w:numPr>
+          <w:ilvl w:val="0"/>
+          <w:numId w:val="1"/>
+        </w:numPr>
+        <w:spacing w:after="100" w:line="300"/>
+      </w:pPr>
+      <w:r>
+        <w:rPr>
+          <w:rFonts w:ascii="Courier New" w:cs="Courier New" w:eastAsia="Courier New" w:hAnsi="Courier New"/>
+          <w:b w:val="false"/>
+          <w:bCs w:val="false"/>
+          <w:color w:val="9B1B5C"/>
+          <w:sz w:val="20"/>
+          <w:szCs w:val="20"/>
+        </w:rPr>
+        <w:t xml:space="preserve">/var</w:t>
+      </w:r>
+      <w:r>
+        <w:rPr>
+          <w:rFonts w:ascii="News Gothic MT" w:cs="News Gothic MT" w:eastAsia="News Gothic MT" w:hAnsi="News Gothic MT"/>
+          <w:b w:val="false"/>
+          <w:bCs w:val="false"/>
+          <w:i w:val="false"/>
+          <w:iCs w:val="false"/>
+          <w:color w:val="1A1A2E"/>
+          <w:sz w:val="21"/>
+          <w:szCs w:val="21"/>
+        </w:rPr>
+        <w:t xml:space="preserve"> — datos que cambian con el tiempo (registros, colas de impresión...).</w:t>
+      </w:r>
+    </w:p>
+    <w:p>
+      <w:pPr>
+        <w:pStyle w:val="ListParagraph"/>
+        <w:numPr>
+          <w:ilvl w:val="0"/>
+          <w:numId w:val="1"/>
+        </w:numPr>
+        <w:spacing w:after="100" w:line="300"/>
+      </w:pPr>
+      <w:r>
+        <w:rPr>
+          <w:rFonts w:ascii="Courier New" w:cs="Courier New" w:eastAsia="Courier New" w:hAnsi="Courier New"/>
+          <w:b w:val="false"/>
+          <w:bCs w:val="false"/>
+          <w:color w:val="9B1B5C"/>
+          <w:sz w:val="20"/>
+          <w:szCs w:val="20"/>
+        </w:rPr>
+        <w:t xml:space="preserve">/bin</w:t>
+      </w:r>
+      <w:r>
+        <w:rPr>
+          <w:rFonts w:ascii="News Gothic MT" w:cs="News Gothic MT" w:eastAsia="News Gothic MT" w:hAnsi="News Gothic MT"/>
+          <w:b w:val="false"/>
+          <w:bCs w:val="false"/>
+          <w:i w:val="false"/>
+          <w:iCs w:val="false"/>
+          <w:color w:val="1A1A2E"/>
+          <w:sz w:val="21"/>
+          <w:szCs w:val="21"/>
+        </w:rPr>
+        <w:t xml:space="preserve"> y </w:t>
+      </w:r>
+      <w:r>
+        <w:rPr>
+          <w:rFonts w:ascii="Courier New" w:cs="Courier New" w:eastAsia="Courier New" w:hAnsi="Courier New"/>
+          <w:b w:val="false"/>
+          <w:bCs w:val="false"/>
+          <w:color w:val="9B1B5C"/>
+          <w:sz w:val="20"/>
+          <w:szCs w:val="20"/>
+        </w:rPr>
+        <w:t xml:space="preserve">/usr</w:t>
+      </w:r>
+      <w:r>
+        <w:rPr>
+          <w:rFonts w:ascii="News Gothic MT" w:cs="News Gothic MT" w:eastAsia="News Gothic MT" w:hAnsi="News Gothic MT"/>
+          <w:b w:val="false"/>
+          <w:bCs w:val="false"/>
+          <w:i w:val="false"/>
+          <w:iCs w:val="false"/>
+          <w:color w:val="1A1A2E"/>
+          <w:sz w:val="21"/>
+          <w:szCs w:val="21"/>
+        </w:rPr>
+        <w:t xml:space="preserve"> — programas del sistema.</w:t>
+      </w:r>
+    </w:p>
+    <w:p>
+      <w:pPr>
+        <w:spacing w:after="160" w:line="300"/>
+        <w:jc w:val="both"/>
+      </w:pPr>
+      <w:r>
+        <w:rPr>
+          <w:rFonts w:ascii="News Gothic MT" w:cs="News Gothic MT" w:eastAsia="News Gothic MT" w:hAnsi="News Gothic MT"/>
+          <w:b w:val="false"/>
+          <w:bCs w:val="false"/>
+          <w:i w:val="false"/>
+          <w:iCs w:val="false"/>
+          <w:color w:val="1A1A2E"/>
+          <w:sz w:val="21"/>
+          <w:szCs w:val="21"/>
+        </w:rPr>
+        <w:t xml:space="preserve">Las rutas en Linux se separan con la barra </w:t>
+      </w:r>
+      <w:r>
+        <w:rPr>
+          <w:rFonts w:ascii="Courier New" w:cs="Courier New" w:eastAsia="Courier New" w:hAnsi="Courier New"/>
+          <w:b w:val="false"/>
+          <w:bCs w:val="false"/>
+          <w:color w:val="9B1B5C"/>
+          <w:sz w:val="20"/>
+          <w:szCs w:val="20"/>
+        </w:rPr>
+        <w:t xml:space="preserve">/</w:t>
+      </w:r>
+      <w:r>
+        <w:rPr>
+          <w:rFonts w:ascii="News Gothic MT" w:cs="News Gothic MT" w:eastAsia="News Gothic MT" w:hAnsi="News Gothic MT"/>
+          <w:b w:val="false"/>
+          <w:bCs w:val="false"/>
+          <w:i w:val="false"/>
+          <w:iCs w:val="false"/>
+          <w:color w:val="1A1A2E"/>
+          <w:sz w:val="21"/>
+          <w:szCs w:val="21"/>
+        </w:rPr>
+        <w:t xml:space="preserve"> (no </w:t>
+      </w:r>
+      <w:r>
+        <w:rPr>
+          <w:rFonts w:ascii="Courier New" w:cs="Courier New" w:eastAsia="Courier New" w:hAnsi="Courier New"/>
+          <w:b w:val="false"/>
+          <w:bCs w:val="false"/>
+          <w:color w:val="9B1B5C"/>
+          <w:sz w:val="20"/>
+          <w:szCs w:val="20"/>
+        </w:rPr>
+        <w:t xml:space="preserve">\</w:t>
+      </w:r>
+      <w:r>
+        <w:rPr>
+          <w:rFonts w:ascii="News Gothic MT" w:cs="News Gothic MT" w:eastAsia="News Gothic MT" w:hAnsi="News Gothic MT"/>
+          <w:b w:val="false"/>
+          <w:bCs w:val="false"/>
+          <w:i w:val="false"/>
+          <w:iCs w:val="false"/>
+          <w:color w:val="1A1A2E"/>
+          <w:sz w:val="21"/>
+          <w:szCs w:val="21"/>
+        </w:rPr>
+        <w:t xml:space="preserve">), y también pueden ser absolutas o relativas, igual que en Windows.</w:t>
+      </w:r>
+    </w:p>
+    <w:p>
+      <w:pPr>
+        <w:pStyle w:val="Heading2"/>
+        <w:spacing w:after="140" w:before="280"/>
+      </w:pPr>
+      <w:r>
+        <w:rPr>
+          <w:rFonts w:ascii="News Gothic MT" w:cs="News Gothic MT" w:eastAsia="News Gothic MT" w:hAnsi="News Gothic MT"/>
+          <w:b/>
+          <w:bCs/>
+          <w:color w:val="1F3864"/>
+          <w:sz w:val="26"/>
+          <w:szCs w:val="26"/>
+        </w:rPr>
+        <w:t xml:space="preserve">La diferencia que más suele fallar: mayúsculas y minúsculas</w:t>
+      </w:r>
+    </w:p>
+    <w:p>
+      <w:pPr>
+        <w:spacing w:after="160" w:line="300"/>
+        <w:jc w:val="both"/>
+      </w:pPr>
+      <w:r>
+        <w:rPr>
+          <w:rFonts w:ascii="News Gothic MT" w:cs="News Gothic MT" w:eastAsia="News Gothic MT" w:hAnsi="News Gothic MT"/>
+          <w:b/>
+          <w:bCs/>
+          <w:color w:val="1A1A2E"/>
+          <w:sz w:val="21"/>
+          <w:szCs w:val="21"/>
+        </w:rPr>
+        <w:t xml:space="preserve">Windows no distingue mayúsculas de minúsculas</w:t>
+      </w:r>
+      <w:r>
+        <w:rPr>
+          <w:rFonts w:ascii="News Gothic MT" w:cs="News Gothic MT" w:eastAsia="News Gothic MT" w:hAnsi="News Gothic MT"/>
+          <w:b w:val="false"/>
+          <w:bCs w:val="false"/>
+          <w:i w:val="false"/>
+          <w:iCs w:val="false"/>
+          <w:color w:val="1A1A2E"/>
+          <w:sz w:val="21"/>
+          <w:szCs w:val="21"/>
+        </w:rPr>
+        <w:t xml:space="preserve"> en los nombres de archivo: </w:t>
+      </w:r>
+      <w:r>
+        <w:rPr>
+          <w:rFonts w:ascii="Courier New" w:cs="Courier New" w:eastAsia="Courier New" w:hAnsi="Courier New"/>
+          <w:b w:val="false"/>
+          <w:bCs w:val="false"/>
+          <w:color w:val="9B1B5C"/>
+          <w:sz w:val="20"/>
+          <w:szCs w:val="20"/>
+        </w:rPr>
+        <w:t xml:space="preserve">Documento.txt</w:t>
+      </w:r>
+      <w:r>
+        <w:rPr>
+          <w:rFonts w:ascii="News Gothic MT" w:cs="News Gothic MT" w:eastAsia="News Gothic MT" w:hAnsi="News Gothic MT"/>
+          <w:b w:val="false"/>
+          <w:bCs w:val="false"/>
+          <w:i w:val="false"/>
+          <w:iCs w:val="false"/>
+          <w:color w:val="1A1A2E"/>
+          <w:sz w:val="21"/>
+          <w:szCs w:val="21"/>
+        </w:rPr>
+        <w:t xml:space="preserve"> y </w:t>
+      </w:r>
+      <w:r>
+        <w:rPr>
+          <w:rFonts w:ascii="Courier New" w:cs="Courier New" w:eastAsia="Courier New" w:hAnsi="Courier New"/>
+          <w:b w:val="false"/>
+          <w:bCs w:val="false"/>
+          <w:color w:val="9B1B5C"/>
+          <w:sz w:val="20"/>
+          <w:szCs w:val="20"/>
+        </w:rPr>
+        <w:t xml:space="preserve">documento.txt</w:t>
+      </w:r>
+      <w:r>
+        <w:rPr>
+          <w:rFonts w:ascii="News Gothic MT" w:cs="News Gothic MT" w:eastAsia="News Gothic MT" w:hAnsi="News Gothic MT"/>
+          <w:b w:val="false"/>
+          <w:bCs w:val="false"/>
+          <w:i w:val="false"/>
+          <w:iCs w:val="false"/>
+          <w:color w:val="1A1A2E"/>
+          <w:sz w:val="21"/>
+          <w:szCs w:val="21"/>
+        </w:rPr>
+        <w:t xml:space="preserve"> son el mismo archivo. </w:t>
+      </w:r>
+      <w:r>
+        <w:rPr>
+          <w:rFonts w:ascii="News Gothic MT" w:cs="News Gothic MT" w:eastAsia="News Gothic MT" w:hAnsi="News Gothic MT"/>
+          <w:b/>
+          <w:bCs/>
+          <w:color w:val="1A1A2E"/>
+          <w:sz w:val="21"/>
+          <w:szCs w:val="21"/>
+        </w:rPr>
+        <w:t xml:space="preserve">Linux sí distingue</w:t>
+      </w:r>
+      <w:r>
+        <w:rPr>
+          <w:rFonts w:ascii="News Gothic MT" w:cs="News Gothic MT" w:eastAsia="News Gothic MT" w:hAnsi="News Gothic MT"/>
+          <w:b w:val="false"/>
+          <w:bCs w:val="false"/>
+          <w:i w:val="false"/>
+          <w:iCs w:val="false"/>
+          <w:color w:val="1A1A2E"/>
+          <w:sz w:val="21"/>
+          <w:szCs w:val="21"/>
+        </w:rPr>
+        <w:t xml:space="preserve">: esos mismos dos nombres serían dos archivos completamente distintos. Esta diferencia es la causa más habitual de que "un comando no funcione" cuando se empieza a trabajar con la terminal de Linux — conviene tenerla muy presente desde ya, antes de que te encuentres con ese problema en la práctica.</w:t>
+      </w:r>
+    </w:p>
+    <w:p>
+      <w:pPr>
+        <w:pStyle w:val="Heading2"/>
+        <w:spacing w:after="140" w:before="280"/>
+      </w:pPr>
+      <w:r>
+        <w:rPr>
+          <w:rFonts w:ascii="News Gothic MT" w:cs="News Gothic MT" w:eastAsia="News Gothic MT" w:hAnsi="News Gothic MT"/>
+          <w:b/>
+          <w:bCs/>
+          <w:color w:val="1F3864"/>
+          <w:sz w:val="26"/>
+          <w:szCs w:val="26"/>
+        </w:rPr>
+        <w:t xml:space="preserve">Atributos de archivos y directorios</w:t>
+      </w:r>
+    </w:p>
+    <w:p>
+      <w:pPr>
+        <w:spacing w:after="160" w:line="300"/>
+        <w:jc w:val="both"/>
+      </w:pPr>
+      <w:r>
+        <w:rPr>
+          <w:rFonts w:ascii="News Gothic MT" w:cs="News Gothic MT" w:eastAsia="News Gothic MT" w:hAnsi="News Gothic MT"/>
+          <w:b w:val="false"/>
+          <w:bCs w:val="false"/>
+          <w:i w:val="false"/>
+          <w:iCs w:val="false"/>
+          <w:color w:val="1A1A2E"/>
+          <w:sz w:val="21"/>
+          <w:szCs w:val="21"/>
+        </w:rPr>
+        <w:t xml:space="preserve">Tanto Windows como Linux permiten marcar archivos y carpetas con </w:t>
+      </w:r>
+      <w:r>
+        <w:rPr>
+          <w:rFonts w:ascii="News Gothic MT" w:cs="News Gothic MT" w:eastAsia="News Gothic MT" w:hAnsi="News Gothic MT"/>
+          <w:b/>
+          <w:bCs/>
+          <w:color w:val="1A1A2E"/>
+          <w:sz w:val="21"/>
+          <w:szCs w:val="21"/>
+        </w:rPr>
+        <w:t xml:space="preserve">atributos</w:t>
+      </w:r>
+      <w:r>
+        <w:rPr>
+          <w:rFonts w:ascii="News Gothic MT" w:cs="News Gothic MT" w:eastAsia="News Gothic MT" w:hAnsi="News Gothic MT"/>
+          <w:b w:val="false"/>
+          <w:bCs w:val="false"/>
+          <w:i w:val="false"/>
+          <w:iCs w:val="false"/>
+          <w:color w:val="1A1A2E"/>
+          <w:sz w:val="21"/>
+          <w:szCs w:val="21"/>
+        </w:rPr>
+        <w:t xml:space="preserve"> que indican propiedades adicionales:</w:t>
+      </w:r>
+    </w:p>
+    <w:p>
+      <w:pPr>
+        <w:pStyle w:val="ListParagraph"/>
+        <w:numPr>
+          <w:ilvl w:val="0"/>
+          <w:numId w:val="1"/>
+        </w:numPr>
+        <w:spacing w:after="100" w:line="300"/>
+      </w:pPr>
+      <w:r>
+        <w:rPr>
+          <w:rFonts w:ascii="News Gothic MT" w:cs="News Gothic MT" w:eastAsia="News Gothic MT" w:hAnsi="News Gothic MT"/>
+          <w:b/>
+          <w:bCs/>
+          <w:color w:val="1A1A2E"/>
+          <w:sz w:val="21"/>
+          <w:szCs w:val="21"/>
+        </w:rPr>
+        <w:t xml:space="preserve">En Windows</w:t>
+      </w:r>
+      <w:r>
+        <w:rPr>
+          <w:rFonts w:ascii="News Gothic MT" w:cs="News Gothic MT" w:eastAsia="News Gothic MT" w:hAnsi="News Gothic MT"/>
+          <w:b w:val="false"/>
+          <w:bCs w:val="false"/>
+          <w:i w:val="false"/>
+          <w:iCs w:val="false"/>
+          <w:color w:val="1A1A2E"/>
+          <w:sz w:val="21"/>
+          <w:szCs w:val="21"/>
+        </w:rPr>
+        <w:t xml:space="preserve">: solo lectura, oculto, sistema, archivo listo para archivar. Se consultan y modifican desde las propiedades del archivo en el Explorador.</w:t>
+      </w:r>
+    </w:p>
+    <w:p>
+      <w:pPr>
+        <w:pStyle w:val="ListParagraph"/>
+        <w:numPr>
+          <w:ilvl w:val="0"/>
+          <w:numId w:val="1"/>
+        </w:numPr>
+        <w:spacing w:after="100" w:line="300"/>
+      </w:pPr>
+      <w:r>
+        <w:rPr>
+          <w:rFonts w:ascii="News Gothic MT" w:cs="News Gothic MT" w:eastAsia="News Gothic MT" w:hAnsi="News Gothic MT"/>
+          <w:b/>
+          <w:bCs/>
+          <w:color w:val="1A1A2E"/>
+          <w:sz w:val="21"/>
+          <w:szCs w:val="21"/>
+        </w:rPr>
+        <w:t xml:space="preserve">En Linux</w:t>
+      </w:r>
+      <w:r>
+        <w:rPr>
+          <w:rFonts w:ascii="News Gothic MT" w:cs="News Gothic MT" w:eastAsia="News Gothic MT" w:hAnsi="News Gothic MT"/>
+          <w:b w:val="false"/>
+          <w:bCs w:val="false"/>
+          <w:i w:val="false"/>
+          <w:iCs w:val="false"/>
+          <w:color w:val="1A1A2E"/>
+          <w:sz w:val="21"/>
+          <w:szCs w:val="21"/>
+        </w:rPr>
+        <w:t xml:space="preserve">: los archivos ocultos se marcan poniendo un punto al principio del nombre (</w:t>
+      </w:r>
+      <w:r>
+        <w:rPr>
+          <w:rFonts w:ascii="Courier New" w:cs="Courier New" w:eastAsia="Courier New" w:hAnsi="Courier New"/>
+          <w:b w:val="false"/>
+          <w:bCs w:val="false"/>
+          <w:color w:val="9B1B5C"/>
+          <w:sz w:val="20"/>
+          <w:szCs w:val="20"/>
+        </w:rPr>
+        <w:t xml:space="preserve">.archivo</w:t>
+      </w:r>
+      <w:r>
+        <w:rPr>
+          <w:rFonts w:ascii="News Gothic MT" w:cs="News Gothic MT" w:eastAsia="News Gothic MT" w:hAnsi="News Gothic MT"/>
+          <w:b w:val="false"/>
+          <w:bCs w:val="false"/>
+          <w:i w:val="false"/>
+          <w:iCs w:val="false"/>
+          <w:color w:val="1A1A2E"/>
+          <w:sz w:val="21"/>
+          <w:szCs w:val="21"/>
+        </w:rPr>
+        <w:t xml:space="preserve">). Existen otros atributos más avanzados gestionables con la herramienta </w:t>
+      </w:r>
+      <w:r>
+        <w:rPr>
+          <w:rFonts w:ascii="Courier New" w:cs="Courier New" w:eastAsia="Courier New" w:hAnsi="Courier New"/>
+          <w:b w:val="false"/>
+          <w:bCs w:val="false"/>
+          <w:color w:val="9B1B5C"/>
+          <w:sz w:val="20"/>
+          <w:szCs w:val="20"/>
+        </w:rPr>
+        <w:t xml:space="preserve">chattr</w:t>
+      </w:r>
+      <w:r>
+        <w:rPr>
+          <w:rFonts w:ascii="News Gothic MT" w:cs="News Gothic MT" w:eastAsia="News Gothic MT" w:hAnsi="News Gothic MT"/>
+          <w:b w:val="false"/>
+          <w:bCs w:val="false"/>
+          <w:i w:val="false"/>
+          <w:iCs w:val="false"/>
+          <w:color w:val="1A1A2E"/>
+          <w:sz w:val="21"/>
+          <w:szCs w:val="21"/>
+        </w:rPr>
+        <w:t xml:space="preserve">, que verás con más detalle en unidades posteriores.</w:t>
+      </w:r>
+    </w:p>
+    <w:p>
+      <w:pPr>
+        <w:spacing w:after="160" w:line="300"/>
+        <w:jc w:val="both"/>
+      </w:pPr>
+      <w:r>
+        <w:rPr>
+          <w:rFonts w:ascii="News Gothic MT" w:cs="News Gothic MT" w:eastAsia="News Gothic MT" w:hAnsi="News Gothic MT"/>
+          <w:b w:val="false"/>
+          <w:bCs w:val="false"/>
+          <w:i w:val="false"/>
+          <w:iCs w:val="false"/>
+          <w:color w:val="1A1A2E"/>
+          <w:sz w:val="21"/>
+          <w:szCs w:val="21"/>
+        </w:rPr>
+        <w:t xml:space="preserve">Un archivo oculto </w:t>
+      </w:r>
+      <w:r>
+        <w:rPr>
+          <w:rFonts w:ascii="News Gothic MT" w:cs="News Gothic MT" w:eastAsia="News Gothic MT" w:hAnsi="News Gothic MT"/>
+          <w:b/>
+          <w:bCs/>
+          <w:color w:val="1A1A2E"/>
+          <w:sz w:val="21"/>
+          <w:szCs w:val="21"/>
+        </w:rPr>
+        <w:t xml:space="preserve">no está protegido</w:t>
+      </w:r>
+      <w:r>
+        <w:rPr>
+          <w:rFonts w:ascii="News Gothic MT" w:cs="News Gothic MT" w:eastAsia="News Gothic MT" w:hAnsi="News Gothic MT"/>
+          <w:b w:val="false"/>
+          <w:bCs w:val="false"/>
+          <w:i w:val="false"/>
+          <w:iCs w:val="false"/>
+          <w:color w:val="1A1A2E"/>
+          <w:sz w:val="21"/>
+          <w:szCs w:val="21"/>
+        </w:rPr>
+        <w:t xml:space="preserve"> de ningún modo especial: simplemente no se muestra por defecto. No confundas "oculto" con "seguro".</w:t>
+      </w:r>
+    </w:p>
+    <w:tbl>
+      <w:tblPr>
+        <w:tblW w:type="dxa" w:w="9638"/>
+        <w:tblBorders>
+          <w:top w:val="single" w:color="CD0063" w:sz="10"/>
+          <w:left w:val="single" w:color="CD0063" w:sz="10"/>
+          <w:bottom w:val="single" w:color="CD0063" w:sz="10"/>
+          <w:right w:val="single" w:color="CD0063" w:sz="10"/>
+          <w:insideH w:val="single" w:color="auto" w:sz="4"/>
+          <w:insideV w:val="single" w:color="auto" w:sz="4"/>
+        </w:tblBorders>
+      </w:tblPr>
+      <w:tblGrid>
+        <w:gridCol w:w="100"/>
+      </w:tblGrid>
+      <w:tr>
+        <w:tc>
+          <w:tcPr>
+            <w:tcW w:type="dxa" w:w="9638"/>
+            <w:shd w:fill="EEF1F8" w:color="auto" w:val="clear"/>
+            <w:tcMar>
+              <w:top w:type="dxa" w:w="200"/>
+              <w:left w:type="dxa" w:w="260"/>
+              <w:bottom w:type="dxa" w:w="200"/>
+              <w:right w:type="dxa" w:w="260"/>
+            </w:tcMar>
+          </w:tcPr>
+          <w:p>
+            <w:pPr>
+              <w:spacing w:after="140"/>
+            </w:pPr>
+            <w:r>
+              <w:rPr>
+                <w:rFonts w:ascii="News Gothic MT" w:cs="News Gothic MT" w:eastAsia="News Gothic MT" w:hAnsi="News Gothic MT"/>
+                <w:b/>
+                <w:bCs/>
+                <w:color w:val="CD0063"/>
+                <w:spacing w:val="20"/>
+                <w:sz w:val="19"/>
+                <w:szCs w:val="19"/>
+              </w:rPr>
               <w:t xml:space="preserve">PARA PRACTICAR</w:t>
             </w:r>
           </w:p>
@@ -5267,6 +5792,274 @@
                 <w:szCs w:val="21"/>
               </w:rPr>
               <w:t xml:space="preserve"> —, ¿cuántos archivos distintos son en Windows? ¿Y en Linux? Justifica tu respuesta con lo aprendido en este apartado.</w:t>
+            </w:r>
+          </w:p>
+        </w:tc>
+      </w:tr>
+    </w:tbl>
+    <w:p>
+      <w:pPr>
+        <w:spacing w:after="160"/>
+      </w:pPr>
+    </w:p>
+    <w:tbl>
+      <w:tblPr>
+        <w:tblW w:type="dxa" w:w="9638"/>
+        <w:tblBorders>
+          <w:top w:val="single" w:color="CD0063" w:sz="10"/>
+          <w:left w:val="single" w:color="CD0063" w:sz="10"/>
+          <w:bottom w:val="single" w:color="CD0063" w:sz="10"/>
+          <w:right w:val="single" w:color="CD0063" w:sz="10"/>
+          <w:insideH w:val="single" w:color="auto" w:sz="4"/>
+          <w:insideV w:val="single" w:color="auto" w:sz="4"/>
+        </w:tblBorders>
+      </w:tblPr>
+      <w:tblGrid>
+        <w:gridCol w:w="100"/>
+      </w:tblGrid>
+      <w:tr>
+        <w:tc>
+          <w:tcPr>
+            <w:tcW w:type="dxa" w:w="9638"/>
+            <w:shd w:fill="EEF1F8" w:color="auto" w:val="clear"/>
+            <w:tcMar>
+              <w:top w:type="dxa" w:w="200"/>
+              <w:left w:type="dxa" w:w="260"/>
+              <w:bottom w:type="dxa" w:w="200"/>
+              <w:right w:type="dxa" w:w="260"/>
+            </w:tcMar>
+          </w:tcPr>
+          <w:p>
+            <w:pPr>
+              <w:spacing w:after="140"/>
+            </w:pPr>
+            <w:r>
+              <w:rPr>
+                <w:rFonts w:ascii="News Gothic MT" w:cs="News Gothic MT" w:eastAsia="News Gothic MT" w:hAnsi="News Gothic MT"/>
+                <w:b/>
+                <w:bCs/>
+                <w:color w:val="CD0063"/>
+                <w:spacing w:val="20"/>
+                <w:sz w:val="19"/>
+                <w:szCs w:val="19"/>
+              </w:rPr>
+              <w:t xml:space="preserve">VAMOS A PRACTICAR: TRES COMPROBACIONES REALES</w:t>
+            </w:r>
+          </w:p>
+          <w:p>
+            <w:pPr>
+              <w:spacing w:after="140" w:line="300"/>
+              <w:jc w:val="both"/>
+            </w:pPr>
+            <w:r>
+              <w:rPr>
+                <w:rFonts w:ascii="News Gothic MT" w:cs="News Gothic MT" w:eastAsia="News Gothic MT" w:hAnsi="News Gothic MT"/>
+                <w:b/>
+                <w:bCs/>
+                <w:i w:val="false"/>
+                <w:iCs w:val="false"/>
+                <w:color w:val="1F3864"/>
+                <w:sz w:val="21"/>
+                <w:szCs w:val="21"/>
+              </w:rPr>
+              <w:t xml:space="preserve">1. Compruébalo en los dos sistemas: </w:t>
+            </w:r>
+            <w:r>
+              <w:rPr>
+                <w:rFonts w:ascii="News Gothic MT" w:cs="News Gothic MT" w:eastAsia="News Gothic MT" w:hAnsi="News Gothic MT"/>
+                <w:b w:val="false"/>
+                <w:bCs w:val="false"/>
+                <w:i w:val="false"/>
+                <w:iCs w:val="false"/>
+                <w:color w:val="1A1A2E"/>
+                <w:sz w:val="21"/>
+                <w:szCs w:val="21"/>
+              </w:rPr>
+              <w:t xml:space="preserve">los equipos del aula tienen Windows y Linux disponibles, así que puedes comprobar esto con datos reales en vez de solo razonarlo. En Windows, crea un archivo </w:t>
+            </w:r>
+            <w:r>
+              <w:rPr>
+                <w:rFonts w:ascii="Courier New" w:cs="Courier New" w:eastAsia="Courier New" w:hAnsi="Courier New"/>
+                <w:b w:val="false"/>
+                <w:bCs w:val="false"/>
+                <w:color w:val="9B1B5C"/>
+                <w:sz w:val="20"/>
+                <w:szCs w:val="20"/>
+              </w:rPr>
+              <w:t xml:space="preserve">prueba.txt</w:t>
+            </w:r>
+            <w:r>
+              <w:rPr>
+                <w:rFonts w:ascii="News Gothic MT" w:cs="News Gothic MT" w:eastAsia="News Gothic MT" w:hAnsi="News Gothic MT"/>
+                <w:b w:val="false"/>
+                <w:bCs w:val="false"/>
+                <w:i w:val="false"/>
+                <w:iCs w:val="false"/>
+                <w:color w:val="1A1A2E"/>
+                <w:sz w:val="21"/>
+                <w:szCs w:val="21"/>
+              </w:rPr>
+              <w:t xml:space="preserve"> en una carpeta cualquiera, y en esa misma carpeta intenta crear otro llamado </w:t>
+            </w:r>
+            <w:r>
+              <w:rPr>
+                <w:rFonts w:ascii="Courier New" w:cs="Courier New" w:eastAsia="Courier New" w:hAnsi="Courier New"/>
+                <w:b w:val="false"/>
+                <w:bCs w:val="false"/>
+                <w:color w:val="9B1B5C"/>
+                <w:sz w:val="20"/>
+                <w:szCs w:val="20"/>
+              </w:rPr>
+              <w:t xml:space="preserve">Prueba.txt</w:t>
+            </w:r>
+            <w:r>
+              <w:rPr>
+                <w:rFonts w:ascii="News Gothic MT" w:cs="News Gothic MT" w:eastAsia="News Gothic MT" w:hAnsi="News Gothic MT"/>
+                <w:b w:val="false"/>
+                <w:bCs w:val="false"/>
+                <w:i w:val="false"/>
+                <w:iCs w:val="false"/>
+                <w:color w:val="1A1A2E"/>
+                <w:sz w:val="21"/>
+                <w:szCs w:val="21"/>
+              </w:rPr>
+              <w:t xml:space="preserve">. ¿Qué pasa? Arranca el mismo equipo en Linux y repite exactamente el mismo experimento. ¿Cuántos archivos distintos tienes ahora? Comprueba también en Windows si puedes tener un </w:t>
+            </w:r>
+            <w:r>
+              <w:rPr>
+                <w:rFonts w:ascii="Courier New" w:cs="Courier New" w:eastAsia="Courier New" w:hAnsi="Courier New"/>
+                <w:b w:val="false"/>
+                <w:bCs w:val="false"/>
+                <w:color w:val="9B1B5C"/>
+                <w:sz w:val="20"/>
+                <w:szCs w:val="20"/>
+              </w:rPr>
+              <w:t xml:space="preserve">PRUEBA.txt</w:t>
+            </w:r>
+            <w:r>
+              <w:rPr>
+                <w:rFonts w:ascii="News Gothic MT" w:cs="News Gothic MT" w:eastAsia="News Gothic MT" w:hAnsi="News Gothic MT"/>
+                <w:b w:val="false"/>
+                <w:bCs w:val="false"/>
+                <w:i w:val="false"/>
+                <w:iCs w:val="false"/>
+                <w:color w:val="1A1A2E"/>
+                <w:sz w:val="21"/>
+                <w:szCs w:val="21"/>
+              </w:rPr>
+              <w:t xml:space="preserve"> "encima" del que ya tenías, y anota qué mensaje muestra el sistema.</w:t>
+            </w:r>
+          </w:p>
+          <w:p>
+            <w:pPr>
+              <w:spacing w:after="140" w:line="300"/>
+              <w:jc w:val="both"/>
+            </w:pPr>
+            <w:r>
+              <w:rPr>
+                <w:rFonts w:ascii="News Gothic MT" w:cs="News Gothic MT" w:eastAsia="News Gothic MT" w:hAnsi="News Gothic MT"/>
+                <w:b/>
+                <w:bCs/>
+                <w:i w:val="false"/>
+                <w:iCs w:val="false"/>
+                <w:color w:val="1F3864"/>
+                <w:sz w:val="21"/>
+                <w:szCs w:val="21"/>
+              </w:rPr>
+              <w:t xml:space="preserve">2. Tu propia ruta real: </w:t>
+            </w:r>
+            <w:r>
+              <w:rPr>
+                <w:rFonts w:ascii="News Gothic MT" w:cs="News Gothic MT" w:eastAsia="News Gothic MT" w:hAnsi="News Gothic MT"/>
+                <w:b w:val="false"/>
+                <w:bCs w:val="false"/>
+                <w:i w:val="false"/>
+                <w:iCs w:val="false"/>
+                <w:color w:val="1A1A2E"/>
+                <w:sz w:val="21"/>
+                <w:szCs w:val="21"/>
+              </w:rPr>
+              <w:t xml:space="preserve">abre el explorador de archivos de tu equipo Windows y navega hasta tu carpeta personal de Documentos. Copia la ruta completa desde la barra de direcciones. Escríbela como ruta absoluta y, después, como ruta relativa partiendo de tu carpeta de usuario (</w:t>
+            </w:r>
+            <w:r>
+              <w:rPr>
+                <w:rFonts w:ascii="Courier New" w:cs="Courier New" w:eastAsia="Courier New" w:hAnsi="Courier New"/>
+                <w:b w:val="false"/>
+                <w:bCs w:val="false"/>
+                <w:color w:val="9B1B5C"/>
+                <w:sz w:val="20"/>
+                <w:szCs w:val="20"/>
+              </w:rPr>
+              <w:t xml:space="preserve">C:\Usuarios\&lt;tu usuario&gt;</w:t>
+            </w:r>
+            <w:r>
+              <w:rPr>
+                <w:rFonts w:ascii="News Gothic MT" w:cs="News Gothic MT" w:eastAsia="News Gothic MT" w:hAnsi="News Gothic MT"/>
+                <w:b w:val="false"/>
+                <w:bCs w:val="false"/>
+                <w:i w:val="false"/>
+                <w:iCs w:val="false"/>
+                <w:color w:val="1A1A2E"/>
+                <w:sz w:val="21"/>
+                <w:szCs w:val="21"/>
+              </w:rPr>
+              <w:t xml:space="preserve">). Como cada alumno tiene un nombre de usuario distinto, tu ruta será distinta a la de cualquier compañero.</w:t>
+            </w:r>
+          </w:p>
+          <w:p>
+            <w:pPr>
+              <w:spacing w:after="0" w:line="300"/>
+              <w:jc w:val="both"/>
+            </w:pPr>
+            <w:r>
+              <w:rPr>
+                <w:rFonts w:ascii="News Gothic MT" w:cs="News Gothic MT" w:eastAsia="News Gothic MT" w:hAnsi="News Gothic MT"/>
+                <w:b/>
+                <w:bCs/>
+                <w:i w:val="false"/>
+                <w:iCs w:val="false"/>
+                <w:color w:val="1F3864"/>
+                <w:sz w:val="21"/>
+                <w:szCs w:val="21"/>
+              </w:rPr>
+              <w:t xml:space="preserve">3. Oculta un archivo de verdad: </w:t>
+            </w:r>
+            <w:r>
+              <w:rPr>
+                <w:rFonts w:ascii="News Gothic MT" w:cs="News Gothic MT" w:eastAsia="News Gothic MT" w:hAnsi="News Gothic MT"/>
+                <w:b w:val="false"/>
+                <w:bCs w:val="false"/>
+                <w:i w:val="false"/>
+                <w:iCs w:val="false"/>
+                <w:color w:val="1A1A2E"/>
+                <w:sz w:val="21"/>
+                <w:szCs w:val="21"/>
+              </w:rPr>
+              <w:t xml:space="preserve">crea un archivo de prueba y márcalo como oculto: en Windows, clic derecho → Propiedades → "Oculto"; en Linux, renómbralo añadiendo un punto delante (</w:t>
+            </w:r>
+            <w:r>
+              <w:rPr>
+                <w:rFonts w:ascii="Courier New" w:cs="Courier New" w:eastAsia="Courier New" w:hAnsi="Courier New"/>
+                <w:b w:val="false"/>
+                <w:bCs w:val="false"/>
+                <w:color w:val="9B1B5C"/>
+                <w:sz w:val="20"/>
+                <w:szCs w:val="20"/>
+              </w:rPr>
+              <w:t xml:space="preserve">.prueba.txt</w:t>
+            </w:r>
+            <w:r>
+              <w:rPr>
+                <w:rFonts w:ascii="News Gothic MT" w:cs="News Gothic MT" w:eastAsia="News Gothic MT" w:hAnsi="News Gothic MT"/>
+                <w:b w:val="false"/>
+                <w:bCs w:val="false"/>
+                <w:i w:val="false"/>
+                <w:iCs w:val="false"/>
+                <w:color w:val="1A1A2E"/>
+                <w:sz w:val="21"/>
+                <w:szCs w:val="21"/>
+              </w:rPr>
+              <w:t xml:space="preserve">). Comprueba que desaparece del explorador con la vista de "elementos ocultos" desactivada, y que vuelve a verse al activarla. ¿Has protegido realmente el contenido de ese archivo con esto?</w:t>
             </w:r>
           </w:p>
         </w:tc>
@@ -15806,6 +16599,125 @@
     </w:p>
     <w:p>
       <w:pPr>
+        <w:spacing w:after="80"/>
+      </w:pPr>
+    </w:p>
+    <w:tbl>
+      <w:tblPr>
+        <w:tblW w:type="dxa" w:w="9638"/>
+        <w:tblBorders>
+          <w:top w:val="single" w:color="CD0063" w:sz="10"/>
+          <w:left w:val="single" w:color="CD0063" w:sz="10"/>
+          <w:bottom w:val="single" w:color="CD0063" w:sz="10"/>
+          <w:right w:val="single" w:color="CD0063" w:sz="10"/>
+          <w:insideH w:val="single" w:color="auto" w:sz="4"/>
+          <w:insideV w:val="single" w:color="auto" w:sz="4"/>
+        </w:tblBorders>
+      </w:tblPr>
+      <w:tblGrid>
+        <w:gridCol w:w="100"/>
+      </w:tblGrid>
+      <w:tr>
+        <w:tc>
+          <w:tcPr>
+            <w:tcW w:type="dxa" w:w="9638"/>
+            <w:shd w:fill="EEF1F8" w:color="auto" w:val="clear"/>
+            <w:tcMar>
+              <w:top w:type="dxa" w:w="200"/>
+              <w:left w:type="dxa" w:w="260"/>
+              <w:bottom w:type="dxa" w:w="200"/>
+              <w:right w:type="dxa" w:w="260"/>
+            </w:tcMar>
+          </w:tcPr>
+          <w:p>
+            <w:pPr>
+              <w:spacing w:after="140"/>
+            </w:pPr>
+            <w:r>
+              <w:rPr>
+                <w:rFonts w:ascii="News Gothic MT" w:cs="News Gothic MT" w:eastAsia="News Gothic MT" w:hAnsi="News Gothic MT"/>
+                <w:b/>
+                <w:bCs/>
+                <w:color w:val="CD0063"/>
+                <w:spacing w:val="20"/>
+                <w:sz w:val="19"/>
+                <w:szCs w:val="19"/>
+              </w:rPr>
+              <w:t xml:space="preserve">VAMOS A PRACTICAR: COMPRUÉBALO CON TU PROPIO DISCO</w:t>
+            </w:r>
+          </w:p>
+          <w:p>
+            <w:pPr>
+              <w:spacing w:after="140" w:line="300"/>
+              <w:jc w:val="both"/>
+            </w:pPr>
+            <w:r>
+              <w:rPr>
+                <w:rFonts w:ascii="News Gothic MT" w:cs="News Gothic MT" w:eastAsia="News Gothic MT" w:hAnsi="News Gothic MT"/>
+                <w:b w:val="false"/>
+                <w:bCs w:val="false"/>
+                <w:i w:val="false"/>
+                <w:iCs w:val="false"/>
+                <w:color w:val="1A1A2E"/>
+                <w:sz w:val="21"/>
+                <w:szCs w:val="21"/>
+              </w:rPr>
+              <w:t xml:space="preserve">En Windows, abre el Explorador de archivos, haz clic derecho sobre la unidad </w:t>
+            </w:r>
+            <w:r>
+              <w:rPr>
+                <w:rFonts w:ascii="Courier New" w:cs="Courier New" w:eastAsia="Courier New" w:hAnsi="Courier New"/>
+                <w:b w:val="false"/>
+                <w:bCs w:val="false"/>
+                <w:color w:val="9B1B5C"/>
+                <w:sz w:val="20"/>
+                <w:szCs w:val="20"/>
+              </w:rPr>
+              <w:t xml:space="preserve">C:</w:t>
+            </w:r>
+            <w:r>
+              <w:rPr>
+                <w:rFonts w:ascii="News Gothic MT" w:cs="News Gothic MT" w:eastAsia="News Gothic MT" w:hAnsi="News Gothic MT"/>
+                <w:b w:val="false"/>
+                <w:bCs w:val="false"/>
+                <w:i w:val="false"/>
+                <w:iCs w:val="false"/>
+                <w:color w:val="1A1A2E"/>
+                <w:sz w:val="21"/>
+                <w:szCs w:val="21"/>
+              </w:rPr>
+              <w:t xml:space="preserve"> y entra en Propiedades. Anota la capacidad total que muestra el sistema (en GB). Después, busca la capacidad anunciada por el fabricante para ese mismo disco (en la caja, la factura o las especificaciones técnicas del equipo). ¿Coinciden exactamente los dos números? Si no, calcula a qué se debe la diferencia usando lo aprendido en este apartado.</w:t>
+            </w:r>
+          </w:p>
+          <w:p>
+            <w:pPr>
+              <w:spacing w:after="0" w:line="300"/>
+              <w:jc w:val="both"/>
+            </w:pPr>
+            <w:r>
+              <w:rPr>
+                <w:rFonts w:ascii="News Gothic MT" w:cs="News Gothic MT" w:eastAsia="News Gothic MT" w:hAnsi="News Gothic MT"/>
+                <w:b w:val="false"/>
+                <w:bCs w:val="false"/>
+                <w:i w:val="false"/>
+                <w:iCs w:val="false"/>
+                <w:color w:val="1A1A2E"/>
+                <w:sz w:val="21"/>
+                <w:szCs w:val="21"/>
+              </w:rPr>
+              <w:t xml:space="preserve">Si no tienes a mano el dato del fabricante, comprueba al menos que el número que Windows llama "GB" es en realidad GiB: en la misma ventana de Propiedades suele mostrarse también la capacidad exacta en bytes; divide ese valor entre 1024³ y comprueba que el resultado coincide con el "GB" que muestra el sistema.</w:t>
+            </w:r>
+          </w:p>
+        </w:tc>
+      </w:tr>
+    </w:tbl>
+    <w:p>
+      <w:pPr>
+        <w:spacing w:after="160"/>
+      </w:pPr>
+    </w:p>
+    <w:p>
+      <w:pPr>
         <w:pStyle w:val="Heading2"/>
         <w:spacing w:after="140" w:before="280"/>
       </w:pPr>
@@ -18683,6 +19595,125 @@
         </w:rPr>
         <w:t xml:space="preserve"> (apartado 4): no es una propiedad de "Windows" o "Linux" en abstracto, es una propiedad del propio sistema de archivos.</w:t>
       </w:r>
+    </w:p>
+    <w:p>
+      <w:pPr>
+        <w:spacing w:after="80"/>
+      </w:pPr>
+    </w:p>
+    <w:tbl>
+      <w:tblPr>
+        <w:tblW w:type="dxa" w:w="9638"/>
+        <w:tblBorders>
+          <w:top w:val="single" w:color="CD0063" w:sz="10"/>
+          <w:left w:val="single" w:color="CD0063" w:sz="10"/>
+          <w:bottom w:val="single" w:color="CD0063" w:sz="10"/>
+          <w:right w:val="single" w:color="CD0063" w:sz="10"/>
+          <w:insideH w:val="single" w:color="auto" w:sz="4"/>
+          <w:insideV w:val="single" w:color="auto" w:sz="4"/>
+        </w:tblBorders>
+      </w:tblPr>
+      <w:tblGrid>
+        <w:gridCol w:w="100"/>
+      </w:tblGrid>
+      <w:tr>
+        <w:tc>
+          <w:tcPr>
+            <w:tcW w:type="dxa" w:w="9638"/>
+            <w:shd w:fill="EEF1F8" w:color="auto" w:val="clear"/>
+            <w:tcMar>
+              <w:top w:type="dxa" w:w="200"/>
+              <w:left w:type="dxa" w:w="260"/>
+              <w:bottom w:type="dxa" w:w="200"/>
+              <w:right w:type="dxa" w:w="260"/>
+            </w:tcMar>
+          </w:tcPr>
+          <w:p>
+            <w:pPr>
+              <w:spacing w:after="140"/>
+            </w:pPr>
+            <w:r>
+              <w:rPr>
+                <w:rFonts w:ascii="News Gothic MT" w:cs="News Gothic MT" w:eastAsia="News Gothic MT" w:hAnsi="News Gothic MT"/>
+                <w:b/>
+                <w:bCs/>
+                <w:color w:val="CD0063"/>
+                <w:spacing w:val="20"/>
+                <w:sz w:val="19"/>
+                <w:szCs w:val="19"/>
+              </w:rPr>
+              <w:t xml:space="preserve">VAMOS A PRACTICAR: COMPRUEBA EL SISTEMA DE ARCHIVOS DE UN PENDRIVE REAL</w:t>
+            </w:r>
+          </w:p>
+          <w:p>
+            <w:pPr>
+              <w:spacing w:after="140" w:line="300"/>
+              <w:jc w:val="both"/>
+            </w:pPr>
+            <w:r>
+              <w:rPr>
+                <w:rFonts w:ascii="News Gothic MT" w:cs="News Gothic MT" w:eastAsia="News Gothic MT" w:hAnsi="News Gothic MT"/>
+                <w:b w:val="false"/>
+                <w:bCs w:val="false"/>
+                <w:i w:val="false"/>
+                <w:iCs w:val="false"/>
+                <w:color w:val="1A1A2E"/>
+                <w:sz w:val="21"/>
+                <w:szCs w:val="21"/>
+              </w:rPr>
+              <w:t xml:space="preserve">Conecta a tu equipo una memoria USB o disco externo que ya tengas (o pide uno prestado). En Windows, clic derecho sobre la unidad → Propiedades, y localiza el campo "Sistema de archivos". En Linux, el mismo dato aparece con el comando </w:t>
+            </w:r>
+            <w:r>
+              <w:rPr>
+                <w:rFonts w:ascii="Courier New" w:cs="Courier New" w:eastAsia="Courier New" w:hAnsi="Courier New"/>
+                <w:b w:val="false"/>
+                <w:bCs w:val="false"/>
+                <w:color w:val="9B1B5C"/>
+                <w:sz w:val="20"/>
+                <w:szCs w:val="20"/>
+              </w:rPr>
+              <w:t xml:space="preserve">lsblk -f</w:t>
+            </w:r>
+            <w:r>
+              <w:rPr>
+                <w:rFonts w:ascii="News Gothic MT" w:cs="News Gothic MT" w:eastAsia="News Gothic MT" w:hAnsi="News Gothic MT"/>
+                <w:b w:val="false"/>
+                <w:bCs w:val="false"/>
+                <w:i w:val="false"/>
+                <w:iCs w:val="false"/>
+                <w:color w:val="1A1A2E"/>
+                <w:sz w:val="21"/>
+                <w:szCs w:val="21"/>
+              </w:rPr>
+              <w:t xml:space="preserve"> en una terminal, o en las propiedades del dispositivo desde el gestor de archivos gráfico.</w:t>
+            </w:r>
+          </w:p>
+          <w:p>
+            <w:pPr>
+              <w:spacing w:after="0" w:line="300"/>
+              <w:jc w:val="both"/>
+            </w:pPr>
+            <w:r>
+              <w:rPr>
+                <w:rFonts w:ascii="News Gothic MT" w:cs="News Gothic MT" w:eastAsia="News Gothic MT" w:hAnsi="News Gothic MT"/>
+                <w:b w:val="false"/>
+                <w:bCs w:val="false"/>
+                <w:i w:val="false"/>
+                <w:iCs w:val="false"/>
+                <w:color w:val="1A1A2E"/>
+                <w:sz w:val="21"/>
+                <w:szCs w:val="21"/>
+              </w:rPr>
+              <w:t xml:space="preserve">Anota qué sistema de archivos tiene formateado y compáralo con la tabla de este apartado: ¿tiene sentido ese sistema de archivos para el uso que le das habitualmente a ese dispositivo? Si te sorprende el resultado, piensa si ese pendrive se ha usado alguna vez en un dispositivo distinto a un ordenador (una cámara, una televisión, una videoconsola...), y si eso explica la elección.</w:t>
+            </w:r>
+          </w:p>
+        </w:tc>
+      </w:tr>
+    </w:tbl>
+    <w:p>
+      <w:pPr>
+        <w:spacing w:after="160"/>
+      </w:pPr>
     </w:p>
     <w:tbl>
       <w:tblPr>

</xml_diff>

<commit_message>
UD01: explica . y .. en rutas relativas y completa el solucionario de la prueba
- Apuntes (apartado 4): nuevo subapartado "Subir de nivel en una ruta
  relativa: . y .." y actividad de ruta relativa desde /etc. La Ficha 4
  (ej. 1.4) y la prueba evaluatoria (IV.1.c) ya lo pedían sin explicarlo.
- Docencia: guion, errores frecuentes y solución de la actividad.
- Solucionario de la prueba: respuesta de IV.1.c, reparto 0,2 por
  apartado y criterio de corrección.
- Regenerados UD01_apuntes.docx/.pdf (25 páginas).

Co-Authored-By: Claude Opus 5.5 <noreply@anthropic.com>
</commit_message>
<xml_diff>
--- a/UD01-fundamentos-so/UD01_apuntes.docx
+++ b/UD01-fundamentos-so/UD01_apuntes.docx
@@ -8861,6 +8861,901 @@
           <w:sz w:val="26"/>
           <w:szCs w:val="26"/>
         </w:rPr>
+        <w:t xml:space="preserve">Subir de nivel en una ruta relativa: . y ..</w:t>
+      </w:r>
+    </w:p>
+    <w:p>
+      <w:pPr>
+        <w:spacing w:after="160" w:line="300"/>
+        <w:jc w:val="both"/>
+      </w:pPr>
+      <w:r>
+        <w:rPr>
+          <w:rFonts w:ascii="News Gothic MT" w:cs="News Gothic MT" w:eastAsia="News Gothic MT" w:hAnsi="News Gothic MT"/>
+          <w:b w:val="false"/>
+          <w:bCs w:val="false"/>
+          <w:i w:val="false"/>
+          <w:iCs w:val="false"/>
+          <w:color w:val="1A1A2E"/>
+          <w:sz w:val="21"/>
+          <w:szCs w:val="21"/>
+        </w:rPr>
+        <w:t xml:space="preserve">Hasta ahora, las rutas relativas que has visto siempre "bajaban" desde la carpeta en la que estás hacia una carpeta que está dentro de ella. Pero a menudo el archivo que buscas no está por debajo de ti, sino en una carpeta "hermana" o más arriba en el árbol. Para eso, todo directorio contiene dos nombres especiales, que existen tanto en Linux como en Windows:</w:t>
+      </w:r>
+    </w:p>
+    <w:p>
+      <w:pPr>
+        <w:pStyle w:val="ListParagraph"/>
+        <w:numPr>
+          <w:ilvl w:val="0"/>
+          <w:numId w:val="1"/>
+        </w:numPr>
+        <w:spacing w:after="100" w:line="300"/>
+      </w:pPr>
+      <w:r>
+        <w:rPr>
+          <w:rFonts w:ascii="Courier New" w:cs="Courier New" w:eastAsia="Courier New" w:hAnsi="Courier New"/>
+          <w:b w:val="false"/>
+          <w:bCs w:val="false"/>
+          <w:color w:val="9B1B5C"/>
+          <w:sz w:val="20"/>
+          <w:szCs w:val="20"/>
+        </w:rPr>
+        <w:t xml:space="preserve">.</w:t>
+      </w:r>
+      <w:r>
+        <w:rPr>
+          <w:rFonts w:ascii="News Gothic MT" w:cs="News Gothic MT" w:eastAsia="News Gothic MT" w:hAnsi="News Gothic MT"/>
+          <w:b w:val="false"/>
+          <w:bCs w:val="false"/>
+          <w:i w:val="false"/>
+          <w:iCs w:val="false"/>
+          <w:color w:val="1A1A2E"/>
+          <w:sz w:val="21"/>
+          <w:szCs w:val="21"/>
+        </w:rPr>
+        <w:t xml:space="preserve"> (un punto): el propio directorio en el que estás.</w:t>
+      </w:r>
+    </w:p>
+    <w:p>
+      <w:pPr>
+        <w:pStyle w:val="ListParagraph"/>
+        <w:numPr>
+          <w:ilvl w:val="0"/>
+          <w:numId w:val="1"/>
+        </w:numPr>
+        <w:spacing w:after="100" w:line="300"/>
+      </w:pPr>
+      <w:r>
+        <w:rPr>
+          <w:rFonts w:ascii="Courier New" w:cs="Courier New" w:eastAsia="Courier New" w:hAnsi="Courier New"/>
+          <w:b w:val="false"/>
+          <w:bCs w:val="false"/>
+          <w:color w:val="9B1B5C"/>
+          <w:sz w:val="20"/>
+          <w:szCs w:val="20"/>
+        </w:rPr>
+        <w:t xml:space="preserve">..</w:t>
+      </w:r>
+      <w:r>
+        <w:rPr>
+          <w:rFonts w:ascii="News Gothic MT" w:cs="News Gothic MT" w:eastAsia="News Gothic MT" w:hAnsi="News Gothic MT"/>
+          <w:b w:val="false"/>
+          <w:bCs w:val="false"/>
+          <w:i w:val="false"/>
+          <w:iCs w:val="false"/>
+          <w:color w:val="1A1A2E"/>
+          <w:sz w:val="21"/>
+          <w:szCs w:val="21"/>
+        </w:rPr>
+        <w:t xml:space="preserve"> (dos puntos): el </w:t>
+      </w:r>
+      <w:r>
+        <w:rPr>
+          <w:rFonts w:ascii="News Gothic MT" w:cs="News Gothic MT" w:eastAsia="News Gothic MT" w:hAnsi="News Gothic MT"/>
+          <w:b/>
+          <w:bCs/>
+          <w:color w:val="1A1A2E"/>
+          <w:sz w:val="21"/>
+          <w:szCs w:val="21"/>
+        </w:rPr>
+        <w:t xml:space="preserve">directorio padre</w:t>
+      </w:r>
+      <w:r>
+        <w:rPr>
+          <w:rFonts w:ascii="News Gothic MT" w:cs="News Gothic MT" w:eastAsia="News Gothic MT" w:hAnsi="News Gothic MT"/>
+          <w:b w:val="false"/>
+          <w:bCs w:val="false"/>
+          <w:i w:val="false"/>
+          <w:iCs w:val="false"/>
+          <w:color w:val="1A1A2E"/>
+          <w:sz w:val="21"/>
+          <w:szCs w:val="21"/>
+        </w:rPr>
+        <w:t xml:space="preserve">, es decir, el que contiene al directorio en el que estás. Usarlo en una ruta equivale a "subir un nivel".</w:t>
+      </w:r>
+    </w:p>
+    <w:p>
+      <w:pPr>
+        <w:spacing w:after="160" w:line="300"/>
+        <w:jc w:val="both"/>
+      </w:pPr>
+      <w:r>
+        <w:rPr>
+          <w:rFonts w:ascii="News Gothic MT" w:cs="News Gothic MT" w:eastAsia="News Gothic MT" w:hAnsi="News Gothic MT"/>
+          <w:b w:val="false"/>
+          <w:bCs w:val="false"/>
+          <w:i w:val="false"/>
+          <w:iCs w:val="false"/>
+          <w:color w:val="1A1A2E"/>
+          <w:sz w:val="21"/>
+          <w:szCs w:val="21"/>
+        </w:rPr>
+        <w:t xml:space="preserve">Fíjate en este árbol:</w:t>
+      </w:r>
+    </w:p>
+    <w:tbl>
+      <w:tblPr>
+        <w:tblW w:type="dxa" w:w="9638"/>
+        <w:tblBorders>
+          <w:top w:val="single" w:color="D8DEEA" w:sz="4"/>
+          <w:left w:val="single" w:color="D8DEEA" w:sz="4"/>
+          <w:bottom w:val="single" w:color="D8DEEA" w:sz="4"/>
+          <w:right w:val="single" w:color="D8DEEA" w:sz="4"/>
+          <w:insideH w:val="single" w:color="auto" w:sz="4"/>
+          <w:insideV w:val="single" w:color="auto" w:sz="4"/>
+        </w:tblBorders>
+      </w:tblPr>
+      <w:tblGrid>
+        <w:gridCol w:w="100"/>
+      </w:tblGrid>
+      <w:tr>
+        <w:tc>
+          <w:tcPr>
+            <w:tcW w:type="dxa" w:w="9638"/>
+            <w:shd w:fill="F3F3F3" w:color="auto" w:val="clear"/>
+            <w:tcMar>
+              <w:top w:type="dxa" w:w="140"/>
+              <w:left w:type="dxa" w:w="200"/>
+              <w:bottom w:type="dxa" w:w="140"/>
+              <w:right w:type="dxa" w:w="200"/>
+            </w:tcMar>
+          </w:tcPr>
+          <w:p>
+            <w:pPr>
+              <w:spacing w:after="0" w:line="260"/>
+            </w:pPr>
+            <w:r>
+              <w:rPr>
+                <w:rFonts w:ascii="Courier New" w:cs="Courier New" w:eastAsia="Courier New" w:hAnsi="Courier New"/>
+                <w:color w:val="1A1A2E"/>
+                <w:sz w:val="19"/>
+                <w:szCs w:val="19"/>
+              </w:rPr>
+              <w:t xml:space="preserve">/</w:t>
+            </w:r>
+          </w:p>
+          <w:p>
+            <w:pPr>
+              <w:spacing w:after="0" w:line="260"/>
+            </w:pPr>
+            <w:r>
+              <w:rPr>
+                <w:rFonts w:ascii="Courier New" w:cs="Courier New" w:eastAsia="Courier New" w:hAnsi="Courier New"/>
+                <w:color w:val="1A1A2E"/>
+                <w:sz w:val="19"/>
+                <w:szCs w:val="19"/>
+              </w:rPr>
+              <w:t xml:space="preserve">└── home/</w:t>
+            </w:r>
+          </w:p>
+          <w:p>
+            <w:pPr>
+              <w:spacing w:after="0" w:line="260"/>
+            </w:pPr>
+            <w:r>
+              <w:rPr>
+                <w:rFonts w:ascii="Courier New" w:cs="Courier New" w:eastAsia="Courier New" w:hAnsi="Courier New"/>
+                <w:color w:val="1A1A2E"/>
+                <w:sz w:val="19"/>
+                <w:szCs w:val="19"/>
+              </w:rPr>
+              <w:t xml:space="preserve">    └── alumno/</w:t>
+            </w:r>
+          </w:p>
+          <w:p>
+            <w:pPr>
+              <w:spacing w:after="0" w:line="260"/>
+            </w:pPr>
+            <w:r>
+              <w:rPr>
+                <w:rFonts w:ascii="Courier New" w:cs="Courier New" w:eastAsia="Courier New" w:hAnsi="Courier New"/>
+                <w:color w:val="1A1A2E"/>
+                <w:sz w:val="19"/>
+                <w:szCs w:val="19"/>
+              </w:rPr>
+              <w:t xml:space="preserve">        ├── documentos/</w:t>
+            </w:r>
+          </w:p>
+          <w:p>
+            <w:pPr>
+              <w:spacing w:after="0" w:line="260"/>
+            </w:pPr>
+            <w:r>
+              <w:rPr>
+                <w:rFonts w:ascii="Courier New" w:cs="Courier New" w:eastAsia="Courier New" w:hAnsi="Courier New"/>
+                <w:color w:val="1A1A2E"/>
+                <w:sz w:val="19"/>
+                <w:szCs w:val="19"/>
+              </w:rPr>
+              <w:t xml:space="preserve">        │   └── informe.txt</w:t>
+            </w:r>
+          </w:p>
+          <w:p>
+            <w:pPr>
+              <w:spacing w:after="0" w:line="260"/>
+            </w:pPr>
+            <w:r>
+              <w:rPr>
+                <w:rFonts w:ascii="Courier New" w:cs="Courier New" w:eastAsia="Courier New" w:hAnsi="Courier New"/>
+                <w:color w:val="1A1A2E"/>
+                <w:sz w:val="19"/>
+                <w:szCs w:val="19"/>
+              </w:rPr>
+              <w:t xml:space="preserve">        └── practicas/</w:t>
+            </w:r>
+          </w:p>
+          <w:p>
+            <w:pPr>
+              <w:spacing w:after="0" w:line="260"/>
+            </w:pPr>
+            <w:r>
+              <w:rPr>
+                <w:rFonts w:ascii="Courier New" w:cs="Courier New" w:eastAsia="Courier New" w:hAnsi="Courier New"/>
+                <w:color w:val="1A1A2E"/>
+                <w:sz w:val="19"/>
+                <w:szCs w:val="19"/>
+              </w:rPr>
+              <w:t xml:space="preserve">            └── ud01/</w:t>
+            </w:r>
+          </w:p>
+        </w:tc>
+      </w:tr>
+    </w:tbl>
+    <w:p>
+      <w:pPr>
+        <w:spacing w:after="160"/>
+      </w:pPr>
+    </w:p>
+    <w:p>
+      <w:pPr>
+        <w:spacing w:after="160" w:line="300"/>
+        <w:jc w:val="both"/>
+      </w:pPr>
+      <w:r>
+        <w:rPr>
+          <w:rFonts w:ascii="News Gothic MT" w:cs="News Gothic MT" w:eastAsia="News Gothic MT" w:hAnsi="News Gothic MT"/>
+          <w:b w:val="false"/>
+          <w:bCs w:val="false"/>
+          <w:i w:val="false"/>
+          <w:iCs w:val="false"/>
+          <w:color w:val="1A1A2E"/>
+          <w:sz w:val="21"/>
+          <w:szCs w:val="21"/>
+        </w:rPr>
+        <w:t xml:space="preserve">Si estás en </w:t>
+      </w:r>
+      <w:r>
+        <w:rPr>
+          <w:rFonts w:ascii="Courier New" w:cs="Courier New" w:eastAsia="Courier New" w:hAnsi="Courier New"/>
+          <w:b w:val="false"/>
+          <w:bCs w:val="false"/>
+          <w:color w:val="9B1B5C"/>
+          <w:sz w:val="20"/>
+          <w:szCs w:val="20"/>
+        </w:rPr>
+        <w:t xml:space="preserve">/home/alumno/practicas</w:t>
+      </w:r>
+      <w:r>
+        <w:rPr>
+          <w:rFonts w:ascii="News Gothic MT" w:cs="News Gothic MT" w:eastAsia="News Gothic MT" w:hAnsi="News Gothic MT"/>
+          <w:b w:val="false"/>
+          <w:bCs w:val="false"/>
+          <w:i w:val="false"/>
+          <w:iCs w:val="false"/>
+          <w:color w:val="1A1A2E"/>
+          <w:sz w:val="21"/>
+          <w:szCs w:val="21"/>
+        </w:rPr>
+        <w:t xml:space="preserve"> y quieres llegar a </w:t>
+      </w:r>
+      <w:r>
+        <w:rPr>
+          <w:rFonts w:ascii="Courier New" w:cs="Courier New" w:eastAsia="Courier New" w:hAnsi="Courier New"/>
+          <w:b w:val="false"/>
+          <w:bCs w:val="false"/>
+          <w:color w:val="9B1B5C"/>
+          <w:sz w:val="20"/>
+          <w:szCs w:val="20"/>
+        </w:rPr>
+        <w:t xml:space="preserve">informe.txt</w:t>
+      </w:r>
+      <w:r>
+        <w:rPr>
+          <w:rFonts w:ascii="News Gothic MT" w:cs="News Gothic MT" w:eastAsia="News Gothic MT" w:hAnsi="News Gothic MT"/>
+          <w:b w:val="false"/>
+          <w:bCs w:val="false"/>
+          <w:i w:val="false"/>
+          <w:iCs w:val="false"/>
+          <w:color w:val="1A1A2E"/>
+          <w:sz w:val="21"/>
+          <w:szCs w:val="21"/>
+        </w:rPr>
+        <w:t xml:space="preserve">, no puedes bajar directamente: </w:t>
+      </w:r>
+      <w:r>
+        <w:rPr>
+          <w:rFonts w:ascii="Courier New" w:cs="Courier New" w:eastAsia="Courier New" w:hAnsi="Courier New"/>
+          <w:b w:val="false"/>
+          <w:bCs w:val="false"/>
+          <w:color w:val="9B1B5C"/>
+          <w:sz w:val="20"/>
+          <w:szCs w:val="20"/>
+        </w:rPr>
+        <w:t xml:space="preserve">informe.txt</w:t>
+      </w:r>
+      <w:r>
+        <w:rPr>
+          <w:rFonts w:ascii="News Gothic MT" w:cs="News Gothic MT" w:eastAsia="News Gothic MT" w:hAnsi="News Gothic MT"/>
+          <w:b w:val="false"/>
+          <w:bCs w:val="false"/>
+          <w:i w:val="false"/>
+          <w:iCs w:val="false"/>
+          <w:color w:val="1A1A2E"/>
+          <w:sz w:val="21"/>
+          <w:szCs w:val="21"/>
+        </w:rPr>
+        <w:t xml:space="preserve"> no está dentro de </w:t>
+      </w:r>
+      <w:r>
+        <w:rPr>
+          <w:rFonts w:ascii="Courier New" w:cs="Courier New" w:eastAsia="Courier New" w:hAnsi="Courier New"/>
+          <w:b w:val="false"/>
+          <w:bCs w:val="false"/>
+          <w:color w:val="9B1B5C"/>
+          <w:sz w:val="20"/>
+          <w:szCs w:val="20"/>
+        </w:rPr>
+        <w:t xml:space="preserve">practicas</w:t>
+      </w:r>
+      <w:r>
+        <w:rPr>
+          <w:rFonts w:ascii="News Gothic MT" w:cs="News Gothic MT" w:eastAsia="News Gothic MT" w:hAnsi="News Gothic MT"/>
+          <w:b w:val="false"/>
+          <w:bCs w:val="false"/>
+          <w:i w:val="false"/>
+          <w:iCs w:val="false"/>
+          <w:color w:val="1A1A2E"/>
+          <w:sz w:val="21"/>
+          <w:szCs w:val="21"/>
+        </w:rPr>
+        <w:t xml:space="preserve">. Primero tienes que subir a </w:t>
+      </w:r>
+      <w:r>
+        <w:rPr>
+          <w:rFonts w:ascii="Courier New" w:cs="Courier New" w:eastAsia="Courier New" w:hAnsi="Courier New"/>
+          <w:b w:val="false"/>
+          <w:bCs w:val="false"/>
+          <w:color w:val="9B1B5C"/>
+          <w:sz w:val="20"/>
+          <w:szCs w:val="20"/>
+        </w:rPr>
+        <w:t xml:space="preserve">alumno</w:t>
+      </w:r>
+      <w:r>
+        <w:rPr>
+          <w:rFonts w:ascii="News Gothic MT" w:cs="News Gothic MT" w:eastAsia="News Gothic MT" w:hAnsi="News Gothic MT"/>
+          <w:b w:val="false"/>
+          <w:bCs w:val="false"/>
+          <w:i w:val="false"/>
+          <w:iCs w:val="false"/>
+          <w:color w:val="1A1A2E"/>
+          <w:sz w:val="21"/>
+          <w:szCs w:val="21"/>
+        </w:rPr>
+        <w:t xml:space="preserve"> y desde ahí bajar a </w:t>
+      </w:r>
+      <w:r>
+        <w:rPr>
+          <w:rFonts w:ascii="Courier New" w:cs="Courier New" w:eastAsia="Courier New" w:hAnsi="Courier New"/>
+          <w:b w:val="false"/>
+          <w:bCs w:val="false"/>
+          <w:color w:val="9B1B5C"/>
+          <w:sz w:val="20"/>
+          <w:szCs w:val="20"/>
+        </w:rPr>
+        <w:t xml:space="preserve">documentos</w:t>
+      </w:r>
+      <w:r>
+        <w:rPr>
+          <w:rFonts w:ascii="News Gothic MT" w:cs="News Gothic MT" w:eastAsia="News Gothic MT" w:hAnsi="News Gothic MT"/>
+          <w:b w:val="false"/>
+          <w:bCs w:val="false"/>
+          <w:i w:val="false"/>
+          <w:iCs w:val="false"/>
+          <w:color w:val="1A1A2E"/>
+          <w:sz w:val="21"/>
+          <w:szCs w:val="21"/>
+        </w:rPr>
+        <w:t xml:space="preserve">. La ruta relativa es </w:t>
+      </w:r>
+      <w:r>
+        <w:rPr>
+          <w:rFonts w:ascii="Courier New" w:cs="Courier New" w:eastAsia="Courier New" w:hAnsi="Courier New"/>
+          <w:b w:val="false"/>
+          <w:bCs w:val="false"/>
+          <w:color w:val="9B1B5C"/>
+          <w:sz w:val="20"/>
+          <w:szCs w:val="20"/>
+        </w:rPr>
+        <w:t xml:space="preserve">../documentos/informe.txt</w:t>
+      </w:r>
+      <w:r>
+        <w:rPr>
+          <w:rFonts w:ascii="News Gothic MT" w:cs="News Gothic MT" w:eastAsia="News Gothic MT" w:hAnsi="News Gothic MT"/>
+          <w:b w:val="false"/>
+          <w:bCs w:val="false"/>
+          <w:i w:val="false"/>
+          <w:iCs w:val="false"/>
+          <w:color w:val="1A1A2E"/>
+          <w:sz w:val="21"/>
+          <w:szCs w:val="21"/>
+        </w:rPr>
+        <w:t xml:space="preserve">, que se lee paso a paso así:</w:t>
+      </w:r>
+    </w:p>
+    <w:p>
+      <w:pPr>
+        <w:pStyle w:val="ListParagraph"/>
+        <w:numPr>
+          <w:ilvl w:val="0"/>
+          <w:numId w:val="3"/>
+        </w:numPr>
+        <w:spacing w:after="100" w:line="300"/>
+      </w:pPr>
+      <w:r>
+        <w:rPr>
+          <w:rFonts w:ascii="Courier New" w:cs="Courier New" w:eastAsia="Courier New" w:hAnsi="Courier New"/>
+          <w:b w:val="false"/>
+          <w:bCs w:val="false"/>
+          <w:color w:val="9B1B5C"/>
+          <w:sz w:val="20"/>
+          <w:szCs w:val="20"/>
+        </w:rPr>
+        <w:t xml:space="preserve">..</w:t>
+      </w:r>
+      <w:r>
+        <w:rPr>
+          <w:rFonts w:ascii="News Gothic MT" w:cs="News Gothic MT" w:eastAsia="News Gothic MT" w:hAnsi="News Gothic MT"/>
+          <w:b w:val="false"/>
+          <w:bCs w:val="false"/>
+          <w:i w:val="false"/>
+          <w:iCs w:val="false"/>
+          <w:color w:val="1A1A2E"/>
+          <w:sz w:val="21"/>
+          <w:szCs w:val="21"/>
+        </w:rPr>
+        <w:t xml:space="preserve"> → subes de </w:t>
+      </w:r>
+      <w:r>
+        <w:rPr>
+          <w:rFonts w:ascii="Courier New" w:cs="Courier New" w:eastAsia="Courier New" w:hAnsi="Courier New"/>
+          <w:b w:val="false"/>
+          <w:bCs w:val="false"/>
+          <w:color w:val="9B1B5C"/>
+          <w:sz w:val="20"/>
+          <w:szCs w:val="20"/>
+        </w:rPr>
+        <w:t xml:space="preserve">/home/alumno/practicas</w:t>
+      </w:r>
+      <w:r>
+        <w:rPr>
+          <w:rFonts w:ascii="News Gothic MT" w:cs="News Gothic MT" w:eastAsia="News Gothic MT" w:hAnsi="News Gothic MT"/>
+          <w:b w:val="false"/>
+          <w:bCs w:val="false"/>
+          <w:i w:val="false"/>
+          <w:iCs w:val="false"/>
+          <w:color w:val="1A1A2E"/>
+          <w:sz w:val="21"/>
+          <w:szCs w:val="21"/>
+        </w:rPr>
+        <w:t xml:space="preserve"> a </w:t>
+      </w:r>
+      <w:r>
+        <w:rPr>
+          <w:rFonts w:ascii="Courier New" w:cs="Courier New" w:eastAsia="Courier New" w:hAnsi="Courier New"/>
+          <w:b w:val="false"/>
+          <w:bCs w:val="false"/>
+          <w:color w:val="9B1B5C"/>
+          <w:sz w:val="20"/>
+          <w:szCs w:val="20"/>
+        </w:rPr>
+        <w:t xml:space="preserve">/home/alumno</w:t>
+      </w:r>
+      <w:r>
+        <w:rPr>
+          <w:rFonts w:ascii="News Gothic MT" w:cs="News Gothic MT" w:eastAsia="News Gothic MT" w:hAnsi="News Gothic MT"/>
+          <w:b w:val="false"/>
+          <w:bCs w:val="false"/>
+          <w:i w:val="false"/>
+          <w:iCs w:val="false"/>
+          <w:color w:val="1A1A2E"/>
+          <w:sz w:val="21"/>
+          <w:szCs w:val="21"/>
+        </w:rPr>
+        <w:t xml:space="preserve">.</w:t>
+      </w:r>
+    </w:p>
+    <w:p>
+      <w:pPr>
+        <w:pStyle w:val="ListParagraph"/>
+        <w:numPr>
+          <w:ilvl w:val="0"/>
+          <w:numId w:val="3"/>
+        </w:numPr>
+        <w:spacing w:after="100" w:line="300"/>
+      </w:pPr>
+      <w:r>
+        <w:rPr>
+          <w:rFonts w:ascii="Courier New" w:cs="Courier New" w:eastAsia="Courier New" w:hAnsi="Courier New"/>
+          <w:b w:val="false"/>
+          <w:bCs w:val="false"/>
+          <w:color w:val="9B1B5C"/>
+          <w:sz w:val="20"/>
+          <w:szCs w:val="20"/>
+        </w:rPr>
+        <w:t xml:space="preserve">documentos</w:t>
+      </w:r>
+      <w:r>
+        <w:rPr>
+          <w:rFonts w:ascii="News Gothic MT" w:cs="News Gothic MT" w:eastAsia="News Gothic MT" w:hAnsi="News Gothic MT"/>
+          <w:b w:val="false"/>
+          <w:bCs w:val="false"/>
+          <w:i w:val="false"/>
+          <w:iCs w:val="false"/>
+          <w:color w:val="1A1A2E"/>
+          <w:sz w:val="21"/>
+          <w:szCs w:val="21"/>
+        </w:rPr>
+        <w:t xml:space="preserve"> → bajas a </w:t>
+      </w:r>
+      <w:r>
+        <w:rPr>
+          <w:rFonts w:ascii="Courier New" w:cs="Courier New" w:eastAsia="Courier New" w:hAnsi="Courier New"/>
+          <w:b w:val="false"/>
+          <w:bCs w:val="false"/>
+          <w:color w:val="9B1B5C"/>
+          <w:sz w:val="20"/>
+          <w:szCs w:val="20"/>
+        </w:rPr>
+        <w:t xml:space="preserve">/home/alumno/documentos</w:t>
+      </w:r>
+      <w:r>
+        <w:rPr>
+          <w:rFonts w:ascii="News Gothic MT" w:cs="News Gothic MT" w:eastAsia="News Gothic MT" w:hAnsi="News Gothic MT"/>
+          <w:b w:val="false"/>
+          <w:bCs w:val="false"/>
+          <w:i w:val="false"/>
+          <w:iCs w:val="false"/>
+          <w:color w:val="1A1A2E"/>
+          <w:sz w:val="21"/>
+          <w:szCs w:val="21"/>
+        </w:rPr>
+        <w:t xml:space="preserve">.</w:t>
+      </w:r>
+    </w:p>
+    <w:p>
+      <w:pPr>
+        <w:pStyle w:val="ListParagraph"/>
+        <w:numPr>
+          <w:ilvl w:val="0"/>
+          <w:numId w:val="3"/>
+        </w:numPr>
+        <w:spacing w:after="100" w:line="300"/>
+      </w:pPr>
+      <w:r>
+        <w:rPr>
+          <w:rFonts w:ascii="Courier New" w:cs="Courier New" w:eastAsia="Courier New" w:hAnsi="Courier New"/>
+          <w:b w:val="false"/>
+          <w:bCs w:val="false"/>
+          <w:color w:val="9B1B5C"/>
+          <w:sz w:val="20"/>
+          <w:szCs w:val="20"/>
+        </w:rPr>
+        <w:t xml:space="preserve">informe.txt</w:t>
+      </w:r>
+      <w:r>
+        <w:rPr>
+          <w:rFonts w:ascii="News Gothic MT" w:cs="News Gothic MT" w:eastAsia="News Gothic MT" w:hAnsi="News Gothic MT"/>
+          <w:b w:val="false"/>
+          <w:bCs w:val="false"/>
+          <w:i w:val="false"/>
+          <w:iCs w:val="false"/>
+          <w:color w:val="1A1A2E"/>
+          <w:sz w:val="21"/>
+          <w:szCs w:val="21"/>
+        </w:rPr>
+        <w:t xml:space="preserve"> → llegas al archivo.</w:t>
+      </w:r>
+    </w:p>
+    <w:p>
+      <w:pPr>
+        <w:spacing w:after="160" w:line="300"/>
+        <w:jc w:val="both"/>
+      </w:pPr>
+      <w:r>
+        <w:rPr>
+          <w:rFonts w:ascii="News Gothic MT" w:cs="News Gothic MT" w:eastAsia="News Gothic MT" w:hAnsi="News Gothic MT"/>
+          <w:b w:val="false"/>
+          <w:bCs w:val="false"/>
+          <w:i w:val="false"/>
+          <w:iCs w:val="false"/>
+          <w:color w:val="1A1A2E"/>
+          <w:sz w:val="21"/>
+          <w:szCs w:val="21"/>
+        </w:rPr>
+        <w:t xml:space="preserve">Puedes encadenar varios </w:t>
+      </w:r>
+      <w:r>
+        <w:rPr>
+          <w:rFonts w:ascii="Courier New" w:cs="Courier New" w:eastAsia="Courier New" w:hAnsi="Courier New"/>
+          <w:b w:val="false"/>
+          <w:bCs w:val="false"/>
+          <w:color w:val="9B1B5C"/>
+          <w:sz w:val="20"/>
+          <w:szCs w:val="20"/>
+        </w:rPr>
+        <w:t xml:space="preserve">..</w:t>
+      </w:r>
+      <w:r>
+        <w:rPr>
+          <w:rFonts w:ascii="News Gothic MT" w:cs="News Gothic MT" w:eastAsia="News Gothic MT" w:hAnsi="News Gothic MT"/>
+          <w:b w:val="false"/>
+          <w:bCs w:val="false"/>
+          <w:i w:val="false"/>
+          <w:iCs w:val="false"/>
+          <w:color w:val="1A1A2E"/>
+          <w:sz w:val="21"/>
+          <w:szCs w:val="21"/>
+        </w:rPr>
+        <w:t xml:space="preserve"> para subir más de un nivel: desde </w:t>
+      </w:r>
+      <w:r>
+        <w:rPr>
+          <w:rFonts w:ascii="Courier New" w:cs="Courier New" w:eastAsia="Courier New" w:hAnsi="Courier New"/>
+          <w:b w:val="false"/>
+          <w:bCs w:val="false"/>
+          <w:color w:val="9B1B5C"/>
+          <w:sz w:val="20"/>
+          <w:szCs w:val="20"/>
+        </w:rPr>
+        <w:t xml:space="preserve">/home/alumno/practicas/ud01</w:t>
+      </w:r>
+      <w:r>
+        <w:rPr>
+          <w:rFonts w:ascii="News Gothic MT" w:cs="News Gothic MT" w:eastAsia="News Gothic MT" w:hAnsi="News Gothic MT"/>
+          <w:b w:val="false"/>
+          <w:bCs w:val="false"/>
+          <w:i w:val="false"/>
+          <w:iCs w:val="false"/>
+          <w:color w:val="1A1A2E"/>
+          <w:sz w:val="21"/>
+          <w:szCs w:val="21"/>
+        </w:rPr>
+        <w:t xml:space="preserve">, la misma ruta sería </w:t>
+      </w:r>
+      <w:r>
+        <w:rPr>
+          <w:rFonts w:ascii="Courier New" w:cs="Courier New" w:eastAsia="Courier New" w:hAnsi="Courier New"/>
+          <w:b w:val="false"/>
+          <w:bCs w:val="false"/>
+          <w:color w:val="9B1B5C"/>
+          <w:sz w:val="20"/>
+          <w:szCs w:val="20"/>
+        </w:rPr>
+        <w:t xml:space="preserve">../../documentos/informe.txt</w:t>
+      </w:r>
+      <w:r>
+        <w:rPr>
+          <w:rFonts w:ascii="News Gothic MT" w:cs="News Gothic MT" w:eastAsia="News Gothic MT" w:hAnsi="News Gothic MT"/>
+          <w:b w:val="false"/>
+          <w:bCs w:val="false"/>
+          <w:i w:val="false"/>
+          <w:iCs w:val="false"/>
+          <w:color w:val="1A1A2E"/>
+          <w:sz w:val="21"/>
+          <w:szCs w:val="21"/>
+        </w:rPr>
+        <w:t xml:space="preserve"> (subes dos niveles, hasta </w:t>
+      </w:r>
+      <w:r>
+        <w:rPr>
+          <w:rFonts w:ascii="Courier New" w:cs="Courier New" w:eastAsia="Courier New" w:hAnsi="Courier New"/>
+          <w:b w:val="false"/>
+          <w:bCs w:val="false"/>
+          <w:color w:val="9B1B5C"/>
+          <w:sz w:val="20"/>
+          <w:szCs w:val="20"/>
+        </w:rPr>
+        <w:t xml:space="preserve">alumno</w:t>
+      </w:r>
+      <w:r>
+        <w:rPr>
+          <w:rFonts w:ascii="News Gothic MT" w:cs="News Gothic MT" w:eastAsia="News Gothic MT" w:hAnsi="News Gothic MT"/>
+          <w:b w:val="false"/>
+          <w:bCs w:val="false"/>
+          <w:i w:val="false"/>
+          <w:iCs w:val="false"/>
+          <w:color w:val="1A1A2E"/>
+          <w:sz w:val="21"/>
+          <w:szCs w:val="21"/>
+        </w:rPr>
+        <w:t xml:space="preserve">, y luego bajas). En Windows funciona exactamente igual, cambiando el separador: </w:t>
+      </w:r>
+      <w:r>
+        <w:rPr>
+          <w:rFonts w:ascii="Courier New" w:cs="Courier New" w:eastAsia="Courier New" w:hAnsi="Courier New"/>
+          <w:b w:val="false"/>
+          <w:bCs w:val="false"/>
+          <w:color w:val="9B1B5C"/>
+          <w:sz w:val="20"/>
+          <w:szCs w:val="20"/>
+        </w:rPr>
+        <w:t xml:space="preserve">..\Documents\informe.docx</w:t>
+      </w:r>
+      <w:r>
+        <w:rPr>
+          <w:rFonts w:ascii="News Gothic MT" w:cs="News Gothic MT" w:eastAsia="News Gothic MT" w:hAnsi="News Gothic MT"/>
+          <w:b w:val="false"/>
+          <w:bCs w:val="false"/>
+          <w:i w:val="false"/>
+          <w:iCs w:val="false"/>
+          <w:color w:val="1A1A2E"/>
+          <w:sz w:val="21"/>
+          <w:szCs w:val="21"/>
+        </w:rPr>
+        <w:t xml:space="preserve">.</w:t>
+      </w:r>
+    </w:p>
+    <w:p>
+      <w:pPr>
+        <w:spacing w:after="160" w:line="300"/>
+        <w:jc w:val="both"/>
+      </w:pPr>
+      <w:r>
+        <w:rPr>
+          <w:rFonts w:ascii="News Gothic MT" w:cs="News Gothic MT" w:eastAsia="News Gothic MT" w:hAnsi="News Gothic MT"/>
+          <w:b w:val="false"/>
+          <w:bCs w:val="false"/>
+          <w:i w:val="false"/>
+          <w:iCs w:val="false"/>
+          <w:color w:val="1A1A2E"/>
+          <w:sz w:val="21"/>
+          <w:szCs w:val="21"/>
+        </w:rPr>
+        <w:t xml:space="preserve">Dos ideas para no equivocarte: una ruta relativa </w:t>
+      </w:r>
+      <w:r>
+        <w:rPr>
+          <w:rFonts w:ascii="News Gothic MT" w:cs="News Gothic MT" w:eastAsia="News Gothic MT" w:hAnsi="News Gothic MT"/>
+          <w:b/>
+          <w:bCs/>
+          <w:color w:val="1A1A2E"/>
+          <w:sz w:val="21"/>
+          <w:szCs w:val="21"/>
+        </w:rPr>
+        <w:t xml:space="preserve">nunca empieza por `/`</w:t>
+      </w:r>
+      <w:r>
+        <w:rPr>
+          <w:rFonts w:ascii="News Gothic MT" w:cs="News Gothic MT" w:eastAsia="News Gothic MT" w:hAnsi="News Gothic MT"/>
+          <w:b w:val="false"/>
+          <w:bCs w:val="false"/>
+          <w:i w:val="false"/>
+          <w:iCs w:val="false"/>
+          <w:color w:val="1A1A2E"/>
+          <w:sz w:val="21"/>
+          <w:szCs w:val="21"/>
+        </w:rPr>
+        <w:t xml:space="preserve"> en Linux (ni por una letra de unidad en Windows), porque entonces sería absoluta; y el resultado de una ruta relativa </w:t>
+      </w:r>
+      <w:r>
+        <w:rPr>
+          <w:rFonts w:ascii="News Gothic MT" w:cs="News Gothic MT" w:eastAsia="News Gothic MT" w:hAnsi="News Gothic MT"/>
+          <w:b/>
+          <w:bCs/>
+          <w:color w:val="1A1A2E"/>
+          <w:sz w:val="21"/>
+          <w:szCs w:val="21"/>
+        </w:rPr>
+        <w:t xml:space="preserve">depende de dónde estés</w:t>
+      </w:r>
+      <w:r>
+        <w:rPr>
+          <w:rFonts w:ascii="News Gothic MT" w:cs="News Gothic MT" w:eastAsia="News Gothic MT" w:hAnsi="News Gothic MT"/>
+          <w:b w:val="false"/>
+          <w:bCs w:val="false"/>
+          <w:i w:val="false"/>
+          <w:iCs w:val="false"/>
+          <w:color w:val="1A1A2E"/>
+          <w:sz w:val="21"/>
+          <w:szCs w:val="21"/>
+        </w:rPr>
+        <w:t xml:space="preserve">, mientras que una absoluta lleva siempre al mismo sitio. Cuando empieces a usar la terminal de Linux, escribirás </w:t>
+      </w:r>
+      <w:r>
+        <w:rPr>
+          <w:rFonts w:ascii="Courier New" w:cs="Courier New" w:eastAsia="Courier New" w:hAnsi="Courier New"/>
+          <w:b w:val="false"/>
+          <w:bCs w:val="false"/>
+          <w:color w:val="9B1B5C"/>
+          <w:sz w:val="20"/>
+          <w:szCs w:val="20"/>
+        </w:rPr>
+        <w:t xml:space="preserve">cd ..</w:t>
+      </w:r>
+      <w:r>
+        <w:rPr>
+          <w:rFonts w:ascii="News Gothic MT" w:cs="News Gothic MT" w:eastAsia="News Gothic MT" w:hAnsi="News Gothic MT"/>
+          <w:b w:val="false"/>
+          <w:bCs w:val="false"/>
+          <w:i w:val="false"/>
+          <w:iCs w:val="false"/>
+          <w:color w:val="1A1A2E"/>
+          <w:sz w:val="21"/>
+          <w:szCs w:val="21"/>
+        </w:rPr>
+        <w:t xml:space="preserve"> constantemente para subir de carpeta: es exactamente este mismo </w:t>
+      </w:r>
+      <w:r>
+        <w:rPr>
+          <w:rFonts w:ascii="Courier New" w:cs="Courier New" w:eastAsia="Courier New" w:hAnsi="Courier New"/>
+          <w:b w:val="false"/>
+          <w:bCs w:val="false"/>
+          <w:color w:val="9B1B5C"/>
+          <w:sz w:val="20"/>
+          <w:szCs w:val="20"/>
+        </w:rPr>
+        <w:t xml:space="preserve">..</w:t>
+      </w:r>
+      <w:r>
+        <w:rPr>
+          <w:rFonts w:ascii="News Gothic MT" w:cs="News Gothic MT" w:eastAsia="News Gothic MT" w:hAnsi="News Gothic MT"/>
+          <w:b w:val="false"/>
+          <w:bCs w:val="false"/>
+          <w:i w:val="false"/>
+          <w:iCs w:val="false"/>
+          <w:color w:val="1A1A2E"/>
+          <w:sz w:val="21"/>
+          <w:szCs w:val="21"/>
+        </w:rPr>
+        <w:t xml:space="preserve">.</w:t>
+      </w:r>
+    </w:p>
+    <w:p>
+      <w:pPr>
+        <w:pStyle w:val="Heading2"/>
+        <w:spacing w:after="140" w:before="280"/>
+      </w:pPr>
+      <w:r>
+        <w:rPr>
+          <w:rFonts w:ascii="News Gothic MT" w:cs="News Gothic MT" w:eastAsia="News Gothic MT" w:hAnsi="News Gothic MT"/>
+          <w:b/>
+          <w:bCs/>
+          <w:color w:val="1F3864"/>
+          <w:sz w:val="26"/>
+          <w:szCs w:val="26"/>
+        </w:rPr>
         <w:t xml:space="preserve">La diferencia que más suele fallar: mayúsculas y minúsculas</w:t>
       </w:r>
     </w:p>
@@ -9596,6 +10491,86 @@
                 <w:szCs w:val="21"/>
               </w:rPr>
               <w:t xml:space="preserve">.</w:t>
+            </w:r>
+          </w:p>
+          <w:p>
+            <w:pPr>
+              <w:spacing w:after="140" w:line="300"/>
+              <w:jc w:val="both"/>
+            </w:pPr>
+            <w:r>
+              <w:rPr>
+                <w:rFonts w:ascii="News Gothic MT" w:cs="News Gothic MT" w:eastAsia="News Gothic MT" w:hAnsi="News Gothic MT"/>
+                <w:b/>
+                <w:bCs/>
+                <w:i w:val="false"/>
+                <w:iCs w:val="false"/>
+                <w:color w:val="1F3864"/>
+                <w:sz w:val="21"/>
+                <w:szCs w:val="21"/>
+              </w:rPr>
+              <w:t xml:space="preserve">Actividad (subir de nivel): </w:t>
+            </w:r>
+            <w:r>
+              <w:rPr>
+                <w:rFonts w:ascii="News Gothic MT" w:cs="News Gothic MT" w:eastAsia="News Gothic MT" w:hAnsi="News Gothic MT"/>
+                <w:b w:val="false"/>
+                <w:bCs w:val="false"/>
+                <w:i w:val="false"/>
+                <w:iCs w:val="false"/>
+                <w:color w:val="1A1A2E"/>
+                <w:sz w:val="21"/>
+                <w:szCs w:val="21"/>
+              </w:rPr>
+              <w:t xml:space="preserve">con ese mismo árbol, escribe una ruta relativa hasta </w:t>
+            </w:r>
+            <w:r>
+              <w:rPr>
+                <w:rFonts w:ascii="Courier New" w:cs="Courier New" w:eastAsia="Courier New" w:hAnsi="Courier New"/>
+                <w:b w:val="false"/>
+                <w:bCs w:val="false"/>
+                <w:color w:val="9B1B5C"/>
+                <w:sz w:val="20"/>
+                <w:szCs w:val="20"/>
+              </w:rPr>
+              <w:t xml:space="preserve">informe.txt</w:t>
+            </w:r>
+            <w:r>
+              <w:rPr>
+                <w:rFonts w:ascii="News Gothic MT" w:cs="News Gothic MT" w:eastAsia="News Gothic MT" w:hAnsi="News Gothic MT"/>
+                <w:b w:val="false"/>
+                <w:bCs w:val="false"/>
+                <w:i w:val="false"/>
+                <w:iCs w:val="false"/>
+                <w:color w:val="1A1A2E"/>
+                <w:sz w:val="21"/>
+                <w:szCs w:val="21"/>
+              </w:rPr>
+              <w:t xml:space="preserve"> suponiendo que partes de </w:t>
+            </w:r>
+            <w:r>
+              <w:rPr>
+                <w:rFonts w:ascii="Courier New" w:cs="Courier New" w:eastAsia="Courier New" w:hAnsi="Courier New"/>
+                <w:b w:val="false"/>
+                <w:bCs w:val="false"/>
+                <w:color w:val="9B1B5C"/>
+                <w:sz w:val="20"/>
+                <w:szCs w:val="20"/>
+              </w:rPr>
+              <w:t xml:space="preserve">/etc</w:t>
+            </w:r>
+            <w:r>
+              <w:rPr>
+                <w:rFonts w:ascii="News Gothic MT" w:cs="News Gothic MT" w:eastAsia="News Gothic MT" w:hAnsi="News Gothic MT"/>
+                <w:b w:val="false"/>
+                <w:bCs w:val="false"/>
+                <w:i w:val="false"/>
+                <w:iCs w:val="false"/>
+                <w:color w:val="1A1A2E"/>
+                <w:sz w:val="21"/>
+                <w:szCs w:val="21"/>
+              </w:rPr>
+              <w:t xml:space="preserve">. Pista: primero tienes que subir hasta la raíz.</w:t>
             </w:r>
           </w:p>
           <w:p>
@@ -15872,7 +16847,7 @@
         <w:pStyle w:val="ListParagraph"/>
         <w:numPr>
           <w:ilvl w:val="0"/>
-          <w:numId w:val="3"/>
+          <w:numId w:val="4"/>
         </w:numPr>
         <w:spacing w:after="100" w:line="300"/>
       </w:pPr>
@@ -15919,7 +16894,7 @@
         <w:pStyle w:val="ListParagraph"/>
         <w:numPr>
           <w:ilvl w:val="0"/>
-          <w:numId w:val="3"/>
+          <w:numId w:val="4"/>
         </w:numPr>
         <w:spacing w:after="100" w:line="300"/>
       </w:pPr>
@@ -15966,7 +16941,7 @@
         <w:pStyle w:val="ListParagraph"/>
         <w:numPr>
           <w:ilvl w:val="0"/>
-          <w:numId w:val="3"/>
+          <w:numId w:val="4"/>
         </w:numPr>
         <w:spacing w:after="100" w:line="300"/>
       </w:pPr>
@@ -16013,7 +16988,7 @@
         <w:pStyle w:val="ListParagraph"/>
         <w:numPr>
           <w:ilvl w:val="0"/>
-          <w:numId w:val="3"/>
+          <w:numId w:val="4"/>
         </w:numPr>
         <w:spacing w:after="100" w:line="300"/>
       </w:pPr>
@@ -16084,7 +17059,7 @@
         <w:pStyle w:val="ListParagraph"/>
         <w:numPr>
           <w:ilvl w:val="0"/>
-          <w:numId w:val="3"/>
+          <w:numId w:val="4"/>
         </w:numPr>
         <w:spacing w:after="100" w:line="300"/>
       </w:pPr>
@@ -23834,7 +24809,7 @@
         <w:pStyle w:val="ListParagraph"/>
         <w:numPr>
           <w:ilvl w:val="0"/>
-          <w:numId w:val="4"/>
+          <w:numId w:val="5"/>
         </w:numPr>
         <w:spacing w:after="100" w:line="300"/>
       </w:pPr>
@@ -23857,7 +24832,7 @@
         <w:pStyle w:val="ListParagraph"/>
         <w:numPr>
           <w:ilvl w:val="0"/>
-          <w:numId w:val="4"/>
+          <w:numId w:val="5"/>
         </w:numPr>
         <w:spacing w:after="100" w:line="300"/>
       </w:pPr>
@@ -23880,7 +24855,7 @@
         <w:pStyle w:val="ListParagraph"/>
         <w:numPr>
           <w:ilvl w:val="0"/>
-          <w:numId w:val="4"/>
+          <w:numId w:val="5"/>
         </w:numPr>
         <w:spacing w:after="100" w:line="300"/>
       </w:pPr>
@@ -25570,6 +26545,18 @@
       </w:pPr>
     </w:lvl>
   </w:abstractNum>
+  <w:abstractNum w:abstractNumId="5" w15:restartNumberingAfterBreak="0">
+    <w:multiLevelType w:val="hybridMultilevel"/>
+    <w:lvl w:ilvl="0" w15:tentative="1">
+      <w:start w:val="1"/>
+      <w:numFmt w:val="decimal"/>
+      <w:lvlText w:val="%1."/>
+      <w:lvlJc w:val="start"/>
+      <w:pPr>
+        <w:ind w:left="420" w:hanging="260"/>
+      </w:pPr>
+    </w:lvl>
+  </w:abstractNum>
   <w:num w:numId="1">
     <w:abstractNumId w:val="1"/>
     <w:lvlOverride w:ilvl="0">
@@ -25590,6 +26577,12 @@
   </w:num>
   <w:num w:numId="4">
     <w:abstractNumId w:val="4"/>
+    <w:lvlOverride w:ilvl="0">
+      <w:startOverride w:val="1"/>
+    </w:lvlOverride>
+  </w:num>
+  <w:num w:numId="5">
+    <w:abstractNumId w:val="5"/>
     <w:lvlOverride w:ilvl="0">
       <w:startOverride w:val="1"/>
     </w:lvlOverride>

</xml_diff>